<commit_message>
Thesis chapter 5 Word file follows the corrected actas
</commit_message>
<xml_diff>
--- a/docs/Trabajo_de_Grado_Entrega_Plantilla_28jul.docx
+++ b/docs/Trabajo_de_Grado_Entrega_Plantilla_28jul.docx
@@ -1073,7 +1073,7 @@
           <w:r>
             <w:fldChar w:fldCharType="separate"/>
           </w:r>
-          <w:hyperlink w:anchor="_Toc242188013" w:history="1">
+          <w:hyperlink w:anchor="_Toc242198036" w:history="1">
             <w:r>
               <w:rPr>
                 <w:rStyle w:val="Hipervnculo"/>
@@ -1103,7 +1103,7 @@
                 <w:noProof/>
                 <w:webHidden/>
               </w:rPr>
-              <w:instrText xml:space="preserve"> PAGEREF _Toc242188013 \h </w:instrText>
+              <w:instrText xml:space="preserve"> PAGEREF _Toc242198036 \h </w:instrText>
             </w:r>
             <w:r>
               <w:rPr>
@@ -1145,7 +1145,7 @@
               <w14:ligatures w14:val="standardContextual"/>
             </w:rPr>
           </w:pPr>
-          <w:hyperlink w:anchor="_Toc242188014" w:history="1">
+          <w:hyperlink w:anchor="_Toc242198037" w:history="1">
             <w:r>
               <w:rPr>
                 <w:rStyle w:val="Hipervnculo"/>
@@ -1175,7 +1175,7 @@
                 <w:noProof/>
                 <w:webHidden/>
               </w:rPr>
-              <w:instrText xml:space="preserve"> PAGEREF _Toc242188014 \h </w:instrText>
+              <w:instrText xml:space="preserve"> PAGEREF _Toc242198037 \h </w:instrText>
             </w:r>
             <w:r>
               <w:rPr>
@@ -1220,7 +1220,7 @@
               <w14:ligatures w14:val="standardContextual"/>
             </w:rPr>
           </w:pPr>
-          <w:hyperlink w:anchor="_Toc242188015" w:history="1">
+          <w:hyperlink w:anchor="_Toc242198038" w:history="1">
             <w:r>
               <w:rPr>
                 <w:rStyle w:val="Hipervnculo"/>
@@ -1247,7 +1247,7 @@
                 <w:noProof/>
                 <w:webHidden/>
               </w:rPr>
-              <w:instrText xml:space="preserve"> PAGEREF _Toc242188015 \h </w:instrText>
+              <w:instrText xml:space="preserve"> PAGEREF _Toc242198038 \h </w:instrText>
             </w:r>
             <w:r>
               <w:rPr>
@@ -1292,7 +1292,7 @@
               <w14:ligatures w14:val="standardContextual"/>
             </w:rPr>
           </w:pPr>
-          <w:hyperlink w:anchor="_Toc242188016" w:history="1">
+          <w:hyperlink w:anchor="_Toc242198039" w:history="1">
             <w:r>
               <w:rPr>
                 <w:rStyle w:val="Hipervnculo"/>
@@ -1319,7 +1319,7 @@
                 <w:noProof/>
                 <w:webHidden/>
               </w:rPr>
-              <w:instrText xml:space="preserve"> PAGEREF _Toc242188016 \h </w:instrText>
+              <w:instrText xml:space="preserve"> PAGEREF _Toc242198039 \h </w:instrText>
             </w:r>
             <w:r>
               <w:rPr>
@@ -1364,7 +1364,7 @@
               <w14:ligatures w14:val="standardContextual"/>
             </w:rPr>
           </w:pPr>
-          <w:hyperlink w:anchor="_Toc242188017" w:history="1">
+          <w:hyperlink w:anchor="_Toc242198040" w:history="1">
             <w:r>
               <w:rPr>
                 <w:rStyle w:val="Hipervnculo"/>
@@ -1391,7 +1391,7 @@
                 <w:noProof/>
                 <w:webHidden/>
               </w:rPr>
-              <w:instrText xml:space="preserve"> PAGEREF _Toc242188017 \h </w:instrText>
+              <w:instrText xml:space="preserve"> PAGEREF _Toc242198040 \h </w:instrText>
             </w:r>
             <w:r>
               <w:rPr>
@@ -1436,7 +1436,7 @@
               <w14:ligatures w14:val="standardContextual"/>
             </w:rPr>
           </w:pPr>
-          <w:hyperlink w:anchor="_Toc242188018" w:history="1">
+          <w:hyperlink w:anchor="_Toc242198041" w:history="1">
             <w:r>
               <w:rPr>
                 <w:rStyle w:val="Hipervnculo"/>
@@ -1463,7 +1463,7 @@
                 <w:noProof/>
                 <w:webHidden/>
               </w:rPr>
-              <w:instrText xml:space="preserve"> PAGEREF _Toc242188018 \h </w:instrText>
+              <w:instrText xml:space="preserve"> PAGEREF _Toc242198041 \h </w:instrText>
             </w:r>
             <w:r>
               <w:rPr>
@@ -1505,7 +1505,7 @@
               <w14:ligatures w14:val="standardContextual"/>
             </w:rPr>
           </w:pPr>
-          <w:hyperlink w:anchor="_Toc242188019" w:history="1">
+          <w:hyperlink w:anchor="_Toc242198042" w:history="1">
             <w:r>
               <w:rPr>
                 <w:rStyle w:val="Hipervnculo"/>
@@ -1535,7 +1535,7 @@
                 <w:noProof/>
                 <w:webHidden/>
               </w:rPr>
-              <w:instrText xml:space="preserve"> PAGEREF _Toc242188019 \h </w:instrText>
+              <w:instrText xml:space="preserve"> PAGEREF _Toc242198042 \h </w:instrText>
             </w:r>
             <w:r>
               <w:rPr>
@@ -1580,7 +1580,7 @@
               <w14:ligatures w14:val="standardContextual"/>
             </w:rPr>
           </w:pPr>
-          <w:hyperlink w:anchor="_Toc242188020" w:history="1">
+          <w:hyperlink w:anchor="_Toc242198043" w:history="1">
             <w:r>
               <w:rPr>
                 <w:rStyle w:val="Hipervnculo"/>
@@ -1607,7 +1607,7 @@
                 <w:noProof/>
                 <w:webHidden/>
               </w:rPr>
-              <w:instrText xml:space="preserve"> PAGEREF _Toc242188020 \h </w:instrText>
+              <w:instrText xml:space="preserve"> PAGEREF _Toc242198043 \h </w:instrText>
             </w:r>
             <w:r>
               <w:rPr>
@@ -1652,7 +1652,7 @@
               <w14:ligatures w14:val="standardContextual"/>
             </w:rPr>
           </w:pPr>
-          <w:hyperlink w:anchor="_Toc242188021" w:history="1">
+          <w:hyperlink w:anchor="_Toc242198044" w:history="1">
             <w:r>
               <w:rPr>
                 <w:rStyle w:val="Hipervnculo"/>
@@ -1679,7 +1679,7 @@
                 <w:noProof/>
                 <w:webHidden/>
               </w:rPr>
-              <w:instrText xml:space="preserve"> PAGEREF _Toc242188021 \h </w:instrText>
+              <w:instrText xml:space="preserve"> PAGEREF _Toc242198044 \h </w:instrText>
             </w:r>
             <w:r>
               <w:rPr>
@@ -1721,7 +1721,7 @@
               <w14:ligatures w14:val="standardContextual"/>
             </w:rPr>
           </w:pPr>
-          <w:hyperlink w:anchor="_Toc242188022" w:history="1">
+          <w:hyperlink w:anchor="_Toc242198045" w:history="1">
             <w:r>
               <w:rPr>
                 <w:rStyle w:val="Hipervnculo"/>
@@ -1751,7 +1751,7 @@
                 <w:noProof/>
                 <w:webHidden/>
               </w:rPr>
-              <w:instrText xml:space="preserve"> PAGEREF _Toc242188022 \h </w:instrText>
+              <w:instrText xml:space="preserve"> PAGEREF _Toc242198045 \h </w:instrText>
             </w:r>
             <w:r>
               <w:rPr>
@@ -1796,7 +1796,7 @@
               <w14:ligatures w14:val="standardContextual"/>
             </w:rPr>
           </w:pPr>
-          <w:hyperlink w:anchor="_Toc242188023" w:history="1">
+          <w:hyperlink w:anchor="_Toc242198046" w:history="1">
             <w:r>
               <w:rPr>
                 <w:rStyle w:val="Hipervnculo"/>
@@ -1823,7 +1823,7 @@
                 <w:noProof/>
                 <w:webHidden/>
               </w:rPr>
-              <w:instrText xml:space="preserve"> PAGEREF _Toc242188023 \h </w:instrText>
+              <w:instrText xml:space="preserve"> PAGEREF _Toc242198046 \h </w:instrText>
             </w:r>
             <w:r>
               <w:rPr>
@@ -1865,7 +1865,7 @@
               <w14:ligatures w14:val="standardContextual"/>
             </w:rPr>
           </w:pPr>
-          <w:hyperlink w:anchor="_Toc242188024" w:history="1">
+          <w:hyperlink w:anchor="_Toc242198047" w:history="1">
             <w:r>
               <w:rPr>
                 <w:rStyle w:val="Hipervnculo"/>
@@ -1892,7 +1892,7 @@
                 <w:noProof/>
                 <w:webHidden/>
               </w:rPr>
-              <w:instrText xml:space="preserve"> PAGEREF _Toc242188024 \h </w:instrText>
+              <w:instrText xml:space="preserve"> PAGEREF _Toc242198047 \h </w:instrText>
             </w:r>
             <w:r>
               <w:rPr>
@@ -1934,7 +1934,7 @@
               <w14:ligatures w14:val="standardContextual"/>
             </w:rPr>
           </w:pPr>
-          <w:hyperlink w:anchor="_Toc242188025" w:history="1">
+          <w:hyperlink w:anchor="_Toc242198048" w:history="1">
             <w:r>
               <w:rPr>
                 <w:rStyle w:val="Hipervnculo"/>
@@ -1961,7 +1961,7 @@
                 <w:noProof/>
                 <w:webHidden/>
               </w:rPr>
-              <w:instrText xml:space="preserve"> PAGEREF _Toc242188025 \h </w:instrText>
+              <w:instrText xml:space="preserve"> PAGEREF _Toc242198048 \h </w:instrText>
             </w:r>
             <w:r>
               <w:rPr>
@@ -2003,7 +2003,7 @@
               <w14:ligatures w14:val="standardContextual"/>
             </w:rPr>
           </w:pPr>
-          <w:hyperlink w:anchor="_Toc242188026" w:history="1">
+          <w:hyperlink w:anchor="_Toc242198049" w:history="1">
             <w:r>
               <w:rPr>
                 <w:rStyle w:val="Hipervnculo"/>
@@ -2030,7 +2030,7 @@
                 <w:noProof/>
                 <w:webHidden/>
               </w:rPr>
-              <w:instrText xml:space="preserve"> PAGEREF _Toc242188026 \h </w:instrText>
+              <w:instrText xml:space="preserve"> PAGEREF _Toc242198049 \h </w:instrText>
             </w:r>
             <w:r>
               <w:rPr>
@@ -2072,7 +2072,7 @@
               <w14:ligatures w14:val="standardContextual"/>
             </w:rPr>
           </w:pPr>
-          <w:hyperlink w:anchor="_Toc242188027" w:history="1">
+          <w:hyperlink w:anchor="_Toc242198050" w:history="1">
             <w:r>
               <w:rPr>
                 <w:rStyle w:val="Hipervnculo"/>
@@ -2099,7 +2099,7 @@
                 <w:noProof/>
                 <w:webHidden/>
               </w:rPr>
-              <w:instrText xml:space="preserve"> PAGEREF _Toc242188027 \h </w:instrText>
+              <w:instrText xml:space="preserve"> PAGEREF _Toc242198050 \h </w:instrText>
             </w:r>
             <w:r>
               <w:rPr>
@@ -2141,7 +2141,7 @@
               <w14:ligatures w14:val="standardContextual"/>
             </w:rPr>
           </w:pPr>
-          <w:hyperlink w:anchor="_Toc242188028" w:history="1">
+          <w:hyperlink w:anchor="_Toc242198051" w:history="1">
             <w:r>
               <w:rPr>
                 <w:rStyle w:val="Hipervnculo"/>
@@ -2168,7 +2168,7 @@
                 <w:noProof/>
                 <w:webHidden/>
               </w:rPr>
-              <w:instrText xml:space="preserve"> PAGEREF _Toc242188028 \h </w:instrText>
+              <w:instrText xml:space="preserve"> PAGEREF _Toc242198051 \h </w:instrText>
             </w:r>
             <w:r>
               <w:rPr>
@@ -2210,7 +2210,7 @@
               <w14:ligatures w14:val="standardContextual"/>
             </w:rPr>
           </w:pPr>
-          <w:hyperlink w:anchor="_Toc242188029" w:history="1">
+          <w:hyperlink w:anchor="_Toc242198052" w:history="1">
             <w:r>
               <w:rPr>
                 <w:rStyle w:val="Hipervnculo"/>
@@ -2237,7 +2237,7 @@
                 <w:noProof/>
                 <w:webHidden/>
               </w:rPr>
-              <w:instrText xml:space="preserve"> PAGEREF _Toc242188029 \h </w:instrText>
+              <w:instrText xml:space="preserve"> PAGEREF _Toc242198052 \h </w:instrText>
             </w:r>
             <w:r>
               <w:rPr>
@@ -2282,7 +2282,7 @@
               <w14:ligatures w14:val="standardContextual"/>
             </w:rPr>
           </w:pPr>
-          <w:hyperlink w:anchor="_Toc242188030" w:history="1">
+          <w:hyperlink w:anchor="_Toc242198053" w:history="1">
             <w:r>
               <w:rPr>
                 <w:rStyle w:val="Hipervnculo"/>
@@ -2309,7 +2309,7 @@
                 <w:noProof/>
                 <w:webHidden/>
               </w:rPr>
-              <w:instrText xml:space="preserve"> PAGEREF _Toc242188030 \h </w:instrText>
+              <w:instrText xml:space="preserve"> PAGEREF _Toc242198053 \h </w:instrText>
             </w:r>
             <w:r>
               <w:rPr>
@@ -2351,7 +2351,7 @@
               <w14:ligatures w14:val="standardContextual"/>
             </w:rPr>
           </w:pPr>
-          <w:hyperlink w:anchor="_Toc242188031" w:history="1">
+          <w:hyperlink w:anchor="_Toc242198054" w:history="1">
             <w:r>
               <w:rPr>
                 <w:rStyle w:val="Hipervnculo"/>
@@ -2378,7 +2378,7 @@
                 <w:noProof/>
                 <w:webHidden/>
               </w:rPr>
-              <w:instrText xml:space="preserve"> PAGEREF _Toc242188031 \h </w:instrText>
+              <w:instrText xml:space="preserve"> PAGEREF _Toc242198054 \h </w:instrText>
             </w:r>
             <w:r>
               <w:rPr>
@@ -2420,7 +2420,7 @@
               <w14:ligatures w14:val="standardContextual"/>
             </w:rPr>
           </w:pPr>
-          <w:hyperlink w:anchor="_Toc242188032" w:history="1">
+          <w:hyperlink w:anchor="_Toc242198055" w:history="1">
             <w:r>
               <w:rPr>
                 <w:rStyle w:val="Hipervnculo"/>
@@ -2447,7 +2447,7 @@
                 <w:noProof/>
                 <w:webHidden/>
               </w:rPr>
-              <w:instrText xml:space="preserve"> PAGEREF _Toc242188032 \h </w:instrText>
+              <w:instrText xml:space="preserve"> PAGEREF _Toc242198055 \h </w:instrText>
             </w:r>
             <w:r>
               <w:rPr>
@@ -2489,7 +2489,7 @@
               <w14:ligatures w14:val="standardContextual"/>
             </w:rPr>
           </w:pPr>
-          <w:hyperlink w:anchor="_Toc242188033" w:history="1">
+          <w:hyperlink w:anchor="_Toc242198056" w:history="1">
             <w:r>
               <w:rPr>
                 <w:rStyle w:val="Hipervnculo"/>
@@ -2516,7 +2516,7 @@
                 <w:noProof/>
                 <w:webHidden/>
               </w:rPr>
-              <w:instrText xml:space="preserve"> PAGEREF _Toc242188033 \h </w:instrText>
+              <w:instrText xml:space="preserve"> PAGEREF _Toc242198056 \h </w:instrText>
             </w:r>
             <w:r>
               <w:rPr>
@@ -2558,7 +2558,7 @@
               <w14:ligatures w14:val="standardContextual"/>
             </w:rPr>
           </w:pPr>
-          <w:hyperlink w:anchor="_Toc242188034" w:history="1">
+          <w:hyperlink w:anchor="_Toc242198057" w:history="1">
             <w:r>
               <w:rPr>
                 <w:rStyle w:val="Hipervnculo"/>
@@ -2585,7 +2585,7 @@
                 <w:noProof/>
                 <w:webHidden/>
               </w:rPr>
-              <w:instrText xml:space="preserve"> PAGEREF _Toc242188034 \h </w:instrText>
+              <w:instrText xml:space="preserve"> PAGEREF _Toc242198057 \h </w:instrText>
             </w:r>
             <w:r>
               <w:rPr>
@@ -2627,7 +2627,7 @@
               <w14:ligatures w14:val="standardContextual"/>
             </w:rPr>
           </w:pPr>
-          <w:hyperlink w:anchor="_Toc242188035" w:history="1">
+          <w:hyperlink w:anchor="_Toc242198058" w:history="1">
             <w:r>
               <w:rPr>
                 <w:rStyle w:val="Hipervnculo"/>
@@ -2654,7 +2654,7 @@
                 <w:noProof/>
                 <w:webHidden/>
               </w:rPr>
-              <w:instrText xml:space="preserve"> PAGEREF _Toc242188035 \h </w:instrText>
+              <w:instrText xml:space="preserve"> PAGEREF _Toc242198058 \h </w:instrText>
             </w:r>
             <w:r>
               <w:rPr>
@@ -2696,7 +2696,7 @@
               <w14:ligatures w14:val="standardContextual"/>
             </w:rPr>
           </w:pPr>
-          <w:hyperlink w:anchor="_Toc242188036" w:history="1">
+          <w:hyperlink w:anchor="_Toc242198059" w:history="1">
             <w:r>
               <w:rPr>
                 <w:rStyle w:val="Hipervnculo"/>
@@ -2723,7 +2723,7 @@
                 <w:noProof/>
                 <w:webHidden/>
               </w:rPr>
-              <w:instrText xml:space="preserve"> PAGEREF _Toc242188036 \h </w:instrText>
+              <w:instrText xml:space="preserve"> PAGEREF _Toc242198059 \h </w:instrText>
             </w:r>
             <w:r>
               <w:rPr>
@@ -2765,7 +2765,7 @@
               <w14:ligatures w14:val="standardContextual"/>
             </w:rPr>
           </w:pPr>
-          <w:hyperlink w:anchor="_Toc242188037" w:history="1">
+          <w:hyperlink w:anchor="_Toc242198060" w:history="1">
             <w:r>
               <w:rPr>
                 <w:rStyle w:val="Hipervnculo"/>
@@ -2792,7 +2792,7 @@
                 <w:noProof/>
                 <w:webHidden/>
               </w:rPr>
-              <w:instrText xml:space="preserve"> PAGEREF _Toc242188037 \h </w:instrText>
+              <w:instrText xml:space="preserve"> PAGEREF _Toc242198060 \h </w:instrText>
             </w:r>
             <w:r>
               <w:rPr>
@@ -2837,7 +2837,7 @@
               <w14:ligatures w14:val="standardContextual"/>
             </w:rPr>
           </w:pPr>
-          <w:hyperlink w:anchor="_Toc242188038" w:history="1">
+          <w:hyperlink w:anchor="_Toc242198061" w:history="1">
             <w:r>
               <w:rPr>
                 <w:rStyle w:val="Hipervnculo"/>
@@ -2864,7 +2864,7 @@
                 <w:noProof/>
                 <w:webHidden/>
               </w:rPr>
-              <w:instrText xml:space="preserve"> PAGEREF _Toc242188038 \h </w:instrText>
+              <w:instrText xml:space="preserve"> PAGEREF _Toc242198061 \h </w:instrText>
             </w:r>
             <w:r>
               <w:rPr>
@@ -2906,7 +2906,7 @@
               <w14:ligatures w14:val="standardContextual"/>
             </w:rPr>
           </w:pPr>
-          <w:hyperlink w:anchor="_Toc242188039" w:history="1">
+          <w:hyperlink w:anchor="_Toc242198062" w:history="1">
             <w:r>
               <w:rPr>
                 <w:rStyle w:val="Hipervnculo"/>
@@ -2933,7 +2933,7 @@
                 <w:noProof/>
                 <w:webHidden/>
               </w:rPr>
-              <w:instrText xml:space="preserve"> PAGEREF _Toc242188039 \h </w:instrText>
+              <w:instrText xml:space="preserve"> PAGEREF _Toc242198062 \h </w:instrText>
             </w:r>
             <w:r>
               <w:rPr>
@@ -2975,7 +2975,7 @@
               <w14:ligatures w14:val="standardContextual"/>
             </w:rPr>
           </w:pPr>
-          <w:hyperlink w:anchor="_Toc242188040" w:history="1">
+          <w:hyperlink w:anchor="_Toc242198063" w:history="1">
             <w:r>
               <w:rPr>
                 <w:rStyle w:val="Hipervnculo"/>
@@ -3002,7 +3002,7 @@
                 <w:noProof/>
                 <w:webHidden/>
               </w:rPr>
-              <w:instrText xml:space="preserve"> PAGEREF _Toc242188040 \h </w:instrText>
+              <w:instrText xml:space="preserve"> PAGEREF _Toc242198063 \h </w:instrText>
             </w:r>
             <w:r>
               <w:rPr>
@@ -3047,7 +3047,7 @@
               <w14:ligatures w14:val="standardContextual"/>
             </w:rPr>
           </w:pPr>
-          <w:hyperlink w:anchor="_Toc242188041" w:history="1">
+          <w:hyperlink w:anchor="_Toc242198064" w:history="1">
             <w:r>
               <w:rPr>
                 <w:rStyle w:val="Hipervnculo"/>
@@ -3074,7 +3074,7 @@
                 <w:noProof/>
                 <w:webHidden/>
               </w:rPr>
-              <w:instrText xml:space="preserve"> PAGEREF _Toc242188041 \h </w:instrText>
+              <w:instrText xml:space="preserve"> PAGEREF _Toc242198064 \h </w:instrText>
             </w:r>
             <w:r>
               <w:rPr>
@@ -3116,7 +3116,7 @@
               <w14:ligatures w14:val="standardContextual"/>
             </w:rPr>
           </w:pPr>
-          <w:hyperlink w:anchor="_Toc242188042" w:history="1">
+          <w:hyperlink w:anchor="_Toc242198065" w:history="1">
             <w:r>
               <w:rPr>
                 <w:rStyle w:val="Hipervnculo"/>
@@ -3146,7 +3146,7 @@
                 <w:noProof/>
                 <w:webHidden/>
               </w:rPr>
-              <w:instrText xml:space="preserve"> PAGEREF _Toc242188042 \h </w:instrText>
+              <w:instrText xml:space="preserve"> PAGEREF _Toc242198065 \h </w:instrText>
             </w:r>
             <w:r>
               <w:rPr>
@@ -3188,7 +3188,7 @@
               <w14:ligatures w14:val="standardContextual"/>
             </w:rPr>
           </w:pPr>
-          <w:hyperlink w:anchor="_Toc242188043" w:history="1">
+          <w:hyperlink w:anchor="_Toc242198066" w:history="1">
             <w:r>
               <w:rPr>
                 <w:rStyle w:val="Hipervnculo"/>
@@ -3218,7 +3218,7 @@
                 <w:noProof/>
                 <w:webHidden/>
               </w:rPr>
-              <w:instrText xml:space="preserve"> PAGEREF _Toc242188043 \h </w:instrText>
+              <w:instrText xml:space="preserve"> PAGEREF _Toc242198066 \h </w:instrText>
             </w:r>
             <w:r>
               <w:rPr>
@@ -3263,7 +3263,7 @@
               <w14:ligatures w14:val="standardContextual"/>
             </w:rPr>
           </w:pPr>
-          <w:hyperlink w:anchor="_Toc242188044" w:history="1">
+          <w:hyperlink w:anchor="_Toc242198067" w:history="1">
             <w:r>
               <w:rPr>
                 <w:rStyle w:val="Hipervnculo"/>
@@ -3290,7 +3290,7 @@
                 <w:noProof/>
                 <w:webHidden/>
               </w:rPr>
-              <w:instrText xml:space="preserve"> PAGEREF _Toc242188044 \h </w:instrText>
+              <w:instrText xml:space="preserve"> PAGEREF _Toc242198067 \h </w:instrText>
             </w:r>
             <w:r>
               <w:rPr>
@@ -3332,7 +3332,7 @@
               <w14:ligatures w14:val="standardContextual"/>
             </w:rPr>
           </w:pPr>
-          <w:hyperlink w:anchor="_Toc242188045" w:history="1">
+          <w:hyperlink w:anchor="_Toc242198068" w:history="1">
             <w:r>
               <w:rPr>
                 <w:rStyle w:val="Hipervnculo"/>
@@ -3359,7 +3359,7 @@
                 <w:noProof/>
                 <w:webHidden/>
               </w:rPr>
-              <w:instrText xml:space="preserve"> PAGEREF _Toc242188045 \h </w:instrText>
+              <w:instrText xml:space="preserve"> PAGEREF _Toc242198068 \h </w:instrText>
             </w:r>
             <w:r>
               <w:rPr>
@@ -3401,7 +3401,7 @@
               <w14:ligatures w14:val="standardContextual"/>
             </w:rPr>
           </w:pPr>
-          <w:hyperlink w:anchor="_Toc242188046" w:history="1">
+          <w:hyperlink w:anchor="_Toc242198069" w:history="1">
             <w:r>
               <w:rPr>
                 <w:rStyle w:val="Hipervnculo"/>
@@ -3428,7 +3428,7 @@
                 <w:noProof/>
                 <w:webHidden/>
               </w:rPr>
-              <w:instrText xml:space="preserve"> PAGEREF _Toc242188046 \h </w:instrText>
+              <w:instrText xml:space="preserve"> PAGEREF _Toc242198069 \h </w:instrText>
             </w:r>
             <w:r>
               <w:rPr>
@@ -3470,7 +3470,7 @@
               <w14:ligatures w14:val="standardContextual"/>
             </w:rPr>
           </w:pPr>
-          <w:hyperlink w:anchor="_Toc242188047" w:history="1">
+          <w:hyperlink w:anchor="_Toc242198070" w:history="1">
             <w:r>
               <w:rPr>
                 <w:rStyle w:val="Hipervnculo"/>
@@ -3497,7 +3497,7 @@
                 <w:noProof/>
                 <w:webHidden/>
               </w:rPr>
-              <w:instrText xml:space="preserve"> PAGEREF _Toc242188047 \h </w:instrText>
+              <w:instrText xml:space="preserve"> PAGEREF _Toc242198070 \h </w:instrText>
             </w:r>
             <w:r>
               <w:rPr>
@@ -3539,7 +3539,7 @@
               <w14:ligatures w14:val="standardContextual"/>
             </w:rPr>
           </w:pPr>
-          <w:hyperlink w:anchor="_Toc242188048" w:history="1">
+          <w:hyperlink w:anchor="_Toc242198071" w:history="1">
             <w:r>
               <w:rPr>
                 <w:rStyle w:val="Hipervnculo"/>
@@ -3566,7 +3566,7 @@
                 <w:noProof/>
                 <w:webHidden/>
               </w:rPr>
-              <w:instrText xml:space="preserve"> PAGEREF _Toc242188048 \h </w:instrText>
+              <w:instrText xml:space="preserve"> PAGEREF _Toc242198071 \h </w:instrText>
             </w:r>
             <w:r>
               <w:rPr>
@@ -3608,7 +3608,7 @@
               <w14:ligatures w14:val="standardContextual"/>
             </w:rPr>
           </w:pPr>
-          <w:hyperlink w:anchor="_Toc242188049" w:history="1">
+          <w:hyperlink w:anchor="_Toc242198072" w:history="1">
             <w:r>
               <w:rPr>
                 <w:rStyle w:val="Hipervnculo"/>
@@ -3635,7 +3635,7 @@
                 <w:noProof/>
                 <w:webHidden/>
               </w:rPr>
-              <w:instrText xml:space="preserve"> PAGEREF _Toc242188049 \h </w:instrText>
+              <w:instrText xml:space="preserve"> PAGEREF _Toc242198072 \h </w:instrText>
             </w:r>
             <w:r>
               <w:rPr>
@@ -3677,7 +3677,7 @@
               <w14:ligatures w14:val="standardContextual"/>
             </w:rPr>
           </w:pPr>
-          <w:hyperlink w:anchor="_Toc242188050" w:history="1">
+          <w:hyperlink w:anchor="_Toc242198073" w:history="1">
             <w:r>
               <w:rPr>
                 <w:rStyle w:val="Hipervnculo"/>
@@ -3704,7 +3704,7 @@
                 <w:noProof/>
                 <w:webHidden/>
               </w:rPr>
-              <w:instrText xml:space="preserve"> PAGEREF _Toc242188050 \h </w:instrText>
+              <w:instrText xml:space="preserve"> PAGEREF _Toc242198073 \h </w:instrText>
             </w:r>
             <w:r>
               <w:rPr>
@@ -3749,7 +3749,7 @@
               <w14:ligatures w14:val="standardContextual"/>
             </w:rPr>
           </w:pPr>
-          <w:hyperlink w:anchor="_Toc242188051" w:history="1">
+          <w:hyperlink w:anchor="_Toc242198074" w:history="1">
             <w:r>
               <w:rPr>
                 <w:rStyle w:val="Hipervnculo"/>
@@ -3776,7 +3776,7 @@
                 <w:noProof/>
                 <w:webHidden/>
               </w:rPr>
-              <w:instrText xml:space="preserve"> PAGEREF _Toc242188051 \h </w:instrText>
+              <w:instrText xml:space="preserve"> PAGEREF _Toc242198074 \h </w:instrText>
             </w:r>
             <w:r>
               <w:rPr>
@@ -3821,7 +3821,7 @@
               <w14:ligatures w14:val="standardContextual"/>
             </w:rPr>
           </w:pPr>
-          <w:hyperlink w:anchor="_Toc242188052" w:history="1">
+          <w:hyperlink w:anchor="_Toc242198075" w:history="1">
             <w:r>
               <w:rPr>
                 <w:rStyle w:val="Hipervnculo"/>
@@ -3848,7 +3848,7 @@
                 <w:noProof/>
                 <w:webHidden/>
               </w:rPr>
-              <w:instrText xml:space="preserve"> PAGEREF _Toc242188052 \h </w:instrText>
+              <w:instrText xml:space="preserve"> PAGEREF _Toc242198075 \h </w:instrText>
             </w:r>
             <w:r>
               <w:rPr>
@@ -3890,7 +3890,7 @@
               <w14:ligatures w14:val="standardContextual"/>
             </w:rPr>
           </w:pPr>
-          <w:hyperlink w:anchor="_Toc242188053" w:history="1">
+          <w:hyperlink w:anchor="_Toc242198076" w:history="1">
             <w:r>
               <w:rPr>
                 <w:rStyle w:val="Hipervnculo"/>
@@ -3919,7 +3919,7 @@
                 <w:noProof/>
                 <w:webHidden/>
               </w:rPr>
-              <w:instrText xml:space="preserve"> PAGEREF _Toc242188053 \h </w:instrText>
+              <w:instrText xml:space="preserve"> PAGEREF _Toc242198076 \h </w:instrText>
             </w:r>
             <w:r>
               <w:rPr>
@@ -3964,7 +3964,7 @@
               <w14:ligatures w14:val="standardContextual"/>
             </w:rPr>
           </w:pPr>
-          <w:hyperlink w:anchor="_Toc242188054" w:history="1">
+          <w:hyperlink w:anchor="_Toc242198077" w:history="1">
             <w:r>
               <w:rPr>
                 <w:rStyle w:val="Hipervnculo"/>
@@ -3991,7 +3991,7 @@
                 <w:noProof/>
                 <w:webHidden/>
               </w:rPr>
-              <w:instrText xml:space="preserve"> PAGEREF _Toc242188054 \h </w:instrText>
+              <w:instrText xml:space="preserve"> PAGEREF _Toc242198077 \h </w:instrText>
             </w:r>
             <w:r>
               <w:rPr>
@@ -4033,7 +4033,7 @@
               <w14:ligatures w14:val="standardContextual"/>
             </w:rPr>
           </w:pPr>
-          <w:hyperlink w:anchor="_Toc242188055" w:history="1">
+          <w:hyperlink w:anchor="_Toc242198078" w:history="1">
             <w:r>
               <w:rPr>
                 <w:rStyle w:val="Hipervnculo"/>
@@ -4061,7 +4061,7 @@
                 <w:noProof/>
                 <w:webHidden/>
               </w:rPr>
-              <w:instrText xml:space="preserve"> PAGEREF _Toc242188055 \h </w:instrText>
+              <w:instrText xml:space="preserve"> PAGEREF _Toc242198078 \h </w:instrText>
             </w:r>
             <w:r>
               <w:rPr>
@@ -4103,7 +4103,7 @@
               <w14:ligatures w14:val="standardContextual"/>
             </w:rPr>
           </w:pPr>
-          <w:hyperlink w:anchor="_Toc242188056" w:history="1">
+          <w:hyperlink w:anchor="_Toc242198079" w:history="1">
             <w:r>
               <w:rPr>
                 <w:rStyle w:val="Hipervnculo"/>
@@ -4131,7 +4131,7 @@
                 <w:noProof/>
                 <w:webHidden/>
               </w:rPr>
-              <w:instrText xml:space="preserve"> PAGEREF _Toc242188056 \h </w:instrText>
+              <w:instrText xml:space="preserve"> PAGEREF _Toc242198079 \h </w:instrText>
             </w:r>
             <w:r>
               <w:rPr>
@@ -4173,7 +4173,7 @@
               <w14:ligatures w14:val="standardContextual"/>
             </w:rPr>
           </w:pPr>
-          <w:hyperlink w:anchor="_Toc242188057" w:history="1">
+          <w:hyperlink w:anchor="_Toc242198080" w:history="1">
             <w:r>
               <w:rPr>
                 <w:rStyle w:val="Hipervnculo"/>
@@ -4201,7 +4201,7 @@
                 <w:noProof/>
                 <w:webHidden/>
               </w:rPr>
-              <w:instrText xml:space="preserve"> PAGEREF _Toc242188057 \h </w:instrText>
+              <w:instrText xml:space="preserve"> PAGEREF _Toc242198080 \h </w:instrText>
             </w:r>
             <w:r>
               <w:rPr>
@@ -4246,7 +4246,7 @@
               <w14:ligatures w14:val="standardContextual"/>
             </w:rPr>
           </w:pPr>
-          <w:hyperlink w:anchor="_Toc242188058" w:history="1">
+          <w:hyperlink w:anchor="_Toc242198081" w:history="1">
             <w:r>
               <w:rPr>
                 <w:rStyle w:val="Hipervnculo"/>
@@ -4273,7 +4273,7 @@
                 <w:noProof/>
                 <w:webHidden/>
               </w:rPr>
-              <w:instrText xml:space="preserve"> PAGEREF _Toc242188058 \h </w:instrText>
+              <w:instrText xml:space="preserve"> PAGEREF _Toc242198081 \h </w:instrText>
             </w:r>
             <w:r>
               <w:rPr>
@@ -4318,7 +4318,7 @@
               <w14:ligatures w14:val="standardContextual"/>
             </w:rPr>
           </w:pPr>
-          <w:hyperlink w:anchor="_Toc242188059" w:history="1">
+          <w:hyperlink w:anchor="_Toc242198082" w:history="1">
             <w:r>
               <w:rPr>
                 <w:rStyle w:val="Hipervnculo"/>
@@ -4345,7 +4345,7 @@
                 <w:noProof/>
                 <w:webHidden/>
               </w:rPr>
-              <w:instrText xml:space="preserve"> PAGEREF _Toc242188059 \h </w:instrText>
+              <w:instrText xml:space="preserve"> PAGEREF _Toc242198082 \h </w:instrText>
             </w:r>
             <w:r>
               <w:rPr>
@@ -4387,7 +4387,7 @@
               <w14:ligatures w14:val="standardContextual"/>
             </w:rPr>
           </w:pPr>
-          <w:hyperlink w:anchor="_Toc242188060" w:history="1">
+          <w:hyperlink w:anchor="_Toc242198083" w:history="1">
             <w:r>
               <w:rPr>
                 <w:rStyle w:val="Hipervnculo"/>
@@ -4416,7 +4416,7 @@
                 <w:noProof/>
                 <w:webHidden/>
               </w:rPr>
-              <w:instrText xml:space="preserve"> PAGEREF _Toc242188060 \h </w:instrText>
+              <w:instrText xml:space="preserve"> PAGEREF _Toc242198083 \h </w:instrText>
             </w:r>
             <w:r>
               <w:rPr>
@@ -4461,7 +4461,7 @@
               <w14:ligatures w14:val="standardContextual"/>
             </w:rPr>
           </w:pPr>
-          <w:hyperlink w:anchor="_Toc242188061" w:history="1">
+          <w:hyperlink w:anchor="_Toc242198084" w:history="1">
             <w:r>
               <w:rPr>
                 <w:rStyle w:val="Hipervnculo"/>
@@ -4488,7 +4488,7 @@
                 <w:noProof/>
                 <w:webHidden/>
               </w:rPr>
-              <w:instrText xml:space="preserve"> PAGEREF _Toc242188061 \h </w:instrText>
+              <w:instrText xml:space="preserve"> PAGEREF _Toc242198084 \h </w:instrText>
             </w:r>
             <w:r>
               <w:rPr>
@@ -4530,7 +4530,7 @@
               <w14:ligatures w14:val="standardContextual"/>
             </w:rPr>
           </w:pPr>
-          <w:hyperlink w:anchor="_Toc242188062" w:history="1">
+          <w:hyperlink w:anchor="_Toc242198085" w:history="1">
             <w:r>
               <w:rPr>
                 <w:rStyle w:val="Hipervnculo"/>
@@ -4558,7 +4558,7 @@
                 <w:noProof/>
                 <w:webHidden/>
               </w:rPr>
-              <w:instrText xml:space="preserve"> PAGEREF _Toc242188062 \h </w:instrText>
+              <w:instrText xml:space="preserve"> PAGEREF _Toc242198085 \h </w:instrText>
             </w:r>
             <w:r>
               <w:rPr>
@@ -4600,7 +4600,7 @@
               <w14:ligatures w14:val="standardContextual"/>
             </w:rPr>
           </w:pPr>
-          <w:hyperlink w:anchor="_Toc242188063" w:history="1">
+          <w:hyperlink w:anchor="_Toc242198086" w:history="1">
             <w:r>
               <w:rPr>
                 <w:rStyle w:val="Hipervnculo"/>
@@ -4628,7 +4628,7 @@
                 <w:noProof/>
                 <w:webHidden/>
               </w:rPr>
-              <w:instrText xml:space="preserve"> PAGEREF _Toc242188063 \h </w:instrText>
+              <w:instrText xml:space="preserve"> PAGEREF _Toc242198086 \h </w:instrText>
             </w:r>
             <w:r>
               <w:rPr>
@@ -4670,7 +4670,7 @@
               <w14:ligatures w14:val="standardContextual"/>
             </w:rPr>
           </w:pPr>
-          <w:hyperlink w:anchor="_Toc242188064" w:history="1">
+          <w:hyperlink w:anchor="_Toc242198087" w:history="1">
             <w:r>
               <w:rPr>
                 <w:rStyle w:val="Hipervnculo"/>
@@ -4698,7 +4698,7 @@
                 <w:noProof/>
                 <w:webHidden/>
               </w:rPr>
-              <w:instrText xml:space="preserve"> PAGEREF _Toc242188064 \h </w:instrText>
+              <w:instrText xml:space="preserve"> PAGEREF _Toc242198087 \h </w:instrText>
             </w:r>
             <w:r>
               <w:rPr>
@@ -4740,7 +4740,7 @@
               <w14:ligatures w14:val="standardContextual"/>
             </w:rPr>
           </w:pPr>
-          <w:hyperlink w:anchor="_Toc242188065" w:history="1">
+          <w:hyperlink w:anchor="_Toc242198088" w:history="1">
             <w:r>
               <w:rPr>
                 <w:rStyle w:val="Hipervnculo"/>
@@ -4768,7 +4768,7 @@
                 <w:noProof/>
                 <w:webHidden/>
               </w:rPr>
-              <w:instrText xml:space="preserve"> PAGEREF _Toc242188065 \h </w:instrText>
+              <w:instrText xml:space="preserve"> PAGEREF _Toc242198088 \h </w:instrText>
             </w:r>
             <w:r>
               <w:rPr>
@@ -4813,7 +4813,7 @@
               <w14:ligatures w14:val="standardContextual"/>
             </w:rPr>
           </w:pPr>
-          <w:hyperlink w:anchor="_Toc242188066" w:history="1">
+          <w:hyperlink w:anchor="_Toc242198089" w:history="1">
             <w:r>
               <w:rPr>
                 <w:rStyle w:val="Hipervnculo"/>
@@ -4840,7 +4840,7 @@
                 <w:noProof/>
                 <w:webHidden/>
               </w:rPr>
-              <w:instrText xml:space="preserve"> PAGEREF _Toc242188066 \h </w:instrText>
+              <w:instrText xml:space="preserve"> PAGEREF _Toc242198089 \h </w:instrText>
             </w:r>
             <w:r>
               <w:rPr>
@@ -4885,7 +4885,7 @@
               <w14:ligatures w14:val="standardContextual"/>
             </w:rPr>
           </w:pPr>
-          <w:hyperlink w:anchor="_Toc242188067" w:history="1">
+          <w:hyperlink w:anchor="_Toc242198090" w:history="1">
             <w:r>
               <w:rPr>
                 <w:rStyle w:val="Hipervnculo"/>
@@ -4912,7 +4912,7 @@
                 <w:noProof/>
                 <w:webHidden/>
               </w:rPr>
-              <w:instrText xml:space="preserve"> PAGEREF _Toc242188067 \h </w:instrText>
+              <w:instrText xml:space="preserve"> PAGEREF _Toc242198090 \h </w:instrText>
             </w:r>
             <w:r>
               <w:rPr>
@@ -4954,7 +4954,7 @@
               <w14:ligatures w14:val="standardContextual"/>
             </w:rPr>
           </w:pPr>
-          <w:hyperlink w:anchor="_Toc242188068" w:history="1">
+          <w:hyperlink w:anchor="_Toc242198091" w:history="1">
             <w:r>
               <w:rPr>
                 <w:rStyle w:val="Hipervnculo"/>
@@ -4983,7 +4983,7 @@
                 <w:noProof/>
                 <w:webHidden/>
               </w:rPr>
-              <w:instrText xml:space="preserve"> PAGEREF _Toc242188068 \h </w:instrText>
+              <w:instrText xml:space="preserve"> PAGEREF _Toc242198091 \h </w:instrText>
             </w:r>
             <w:r>
               <w:rPr>
@@ -5028,7 +5028,7 @@
               <w14:ligatures w14:val="standardContextual"/>
             </w:rPr>
           </w:pPr>
-          <w:hyperlink w:anchor="_Toc242188069" w:history="1">
+          <w:hyperlink w:anchor="_Toc242198092" w:history="1">
             <w:r>
               <w:rPr>
                 <w:rStyle w:val="Hipervnculo"/>
@@ -5055,7 +5055,7 @@
                 <w:noProof/>
                 <w:webHidden/>
               </w:rPr>
-              <w:instrText xml:space="preserve"> PAGEREF _Toc242188069 \h </w:instrText>
+              <w:instrText xml:space="preserve"> PAGEREF _Toc242198092 \h </w:instrText>
             </w:r>
             <w:r>
               <w:rPr>
@@ -5097,7 +5097,7 @@
               <w14:ligatures w14:val="standardContextual"/>
             </w:rPr>
           </w:pPr>
-          <w:hyperlink w:anchor="_Toc242188070" w:history="1">
+          <w:hyperlink w:anchor="_Toc242198093" w:history="1">
             <w:r>
               <w:rPr>
                 <w:rStyle w:val="Hipervnculo"/>
@@ -5125,7 +5125,7 @@
                 <w:noProof/>
                 <w:webHidden/>
               </w:rPr>
-              <w:instrText xml:space="preserve"> PAGEREF _Toc242188070 \h </w:instrText>
+              <w:instrText xml:space="preserve"> PAGEREF _Toc242198093 \h </w:instrText>
             </w:r>
             <w:r>
               <w:rPr>
@@ -5167,7 +5167,7 @@
               <w14:ligatures w14:val="standardContextual"/>
             </w:rPr>
           </w:pPr>
-          <w:hyperlink w:anchor="_Toc242188071" w:history="1">
+          <w:hyperlink w:anchor="_Toc242198094" w:history="1">
             <w:r>
               <w:rPr>
                 <w:rStyle w:val="Hipervnculo"/>
@@ -5195,7 +5195,7 @@
                 <w:noProof/>
                 <w:webHidden/>
               </w:rPr>
-              <w:instrText xml:space="preserve"> PAGEREF _Toc242188071 \h </w:instrText>
+              <w:instrText xml:space="preserve"> PAGEREF _Toc242198094 \h </w:instrText>
             </w:r>
             <w:r>
               <w:rPr>
@@ -5237,7 +5237,7 @@
               <w14:ligatures w14:val="standardContextual"/>
             </w:rPr>
           </w:pPr>
-          <w:hyperlink w:anchor="_Toc242188072" w:history="1">
+          <w:hyperlink w:anchor="_Toc242198095" w:history="1">
             <w:r>
               <w:rPr>
                 <w:rStyle w:val="Hipervnculo"/>
@@ -5265,7 +5265,7 @@
                 <w:noProof/>
                 <w:webHidden/>
               </w:rPr>
-              <w:instrText xml:space="preserve"> PAGEREF _Toc242188072 \h </w:instrText>
+              <w:instrText xml:space="preserve"> PAGEREF _Toc242198095 \h </w:instrText>
             </w:r>
             <w:r>
               <w:rPr>
@@ -5307,7 +5307,7 @@
               <w14:ligatures w14:val="standardContextual"/>
             </w:rPr>
           </w:pPr>
-          <w:hyperlink w:anchor="_Toc242188073" w:history="1">
+          <w:hyperlink w:anchor="_Toc242198096" w:history="1">
             <w:r>
               <w:rPr>
                 <w:rStyle w:val="Hipervnculo"/>
@@ -5335,7 +5335,7 @@
                 <w:noProof/>
                 <w:webHidden/>
               </w:rPr>
-              <w:instrText xml:space="preserve"> PAGEREF _Toc242188073 \h </w:instrText>
+              <w:instrText xml:space="preserve"> PAGEREF _Toc242198096 \h </w:instrText>
             </w:r>
             <w:r>
               <w:rPr>
@@ -5380,7 +5380,7 @@
               <w14:ligatures w14:val="standardContextual"/>
             </w:rPr>
           </w:pPr>
-          <w:hyperlink w:anchor="_Toc242188074" w:history="1">
+          <w:hyperlink w:anchor="_Toc242198097" w:history="1">
             <w:r>
               <w:rPr>
                 <w:rStyle w:val="Hipervnculo"/>
@@ -5407,7 +5407,7 @@
                 <w:noProof/>
                 <w:webHidden/>
               </w:rPr>
-              <w:instrText xml:space="preserve"> PAGEREF _Toc242188074 \h </w:instrText>
+              <w:instrText xml:space="preserve"> PAGEREF _Toc242198097 \h </w:instrText>
             </w:r>
             <w:r>
               <w:rPr>
@@ -5452,7 +5452,7 @@
               <w14:ligatures w14:val="standardContextual"/>
             </w:rPr>
           </w:pPr>
-          <w:hyperlink w:anchor="_Toc242188075" w:history="1">
+          <w:hyperlink w:anchor="_Toc242198098" w:history="1">
             <w:r>
               <w:rPr>
                 <w:rStyle w:val="Hipervnculo"/>
@@ -5479,7 +5479,7 @@
                 <w:noProof/>
                 <w:webHidden/>
               </w:rPr>
-              <w:instrText xml:space="preserve"> PAGEREF _Toc242188075 \h </w:instrText>
+              <w:instrText xml:space="preserve"> PAGEREF _Toc242198098 \h </w:instrText>
             </w:r>
             <w:r>
               <w:rPr>
@@ -5521,7 +5521,7 @@
               <w14:ligatures w14:val="standardContextual"/>
             </w:rPr>
           </w:pPr>
-          <w:hyperlink w:anchor="_Toc242188076" w:history="1">
+          <w:hyperlink w:anchor="_Toc242198099" w:history="1">
             <w:r>
               <w:rPr>
                 <w:rStyle w:val="Hipervnculo"/>
@@ -5551,7 +5551,7 @@
                 <w:noProof/>
                 <w:webHidden/>
               </w:rPr>
-              <w:instrText xml:space="preserve"> PAGEREF _Toc242188076 \h </w:instrText>
+              <w:instrText xml:space="preserve"> PAGEREF _Toc242198099 \h </w:instrText>
             </w:r>
             <w:r>
               <w:rPr>
@@ -5712,7 +5712,7 @@
         </w:rPr>
         <w:fldChar w:fldCharType="separate"/>
       </w:r>
-      <w:hyperlink w:anchor="_Toc242188077" w:history="1">
+      <w:hyperlink w:anchor="_Toc242198100" w:history="1">
         <w:r>
           <w:rPr>
             <w:rStyle w:val="Hipervnculo"/>
@@ -5740,7 +5740,7 @@
             <w:noProof/>
             <w:webHidden/>
           </w:rPr>
-          <w:instrText xml:space="preserve"> PAGEREF _Toc242188077 \h </w:instrText>
+          <w:instrText xml:space="preserve"> PAGEREF _Toc242198100 \h </w:instrText>
         </w:r>
         <w:r>
           <w:rPr>
@@ -5788,7 +5788,7 @@
           <w14:ligatures w14:val="standardContextual"/>
         </w:rPr>
       </w:pPr>
-      <w:hyperlink w:anchor="_Toc242188078" w:history="1">
+      <w:hyperlink w:anchor="_Toc242198101" w:history="1">
         <w:r>
           <w:rPr>
             <w:rStyle w:val="Hipervnculo"/>
@@ -5816,7 +5816,7 @@
             <w:noProof/>
             <w:webHidden/>
           </w:rPr>
-          <w:instrText xml:space="preserve"> PAGEREF _Toc242188078 \h </w:instrText>
+          <w:instrText xml:space="preserve"> PAGEREF _Toc242198101 \h </w:instrText>
         </w:r>
         <w:r>
           <w:rPr>
@@ -5864,7 +5864,7 @@
           <w14:ligatures w14:val="standardContextual"/>
         </w:rPr>
       </w:pPr>
-      <w:hyperlink w:anchor="_Toc242188079" w:history="1">
+      <w:hyperlink w:anchor="_Toc242198102" w:history="1">
         <w:r>
           <w:rPr>
             <w:rStyle w:val="Hipervnculo"/>
@@ -5892,7 +5892,7 @@
             <w:noProof/>
             <w:webHidden/>
           </w:rPr>
-          <w:instrText xml:space="preserve"> PAGEREF _Toc242188079 \h </w:instrText>
+          <w:instrText xml:space="preserve"> PAGEREF _Toc242198102 \h </w:instrText>
         </w:r>
         <w:r>
           <w:rPr>
@@ -5940,7 +5940,7 @@
           <w14:ligatures w14:val="standardContextual"/>
         </w:rPr>
       </w:pPr>
-      <w:hyperlink w:anchor="_Toc242188080" w:history="1">
+      <w:hyperlink w:anchor="_Toc242198103" w:history="1">
         <w:r>
           <w:rPr>
             <w:rStyle w:val="Hipervnculo"/>
@@ -5968,7 +5968,7 @@
             <w:noProof/>
             <w:webHidden/>
           </w:rPr>
-          <w:instrText xml:space="preserve"> PAGEREF _Toc242188080 \h </w:instrText>
+          <w:instrText xml:space="preserve"> PAGEREF _Toc242198103 \h </w:instrText>
         </w:r>
         <w:r>
           <w:rPr>
@@ -6016,7 +6016,7 @@
           <w14:ligatures w14:val="standardContextual"/>
         </w:rPr>
       </w:pPr>
-      <w:hyperlink w:anchor="_Toc242188081" w:history="1">
+      <w:hyperlink w:anchor="_Toc242198104" w:history="1">
         <w:r>
           <w:rPr>
             <w:rStyle w:val="Hipervnculo"/>
@@ -6044,7 +6044,7 @@
             <w:noProof/>
             <w:webHidden/>
           </w:rPr>
-          <w:instrText xml:space="preserve"> PAGEREF _Toc242188081 \h </w:instrText>
+          <w:instrText xml:space="preserve"> PAGEREF _Toc242198104 \h </w:instrText>
         </w:r>
         <w:r>
           <w:rPr>
@@ -6092,7 +6092,7 @@
           <w14:ligatures w14:val="standardContextual"/>
         </w:rPr>
       </w:pPr>
-      <w:hyperlink w:anchor="_Toc242188082" w:history="1">
+      <w:hyperlink w:anchor="_Toc242198105" w:history="1">
         <w:r>
           <w:rPr>
             <w:rStyle w:val="Hipervnculo"/>
@@ -6120,7 +6120,7 @@
             <w:noProof/>
             <w:webHidden/>
           </w:rPr>
-          <w:instrText xml:space="preserve"> PAGEREF _Toc242188082 \h </w:instrText>
+          <w:instrText xml:space="preserve"> PAGEREF _Toc242198105 \h </w:instrText>
         </w:r>
         <w:r>
           <w:rPr>
@@ -6168,7 +6168,7 @@
           <w14:ligatures w14:val="standardContextual"/>
         </w:rPr>
       </w:pPr>
-      <w:hyperlink w:anchor="_Toc242188083" w:history="1">
+      <w:hyperlink w:anchor="_Toc242198106" w:history="1">
         <w:r>
           <w:rPr>
             <w:rStyle w:val="Hipervnculo"/>
@@ -6196,7 +6196,7 @@
             <w:noProof/>
             <w:webHidden/>
           </w:rPr>
-          <w:instrText xml:space="preserve"> PAGEREF _Toc242188083 \h </w:instrText>
+          <w:instrText xml:space="preserve"> PAGEREF _Toc242198106 \h </w:instrText>
         </w:r>
         <w:r>
           <w:rPr>
@@ -6244,7 +6244,7 @@
           <w14:ligatures w14:val="standardContextual"/>
         </w:rPr>
       </w:pPr>
-      <w:hyperlink w:anchor="_Toc242188084" w:history="1">
+      <w:hyperlink w:anchor="_Toc242198107" w:history="1">
         <w:r>
           <w:rPr>
             <w:rStyle w:val="Hipervnculo"/>
@@ -6272,7 +6272,7 @@
             <w:noProof/>
             <w:webHidden/>
           </w:rPr>
-          <w:instrText xml:space="preserve"> PAGEREF _Toc242188084 \h </w:instrText>
+          <w:instrText xml:space="preserve"> PAGEREF _Toc242198107 \h </w:instrText>
         </w:r>
         <w:r>
           <w:rPr>
@@ -6320,7 +6320,7 @@
           <w14:ligatures w14:val="standardContextual"/>
         </w:rPr>
       </w:pPr>
-      <w:hyperlink w:anchor="_Toc242188085" w:history="1">
+      <w:hyperlink w:anchor="_Toc242198108" w:history="1">
         <w:r>
           <w:rPr>
             <w:rStyle w:val="Hipervnculo"/>
@@ -6348,7 +6348,7 @@
             <w:noProof/>
             <w:webHidden/>
           </w:rPr>
-          <w:instrText xml:space="preserve"> PAGEREF _Toc242188085 \h </w:instrText>
+          <w:instrText xml:space="preserve"> PAGEREF _Toc242198108 \h </w:instrText>
         </w:r>
         <w:r>
           <w:rPr>
@@ -6396,7 +6396,7 @@
           <w14:ligatures w14:val="standardContextual"/>
         </w:rPr>
       </w:pPr>
-      <w:hyperlink w:anchor="_Toc242188086" w:history="1">
+      <w:hyperlink w:anchor="_Toc242198109" w:history="1">
         <w:r>
           <w:rPr>
             <w:rStyle w:val="Hipervnculo"/>
@@ -6424,7 +6424,7 @@
             <w:noProof/>
             <w:webHidden/>
           </w:rPr>
-          <w:instrText xml:space="preserve"> PAGEREF _Toc242188086 \h </w:instrText>
+          <w:instrText xml:space="preserve"> PAGEREF _Toc242198109 \h </w:instrText>
         </w:r>
         <w:r>
           <w:rPr>
@@ -6472,7 +6472,7 @@
           <w14:ligatures w14:val="standardContextual"/>
         </w:rPr>
       </w:pPr>
-      <w:hyperlink w:anchor="_Toc242188087" w:history="1">
+      <w:hyperlink w:anchor="_Toc242198110" w:history="1">
         <w:r>
           <w:rPr>
             <w:rStyle w:val="Hipervnculo"/>
@@ -6500,7 +6500,7 @@
             <w:noProof/>
             <w:webHidden/>
           </w:rPr>
-          <w:instrText xml:space="preserve"> PAGEREF _Toc242188087 \h </w:instrText>
+          <w:instrText xml:space="preserve"> PAGEREF _Toc242198110 \h </w:instrText>
         </w:r>
         <w:r>
           <w:rPr>
@@ -6739,7 +6739,7 @@
         </w:rPr>
         <w:fldChar w:fldCharType="separate"/>
       </w:r>
-      <w:hyperlink w:anchor="_Toc242188088" w:history="1">
+      <w:hyperlink w:anchor="_Toc242198111" w:history="1">
         <w:r>
           <w:rPr>
             <w:rStyle w:val="Hipervnculo"/>
@@ -6767,7 +6767,7 @@
             <w:noProof/>
             <w:webHidden/>
           </w:rPr>
-          <w:instrText xml:space="preserve"> PAGEREF _Toc242188088 \h </w:instrText>
+          <w:instrText xml:space="preserve"> PAGEREF _Toc242198111 \h </w:instrText>
         </w:r>
         <w:r>
           <w:rPr>
@@ -6815,7 +6815,7 @@
           <w14:ligatures w14:val="standardContextual"/>
         </w:rPr>
       </w:pPr>
-      <w:hyperlink w:anchor="_Toc242188089" w:history="1">
+      <w:hyperlink w:anchor="_Toc242198112" w:history="1">
         <w:r>
           <w:rPr>
             <w:rStyle w:val="Hipervnculo"/>
@@ -6843,7 +6843,7 @@
             <w:noProof/>
             <w:webHidden/>
           </w:rPr>
-          <w:instrText xml:space="preserve"> PAGEREF _Toc242188089 \h </w:instrText>
+          <w:instrText xml:space="preserve"> PAGEREF _Toc242198112 \h </w:instrText>
         </w:r>
         <w:r>
           <w:rPr>
@@ -6891,7 +6891,7 @@
           <w14:ligatures w14:val="standardContextual"/>
         </w:rPr>
       </w:pPr>
-      <w:hyperlink w:anchor="_Toc242188090" w:history="1">
+      <w:hyperlink w:anchor="_Toc242198113" w:history="1">
         <w:r>
           <w:rPr>
             <w:rStyle w:val="Hipervnculo"/>
@@ -6927,7 +6927,7 @@
             <w:noProof/>
             <w:webHidden/>
           </w:rPr>
-          <w:instrText xml:space="preserve"> PAGEREF _Toc242188090 \h </w:instrText>
+          <w:instrText xml:space="preserve"> PAGEREF _Toc242198113 \h </w:instrText>
         </w:r>
         <w:r>
           <w:rPr>
@@ -6975,7 +6975,7 @@
           <w14:ligatures w14:val="standardContextual"/>
         </w:rPr>
       </w:pPr>
-      <w:hyperlink w:anchor="_Toc242188091" w:history="1">
+      <w:hyperlink w:anchor="_Toc242198114" w:history="1">
         <w:r>
           <w:rPr>
             <w:rStyle w:val="Hipervnculo"/>
@@ -7011,7 +7011,7 @@
             <w:noProof/>
             <w:webHidden/>
           </w:rPr>
-          <w:instrText xml:space="preserve"> PAGEREF _Toc242188091 \h </w:instrText>
+          <w:instrText xml:space="preserve"> PAGEREF _Toc242198114 \h </w:instrText>
         </w:r>
         <w:r>
           <w:rPr>
@@ -7059,7 +7059,7 @@
           <w14:ligatures w14:val="standardContextual"/>
         </w:rPr>
       </w:pPr>
-      <w:hyperlink w:anchor="_Toc242188092" w:history="1">
+      <w:hyperlink w:anchor="_Toc242198115" w:history="1">
         <w:r>
           <w:rPr>
             <w:rStyle w:val="Hipervnculo"/>
@@ -7087,7 +7087,7 @@
             <w:noProof/>
             <w:webHidden/>
           </w:rPr>
-          <w:instrText xml:space="preserve"> PAGEREF _Toc242188092 \h </w:instrText>
+          <w:instrText xml:space="preserve"> PAGEREF _Toc242198115 \h </w:instrText>
         </w:r>
         <w:r>
           <w:rPr>
@@ -7135,7 +7135,7 @@
           <w14:ligatures w14:val="standardContextual"/>
         </w:rPr>
       </w:pPr>
-      <w:hyperlink w:anchor="_Toc242188093" w:history="1">
+      <w:hyperlink w:anchor="_Toc242198116" w:history="1">
         <w:r>
           <w:rPr>
             <w:rStyle w:val="Hipervnculo"/>
@@ -7163,7 +7163,7 @@
             <w:noProof/>
             <w:webHidden/>
           </w:rPr>
-          <w:instrText xml:space="preserve"> PAGEREF _Toc242188093 \h </w:instrText>
+          <w:instrText xml:space="preserve"> PAGEREF _Toc242198116 \h </w:instrText>
         </w:r>
         <w:r>
           <w:rPr>
@@ -7211,7 +7211,7 @@
           <w14:ligatures w14:val="standardContextual"/>
         </w:rPr>
       </w:pPr>
-      <w:hyperlink w:anchor="_Toc242188094" w:history="1">
+      <w:hyperlink w:anchor="_Toc242198117" w:history="1">
         <w:r>
           <w:rPr>
             <w:rStyle w:val="Hipervnculo"/>
@@ -7239,7 +7239,7 @@
             <w:noProof/>
             <w:webHidden/>
           </w:rPr>
-          <w:instrText xml:space="preserve"> PAGEREF _Toc242188094 \h </w:instrText>
+          <w:instrText xml:space="preserve"> PAGEREF _Toc242198117 \h </w:instrText>
         </w:r>
         <w:r>
           <w:rPr>
@@ -7287,7 +7287,7 @@
           <w14:ligatures w14:val="standardContextual"/>
         </w:rPr>
       </w:pPr>
-      <w:hyperlink w:anchor="_Toc242188095" w:history="1">
+      <w:hyperlink w:anchor="_Toc242198118" w:history="1">
         <w:r>
           <w:rPr>
             <w:rStyle w:val="Hipervnculo"/>
@@ -7315,7 +7315,7 @@
             <w:noProof/>
             <w:webHidden/>
           </w:rPr>
-          <w:instrText xml:space="preserve"> PAGEREF _Toc242188095 \h </w:instrText>
+          <w:instrText xml:space="preserve"> PAGEREF _Toc242198118 \h </w:instrText>
         </w:r>
         <w:r>
           <w:rPr>
@@ -8504,7 +8504,7 @@
       </w:pPr>
       <w:bookmarkStart w:id="3" w:name="_Toc475112151"/>
       <w:bookmarkStart w:id="4" w:name="_Toc475115507"/>
-      <w:bookmarkStart w:id="5" w:name="_Toc242188013"/>
+      <w:bookmarkStart w:id="5" w:name="_Toc242198036"/>
       <w:r>
         <w:rPr>
           <w:rFonts w:cs="Arial"/>
@@ -8656,7 +8656,7 @@
           <w:caps w:val="0"/>
         </w:rPr>
       </w:pPr>
-      <w:bookmarkStart w:id="6" w:name="_Toc242188014"/>
+      <w:bookmarkStart w:id="6" w:name="_Toc242198037"/>
       <w:r>
         <w:rPr>
           <w:rFonts w:cs="Arial"/>
@@ -8705,7 +8705,7 @@
       </w:pPr>
       <w:bookmarkStart w:id="7" w:name="_Toc475112154"/>
       <w:bookmarkStart w:id="8" w:name="_Toc475115510"/>
-      <w:bookmarkStart w:id="9" w:name="_Toc242188015"/>
+      <w:bookmarkStart w:id="9" w:name="_Toc242198038"/>
       <w:r>
         <w:t>1.1 Planteamiento del problema</w:t>
       </w:r>
@@ -8762,7 +8762,7 @@
           <w:iCs w:val="0"/>
         </w:rPr>
       </w:pPr>
-      <w:bookmarkStart w:id="10" w:name="_Toc242188088"/>
+      <w:bookmarkStart w:id="10" w:name="_Toc242198111"/>
       <w:r>
         <w:rPr>
           <w:rFonts w:cs="Arial"/>
@@ -8983,7 +8983,7 @@
           <w:iCs w:val="0"/>
         </w:rPr>
       </w:pPr>
-      <w:bookmarkStart w:id="11" w:name="_Toc242188089"/>
+      <w:bookmarkStart w:id="11" w:name="_Toc242198112"/>
       <w:r>
         <w:rPr>
           <w:rFonts w:cs="Arial"/>
@@ -9131,7 +9131,7 @@
           <w:rFonts w:eastAsia="Arial" w:cs="Arial"/>
         </w:rPr>
       </w:pPr>
-      <w:bookmarkStart w:id="12" w:name="_Toc242188090"/>
+      <w:bookmarkStart w:id="12" w:name="_Toc242198113"/>
       <w:r>
         <w:rPr>
           <w:rFonts w:cs="Arial"/>
@@ -9382,7 +9382,7 @@
       </w:pPr>
       <w:bookmarkStart w:id="13" w:name="_Toc475112156"/>
       <w:bookmarkStart w:id="14" w:name="_Toc475115512"/>
-      <w:bookmarkStart w:id="15" w:name="_Toc242188016"/>
+      <w:bookmarkStart w:id="15" w:name="_Toc242198039"/>
       <w:r>
         <w:t>1.2 Pregunta de investigación</w:t>
       </w:r>
@@ -9433,7 +9433,7 @@
       <w:pPr>
         <w:pStyle w:val="Ttulo2"/>
       </w:pPr>
-      <w:bookmarkStart w:id="16" w:name="_Toc242188017"/>
+      <w:bookmarkStart w:id="16" w:name="_Toc242198040"/>
       <w:r>
         <w:t>1.3 Justificación</w:t>
       </w:r>
@@ -9562,7 +9562,7 @@
           <w:iCs w:val="0"/>
         </w:rPr>
       </w:pPr>
-      <w:bookmarkStart w:id="17" w:name="_Toc242188091"/>
+      <w:bookmarkStart w:id="17" w:name="_Toc242198114"/>
       <w:r>
         <w:rPr>
           <w:rFonts w:cs="Arial"/>
@@ -9737,7 +9737,7 @@
       </w:pPr>
       <w:bookmarkStart w:id="18" w:name="_Toc475112155"/>
       <w:bookmarkStart w:id="19" w:name="_Toc475115511"/>
-      <w:bookmarkStart w:id="20" w:name="_Toc242188018"/>
+      <w:bookmarkStart w:id="20" w:name="_Toc242198041"/>
       <w:r>
         <w:t>1.4 Antecedentes del</w:t>
       </w:r>
@@ -9891,7 +9891,7 @@
           <w:caps w:val="0"/>
         </w:rPr>
       </w:pPr>
-      <w:bookmarkStart w:id="21" w:name="_Toc242188019"/>
+      <w:bookmarkStart w:id="21" w:name="_Toc242198042"/>
       <w:r>
         <w:rPr>
           <w:rFonts w:cs="Arial"/>
@@ -9932,7 +9932,7 @@
       </w:pPr>
       <w:bookmarkStart w:id="22" w:name="_Toc475112161"/>
       <w:bookmarkStart w:id="23" w:name="_Toc475115517"/>
-      <w:bookmarkStart w:id="24" w:name="_Toc242188020"/>
+      <w:bookmarkStart w:id="24" w:name="_Toc242198043"/>
       <w:r>
         <w:t>2.1 Objetivo general</w:t>
       </w:r>
@@ -9991,7 +9991,7 @@
         <w:pStyle w:val="Ttulo2"/>
         <w:ind w:left="567" w:hanging="576"/>
       </w:pPr>
-      <w:bookmarkStart w:id="27" w:name="_Toc242188021"/>
+      <w:bookmarkStart w:id="27" w:name="_Toc242198044"/>
       <w:r>
         <w:t>2.2 Objetivos específicos</w:t>
       </w:r>
@@ -10117,7 +10117,7 @@
       </w:pPr>
       <w:bookmarkStart w:id="28" w:name="_Toc475112165"/>
       <w:bookmarkStart w:id="29" w:name="_Toc475115521"/>
-      <w:bookmarkStart w:id="30" w:name="_Toc242188022"/>
+      <w:bookmarkStart w:id="30" w:name="_Toc242198045"/>
       <w:r>
         <w:rPr>
           <w:rFonts w:cs="Arial"/>
@@ -10146,7 +10146,7 @@
       </w:pPr>
       <w:bookmarkStart w:id="31" w:name="_Toc475112166"/>
       <w:bookmarkStart w:id="32" w:name="_Toc475115522"/>
-      <w:bookmarkStart w:id="33" w:name="_Toc242188023"/>
+      <w:bookmarkStart w:id="33" w:name="_Toc242198046"/>
       <w:r>
         <w:t>3.1 Marco conceptual</w:t>
       </w:r>
@@ -10168,7 +10168,7 @@
           <w:rFonts w:cs="Arial"/>
         </w:rPr>
       </w:pPr>
-      <w:bookmarkStart w:id="34" w:name="_Toc242188024"/>
+      <w:bookmarkStart w:id="34" w:name="_Toc242198047"/>
       <w:r>
         <w:t>3.1.1 El pensamiento computacional (PC):</w:t>
       </w:r>
@@ -10461,7 +10461,7 @@
           <w:bCs/>
         </w:rPr>
       </w:pPr>
-      <w:bookmarkStart w:id="35" w:name="_Toc242188025"/>
+      <w:bookmarkStart w:id="35" w:name="_Toc242198048"/>
       <w:r>
         <w:t>3.1.2. Pruebas Bebras:</w:t>
       </w:r>
@@ -10497,7 +10497,7 @@
           <w:rFonts w:cs="Arial"/>
         </w:rPr>
       </w:pPr>
-      <w:bookmarkStart w:id="36" w:name="_Toc242188026"/>
+      <w:bookmarkStart w:id="36" w:name="_Toc242198049"/>
       <w:r>
         <w:t>3.1.3. teoría del flujo</w:t>
       </w:r>
@@ -10519,7 +10519,7 @@
           <w:iCs w:val="0"/>
         </w:rPr>
       </w:pPr>
-      <w:bookmarkStart w:id="37" w:name="_Toc242188092"/>
+      <w:bookmarkStart w:id="37" w:name="_Toc242198115"/>
       <w:r>
         <w:rPr>
           <w:rFonts w:cs="Arial"/>
@@ -10665,7 +10665,7 @@
       <w:pPr>
         <w:pStyle w:val="Ttulo3"/>
       </w:pPr>
-      <w:bookmarkStart w:id="38" w:name="_Toc242188027"/>
+      <w:bookmarkStart w:id="38" w:name="_Toc242198050"/>
       <w:r>
         <w:t>3.1.4. Teoría de la Autodeterminación</w:t>
       </w:r>
@@ -11165,7 +11165,7 @@
           <w:rFonts w:eastAsia="Arial" w:cs="Arial"/>
         </w:rPr>
       </w:pPr>
-      <w:bookmarkStart w:id="39" w:name="_Toc242188028"/>
+      <w:bookmarkStart w:id="39" w:name="_Toc242198051"/>
       <w:r>
         <w:t>3.1.6 GOLDEN PATH</w:t>
       </w:r>
@@ -11206,7 +11206,7 @@
           <w:rFonts w:eastAsia="Arial" w:cs="Arial"/>
         </w:rPr>
       </w:pPr>
-      <w:bookmarkStart w:id="40" w:name="_Toc242188029"/>
+      <w:bookmarkStart w:id="40" w:name="_Toc242198052"/>
       <w:r>
         <w:t>3.1.7 Gamificación</w:t>
       </w:r>
@@ -11264,7 +11264,7 @@
       </w:pPr>
       <w:bookmarkStart w:id="41" w:name="_Toc475112167"/>
       <w:bookmarkStart w:id="42" w:name="_Toc475115523"/>
-      <w:bookmarkStart w:id="43" w:name="_Toc242188030"/>
+      <w:bookmarkStart w:id="43" w:name="_Toc242198053"/>
       <w:r>
         <w:t>3.2 Marco teórico</w:t>
       </w:r>
@@ -11286,7 +11286,7 @@
           <w:rFonts w:cs="Arial"/>
         </w:rPr>
       </w:pPr>
-      <w:bookmarkStart w:id="44" w:name="_Toc242188031"/>
+      <w:bookmarkStart w:id="44" w:name="_Toc242198054"/>
       <w:r>
         <w:t>3.2.1 Aprendizaje basado en juegos (ABJ)</w:t>
       </w:r>
@@ -11504,7 +11504,7 @@
           <w:caps w:val="0"/>
         </w:rPr>
       </w:pPr>
-      <w:bookmarkStart w:id="45" w:name="_Toc242188032"/>
+      <w:bookmarkStart w:id="45" w:name="_Toc242198055"/>
       <w:r>
         <w:t xml:space="preserve">3.2.2. </w:t>
       </w:r>
@@ -11549,7 +11549,7 @@
           <w:caps w:val="0"/>
         </w:rPr>
       </w:pPr>
-      <w:bookmarkStart w:id="46" w:name="_Toc242188033"/>
+      <w:bookmarkStart w:id="46" w:name="_Toc242198056"/>
       <w:r>
         <w:t xml:space="preserve">3.2.3 </w:t>
       </w:r>
@@ -11912,7 +11912,7 @@
       <w:pPr>
         <w:pStyle w:val="Ttulo3"/>
       </w:pPr>
-      <w:bookmarkStart w:id="47" w:name="_Toc242188034"/>
+      <w:bookmarkStart w:id="47" w:name="_Toc242198057"/>
       <w:r>
         <w:t>3.2.</w:t>
       </w:r>
@@ -12052,7 +12052,7 @@
           <w:bCs/>
         </w:rPr>
       </w:pPr>
-      <w:bookmarkStart w:id="48" w:name="_Toc242188035"/>
+      <w:bookmarkStart w:id="48" w:name="_Toc242198058"/>
       <w:r>
         <w:t>3.2.</w:t>
       </w:r>
@@ -12177,7 +12177,7 @@
           <w:rFonts w:cs="Arial"/>
         </w:rPr>
       </w:pPr>
-      <w:bookmarkStart w:id="49" w:name="_Toc242188036"/>
+      <w:bookmarkStart w:id="49" w:name="_Toc242198059"/>
       <w:r>
         <w:t>3.2.</w:t>
       </w:r>
@@ -12296,7 +12296,7 @@
           <w:rFonts w:cs="Arial"/>
         </w:rPr>
       </w:pPr>
-      <w:bookmarkStart w:id="50" w:name="_Toc242188037"/>
+      <w:bookmarkStart w:id="50" w:name="_Toc242198060"/>
       <w:r>
         <w:t>3.2.</w:t>
       </w:r>
@@ -12362,7 +12362,7 @@
       </w:pPr>
       <w:bookmarkStart w:id="51" w:name="_Toc475112168"/>
       <w:bookmarkStart w:id="52" w:name="_Toc475115524"/>
-      <w:bookmarkStart w:id="53" w:name="_Toc242188038"/>
+      <w:bookmarkStart w:id="53" w:name="_Toc242198061"/>
       <w:r>
         <w:t>3.3 Marco jurídico</w:t>
       </w:r>
@@ -12393,7 +12393,7 @@
           <w:rFonts w:cs="Arial"/>
         </w:rPr>
       </w:pPr>
-      <w:bookmarkStart w:id="54" w:name="_Toc242188039"/>
+      <w:bookmarkStart w:id="54" w:name="_Toc242198062"/>
       <w:r>
         <w:t>3.3.1. Tratamiento de datos personales y régimen de habeas data</w:t>
       </w:r>
@@ -12758,7 +12758,7 @@
       <w:pPr>
         <w:pStyle w:val="Ttulo3"/>
       </w:pPr>
-      <w:bookmarkStart w:id="55" w:name="_Toc242188040"/>
+      <w:bookmarkStart w:id="55" w:name="_Toc242198063"/>
       <w:r>
         <w:t>3.3.2. Derechos de autor sobre los personajes utilizados</w:t>
       </w:r>
@@ -13009,7 +13009,7 @@
       </w:pPr>
       <w:bookmarkStart w:id="56" w:name="_Toc475112170"/>
       <w:bookmarkStart w:id="57" w:name="_Toc475115526"/>
-      <w:bookmarkStart w:id="58" w:name="_Toc242188041"/>
+      <w:bookmarkStart w:id="58" w:name="_Toc242198064"/>
       <w:r>
         <w:rPr>
           <w:color w:val="auto"/>
@@ -13095,7 +13095,7 @@
           <w:caps w:val="0"/>
         </w:rPr>
       </w:pPr>
-      <w:bookmarkStart w:id="61" w:name="_Toc242188042"/>
+      <w:bookmarkStart w:id="61" w:name="_Toc242198065"/>
       <w:r>
         <w:rPr>
           <w:rFonts w:cs="Arial"/>
@@ -13498,7 +13498,7 @@
       </w:pPr>
       <w:bookmarkStart w:id="62" w:name="_Toc475112172"/>
       <w:bookmarkStart w:id="63" w:name="_Toc475115528"/>
-      <w:bookmarkStart w:id="64" w:name="_Toc242188043"/>
+      <w:bookmarkStart w:id="64" w:name="_Toc242198066"/>
       <w:r>
         <w:rPr>
           <w:rFonts w:cs="Arial"/>
@@ -13650,7 +13650,7 @@
         <w:pStyle w:val="Ttulo2"/>
         <w:ind w:left="567" w:hanging="576"/>
       </w:pPr>
-      <w:bookmarkStart w:id="65" w:name="_Toc242188044"/>
+      <w:bookmarkStart w:id="65" w:name="_Toc242198067"/>
       <w:r>
         <w:lastRenderedPageBreak/>
         <w:t>5.1 Fases del trabajo de grado</w:t>
@@ -13694,7 +13694,7 @@
         <w:pStyle w:val="Ttulo3"/>
         <w:spacing w:before="240"/>
       </w:pPr>
-      <w:bookmarkStart w:id="66" w:name="_Toc242188045"/>
+      <w:bookmarkStart w:id="66" w:name="_Toc242198068"/>
       <w:r>
         <w:t>5.1.1 Apertura del trabajo con Árcade y Kanban</w:t>
       </w:r>
@@ -13741,7 +13741,7 @@
         <w:pStyle w:val="Ttulo3"/>
         <w:spacing w:before="240"/>
       </w:pPr>
-      <w:bookmarkStart w:id="67" w:name="_Toc242188046"/>
+      <w:bookmarkStart w:id="67" w:name="_Toc242198069"/>
       <w:r>
         <w:t>5.1.2 Diseño del guion</w:t>
       </w:r>
@@ -13788,7 +13788,7 @@
         <w:pStyle w:val="Ttulo3"/>
         <w:spacing w:before="240"/>
       </w:pPr>
-      <w:bookmarkStart w:id="68" w:name="_Toc242188047"/>
+      <w:bookmarkStart w:id="68" w:name="_Toc242198070"/>
       <w:r>
         <w:t>5.1.3 Especificación de requerimientos (objetivo 1)</w:t>
       </w:r>
@@ -13851,7 +13851,7 @@
         <w:pStyle w:val="Ttulo3"/>
         <w:spacing w:before="240"/>
       </w:pPr>
-      <w:bookmarkStart w:id="69" w:name="_Toc242188048"/>
+      <w:bookmarkStart w:id="69" w:name="_Toc242198071"/>
       <w:r>
         <w:t>5.1.4 Diseño del videojuego (objetivo 2)</w:t>
       </w:r>
@@ -13906,7 +13906,13 @@
         <w:spacing w:before="240" w:after="240"/>
       </w:pPr>
       <w:r>
-        <w:t>En el tablero, la O01 cerró las tarjetas R10-1 y R10-2 y abrió dos. La O02 abrió tres (aplicar las correcciones, consolidar la dirección de arte y preparar la presentación para la colaboradora), y la O03 cerró la O02-1 y dejó la O02-2 y la O02-3 «en proceso»; las dos se cerraron en la D01. Entre el 30/08 y el 02/09/2026 el código O03 designó dos juegos de tarjetas distintos, los del acta O03 y los de la D01, cuyo encabezado conserva ese código, y la D02 renumeró estos últimos como D01-1 a D01-3. La O04 todavía cita con el código O03 las tarjetas de la D01, y es el único caso de código repetido que se advierte en las actas.</w:t>
+        <w:t xml:space="preserve">En el tablero, la O01 cerró las tarjetas R10-1 y R10-2 y abrió dos. La O02 abrió tres (aplicar las correcciones, consolidar la dirección de arte y preparar la presentación para la colaboradora), y la O03 cerró la O02-1 y dejó la O02-2 y la O02-3 «en proceso»; las dos se cerraron en la D01. </w:t>
+      </w:r>
+      <w:r>
+        <w:t>La D01 abrió las tarjetas D01-1 a D01-3, que la O04 y la D02 citan con ese código</w:t>
+      </w:r>
+      <w:r>
+        <w:t>.</w:t>
       </w:r>
     </w:p>
     <w:p>
@@ -13914,7 +13920,7 @@
         <w:pStyle w:val="Ttulo3"/>
         <w:spacing w:before="240"/>
       </w:pPr>
-      <w:bookmarkStart w:id="70" w:name="_Toc242188049"/>
+      <w:bookmarkStart w:id="70" w:name="_Toc242198072"/>
       <w:r>
         <w:t>5.1.5 Ciclo Diseño ↔ Desarrollo ↔ Pruebas (objetivo 3)</w:t>
       </w:r>
@@ -13933,11 +13939,16 @@
         <w:spacing w:before="240" w:after="240"/>
       </w:pPr>
       <w:r>
-        <w:t xml:space="preserve">La D02 retomó la planeación en cuatro incrementos de la O05, la contrastó con los 47 RF y revisó la fase de cimientos del primer slice, ya ejecutada a partir de la tarjeta O03-3 del 30/08/2026: 23 pruebas de lógica y 3 de integración superadas, con el tiempo de carga declarado como no verificado porque la ejecución por lotes no sirve para medirlo. Resolvió dos puntos que ningún documento fijaba. Reconfirmar una fase no sobrescribe el registro anterior, porque acumular inflaría los pasos utilizados, y se rechaza el nombre de perfil que no sirva como nombre de archivo, porque un nombre con separadores de ruta escribiría fuera de la carpeta portable. De las cuatro tareas de la fase siguiente (T05 a T08) se comprometieron solo </w:t>
-      </w:r>
+        <w:t>La D02 retomó la planeación en cuatro incrementos de la O05, la contrastó con los 47 RF y revisó la fase de cimientos del primer slice, ya ejecutada a partir de la tarjeta O03-3 del 30/08/2026: 23 pruebas de lógica y 3 de integración superadas, con el tiempo de carga declarado como no verificado porque la ejecución por lotes no sirve para medirlo. Resolvió dos puntos que ningún documento fijaba. Reconfirmar una fase no sobrescribe el registro anterior, porque acumular inflaría los pasos utilizados, y se rechaza el nombre de perfil que no sirva como nombre de archivo, porque un nombre con separadores de ruta escribiría fuera de la carpeta portable. De las cuatro tareas de la fase siguiente (T05 a T08) se comprometieron solo las dos primeras, que se sostienen mutuamente y obligan a conectar por primera vez la persistencia con el disco.</w:t>
+      </w:r>
+    </w:p>
+    <w:p>
+      <w:pPr>
+        <w:spacing w:before="240" w:after="240"/>
+      </w:pPr>
       <w:r>
         <w:lastRenderedPageBreak/>
-        <w:t>las dos primeras, que se sostienen mutuamente y obligan a conectar por primera vez la persistencia con el disco.</w:t>
+        <w:t>La D03 (06/09/2026) ejecutó esas dos tareas y conectó el corredor de pruebas al editor abierto, con lo que quedó habilitado escribir la prueba antes que el código; la O03, la O04, la O05 y la D02 habían dejado esa instalación como pendiente. Resolvió por precedencia del contrato del proyecto que la selección de perfil fuera un panel y no una escena, fijó con carácter provisional el título «Algoritm» y adoptó o descartó tres bocetos de entornos (la vista cenital del nivel 1 no se adoptó y se reservó para la fase 3 del nivel 2). Registró tres defectos hallados al ejecutar, entre ellos una prueba del tiempo de carga que podía pasar sin medir nada. Cerró con 34 de 34 pruebas de lógica y 16 de 16 de integración, y declaró que el punto de control de la fase no se cerraba porque faltaban el menú de niveles, los créditos y comprobaciones manuales.</w:t>
       </w:r>
     </w:p>
     <w:p>
@@ -13945,7 +13956,7 @@
         <w:spacing w:before="240" w:after="240"/>
       </w:pPr>
       <w:r>
-        <w:t>La D03 (06/09/2026) ejecutó esas dos tareas y conectó el corredor de pruebas al editor abierto, con lo que quedó habilitado escribir la prueba antes que el código; la O03, la O04, la O05 y la D02 habían dejado esa instalación como pendiente. Resolvió por precedencia del contrato del proyecto que la selección de perfil fuera un panel y no una escena, fijó con carácter provisional el título «Algoritm» y adoptó o descartó tres bocetos de entornos (la vista cenital del nivel 1 no se adoptó y se reservó para la fase 3 del nivel 2). Registró tres defectos hallados al ejecutar, entre ellos una prueba del tiempo de carga que podía pasar sin medir nada. Cerró con 34 de 34 pruebas de lógica y 16 de 16 de integración, y declaró que el punto de control de la fase no se cerraba porque faltaban el menú de niveles, los créditos y comprobaciones manuales.</w:t>
+        <w:t>La D04 (09/09/2026), sesión de los miércoles con la colaboradora, tomó decisiones de arte con una medida real: el ejecutable portable armado el 08/09 pesaba 137 MB frente al máximo de 500 MB, de modo que los entornos se entregarían a 2048 × 1152 sin apretar la calidad. Resolvió la progresión de luz del nivel 1 con una máscara de opacidad variable sobre una sola pieza y no con cuatro entornos, para no multiplicar por cuatro el peso. Registró también que el ejecutable dejaba un archivo de registro y archivos de telemetría fuera de su carpeta de datos, defecto que exigía dos decisiones. La respuesta llegó el 29/09/2026 (decisión D3, acta D10): la analítica quedó apagada sin retirar ningún paquete.</w:t>
       </w:r>
     </w:p>
     <w:p>
@@ -13953,7 +13964,13 @@
         <w:spacing w:before="240" w:after="240"/>
       </w:pPr>
       <w:r>
-        <w:t>La D04 (09/09/2026), sesión de los miércoles con la colaboradora, tomó decisiones de arte con una medida real: el ejecutable portable armado el 08/09 pesaba 137 MB frente al máximo de 500 MB, de modo que los entornos se entregarían a 2048 × 1152 sin apretar la calidad. Resolvió la progresión de luz del nivel 1 con una máscara de opacidad variable sobre una sola pieza y no con cuatro entornos, para no multiplicar por cuatro el peso. Registró también que el ejecutable dejaba un archivo de registro y archivos de telemetría fuera de su carpeta de datos, defecto que exigía dos decisiones. La respuesta llegó el 29/09/2026 (decisión D3, acta D10): la analítica quedó apagada sin retirar ningún paquete.</w:t>
+        <w:t>La D05 (13/09/2026) revisó la puesta en escena de los niveles 1 y 2 y halló dos escenas del guion que existían como contenido y que nada reproducía, y objetos que el texto nombra y quedaban bajo el cuadro de diálogo. Cuando objeto y encuadre no concordaban, se movió el objeto y no la cámara, porque los encuadres son el diseño registrado; se dejó una comprobación automática y se generaron hojas gráficas de verificación. La misma acta repartió el trabajo y arrastró la tarjeta D0</w:t>
+      </w:r>
+      <w:r>
+        <w:t>5-1</w:t>
+      </w:r>
+      <w:r>
+        <w:t>, que abre el slice 2 «en paralelo de la finalización del primer Slice». La regla de orden estricto que habían fijado la O05 y la D02 dejó así de regir, como describe el apartado 8.1.1.</w:t>
       </w:r>
     </w:p>
     <w:p>
@@ -13961,7 +13978,7 @@
         <w:spacing w:before="240" w:after="240"/>
       </w:pPr>
       <w:r>
-        <w:t>La D05 (13/09/2026) revisó la puesta en escena de los niveles 1 y 2 y halló dos escenas del guion que existían como contenido y que nada reproducía, y objetos que el texto nombra y quedaban bajo el cuadro de diálogo. Cuando objeto y encuadre no concordaban, se movió el objeto y no la cámara, porque los encuadres son el diseño registrado; se dejó una comprobación automática y se generaron hojas gráficas de verificación. La misma acta repartió el trabajo y arrastró la tarjeta D04-4, que abre el slice 2 «en paralelo de la finalización del primer Slice». La regla de orden estricto que habían fijado la O05 y la D02 dejó así de regir, como describe el apartado 8.1.1.</w:t>
+        <w:t>Los entornos finalizados llegaron en la D06 (15/09/2026), que definió los props sobre los marcadores provisionales, ya medidos en sus encuadres. Entre los dos autores se aprobaron dos cambios: el nivel 1 pasó a dos fases (reunir las piezas y encender con dos deslizantes, hallazgo 47 del registro de inconsistencias) y el empuje del bosque del nivel 2 salió a la escena narrativa (hallazgo 50). Declaró el resultado de la suite tal cual: 221 de 221 pruebas de edición y 144 de 153 de juego, con seis omitidas porque el modo por lotes no puede capturarlas y tres fallos de disposición que ese modo provoca por su resolución reducida y que ya existían antes del cambio. Con ese resultado se acordó fusionar la rama del slice 2, que la D07 da por fusionada.</w:t>
       </w:r>
     </w:p>
     <w:p>
@@ -13969,7 +13986,7 @@
         <w:spacing w:before="240" w:after="240"/>
       </w:pPr>
       <w:r>
-        <w:t>Los entornos finalizados llegaron en la D06 (15/09/2026), que definió los props sobre los marcadores provisionales, ya medidos en sus encuadres. Entre los dos autores se aprobaron dos cambios: el nivel 1 pasó a dos fases (reunir las piezas y encender con dos deslizantes, hallazgo 47 del registro de inconsistencias) y el empuje del bosque del nivel 2 salió a la escena narrativa (hallazgo 50). Declaró el resultado de la suite tal cual: 221 de 221 pruebas de edición y 144 de 153 de juego, con seis omitidas porque el modo por lotes no puede capturarlas y tres fallos de disposición que ese modo provoca por su resolución reducida y que ya existían antes del cambio. Con ese resultado se acordó fusionar la rama del slice 2, que la D07 da por fusionada.</w:t>
+        <w:t>El ensamblaje de la balsa del nivel 3 se definió en la D07 (19/09/2026). Se juega sobre el río y no en una ventana superpuesta, porque el estudiante debe ver de dónde salió cada material, y se arma en tres partes que se bloquean entre sí. Entre los materiales hay un tronco más largo que, usado en la base, hunde la balsa y vuelve la prueba una ocasión de depurar. Colocar una pieza no valida nada; valida el botón. La escena del primer fallo aparece solo la primera vez. La D07 cambió también el encargo de arte: componer la balsa en el motor con ocho piezas en lugar de pedir treinta y cuatro láminas de estado. Fijó que ningún efecto de sonido pueda sonar a derrota, error o castigo, regla que el capítulo 6 cita.</w:t>
       </w:r>
     </w:p>
     <w:p>
@@ -13977,16 +13994,11 @@
         <w:spacing w:before="240" w:after="240"/>
       </w:pPr>
       <w:r>
-        <w:t>El ensamblaje de la balsa del nivel 3 se definió en la D07 (19/09/2026). Se juega sobre el río y no en una ventana superpuesta, porque el estudiante debe ver de dónde salió cada material, y se arma en tres partes que se bloquean entre sí. Entre los materiales hay un tronco más largo que, usado en la base, hunde la balsa y vuelve la prueba una ocasión de depurar. Colocar una pieza no valida nada; valida el botón. La escena del primer fallo aparece solo la primera vez. La D07 cambió también el encargo de arte: componer la balsa en el motor con ocho piezas en lugar de pedir treinta y cuatro láminas de estado. Fijó que ningún efecto de sonido pueda sonar a derrota, error o castigo, regla que el capítulo 6 cita.</w:t>
-      </w:r>
-    </w:p>
-    <w:p>
-      <w:pPr>
-        <w:spacing w:before="240" w:after="240"/>
-      </w:pPr>
+        <w:t xml:space="preserve">La D08 (23/09/2026) se adelantó a la sesión prevista del 27/09 porque el slice 3 cerró el 21/09, seis días antes del plazo de su tarjeta D07-1, y el carril de arte y sonido quedó integrado a la </w:t>
+      </w:r>
       <w:r>
         <w:lastRenderedPageBreak/>
-        <w:t>La D08 (23/09/2026) se adelantó a la sesión prevista del 27/09 porque el slice 3 cerró el 21/09, seis días antes del plazo de su tarjeta D07-1, y el carril de arte y sonido quedó integrado a la rama principal el mismo 23/09. Aprobó que el nivel 2 transcurra del amanecer a la noche con luz aplicada sobre la ilustración y no con un dibujo por hora, de modo que el encargo de arte no crece, y que la pantalla funda a negro, a cuatro décimas de segundo por mitad, entre narrativa y juego. Abrió el slice 4 con un módulo de informe que depende solo del núcleo. Repartió lo que quedaba: un autor lleva el slice 4 y el otro los sprites y sonidos. La D09 (24/09/2026) presentó a la colaboradora el juego con corte al último commit, con el slice 4 cerrado y fusionado (RF-01 a RF-47 implementados, 321 de 321 pruebas de edición según su documento de resultados) y los personajes animados en las 18 secuencias narrativas y las cinco escenas jugables, y acordó que los troncos del nivel 2 rodaran en el motor y no como secuencia de cuadros.</w:t>
+        <w:t>rama principal el mismo 23/09. Aprobó que el nivel 2 transcurra del amanecer a la noche con luz aplicada sobre la ilustración y no con un dibujo por hora, de modo que el encargo de arte no crece, y que la pantalla funda a negro, a cuatro décimas de segundo por mitad, entre narrativa y juego. Abrió el slice 4 con un módulo de informe que depende solo del núcleo. Repartió lo que quedaba: un autor lleva el slice 4 y el otro los sprites y sonidos. La D09 (24/09/2026) presentó a la colaboradora el juego con corte al último commit, con el slice 4 cerrado y fusionado (RF-01 a RF-47 implementados, 321 de 321 pruebas de edición según su documento de resultados) y los personajes animados en las 18 secuencias narrativas y las cinco escenas jugables, y acordó que los troncos del nivel 2 rodaran en el motor y no como secuencia de cuadros.</w:t>
       </w:r>
     </w:p>
     <w:p>
@@ -14026,7 +14038,7 @@
         <w:pStyle w:val="Ttulo3"/>
         <w:spacing w:before="240"/>
       </w:pPr>
-      <w:bookmarkStart w:id="71" w:name="_Toc242188050"/>
+      <w:bookmarkStart w:id="71" w:name="_Toc242198073"/>
       <w:r>
         <w:t>5.1.6 Evaluación del prototipo (objetivo 4)</w:t>
       </w:r>
@@ -14045,8 +14057,11 @@
         <w:spacing w:before="240" w:after="240"/>
       </w:pPr>
       <w:r>
+        <w:t xml:space="preserve">La D10 recoge que el 29/09/2026 entró el plan de pruebas, con unos 120 casos y seis puntos de control, y fija cómo se ejecuta: sobre el ejecutable compilado y con un arnés que lo maneja </w:t>
+      </w:r>
+      <w:r>
         <w:lastRenderedPageBreak/>
-        <w:t>La D10 recoge que el 29/09/2026 entró el plan de pruebas, con unos 120 casos y seis puntos de control, y fija cómo se ejecuta: sobre el ejecutable compilado y con un arnés que lo maneja como caja negra, e incluye dos recorridos completos de la ruta principal, cierres forzados en seis momentos, borrado de un perfil, comprobación de residuos fuera de la carpeta de datos, ejecución desde una ruta con espacios, tres mediciones de la carga de cada escena y la prueba de exclusión de RNF-16. La D10 preveía un segundo candidato si la primera pasada hallaba un defecto bloqueante o mayor, y la adenda registra que esa pasada, sobre el candidato rc1, halló defectos que se corrigieron antes de la entrega: entre ellos, las conexiones de red de los servicios de Unity, que ahora se apagan al compilar. El primer ejecutable de doce escenas pesaba 866,7 MB y quedó en 479,0 MB. El segundo candidato, rc2, se reverificó con un tercer recorrido completo, y quedaron 103 casos con veredicto: 89 con P, 13 con P parcial, ninguno con F y uno con NE. Otros 24 casos siguen sin ejecutar, entre ellos todos los de verificación manual.</w:t>
+        <w:t>como caja negra, e incluye dos recorridos completos de la ruta principal, cierres forzados en seis momentos, borrado de un perfil, comprobación de residuos fuera de la carpeta de datos, ejecución desde una ruta con espacios, tres mediciones de la carga de cada escena y la prueba de exclusión de RNF-16. La D10 preveía un segundo candidato si la primera pasada hallaba un defecto bloqueante o mayor, y la adenda registra que esa pasada, sobre el candidato rc1, halló defectos que se corrigieron antes de la entrega: entre ellos, las conexiones de red de los servicios de Unity, que ahora se apagan al compilar. El primer ejecutable de doce escenas pesaba 866,7 MB y quedó en 479,0 MB. El segundo candidato, rc2, se reverificó con un tercer recorrido completo, y quedaron 103 casos con veredicto: 89 con P, 13 con P parcial, ninguno con F y uno con NE. Otros 24 casos siguen sin ejecutar, entre ellos todos los de verificación manual.</w:t>
       </w:r>
     </w:p>
     <w:p>
@@ -14072,7 +14087,7 @@
       </w:pPr>
       <w:bookmarkStart w:id="72" w:name="_Toc475112174"/>
       <w:bookmarkStart w:id="73" w:name="_Toc475115530"/>
-      <w:bookmarkStart w:id="74" w:name="_Toc242188051"/>
+      <w:bookmarkStart w:id="74" w:name="_Toc242198074"/>
       <w:r>
         <w:t>5.</w:t>
       </w:r>
@@ -14283,17 +14298,17 @@
         <w:t xml:space="preserve">, se hará uso del libro “Tecnología Para niños”, </w:t>
       </w:r>
       <w:r>
-        <w:t xml:space="preserve">cuyos </w:t>
+        <w:t>cuyos personajes e ilustraciones servirán como base para el diseño visual de los personajes del videojuego</w:t>
+      </w:r>
+      <w:r>
+        <w:t>, con la autorización escrita de sus autores (3.3.2)</w:t>
+      </w:r>
+      <w:r>
+        <w:t xml:space="preserve">, asegurando </w:t>
       </w:r>
       <w:r>
         <w:lastRenderedPageBreak/>
-        <w:t>personajes e ilustraciones servirán como base para el diseño visual de los personajes del videojuego</w:t>
-      </w:r>
-      <w:r>
-        <w:t>, con la autorización escrita de sus autores (3.3.2)</w:t>
-      </w:r>
-      <w:r>
-        <w:t>, asegurando coherencia entre la propuesta narrativa y los elementos gráficos del proyecto.</w:t>
+        <w:t>coherencia entre la propuesta narrativa y los elementos gráficos del proyecto.</w:t>
       </w:r>
     </w:p>
     <w:p>
@@ -14348,7 +14363,7 @@
         <w:ind w:left="567" w:hanging="576"/>
       </w:pPr>
       <w:bookmarkStart w:id="76" w:name="_Toc475115531"/>
-      <w:bookmarkStart w:id="77" w:name="_Toc242188052"/>
+      <w:bookmarkStart w:id="77" w:name="_Toc242198075"/>
       <w:r>
         <w:t>5.</w:t>
       </w:r>
@@ -14449,7 +14464,7 @@
           <w:b/>
         </w:rPr>
       </w:pPr>
-      <w:bookmarkStart w:id="78" w:name="_Toc242188053"/>
+      <w:bookmarkStart w:id="78" w:name="_Toc242198076"/>
       <w:r>
         <w:rPr>
           <w:rFonts w:cs="Arial"/>
@@ -14484,7 +14499,7 @@
           <w:color w:val="auto"/>
         </w:rPr>
       </w:pPr>
-      <w:bookmarkStart w:id="79" w:name="_Toc242188054"/>
+      <w:bookmarkStart w:id="79" w:name="_Toc242198077"/>
       <w:r>
         <w:rPr>
           <w:color w:val="auto"/>
@@ -14501,7 +14516,7 @@
           <w:rFonts w:cs="Arial"/>
         </w:rPr>
       </w:pPr>
-      <w:bookmarkStart w:id="80" w:name="_Toc242188055"/>
+      <w:bookmarkStart w:id="80" w:name="_Toc242198078"/>
       <w:r>
         <w:rPr>
           <w:rFonts w:cs="Arial"/>
@@ -14553,7 +14568,7 @@
           <w:color w:val="auto"/>
         </w:rPr>
       </w:pPr>
-      <w:bookmarkStart w:id="81" w:name="_Toc242188077"/>
+      <w:bookmarkStart w:id="81" w:name="_Toc242198100"/>
       <w:r>
         <w:rPr>
           <w:rFonts w:cs="Arial"/>
@@ -14901,7 +14916,7 @@
           <w:rFonts w:cs="Arial"/>
         </w:rPr>
       </w:pPr>
-      <w:bookmarkStart w:id="82" w:name="_Toc242188056"/>
+      <w:bookmarkStart w:id="82" w:name="_Toc242198079"/>
       <w:r>
         <w:rPr>
           <w:rFonts w:cs="Arial"/>
@@ -14937,7 +14952,7 @@
           <w:color w:val="auto"/>
         </w:rPr>
       </w:pPr>
-      <w:bookmarkStart w:id="83" w:name="_Toc242188078"/>
+      <w:bookmarkStart w:id="83" w:name="_Toc242198101"/>
       <w:r>
         <w:rPr>
           <w:rFonts w:cs="Arial"/>
@@ -15643,7 +15658,7 @@
           <w:rFonts w:cs="Arial"/>
         </w:rPr>
       </w:pPr>
-      <w:bookmarkStart w:id="84" w:name="_Toc242188057"/>
+      <w:bookmarkStart w:id="84" w:name="_Toc242198080"/>
       <w:r>
         <w:rPr>
           <w:rFonts w:cs="Arial"/>
@@ -15719,7 +15734,7 @@
           <w:color w:val="auto"/>
         </w:rPr>
       </w:pPr>
-      <w:bookmarkStart w:id="85" w:name="_Toc242188058"/>
+      <w:bookmarkStart w:id="85" w:name="_Toc242198081"/>
       <w:r>
         <w:rPr>
           <w:color w:val="auto"/>
@@ -15755,7 +15770,7 @@
           <w:color w:val="auto"/>
         </w:rPr>
       </w:pPr>
-      <w:bookmarkStart w:id="86" w:name="_Toc242188079"/>
+      <w:bookmarkStart w:id="86" w:name="_Toc242198102"/>
       <w:r>
         <w:rPr>
           <w:rFonts w:cs="Arial"/>
@@ -16539,7 +16554,7 @@
           <w:color w:val="auto"/>
         </w:rPr>
       </w:pPr>
-      <w:bookmarkStart w:id="87" w:name="_Toc242188080"/>
+      <w:bookmarkStart w:id="87" w:name="_Toc242198103"/>
       <w:r>
         <w:rPr>
           <w:rFonts w:cs="Arial"/>
@@ -16889,7 +16904,7 @@
           <w:color w:val="auto"/>
         </w:rPr>
       </w:pPr>
-      <w:bookmarkStart w:id="88" w:name="_Toc242188059"/>
+      <w:bookmarkStart w:id="88" w:name="_Toc242198082"/>
       <w:r>
         <w:rPr>
           <w:color w:val="auto"/>
@@ -16988,7 +17003,7 @@
           <w:b/>
         </w:rPr>
       </w:pPr>
-      <w:bookmarkStart w:id="89" w:name="_Toc242188060"/>
+      <w:bookmarkStart w:id="89" w:name="_Toc242198083"/>
       <w:r>
         <w:rPr>
           <w:rFonts w:cs="Arial"/>
@@ -17023,7 +17038,7 @@
           <w:color w:val="auto"/>
         </w:rPr>
       </w:pPr>
-      <w:bookmarkStart w:id="90" w:name="_Toc242188061"/>
+      <w:bookmarkStart w:id="90" w:name="_Toc242198084"/>
       <w:r>
         <w:rPr>
           <w:color w:val="auto"/>
@@ -17040,7 +17055,7 @@
           <w:rFonts w:cs="Arial"/>
         </w:rPr>
       </w:pPr>
-      <w:bookmarkStart w:id="91" w:name="_Toc242188062"/>
+      <w:bookmarkStart w:id="91" w:name="_Toc242198085"/>
       <w:r>
         <w:rPr>
           <w:rFonts w:cs="Arial"/>
@@ -17137,7 +17152,7 @@
           <w:rFonts w:cs="Arial"/>
         </w:rPr>
       </w:pPr>
-      <w:bookmarkStart w:id="92" w:name="_Toc242188063"/>
+      <w:bookmarkStart w:id="92" w:name="_Toc242198086"/>
       <w:r>
         <w:rPr>
           <w:rFonts w:cs="Arial"/>
@@ -17173,7 +17188,7 @@
           <w:color w:val="auto"/>
         </w:rPr>
       </w:pPr>
-      <w:bookmarkStart w:id="93" w:name="_Toc242188081"/>
+      <w:bookmarkStart w:id="93" w:name="_Toc242198104"/>
       <w:r>
         <w:rPr>
           <w:rFonts w:cs="Arial"/>
@@ -17839,7 +17854,7 @@
           <w:rFonts w:cs="Arial"/>
         </w:rPr>
       </w:pPr>
-      <w:bookmarkStart w:id="94" w:name="_Toc242188064"/>
+      <w:bookmarkStart w:id="94" w:name="_Toc242198087"/>
       <w:r>
         <w:rPr>
           <w:rFonts w:cs="Arial"/>
@@ -17912,7 +17927,7 @@
           <w:rFonts w:cs="Arial"/>
         </w:rPr>
       </w:pPr>
-      <w:bookmarkStart w:id="95" w:name="_Toc242188065"/>
+      <w:bookmarkStart w:id="95" w:name="_Toc242198088"/>
       <w:r>
         <w:rPr>
           <w:rFonts w:cs="Arial"/>
@@ -17961,7 +17976,7 @@
           <w:color w:val="auto"/>
         </w:rPr>
       </w:pPr>
-      <w:bookmarkStart w:id="96" w:name="_Toc242188066"/>
+      <w:bookmarkStart w:id="96" w:name="_Toc242198089"/>
       <w:r>
         <w:rPr>
           <w:color w:val="auto"/>
@@ -18013,7 +18028,7 @@
           <w:color w:val="auto"/>
         </w:rPr>
       </w:pPr>
-      <w:bookmarkStart w:id="97" w:name="_Toc242188082"/>
+      <w:bookmarkStart w:id="97" w:name="_Toc242198105"/>
       <w:r>
         <w:rPr>
           <w:rFonts w:cs="Arial"/>
@@ -18684,7 +18699,7 @@
           <w:color w:val="auto"/>
         </w:rPr>
       </w:pPr>
-      <w:bookmarkStart w:id="98" w:name="_Toc242188083"/>
+      <w:bookmarkStart w:id="98" w:name="_Toc242198106"/>
       <w:r>
         <w:rPr>
           <w:rFonts w:cs="Arial"/>
@@ -19050,7 +19065,7 @@
           <w:color w:val="auto"/>
         </w:rPr>
       </w:pPr>
-      <w:bookmarkStart w:id="99" w:name="_Toc242188067"/>
+      <w:bookmarkStart w:id="99" w:name="_Toc242198090"/>
       <w:r>
         <w:rPr>
           <w:color w:val="auto"/>
@@ -19149,7 +19164,7 @@
           <w:b/>
         </w:rPr>
       </w:pPr>
-      <w:bookmarkStart w:id="100" w:name="_Toc242188068"/>
+      <w:bookmarkStart w:id="100" w:name="_Toc242198091"/>
       <w:r>
         <w:rPr>
           <w:rFonts w:cs="Arial"/>
@@ -19198,7 +19213,7 @@
           <w:color w:val="auto"/>
         </w:rPr>
       </w:pPr>
-      <w:bookmarkStart w:id="101" w:name="_Toc242188069"/>
+      <w:bookmarkStart w:id="101" w:name="_Toc242198092"/>
       <w:r>
         <w:rPr>
           <w:color w:val="auto"/>
@@ -19215,7 +19230,7 @@
           <w:rFonts w:cs="Arial"/>
         </w:rPr>
       </w:pPr>
-      <w:bookmarkStart w:id="102" w:name="_Toc242188070"/>
+      <w:bookmarkStart w:id="102" w:name="_Toc242198093"/>
       <w:r>
         <w:rPr>
           <w:rFonts w:cs="Arial"/>
@@ -19295,7 +19310,7 @@
           <w:color w:val="auto"/>
         </w:rPr>
       </w:pPr>
-      <w:bookmarkStart w:id="103" w:name="_Toc242188084"/>
+      <w:bookmarkStart w:id="103" w:name="_Toc242198107"/>
       <w:r>
         <w:rPr>
           <w:rFonts w:cs="Arial"/>
@@ -20002,7 +20017,7 @@
           <w:rFonts w:cs="Arial"/>
         </w:rPr>
       </w:pPr>
-      <w:bookmarkStart w:id="104" w:name="_Toc242188071"/>
+      <w:bookmarkStart w:id="104" w:name="_Toc242198094"/>
       <w:r>
         <w:rPr>
           <w:rFonts w:cs="Arial"/>
@@ -20123,7 +20138,7 @@
           <w:rFonts w:cs="Arial"/>
         </w:rPr>
       </w:pPr>
-      <w:bookmarkStart w:id="105" w:name="_Toc242188072"/>
+      <w:bookmarkStart w:id="105" w:name="_Toc242198095"/>
       <w:r>
         <w:rPr>
           <w:rFonts w:cs="Arial"/>
@@ -20195,7 +20210,7 @@
           <w:color w:val="auto"/>
         </w:rPr>
       </w:pPr>
-      <w:bookmarkStart w:id="106" w:name="_Toc242188093"/>
+      <w:bookmarkStart w:id="106" w:name="_Toc242198116"/>
       <w:r>
         <w:rPr>
           <w:rFonts w:cs="Arial"/>
@@ -20383,7 +20398,7 @@
           <w:color w:val="auto"/>
         </w:rPr>
       </w:pPr>
-      <w:bookmarkStart w:id="107" w:name="_Toc242188094"/>
+      <w:bookmarkStart w:id="107" w:name="_Toc242198117"/>
       <w:r>
         <w:rPr>
           <w:rFonts w:cs="Arial"/>
@@ -20572,7 +20587,7 @@
           <w:color w:val="auto"/>
         </w:rPr>
       </w:pPr>
-      <w:bookmarkStart w:id="108" w:name="_Toc242188095"/>
+      <w:bookmarkStart w:id="108" w:name="_Toc242198118"/>
       <w:r>
         <w:rPr>
           <w:rFonts w:cs="Arial"/>
@@ -20727,7 +20742,7 @@
           <w:rFonts w:cs="Arial"/>
         </w:rPr>
       </w:pPr>
-      <w:bookmarkStart w:id="109" w:name="_Toc242188073"/>
+      <w:bookmarkStart w:id="109" w:name="_Toc242198096"/>
       <w:r>
         <w:rPr>
           <w:rFonts w:cs="Arial"/>
@@ -20783,7 +20798,7 @@
           <w:color w:val="auto"/>
         </w:rPr>
       </w:pPr>
-      <w:bookmarkStart w:id="110" w:name="_Toc242188074"/>
+      <w:bookmarkStart w:id="110" w:name="_Toc242198097"/>
       <w:r>
         <w:rPr>
           <w:color w:val="auto"/>
@@ -21023,7 +21038,7 @@
           <w:color w:val="auto"/>
         </w:rPr>
       </w:pPr>
-      <w:bookmarkStart w:id="111" w:name="_Toc242188085"/>
+      <w:bookmarkStart w:id="111" w:name="_Toc242198108"/>
       <w:r>
         <w:rPr>
           <w:rFonts w:cs="Arial"/>
@@ -21436,7 +21451,7 @@
           <w:color w:val="auto"/>
         </w:rPr>
       </w:pPr>
-      <w:bookmarkStart w:id="112" w:name="_Toc242188086"/>
+      <w:bookmarkStart w:id="112" w:name="_Toc242198109"/>
       <w:r>
         <w:rPr>
           <w:rFonts w:cs="Arial"/>
@@ -22165,7 +22180,7 @@
           <w:color w:val="auto"/>
         </w:rPr>
       </w:pPr>
-      <w:bookmarkStart w:id="113" w:name="_Toc242188087"/>
+      <w:bookmarkStart w:id="113" w:name="_Toc242198110"/>
       <w:r>
         <w:rPr>
           <w:rFonts w:cs="Arial"/>
@@ -22904,7 +22919,7 @@
           <w:color w:val="auto"/>
         </w:rPr>
       </w:pPr>
-      <w:bookmarkStart w:id="114" w:name="_Toc242188075"/>
+      <w:bookmarkStart w:id="114" w:name="_Toc242198098"/>
       <w:r>
         <w:rPr>
           <w:color w:val="auto"/>
@@ -23065,7 +23080,7 @@
         </w:rPr>
       </w:pPr>
       <w:bookmarkStart w:id="115" w:name="_Toc379905744"/>
-      <w:bookmarkStart w:id="116" w:name="_Toc242188076"/>
+      <w:bookmarkStart w:id="116" w:name="_Toc242198099"/>
       <w:r>
         <w:rPr>
           <w:rFonts w:cs="Arial"/>
@@ -32046,6 +32061,7 @@
   <w:style w:type="character" w:default="1" w:styleId="Fuentedeprrafopredeter">
     <w:name w:val="Default Paragraph Font"/>
     <w:uiPriority w:val="1"/>
+    <w:semiHidden/>
     <w:unhideWhenUsed/>
   </w:style>
   <w:style w:type="table" w:default="1" w:styleId="Tablanormal">
@@ -33354,10 +33370,6 @@
 </file>
 
 <file path=customXml/item1.xml><?xml version="1.0" encoding="utf-8"?>
-<b:Sources xmlns:b="http://schemas.openxmlformats.org/officeDocument/2006/bibliography" xmlns="http://schemas.openxmlformats.org/officeDocument/2006/bibliography" SelectedStyle="\IEEE2006OfficeOnline.xsl" StyleName="IEEE" Version="2006"/>
-</file>
-
-<file path=customXml/item2.xml><?xml version="1.0" encoding="utf-8"?>
 <PERRLA xmlns="PERRLAReferences" id="1" gen="1772897757446_fz0nj9rbg">
   <References>
     <Reference>
@@ -35750,18 +35762,22 @@
 </PERRLA>
 </file>
 
+<file path=customXml/item2.xml><?xml version="1.0" encoding="utf-8"?>
+<b:Sources xmlns:b="http://schemas.openxmlformats.org/officeDocument/2006/bibliography" xmlns="http://schemas.openxmlformats.org/officeDocument/2006/bibliography" SelectedStyle="\IEEE2006OfficeOnline.xsl" StyleName="IEEE" Version="2006"/>
+</file>
+
 <file path=customXml/itemProps1.xml><?xml version="1.0" encoding="utf-8"?>
+<ds:datastoreItem xmlns:ds="http://schemas.openxmlformats.org/officeDocument/2006/customXml" ds:itemID="{75E55BB1-1658-473A-8BA5-374477F37E7C}">
+  <ds:schemaRefs>
+    <ds:schemaRef ds:uri="PERRLAReferences"/>
+  </ds:schemaRefs>
+</ds:datastoreItem>
+</file>
+
+<file path=customXml/itemProps2.xml><?xml version="1.0" encoding="utf-8"?>
 <ds:datastoreItem xmlns:ds="http://schemas.openxmlformats.org/officeDocument/2006/customXml" ds:itemID="{5C672598-A095-4690-A035-71B3EC7C3A93}">
   <ds:schemaRefs>
     <ds:schemaRef ds:uri="http://schemas.openxmlformats.org/officeDocument/2006/bibliography"/>
   </ds:schemaRefs>
 </ds:datastoreItem>
-</file>
-
-<file path=customXml/itemProps2.xml><?xml version="1.0" encoding="utf-8"?>
-<ds:datastoreItem xmlns:ds="http://schemas.openxmlformats.org/officeDocument/2006/customXml" ds:itemID="{75E55BB1-1658-473A-8BA5-374477F37E7C}">
-  <ds:schemaRefs>
-    <ds:schemaRef ds:uri="PERRLAReferences"/>
-  </ds:schemaRefs>
-</ds:datastoreItem>
 </file>
</xml_diff>

<commit_message>
Thesis: sprite production with the collaborator and the design round of 08/10
Sections 5.1.4, 5.2 and 8.1.1 name the hired collaborator (acta D01), CLIP
Studio in place of Illustrator and Photoshop, and the five steps every sprite
went through (team brainstorm, sketch, clean line, flat colour and shadow,
delivery and corrections); 5.1.5 and 8.1.3 add the interface, narrative and
character changes of the round (INC-137 to INC-145). Figure 7 shows the new
maze and chapter 8 adds the suite of 09/10/2026 next to the figures of the
01/10 cut, whose tables stay as they were. 76 pages (chapter 8: 8 of 10).

New tools: insertar_parrafos.ps1 (inserts paragraphs through Word COM next to
an exact anchor, keeping style) and medir_paginas.ps1, with their pair files.
</commit_message>
<xml_diff>
--- a/docs/Trabajo_de_Grado_Entrega_Plantilla_28jul.docx
+++ b/docs/Trabajo_de_Grado_Entrega_Plantilla_28jul.docx
@@ -1073,7 +1073,7 @@
           <w:r>
             <w:fldChar w:fldCharType="separate"/>
           </w:r>
-          <w:hyperlink w:anchor="_Toc242198036" w:history="1">
+          <w:hyperlink w:anchor="_Toc242400644" w:history="1">
             <w:r>
               <w:rPr>
                 <w:rStyle w:val="Hipervnculo"/>
@@ -1103,7 +1103,7 @@
                 <w:noProof/>
                 <w:webHidden/>
               </w:rPr>
-              <w:instrText xml:space="preserve"> PAGEREF _Toc242198036 \h </w:instrText>
+              <w:instrText xml:space="preserve"> PAGEREF _Toc242400644 \h </w:instrText>
             </w:r>
             <w:r>
               <w:rPr>
@@ -1145,7 +1145,7 @@
               <w14:ligatures w14:val="standardContextual"/>
             </w:rPr>
           </w:pPr>
-          <w:hyperlink w:anchor="_Toc242198037" w:history="1">
+          <w:hyperlink w:anchor="_Toc242400645" w:history="1">
             <w:r>
               <w:rPr>
                 <w:rStyle w:val="Hipervnculo"/>
@@ -1175,7 +1175,7 @@
                 <w:noProof/>
                 <w:webHidden/>
               </w:rPr>
-              <w:instrText xml:space="preserve"> PAGEREF _Toc242198037 \h </w:instrText>
+              <w:instrText xml:space="preserve"> PAGEREF _Toc242400645 \h </w:instrText>
             </w:r>
             <w:r>
               <w:rPr>
@@ -1220,7 +1220,7 @@
               <w14:ligatures w14:val="standardContextual"/>
             </w:rPr>
           </w:pPr>
-          <w:hyperlink w:anchor="_Toc242198038" w:history="1">
+          <w:hyperlink w:anchor="_Toc242400646" w:history="1">
             <w:r>
               <w:rPr>
                 <w:rStyle w:val="Hipervnculo"/>
@@ -1247,7 +1247,7 @@
                 <w:noProof/>
                 <w:webHidden/>
               </w:rPr>
-              <w:instrText xml:space="preserve"> PAGEREF _Toc242198038 \h </w:instrText>
+              <w:instrText xml:space="preserve"> PAGEREF _Toc242400646 \h </w:instrText>
             </w:r>
             <w:r>
               <w:rPr>
@@ -1292,7 +1292,7 @@
               <w14:ligatures w14:val="standardContextual"/>
             </w:rPr>
           </w:pPr>
-          <w:hyperlink w:anchor="_Toc242198039" w:history="1">
+          <w:hyperlink w:anchor="_Toc242400647" w:history="1">
             <w:r>
               <w:rPr>
                 <w:rStyle w:val="Hipervnculo"/>
@@ -1319,7 +1319,7 @@
                 <w:noProof/>
                 <w:webHidden/>
               </w:rPr>
-              <w:instrText xml:space="preserve"> PAGEREF _Toc242198039 \h </w:instrText>
+              <w:instrText xml:space="preserve"> PAGEREF _Toc242400647 \h </w:instrText>
             </w:r>
             <w:r>
               <w:rPr>
@@ -1364,7 +1364,7 @@
               <w14:ligatures w14:val="standardContextual"/>
             </w:rPr>
           </w:pPr>
-          <w:hyperlink w:anchor="_Toc242198040" w:history="1">
+          <w:hyperlink w:anchor="_Toc242400648" w:history="1">
             <w:r>
               <w:rPr>
                 <w:rStyle w:val="Hipervnculo"/>
@@ -1391,7 +1391,7 @@
                 <w:noProof/>
                 <w:webHidden/>
               </w:rPr>
-              <w:instrText xml:space="preserve"> PAGEREF _Toc242198040 \h </w:instrText>
+              <w:instrText xml:space="preserve"> PAGEREF _Toc242400648 \h </w:instrText>
             </w:r>
             <w:r>
               <w:rPr>
@@ -1436,7 +1436,7 @@
               <w14:ligatures w14:val="standardContextual"/>
             </w:rPr>
           </w:pPr>
-          <w:hyperlink w:anchor="_Toc242198041" w:history="1">
+          <w:hyperlink w:anchor="_Toc242400649" w:history="1">
             <w:r>
               <w:rPr>
                 <w:rStyle w:val="Hipervnculo"/>
@@ -1463,7 +1463,7 @@
                 <w:noProof/>
                 <w:webHidden/>
               </w:rPr>
-              <w:instrText xml:space="preserve"> PAGEREF _Toc242198041 \h </w:instrText>
+              <w:instrText xml:space="preserve"> PAGEREF _Toc242400649 \h </w:instrText>
             </w:r>
             <w:r>
               <w:rPr>
@@ -1505,7 +1505,7 @@
               <w14:ligatures w14:val="standardContextual"/>
             </w:rPr>
           </w:pPr>
-          <w:hyperlink w:anchor="_Toc242198042" w:history="1">
+          <w:hyperlink w:anchor="_Toc242400650" w:history="1">
             <w:r>
               <w:rPr>
                 <w:rStyle w:val="Hipervnculo"/>
@@ -1535,7 +1535,7 @@
                 <w:noProof/>
                 <w:webHidden/>
               </w:rPr>
-              <w:instrText xml:space="preserve"> PAGEREF _Toc242198042 \h </w:instrText>
+              <w:instrText xml:space="preserve"> PAGEREF _Toc242400650 \h </w:instrText>
             </w:r>
             <w:r>
               <w:rPr>
@@ -1580,7 +1580,7 @@
               <w14:ligatures w14:val="standardContextual"/>
             </w:rPr>
           </w:pPr>
-          <w:hyperlink w:anchor="_Toc242198043" w:history="1">
+          <w:hyperlink w:anchor="_Toc242400651" w:history="1">
             <w:r>
               <w:rPr>
                 <w:rStyle w:val="Hipervnculo"/>
@@ -1607,7 +1607,7 @@
                 <w:noProof/>
                 <w:webHidden/>
               </w:rPr>
-              <w:instrText xml:space="preserve"> PAGEREF _Toc242198043 \h </w:instrText>
+              <w:instrText xml:space="preserve"> PAGEREF _Toc242400651 \h </w:instrText>
             </w:r>
             <w:r>
               <w:rPr>
@@ -1652,7 +1652,7 @@
               <w14:ligatures w14:val="standardContextual"/>
             </w:rPr>
           </w:pPr>
-          <w:hyperlink w:anchor="_Toc242198044" w:history="1">
+          <w:hyperlink w:anchor="_Toc242400652" w:history="1">
             <w:r>
               <w:rPr>
                 <w:rStyle w:val="Hipervnculo"/>
@@ -1679,7 +1679,7 @@
                 <w:noProof/>
                 <w:webHidden/>
               </w:rPr>
-              <w:instrText xml:space="preserve"> PAGEREF _Toc242198044 \h </w:instrText>
+              <w:instrText xml:space="preserve"> PAGEREF _Toc242400652 \h </w:instrText>
             </w:r>
             <w:r>
               <w:rPr>
@@ -1721,7 +1721,7 @@
               <w14:ligatures w14:val="standardContextual"/>
             </w:rPr>
           </w:pPr>
-          <w:hyperlink w:anchor="_Toc242198045" w:history="1">
+          <w:hyperlink w:anchor="_Toc242400653" w:history="1">
             <w:r>
               <w:rPr>
                 <w:rStyle w:val="Hipervnculo"/>
@@ -1751,7 +1751,7 @@
                 <w:noProof/>
                 <w:webHidden/>
               </w:rPr>
-              <w:instrText xml:space="preserve"> PAGEREF _Toc242198045 \h </w:instrText>
+              <w:instrText xml:space="preserve"> PAGEREF _Toc242400653 \h </w:instrText>
             </w:r>
             <w:r>
               <w:rPr>
@@ -1796,7 +1796,7 @@
               <w14:ligatures w14:val="standardContextual"/>
             </w:rPr>
           </w:pPr>
-          <w:hyperlink w:anchor="_Toc242198046" w:history="1">
+          <w:hyperlink w:anchor="_Toc242400654" w:history="1">
             <w:r>
               <w:rPr>
                 <w:rStyle w:val="Hipervnculo"/>
@@ -1823,7 +1823,7 @@
                 <w:noProof/>
                 <w:webHidden/>
               </w:rPr>
-              <w:instrText xml:space="preserve"> PAGEREF _Toc242198046 \h </w:instrText>
+              <w:instrText xml:space="preserve"> PAGEREF _Toc242400654 \h </w:instrText>
             </w:r>
             <w:r>
               <w:rPr>
@@ -1865,7 +1865,7 @@
               <w14:ligatures w14:val="standardContextual"/>
             </w:rPr>
           </w:pPr>
-          <w:hyperlink w:anchor="_Toc242198047" w:history="1">
+          <w:hyperlink w:anchor="_Toc242400655" w:history="1">
             <w:r>
               <w:rPr>
                 <w:rStyle w:val="Hipervnculo"/>
@@ -1892,7 +1892,7 @@
                 <w:noProof/>
                 <w:webHidden/>
               </w:rPr>
-              <w:instrText xml:space="preserve"> PAGEREF _Toc242198047 \h </w:instrText>
+              <w:instrText xml:space="preserve"> PAGEREF _Toc242400655 \h </w:instrText>
             </w:r>
             <w:r>
               <w:rPr>
@@ -1934,7 +1934,7 @@
               <w14:ligatures w14:val="standardContextual"/>
             </w:rPr>
           </w:pPr>
-          <w:hyperlink w:anchor="_Toc242198048" w:history="1">
+          <w:hyperlink w:anchor="_Toc242400656" w:history="1">
             <w:r>
               <w:rPr>
                 <w:rStyle w:val="Hipervnculo"/>
@@ -1961,7 +1961,7 @@
                 <w:noProof/>
                 <w:webHidden/>
               </w:rPr>
-              <w:instrText xml:space="preserve"> PAGEREF _Toc242198048 \h </w:instrText>
+              <w:instrText xml:space="preserve"> PAGEREF _Toc242400656 \h </w:instrText>
             </w:r>
             <w:r>
               <w:rPr>
@@ -2003,7 +2003,7 @@
               <w14:ligatures w14:val="standardContextual"/>
             </w:rPr>
           </w:pPr>
-          <w:hyperlink w:anchor="_Toc242198049" w:history="1">
+          <w:hyperlink w:anchor="_Toc242400657" w:history="1">
             <w:r>
               <w:rPr>
                 <w:rStyle w:val="Hipervnculo"/>
@@ -2030,7 +2030,7 @@
                 <w:noProof/>
                 <w:webHidden/>
               </w:rPr>
-              <w:instrText xml:space="preserve"> PAGEREF _Toc242198049 \h </w:instrText>
+              <w:instrText xml:space="preserve"> PAGEREF _Toc242400657 \h </w:instrText>
             </w:r>
             <w:r>
               <w:rPr>
@@ -2072,7 +2072,7 @@
               <w14:ligatures w14:val="standardContextual"/>
             </w:rPr>
           </w:pPr>
-          <w:hyperlink w:anchor="_Toc242198050" w:history="1">
+          <w:hyperlink w:anchor="_Toc242400658" w:history="1">
             <w:r>
               <w:rPr>
                 <w:rStyle w:val="Hipervnculo"/>
@@ -2099,7 +2099,7 @@
                 <w:noProof/>
                 <w:webHidden/>
               </w:rPr>
-              <w:instrText xml:space="preserve"> PAGEREF _Toc242198050 \h </w:instrText>
+              <w:instrText xml:space="preserve"> PAGEREF _Toc242400658 \h </w:instrText>
             </w:r>
             <w:r>
               <w:rPr>
@@ -2141,7 +2141,7 @@
               <w14:ligatures w14:val="standardContextual"/>
             </w:rPr>
           </w:pPr>
-          <w:hyperlink w:anchor="_Toc242198051" w:history="1">
+          <w:hyperlink w:anchor="_Toc242400659" w:history="1">
             <w:r>
               <w:rPr>
                 <w:rStyle w:val="Hipervnculo"/>
@@ -2168,7 +2168,7 @@
                 <w:noProof/>
                 <w:webHidden/>
               </w:rPr>
-              <w:instrText xml:space="preserve"> PAGEREF _Toc242198051 \h </w:instrText>
+              <w:instrText xml:space="preserve"> PAGEREF _Toc242400659 \h </w:instrText>
             </w:r>
             <w:r>
               <w:rPr>
@@ -2210,7 +2210,7 @@
               <w14:ligatures w14:val="standardContextual"/>
             </w:rPr>
           </w:pPr>
-          <w:hyperlink w:anchor="_Toc242198052" w:history="1">
+          <w:hyperlink w:anchor="_Toc242400660" w:history="1">
             <w:r>
               <w:rPr>
                 <w:rStyle w:val="Hipervnculo"/>
@@ -2237,7 +2237,7 @@
                 <w:noProof/>
                 <w:webHidden/>
               </w:rPr>
-              <w:instrText xml:space="preserve"> PAGEREF _Toc242198052 \h </w:instrText>
+              <w:instrText xml:space="preserve"> PAGEREF _Toc242400660 \h </w:instrText>
             </w:r>
             <w:r>
               <w:rPr>
@@ -2282,7 +2282,7 @@
               <w14:ligatures w14:val="standardContextual"/>
             </w:rPr>
           </w:pPr>
-          <w:hyperlink w:anchor="_Toc242198053" w:history="1">
+          <w:hyperlink w:anchor="_Toc242400661" w:history="1">
             <w:r>
               <w:rPr>
                 <w:rStyle w:val="Hipervnculo"/>
@@ -2309,7 +2309,7 @@
                 <w:noProof/>
                 <w:webHidden/>
               </w:rPr>
-              <w:instrText xml:space="preserve"> PAGEREF _Toc242198053 \h </w:instrText>
+              <w:instrText xml:space="preserve"> PAGEREF _Toc242400661 \h </w:instrText>
             </w:r>
             <w:r>
               <w:rPr>
@@ -2351,7 +2351,7 @@
               <w14:ligatures w14:val="standardContextual"/>
             </w:rPr>
           </w:pPr>
-          <w:hyperlink w:anchor="_Toc242198054" w:history="1">
+          <w:hyperlink w:anchor="_Toc242400662" w:history="1">
             <w:r>
               <w:rPr>
                 <w:rStyle w:val="Hipervnculo"/>
@@ -2378,7 +2378,7 @@
                 <w:noProof/>
                 <w:webHidden/>
               </w:rPr>
-              <w:instrText xml:space="preserve"> PAGEREF _Toc242198054 \h </w:instrText>
+              <w:instrText xml:space="preserve"> PAGEREF _Toc242400662 \h </w:instrText>
             </w:r>
             <w:r>
               <w:rPr>
@@ -2420,7 +2420,7 @@
               <w14:ligatures w14:val="standardContextual"/>
             </w:rPr>
           </w:pPr>
-          <w:hyperlink w:anchor="_Toc242198055" w:history="1">
+          <w:hyperlink w:anchor="_Toc242400663" w:history="1">
             <w:r>
               <w:rPr>
                 <w:rStyle w:val="Hipervnculo"/>
@@ -2447,7 +2447,7 @@
                 <w:noProof/>
                 <w:webHidden/>
               </w:rPr>
-              <w:instrText xml:space="preserve"> PAGEREF _Toc242198055 \h </w:instrText>
+              <w:instrText xml:space="preserve"> PAGEREF _Toc242400663 \h </w:instrText>
             </w:r>
             <w:r>
               <w:rPr>
@@ -2489,7 +2489,7 @@
               <w14:ligatures w14:val="standardContextual"/>
             </w:rPr>
           </w:pPr>
-          <w:hyperlink w:anchor="_Toc242198056" w:history="1">
+          <w:hyperlink w:anchor="_Toc242400664" w:history="1">
             <w:r>
               <w:rPr>
                 <w:rStyle w:val="Hipervnculo"/>
@@ -2516,7 +2516,7 @@
                 <w:noProof/>
                 <w:webHidden/>
               </w:rPr>
-              <w:instrText xml:space="preserve"> PAGEREF _Toc242198056 \h </w:instrText>
+              <w:instrText xml:space="preserve"> PAGEREF _Toc242400664 \h </w:instrText>
             </w:r>
             <w:r>
               <w:rPr>
@@ -2558,7 +2558,7 @@
               <w14:ligatures w14:val="standardContextual"/>
             </w:rPr>
           </w:pPr>
-          <w:hyperlink w:anchor="_Toc242198057" w:history="1">
+          <w:hyperlink w:anchor="_Toc242400665" w:history="1">
             <w:r>
               <w:rPr>
                 <w:rStyle w:val="Hipervnculo"/>
@@ -2585,7 +2585,7 @@
                 <w:noProof/>
                 <w:webHidden/>
               </w:rPr>
-              <w:instrText xml:space="preserve"> PAGEREF _Toc242198057 \h </w:instrText>
+              <w:instrText xml:space="preserve"> PAGEREF _Toc242400665 \h </w:instrText>
             </w:r>
             <w:r>
               <w:rPr>
@@ -2627,7 +2627,7 @@
               <w14:ligatures w14:val="standardContextual"/>
             </w:rPr>
           </w:pPr>
-          <w:hyperlink w:anchor="_Toc242198058" w:history="1">
+          <w:hyperlink w:anchor="_Toc242400666" w:history="1">
             <w:r>
               <w:rPr>
                 <w:rStyle w:val="Hipervnculo"/>
@@ -2654,7 +2654,7 @@
                 <w:noProof/>
                 <w:webHidden/>
               </w:rPr>
-              <w:instrText xml:space="preserve"> PAGEREF _Toc242198058 \h </w:instrText>
+              <w:instrText xml:space="preserve"> PAGEREF _Toc242400666 \h </w:instrText>
             </w:r>
             <w:r>
               <w:rPr>
@@ -2696,7 +2696,7 @@
               <w14:ligatures w14:val="standardContextual"/>
             </w:rPr>
           </w:pPr>
-          <w:hyperlink w:anchor="_Toc242198059" w:history="1">
+          <w:hyperlink w:anchor="_Toc242400667" w:history="1">
             <w:r>
               <w:rPr>
                 <w:rStyle w:val="Hipervnculo"/>
@@ -2723,7 +2723,7 @@
                 <w:noProof/>
                 <w:webHidden/>
               </w:rPr>
-              <w:instrText xml:space="preserve"> PAGEREF _Toc242198059 \h </w:instrText>
+              <w:instrText xml:space="preserve"> PAGEREF _Toc242400667 \h </w:instrText>
             </w:r>
             <w:r>
               <w:rPr>
@@ -2765,7 +2765,7 @@
               <w14:ligatures w14:val="standardContextual"/>
             </w:rPr>
           </w:pPr>
-          <w:hyperlink w:anchor="_Toc242198060" w:history="1">
+          <w:hyperlink w:anchor="_Toc242400668" w:history="1">
             <w:r>
               <w:rPr>
                 <w:rStyle w:val="Hipervnculo"/>
@@ -2792,7 +2792,7 @@
                 <w:noProof/>
                 <w:webHidden/>
               </w:rPr>
-              <w:instrText xml:space="preserve"> PAGEREF _Toc242198060 \h </w:instrText>
+              <w:instrText xml:space="preserve"> PAGEREF _Toc242400668 \h </w:instrText>
             </w:r>
             <w:r>
               <w:rPr>
@@ -2837,7 +2837,7 @@
               <w14:ligatures w14:val="standardContextual"/>
             </w:rPr>
           </w:pPr>
-          <w:hyperlink w:anchor="_Toc242198061" w:history="1">
+          <w:hyperlink w:anchor="_Toc242400669" w:history="1">
             <w:r>
               <w:rPr>
                 <w:rStyle w:val="Hipervnculo"/>
@@ -2864,7 +2864,7 @@
                 <w:noProof/>
                 <w:webHidden/>
               </w:rPr>
-              <w:instrText xml:space="preserve"> PAGEREF _Toc242198061 \h </w:instrText>
+              <w:instrText xml:space="preserve"> PAGEREF _Toc242400669 \h </w:instrText>
             </w:r>
             <w:r>
               <w:rPr>
@@ -2906,7 +2906,7 @@
               <w14:ligatures w14:val="standardContextual"/>
             </w:rPr>
           </w:pPr>
-          <w:hyperlink w:anchor="_Toc242198062" w:history="1">
+          <w:hyperlink w:anchor="_Toc242400670" w:history="1">
             <w:r>
               <w:rPr>
                 <w:rStyle w:val="Hipervnculo"/>
@@ -2933,7 +2933,7 @@
                 <w:noProof/>
                 <w:webHidden/>
               </w:rPr>
-              <w:instrText xml:space="preserve"> PAGEREF _Toc242198062 \h </w:instrText>
+              <w:instrText xml:space="preserve"> PAGEREF _Toc242400670 \h </w:instrText>
             </w:r>
             <w:r>
               <w:rPr>
@@ -2975,7 +2975,7 @@
               <w14:ligatures w14:val="standardContextual"/>
             </w:rPr>
           </w:pPr>
-          <w:hyperlink w:anchor="_Toc242198063" w:history="1">
+          <w:hyperlink w:anchor="_Toc242400671" w:history="1">
             <w:r>
               <w:rPr>
                 <w:rStyle w:val="Hipervnculo"/>
@@ -3002,7 +3002,7 @@
                 <w:noProof/>
                 <w:webHidden/>
               </w:rPr>
-              <w:instrText xml:space="preserve"> PAGEREF _Toc242198063 \h </w:instrText>
+              <w:instrText xml:space="preserve"> PAGEREF _Toc242400671 \h </w:instrText>
             </w:r>
             <w:r>
               <w:rPr>
@@ -3047,7 +3047,7 @@
               <w14:ligatures w14:val="standardContextual"/>
             </w:rPr>
           </w:pPr>
-          <w:hyperlink w:anchor="_Toc242198064" w:history="1">
+          <w:hyperlink w:anchor="_Toc242400672" w:history="1">
             <w:r>
               <w:rPr>
                 <w:rStyle w:val="Hipervnculo"/>
@@ -3074,7 +3074,7 @@
                 <w:noProof/>
                 <w:webHidden/>
               </w:rPr>
-              <w:instrText xml:space="preserve"> PAGEREF _Toc242198064 \h </w:instrText>
+              <w:instrText xml:space="preserve"> PAGEREF _Toc242400672 \h </w:instrText>
             </w:r>
             <w:r>
               <w:rPr>
@@ -3116,7 +3116,7 @@
               <w14:ligatures w14:val="standardContextual"/>
             </w:rPr>
           </w:pPr>
-          <w:hyperlink w:anchor="_Toc242198065" w:history="1">
+          <w:hyperlink w:anchor="_Toc242400673" w:history="1">
             <w:r>
               <w:rPr>
                 <w:rStyle w:val="Hipervnculo"/>
@@ -3146,7 +3146,7 @@
                 <w:noProof/>
                 <w:webHidden/>
               </w:rPr>
-              <w:instrText xml:space="preserve"> PAGEREF _Toc242198065 \h </w:instrText>
+              <w:instrText xml:space="preserve"> PAGEREF _Toc242400673 \h </w:instrText>
             </w:r>
             <w:r>
               <w:rPr>
@@ -3188,7 +3188,7 @@
               <w14:ligatures w14:val="standardContextual"/>
             </w:rPr>
           </w:pPr>
-          <w:hyperlink w:anchor="_Toc242198066" w:history="1">
+          <w:hyperlink w:anchor="_Toc242400674" w:history="1">
             <w:r>
               <w:rPr>
                 <w:rStyle w:val="Hipervnculo"/>
@@ -3218,7 +3218,7 @@
                 <w:noProof/>
                 <w:webHidden/>
               </w:rPr>
-              <w:instrText xml:space="preserve"> PAGEREF _Toc242198066 \h </w:instrText>
+              <w:instrText xml:space="preserve"> PAGEREF _Toc242400674 \h </w:instrText>
             </w:r>
             <w:r>
               <w:rPr>
@@ -3263,7 +3263,7 @@
               <w14:ligatures w14:val="standardContextual"/>
             </w:rPr>
           </w:pPr>
-          <w:hyperlink w:anchor="_Toc242198067" w:history="1">
+          <w:hyperlink w:anchor="_Toc242400675" w:history="1">
             <w:r>
               <w:rPr>
                 <w:rStyle w:val="Hipervnculo"/>
@@ -3290,7 +3290,7 @@
                 <w:noProof/>
                 <w:webHidden/>
               </w:rPr>
-              <w:instrText xml:space="preserve"> PAGEREF _Toc242198067 \h </w:instrText>
+              <w:instrText xml:space="preserve"> PAGEREF _Toc242400675 \h </w:instrText>
             </w:r>
             <w:r>
               <w:rPr>
@@ -3332,7 +3332,7 @@
               <w14:ligatures w14:val="standardContextual"/>
             </w:rPr>
           </w:pPr>
-          <w:hyperlink w:anchor="_Toc242198068" w:history="1">
+          <w:hyperlink w:anchor="_Toc242400676" w:history="1">
             <w:r>
               <w:rPr>
                 <w:rStyle w:val="Hipervnculo"/>
@@ -3359,7 +3359,7 @@
                 <w:noProof/>
                 <w:webHidden/>
               </w:rPr>
-              <w:instrText xml:space="preserve"> PAGEREF _Toc242198068 \h </w:instrText>
+              <w:instrText xml:space="preserve"> PAGEREF _Toc242400676 \h </w:instrText>
             </w:r>
             <w:r>
               <w:rPr>
@@ -3401,7 +3401,7 @@
               <w14:ligatures w14:val="standardContextual"/>
             </w:rPr>
           </w:pPr>
-          <w:hyperlink w:anchor="_Toc242198069" w:history="1">
+          <w:hyperlink w:anchor="_Toc242400677" w:history="1">
             <w:r>
               <w:rPr>
                 <w:rStyle w:val="Hipervnculo"/>
@@ -3428,7 +3428,7 @@
                 <w:noProof/>
                 <w:webHidden/>
               </w:rPr>
-              <w:instrText xml:space="preserve"> PAGEREF _Toc242198069 \h </w:instrText>
+              <w:instrText xml:space="preserve"> PAGEREF _Toc242400677 \h </w:instrText>
             </w:r>
             <w:r>
               <w:rPr>
@@ -3470,7 +3470,7 @@
               <w14:ligatures w14:val="standardContextual"/>
             </w:rPr>
           </w:pPr>
-          <w:hyperlink w:anchor="_Toc242198070" w:history="1">
+          <w:hyperlink w:anchor="_Toc242400678" w:history="1">
             <w:r>
               <w:rPr>
                 <w:rStyle w:val="Hipervnculo"/>
@@ -3497,7 +3497,7 @@
                 <w:noProof/>
                 <w:webHidden/>
               </w:rPr>
-              <w:instrText xml:space="preserve"> PAGEREF _Toc242198070 \h </w:instrText>
+              <w:instrText xml:space="preserve"> PAGEREF _Toc242400678 \h </w:instrText>
             </w:r>
             <w:r>
               <w:rPr>
@@ -3539,7 +3539,7 @@
               <w14:ligatures w14:val="standardContextual"/>
             </w:rPr>
           </w:pPr>
-          <w:hyperlink w:anchor="_Toc242198071" w:history="1">
+          <w:hyperlink w:anchor="_Toc242400679" w:history="1">
             <w:r>
               <w:rPr>
                 <w:rStyle w:val="Hipervnculo"/>
@@ -3566,7 +3566,7 @@
                 <w:noProof/>
                 <w:webHidden/>
               </w:rPr>
-              <w:instrText xml:space="preserve"> PAGEREF _Toc242198071 \h </w:instrText>
+              <w:instrText xml:space="preserve"> PAGEREF _Toc242400679 \h </w:instrText>
             </w:r>
             <w:r>
               <w:rPr>
@@ -3608,7 +3608,7 @@
               <w14:ligatures w14:val="standardContextual"/>
             </w:rPr>
           </w:pPr>
-          <w:hyperlink w:anchor="_Toc242198072" w:history="1">
+          <w:hyperlink w:anchor="_Toc242400680" w:history="1">
             <w:r>
               <w:rPr>
                 <w:rStyle w:val="Hipervnculo"/>
@@ -3635,7 +3635,7 @@
                 <w:noProof/>
                 <w:webHidden/>
               </w:rPr>
-              <w:instrText xml:space="preserve"> PAGEREF _Toc242198072 \h </w:instrText>
+              <w:instrText xml:space="preserve"> PAGEREF _Toc242400680 \h </w:instrText>
             </w:r>
             <w:r>
               <w:rPr>
@@ -3677,7 +3677,7 @@
               <w14:ligatures w14:val="standardContextual"/>
             </w:rPr>
           </w:pPr>
-          <w:hyperlink w:anchor="_Toc242198073" w:history="1">
+          <w:hyperlink w:anchor="_Toc242400681" w:history="1">
             <w:r>
               <w:rPr>
                 <w:rStyle w:val="Hipervnculo"/>
@@ -3704,7 +3704,7 @@
                 <w:noProof/>
                 <w:webHidden/>
               </w:rPr>
-              <w:instrText xml:space="preserve"> PAGEREF _Toc242198073 \h </w:instrText>
+              <w:instrText xml:space="preserve"> PAGEREF _Toc242400681 \h </w:instrText>
             </w:r>
             <w:r>
               <w:rPr>
@@ -3749,7 +3749,7 @@
               <w14:ligatures w14:val="standardContextual"/>
             </w:rPr>
           </w:pPr>
-          <w:hyperlink w:anchor="_Toc242198074" w:history="1">
+          <w:hyperlink w:anchor="_Toc242400682" w:history="1">
             <w:r>
               <w:rPr>
                 <w:rStyle w:val="Hipervnculo"/>
@@ -3776,7 +3776,7 @@
                 <w:noProof/>
                 <w:webHidden/>
               </w:rPr>
-              <w:instrText xml:space="preserve"> PAGEREF _Toc242198074 \h </w:instrText>
+              <w:instrText xml:space="preserve"> PAGEREF _Toc242400682 \h </w:instrText>
             </w:r>
             <w:r>
               <w:rPr>
@@ -3821,7 +3821,7 @@
               <w14:ligatures w14:val="standardContextual"/>
             </w:rPr>
           </w:pPr>
-          <w:hyperlink w:anchor="_Toc242198075" w:history="1">
+          <w:hyperlink w:anchor="_Toc242400683" w:history="1">
             <w:r>
               <w:rPr>
                 <w:rStyle w:val="Hipervnculo"/>
@@ -3848,7 +3848,7 @@
                 <w:noProof/>
                 <w:webHidden/>
               </w:rPr>
-              <w:instrText xml:space="preserve"> PAGEREF _Toc242198075 \h </w:instrText>
+              <w:instrText xml:space="preserve"> PAGEREF _Toc242400683 \h </w:instrText>
             </w:r>
             <w:r>
               <w:rPr>
@@ -3890,7 +3890,7 @@
               <w14:ligatures w14:val="standardContextual"/>
             </w:rPr>
           </w:pPr>
-          <w:hyperlink w:anchor="_Toc242198076" w:history="1">
+          <w:hyperlink w:anchor="_Toc242400684" w:history="1">
             <w:r>
               <w:rPr>
                 <w:rStyle w:val="Hipervnculo"/>
@@ -3919,7 +3919,7 @@
                 <w:noProof/>
                 <w:webHidden/>
               </w:rPr>
-              <w:instrText xml:space="preserve"> PAGEREF _Toc242198076 \h </w:instrText>
+              <w:instrText xml:space="preserve"> PAGEREF _Toc242400684 \h </w:instrText>
             </w:r>
             <w:r>
               <w:rPr>
@@ -3964,7 +3964,7 @@
               <w14:ligatures w14:val="standardContextual"/>
             </w:rPr>
           </w:pPr>
-          <w:hyperlink w:anchor="_Toc242198077" w:history="1">
+          <w:hyperlink w:anchor="_Toc242400685" w:history="1">
             <w:r>
               <w:rPr>
                 <w:rStyle w:val="Hipervnculo"/>
@@ -3991,7 +3991,7 @@
                 <w:noProof/>
                 <w:webHidden/>
               </w:rPr>
-              <w:instrText xml:space="preserve"> PAGEREF _Toc242198077 \h </w:instrText>
+              <w:instrText xml:space="preserve"> PAGEREF _Toc242400685 \h </w:instrText>
             </w:r>
             <w:r>
               <w:rPr>
@@ -4033,7 +4033,7 @@
               <w14:ligatures w14:val="standardContextual"/>
             </w:rPr>
           </w:pPr>
-          <w:hyperlink w:anchor="_Toc242198078" w:history="1">
+          <w:hyperlink w:anchor="_Toc242400686" w:history="1">
             <w:r>
               <w:rPr>
                 <w:rStyle w:val="Hipervnculo"/>
@@ -4061,7 +4061,7 @@
                 <w:noProof/>
                 <w:webHidden/>
               </w:rPr>
-              <w:instrText xml:space="preserve"> PAGEREF _Toc242198078 \h </w:instrText>
+              <w:instrText xml:space="preserve"> PAGEREF _Toc242400686 \h </w:instrText>
             </w:r>
             <w:r>
               <w:rPr>
@@ -4103,7 +4103,7 @@
               <w14:ligatures w14:val="standardContextual"/>
             </w:rPr>
           </w:pPr>
-          <w:hyperlink w:anchor="_Toc242198079" w:history="1">
+          <w:hyperlink w:anchor="_Toc242400687" w:history="1">
             <w:r>
               <w:rPr>
                 <w:rStyle w:val="Hipervnculo"/>
@@ -4131,7 +4131,7 @@
                 <w:noProof/>
                 <w:webHidden/>
               </w:rPr>
-              <w:instrText xml:space="preserve"> PAGEREF _Toc242198079 \h </w:instrText>
+              <w:instrText xml:space="preserve"> PAGEREF _Toc242400687 \h </w:instrText>
             </w:r>
             <w:r>
               <w:rPr>
@@ -4173,7 +4173,7 @@
               <w14:ligatures w14:val="standardContextual"/>
             </w:rPr>
           </w:pPr>
-          <w:hyperlink w:anchor="_Toc242198080" w:history="1">
+          <w:hyperlink w:anchor="_Toc242400688" w:history="1">
             <w:r>
               <w:rPr>
                 <w:rStyle w:val="Hipervnculo"/>
@@ -4201,7 +4201,7 @@
                 <w:noProof/>
                 <w:webHidden/>
               </w:rPr>
-              <w:instrText xml:space="preserve"> PAGEREF _Toc242198080 \h </w:instrText>
+              <w:instrText xml:space="preserve"> PAGEREF _Toc242400688 \h </w:instrText>
             </w:r>
             <w:r>
               <w:rPr>
@@ -4246,7 +4246,7 @@
               <w14:ligatures w14:val="standardContextual"/>
             </w:rPr>
           </w:pPr>
-          <w:hyperlink w:anchor="_Toc242198081" w:history="1">
+          <w:hyperlink w:anchor="_Toc242400689" w:history="1">
             <w:r>
               <w:rPr>
                 <w:rStyle w:val="Hipervnculo"/>
@@ -4273,7 +4273,7 @@
                 <w:noProof/>
                 <w:webHidden/>
               </w:rPr>
-              <w:instrText xml:space="preserve"> PAGEREF _Toc242198081 \h </w:instrText>
+              <w:instrText xml:space="preserve"> PAGEREF _Toc242400689 \h </w:instrText>
             </w:r>
             <w:r>
               <w:rPr>
@@ -4318,7 +4318,7 @@
               <w14:ligatures w14:val="standardContextual"/>
             </w:rPr>
           </w:pPr>
-          <w:hyperlink w:anchor="_Toc242198082" w:history="1">
+          <w:hyperlink w:anchor="_Toc242400690" w:history="1">
             <w:r>
               <w:rPr>
                 <w:rStyle w:val="Hipervnculo"/>
@@ -4345,7 +4345,7 @@
                 <w:noProof/>
                 <w:webHidden/>
               </w:rPr>
-              <w:instrText xml:space="preserve"> PAGEREF _Toc242198082 \h </w:instrText>
+              <w:instrText xml:space="preserve"> PAGEREF _Toc242400690 \h </w:instrText>
             </w:r>
             <w:r>
               <w:rPr>
@@ -4387,7 +4387,7 @@
               <w14:ligatures w14:val="standardContextual"/>
             </w:rPr>
           </w:pPr>
-          <w:hyperlink w:anchor="_Toc242198083" w:history="1">
+          <w:hyperlink w:anchor="_Toc242400691" w:history="1">
             <w:r>
               <w:rPr>
                 <w:rStyle w:val="Hipervnculo"/>
@@ -4416,7 +4416,7 @@
                 <w:noProof/>
                 <w:webHidden/>
               </w:rPr>
-              <w:instrText xml:space="preserve"> PAGEREF _Toc242198083 \h </w:instrText>
+              <w:instrText xml:space="preserve"> PAGEREF _Toc242400691 \h </w:instrText>
             </w:r>
             <w:r>
               <w:rPr>
@@ -4461,7 +4461,7 @@
               <w14:ligatures w14:val="standardContextual"/>
             </w:rPr>
           </w:pPr>
-          <w:hyperlink w:anchor="_Toc242198084" w:history="1">
+          <w:hyperlink w:anchor="_Toc242400692" w:history="1">
             <w:r>
               <w:rPr>
                 <w:rStyle w:val="Hipervnculo"/>
@@ -4488,7 +4488,7 @@
                 <w:noProof/>
                 <w:webHidden/>
               </w:rPr>
-              <w:instrText xml:space="preserve"> PAGEREF _Toc242198084 \h </w:instrText>
+              <w:instrText xml:space="preserve"> PAGEREF _Toc242400692 \h </w:instrText>
             </w:r>
             <w:r>
               <w:rPr>
@@ -4530,7 +4530,7 @@
               <w14:ligatures w14:val="standardContextual"/>
             </w:rPr>
           </w:pPr>
-          <w:hyperlink w:anchor="_Toc242198085" w:history="1">
+          <w:hyperlink w:anchor="_Toc242400693" w:history="1">
             <w:r>
               <w:rPr>
                 <w:rStyle w:val="Hipervnculo"/>
@@ -4558,7 +4558,7 @@
                 <w:noProof/>
                 <w:webHidden/>
               </w:rPr>
-              <w:instrText xml:space="preserve"> PAGEREF _Toc242198085 \h </w:instrText>
+              <w:instrText xml:space="preserve"> PAGEREF _Toc242400693 \h </w:instrText>
             </w:r>
             <w:r>
               <w:rPr>
@@ -4600,7 +4600,7 @@
               <w14:ligatures w14:val="standardContextual"/>
             </w:rPr>
           </w:pPr>
-          <w:hyperlink w:anchor="_Toc242198086" w:history="1">
+          <w:hyperlink w:anchor="_Toc242400694" w:history="1">
             <w:r>
               <w:rPr>
                 <w:rStyle w:val="Hipervnculo"/>
@@ -4628,7 +4628,7 @@
                 <w:noProof/>
                 <w:webHidden/>
               </w:rPr>
-              <w:instrText xml:space="preserve"> PAGEREF _Toc242198086 \h </w:instrText>
+              <w:instrText xml:space="preserve"> PAGEREF _Toc242400694 \h </w:instrText>
             </w:r>
             <w:r>
               <w:rPr>
@@ -4670,7 +4670,7 @@
               <w14:ligatures w14:val="standardContextual"/>
             </w:rPr>
           </w:pPr>
-          <w:hyperlink w:anchor="_Toc242198087" w:history="1">
+          <w:hyperlink w:anchor="_Toc242400695" w:history="1">
             <w:r>
               <w:rPr>
                 <w:rStyle w:val="Hipervnculo"/>
@@ -4698,7 +4698,7 @@
                 <w:noProof/>
                 <w:webHidden/>
               </w:rPr>
-              <w:instrText xml:space="preserve"> PAGEREF _Toc242198087 \h </w:instrText>
+              <w:instrText xml:space="preserve"> PAGEREF _Toc242400695 \h </w:instrText>
             </w:r>
             <w:r>
               <w:rPr>
@@ -4740,7 +4740,7 @@
               <w14:ligatures w14:val="standardContextual"/>
             </w:rPr>
           </w:pPr>
-          <w:hyperlink w:anchor="_Toc242198088" w:history="1">
+          <w:hyperlink w:anchor="_Toc242400696" w:history="1">
             <w:r>
               <w:rPr>
                 <w:rStyle w:val="Hipervnculo"/>
@@ -4768,7 +4768,7 @@
                 <w:noProof/>
                 <w:webHidden/>
               </w:rPr>
-              <w:instrText xml:space="preserve"> PAGEREF _Toc242198088 \h </w:instrText>
+              <w:instrText xml:space="preserve"> PAGEREF _Toc242400696 \h </w:instrText>
             </w:r>
             <w:r>
               <w:rPr>
@@ -4813,7 +4813,7 @@
               <w14:ligatures w14:val="standardContextual"/>
             </w:rPr>
           </w:pPr>
-          <w:hyperlink w:anchor="_Toc242198089" w:history="1">
+          <w:hyperlink w:anchor="_Toc242400697" w:history="1">
             <w:r>
               <w:rPr>
                 <w:rStyle w:val="Hipervnculo"/>
@@ -4840,7 +4840,7 @@
                 <w:noProof/>
                 <w:webHidden/>
               </w:rPr>
-              <w:instrText xml:space="preserve"> PAGEREF _Toc242198089 \h </w:instrText>
+              <w:instrText xml:space="preserve"> PAGEREF _Toc242400697 \h </w:instrText>
             </w:r>
             <w:r>
               <w:rPr>
@@ -4885,7 +4885,7 @@
               <w14:ligatures w14:val="standardContextual"/>
             </w:rPr>
           </w:pPr>
-          <w:hyperlink w:anchor="_Toc242198090" w:history="1">
+          <w:hyperlink w:anchor="_Toc242400698" w:history="1">
             <w:r>
               <w:rPr>
                 <w:rStyle w:val="Hipervnculo"/>
@@ -4912,7 +4912,7 @@
                 <w:noProof/>
                 <w:webHidden/>
               </w:rPr>
-              <w:instrText xml:space="preserve"> PAGEREF _Toc242198090 \h </w:instrText>
+              <w:instrText xml:space="preserve"> PAGEREF _Toc242400698 \h </w:instrText>
             </w:r>
             <w:r>
               <w:rPr>
@@ -4954,7 +4954,7 @@
               <w14:ligatures w14:val="standardContextual"/>
             </w:rPr>
           </w:pPr>
-          <w:hyperlink w:anchor="_Toc242198091" w:history="1">
+          <w:hyperlink w:anchor="_Toc242400699" w:history="1">
             <w:r>
               <w:rPr>
                 <w:rStyle w:val="Hipervnculo"/>
@@ -4983,7 +4983,7 @@
                 <w:noProof/>
                 <w:webHidden/>
               </w:rPr>
-              <w:instrText xml:space="preserve"> PAGEREF _Toc242198091 \h </w:instrText>
+              <w:instrText xml:space="preserve"> PAGEREF _Toc242400699 \h </w:instrText>
             </w:r>
             <w:r>
               <w:rPr>
@@ -5028,7 +5028,7 @@
               <w14:ligatures w14:val="standardContextual"/>
             </w:rPr>
           </w:pPr>
-          <w:hyperlink w:anchor="_Toc242198092" w:history="1">
+          <w:hyperlink w:anchor="_Toc242400700" w:history="1">
             <w:r>
               <w:rPr>
                 <w:rStyle w:val="Hipervnculo"/>
@@ -5055,7 +5055,7 @@
                 <w:noProof/>
                 <w:webHidden/>
               </w:rPr>
-              <w:instrText xml:space="preserve"> PAGEREF _Toc242198092 \h </w:instrText>
+              <w:instrText xml:space="preserve"> PAGEREF _Toc242400700 \h </w:instrText>
             </w:r>
             <w:r>
               <w:rPr>
@@ -5097,7 +5097,7 @@
               <w14:ligatures w14:val="standardContextual"/>
             </w:rPr>
           </w:pPr>
-          <w:hyperlink w:anchor="_Toc242198093" w:history="1">
+          <w:hyperlink w:anchor="_Toc242400701" w:history="1">
             <w:r>
               <w:rPr>
                 <w:rStyle w:val="Hipervnculo"/>
@@ -5125,7 +5125,7 @@
                 <w:noProof/>
                 <w:webHidden/>
               </w:rPr>
-              <w:instrText xml:space="preserve"> PAGEREF _Toc242198093 \h </w:instrText>
+              <w:instrText xml:space="preserve"> PAGEREF _Toc242400701 \h </w:instrText>
             </w:r>
             <w:r>
               <w:rPr>
@@ -5167,7 +5167,7 @@
               <w14:ligatures w14:val="standardContextual"/>
             </w:rPr>
           </w:pPr>
-          <w:hyperlink w:anchor="_Toc242198094" w:history="1">
+          <w:hyperlink w:anchor="_Toc242400702" w:history="1">
             <w:r>
               <w:rPr>
                 <w:rStyle w:val="Hipervnculo"/>
@@ -5195,7 +5195,7 @@
                 <w:noProof/>
                 <w:webHidden/>
               </w:rPr>
-              <w:instrText xml:space="preserve"> PAGEREF _Toc242198094 \h </w:instrText>
+              <w:instrText xml:space="preserve"> PAGEREF _Toc242400702 \h </w:instrText>
             </w:r>
             <w:r>
               <w:rPr>
@@ -5237,7 +5237,7 @@
               <w14:ligatures w14:val="standardContextual"/>
             </w:rPr>
           </w:pPr>
-          <w:hyperlink w:anchor="_Toc242198095" w:history="1">
+          <w:hyperlink w:anchor="_Toc242400703" w:history="1">
             <w:r>
               <w:rPr>
                 <w:rStyle w:val="Hipervnculo"/>
@@ -5265,7 +5265,7 @@
                 <w:noProof/>
                 <w:webHidden/>
               </w:rPr>
-              <w:instrText xml:space="preserve"> PAGEREF _Toc242198095 \h </w:instrText>
+              <w:instrText xml:space="preserve"> PAGEREF _Toc242400703 \h </w:instrText>
             </w:r>
             <w:r>
               <w:rPr>
@@ -5285,7 +5285,7 @@
                 <w:noProof/>
                 <w:webHidden/>
               </w:rPr>
-              <w:t>60</w:t>
+              <w:t>61</w:t>
             </w:r>
             <w:r>
               <w:rPr>
@@ -5307,7 +5307,7 @@
               <w14:ligatures w14:val="standardContextual"/>
             </w:rPr>
           </w:pPr>
-          <w:hyperlink w:anchor="_Toc242198096" w:history="1">
+          <w:hyperlink w:anchor="_Toc242400704" w:history="1">
             <w:r>
               <w:rPr>
                 <w:rStyle w:val="Hipervnculo"/>
@@ -5335,7 +5335,7 @@
                 <w:noProof/>
                 <w:webHidden/>
               </w:rPr>
-              <w:instrText xml:space="preserve"> PAGEREF _Toc242198096 \h </w:instrText>
+              <w:instrText xml:space="preserve"> PAGEREF _Toc242400704 \h </w:instrText>
             </w:r>
             <w:r>
               <w:rPr>
@@ -5355,7 +5355,7 @@
                 <w:noProof/>
                 <w:webHidden/>
               </w:rPr>
-              <w:t>62</w:t>
+              <w:t>63</w:t>
             </w:r>
             <w:r>
               <w:rPr>
@@ -5380,7 +5380,7 @@
               <w14:ligatures w14:val="standardContextual"/>
             </w:rPr>
           </w:pPr>
-          <w:hyperlink w:anchor="_Toc242198097" w:history="1">
+          <w:hyperlink w:anchor="_Toc242400705" w:history="1">
             <w:r>
               <w:rPr>
                 <w:rStyle w:val="Hipervnculo"/>
@@ -5407,7 +5407,7 @@
                 <w:noProof/>
                 <w:webHidden/>
               </w:rPr>
-              <w:instrText xml:space="preserve"> PAGEREF _Toc242198097 \h </w:instrText>
+              <w:instrText xml:space="preserve"> PAGEREF _Toc242400705 \h </w:instrText>
             </w:r>
             <w:r>
               <w:rPr>
@@ -5452,7 +5452,7 @@
               <w14:ligatures w14:val="standardContextual"/>
             </w:rPr>
           </w:pPr>
-          <w:hyperlink w:anchor="_Toc242198098" w:history="1">
+          <w:hyperlink w:anchor="_Toc242400706" w:history="1">
             <w:r>
               <w:rPr>
                 <w:rStyle w:val="Hipervnculo"/>
@@ -5479,7 +5479,7 @@
                 <w:noProof/>
                 <w:webHidden/>
               </w:rPr>
-              <w:instrText xml:space="preserve"> PAGEREF _Toc242198098 \h </w:instrText>
+              <w:instrText xml:space="preserve"> PAGEREF _Toc242400706 \h </w:instrText>
             </w:r>
             <w:r>
               <w:rPr>
@@ -5499,7 +5499,7 @@
                 <w:noProof/>
                 <w:webHidden/>
               </w:rPr>
-              <w:t>65</w:t>
+              <w:t>66</w:t>
             </w:r>
             <w:r>
               <w:rPr>
@@ -5521,7 +5521,7 @@
               <w14:ligatures w14:val="standardContextual"/>
             </w:rPr>
           </w:pPr>
-          <w:hyperlink w:anchor="_Toc242198099" w:history="1">
+          <w:hyperlink w:anchor="_Toc242400707" w:history="1">
             <w:r>
               <w:rPr>
                 <w:rStyle w:val="Hipervnculo"/>
@@ -5551,7 +5551,7 @@
                 <w:noProof/>
                 <w:webHidden/>
               </w:rPr>
-              <w:instrText xml:space="preserve"> PAGEREF _Toc242198099 \h </w:instrText>
+              <w:instrText xml:space="preserve"> PAGEREF _Toc242400707 \h </w:instrText>
             </w:r>
             <w:r>
               <w:rPr>
@@ -5571,7 +5571,7 @@
                 <w:noProof/>
                 <w:webHidden/>
               </w:rPr>
-              <w:t>66</w:t>
+              <w:t>67</w:t>
             </w:r>
             <w:r>
               <w:rPr>
@@ -5712,7 +5712,7 @@
         </w:rPr>
         <w:fldChar w:fldCharType="separate"/>
       </w:r>
-      <w:hyperlink w:anchor="_Toc242198100" w:history="1">
+      <w:hyperlink w:anchor="_Toc242400708" w:history="1">
         <w:r>
           <w:rPr>
             <w:rStyle w:val="Hipervnculo"/>
@@ -5740,7 +5740,7 @@
             <w:noProof/>
             <w:webHidden/>
           </w:rPr>
-          <w:instrText xml:space="preserve"> PAGEREF _Toc242198100 \h </w:instrText>
+          <w:instrText xml:space="preserve"> PAGEREF _Toc242400708 \h </w:instrText>
         </w:r>
         <w:r>
           <w:rPr>
@@ -5788,7 +5788,7 @@
           <w14:ligatures w14:val="standardContextual"/>
         </w:rPr>
       </w:pPr>
-      <w:hyperlink w:anchor="_Toc242198101" w:history="1">
+      <w:hyperlink w:anchor="_Toc242400709" w:history="1">
         <w:r>
           <w:rPr>
             <w:rStyle w:val="Hipervnculo"/>
@@ -5816,7 +5816,7 @@
             <w:noProof/>
             <w:webHidden/>
           </w:rPr>
-          <w:instrText xml:space="preserve"> PAGEREF _Toc242198101 \h </w:instrText>
+          <w:instrText xml:space="preserve"> PAGEREF _Toc242400709 \h </w:instrText>
         </w:r>
         <w:r>
           <w:rPr>
@@ -5864,7 +5864,7 @@
           <w14:ligatures w14:val="standardContextual"/>
         </w:rPr>
       </w:pPr>
-      <w:hyperlink w:anchor="_Toc242198102" w:history="1">
+      <w:hyperlink w:anchor="_Toc242400710" w:history="1">
         <w:r>
           <w:rPr>
             <w:rStyle w:val="Hipervnculo"/>
@@ -5892,7 +5892,7 @@
             <w:noProof/>
             <w:webHidden/>
           </w:rPr>
-          <w:instrText xml:space="preserve"> PAGEREF _Toc242198102 \h </w:instrText>
+          <w:instrText xml:space="preserve"> PAGEREF _Toc242400710 \h </w:instrText>
         </w:r>
         <w:r>
           <w:rPr>
@@ -5940,7 +5940,7 @@
           <w14:ligatures w14:val="standardContextual"/>
         </w:rPr>
       </w:pPr>
-      <w:hyperlink w:anchor="_Toc242198103" w:history="1">
+      <w:hyperlink w:anchor="_Toc242400711" w:history="1">
         <w:r>
           <w:rPr>
             <w:rStyle w:val="Hipervnculo"/>
@@ -5968,7 +5968,7 @@
             <w:noProof/>
             <w:webHidden/>
           </w:rPr>
-          <w:instrText xml:space="preserve"> PAGEREF _Toc242198103 \h </w:instrText>
+          <w:instrText xml:space="preserve"> PAGEREF _Toc242400711 \h </w:instrText>
         </w:r>
         <w:r>
           <w:rPr>
@@ -6016,7 +6016,7 @@
           <w14:ligatures w14:val="standardContextual"/>
         </w:rPr>
       </w:pPr>
-      <w:hyperlink w:anchor="_Toc242198104" w:history="1">
+      <w:hyperlink w:anchor="_Toc242400712" w:history="1">
         <w:r>
           <w:rPr>
             <w:rStyle w:val="Hipervnculo"/>
@@ -6044,7 +6044,7 @@
             <w:noProof/>
             <w:webHidden/>
           </w:rPr>
-          <w:instrText xml:space="preserve"> PAGEREF _Toc242198104 \h </w:instrText>
+          <w:instrText xml:space="preserve"> PAGEREF _Toc242400712 \h </w:instrText>
         </w:r>
         <w:r>
           <w:rPr>
@@ -6092,7 +6092,7 @@
           <w14:ligatures w14:val="standardContextual"/>
         </w:rPr>
       </w:pPr>
-      <w:hyperlink w:anchor="_Toc242198105" w:history="1">
+      <w:hyperlink w:anchor="_Toc242400713" w:history="1">
         <w:r>
           <w:rPr>
             <w:rStyle w:val="Hipervnculo"/>
@@ -6120,7 +6120,7 @@
             <w:noProof/>
             <w:webHidden/>
           </w:rPr>
-          <w:instrText xml:space="preserve"> PAGEREF _Toc242198105 \h </w:instrText>
+          <w:instrText xml:space="preserve"> PAGEREF _Toc242400713 \h </w:instrText>
         </w:r>
         <w:r>
           <w:rPr>
@@ -6168,7 +6168,7 @@
           <w14:ligatures w14:val="standardContextual"/>
         </w:rPr>
       </w:pPr>
-      <w:hyperlink w:anchor="_Toc242198106" w:history="1">
+      <w:hyperlink w:anchor="_Toc242400714" w:history="1">
         <w:r>
           <w:rPr>
             <w:rStyle w:val="Hipervnculo"/>
@@ -6196,7 +6196,7 @@
             <w:noProof/>
             <w:webHidden/>
           </w:rPr>
-          <w:instrText xml:space="preserve"> PAGEREF _Toc242198106 \h </w:instrText>
+          <w:instrText xml:space="preserve"> PAGEREF _Toc242400714 \h </w:instrText>
         </w:r>
         <w:r>
           <w:rPr>
@@ -6244,7 +6244,7 @@
           <w14:ligatures w14:val="standardContextual"/>
         </w:rPr>
       </w:pPr>
-      <w:hyperlink w:anchor="_Toc242198107" w:history="1">
+      <w:hyperlink w:anchor="_Toc242400715" w:history="1">
         <w:r>
           <w:rPr>
             <w:rStyle w:val="Hipervnculo"/>
@@ -6272,7 +6272,7 @@
             <w:noProof/>
             <w:webHidden/>
           </w:rPr>
-          <w:instrText xml:space="preserve"> PAGEREF _Toc242198107 \h </w:instrText>
+          <w:instrText xml:space="preserve"> PAGEREF _Toc242400715 \h </w:instrText>
         </w:r>
         <w:r>
           <w:rPr>
@@ -6320,7 +6320,7 @@
           <w14:ligatures w14:val="standardContextual"/>
         </w:rPr>
       </w:pPr>
-      <w:hyperlink w:anchor="_Toc242198108" w:history="1">
+      <w:hyperlink w:anchor="_Toc242400716" w:history="1">
         <w:r>
           <w:rPr>
             <w:rStyle w:val="Hipervnculo"/>
@@ -6348,7 +6348,7 @@
             <w:noProof/>
             <w:webHidden/>
           </w:rPr>
-          <w:instrText xml:space="preserve"> PAGEREF _Toc242198108 \h </w:instrText>
+          <w:instrText xml:space="preserve"> PAGEREF _Toc242400716 \h </w:instrText>
         </w:r>
         <w:r>
           <w:rPr>
@@ -6396,7 +6396,7 @@
           <w14:ligatures w14:val="standardContextual"/>
         </w:rPr>
       </w:pPr>
-      <w:hyperlink w:anchor="_Toc242198109" w:history="1">
+      <w:hyperlink w:anchor="_Toc242400717" w:history="1">
         <w:r>
           <w:rPr>
             <w:rStyle w:val="Hipervnculo"/>
@@ -6424,7 +6424,7 @@
             <w:noProof/>
             <w:webHidden/>
           </w:rPr>
-          <w:instrText xml:space="preserve"> PAGEREF _Toc242198109 \h </w:instrText>
+          <w:instrText xml:space="preserve"> PAGEREF _Toc242400717 \h </w:instrText>
         </w:r>
         <w:r>
           <w:rPr>
@@ -6444,7 +6444,7 @@
             <w:noProof/>
             <w:webHidden/>
           </w:rPr>
-          <w:t>64</w:t>
+          <w:t>65</w:t>
         </w:r>
         <w:r>
           <w:rPr>
@@ -6472,7 +6472,7 @@
           <w14:ligatures w14:val="standardContextual"/>
         </w:rPr>
       </w:pPr>
-      <w:hyperlink w:anchor="_Toc242198110" w:history="1">
+      <w:hyperlink w:anchor="_Toc242400718" w:history="1">
         <w:r>
           <w:rPr>
             <w:rStyle w:val="Hipervnculo"/>
@@ -6500,7 +6500,7 @@
             <w:noProof/>
             <w:webHidden/>
           </w:rPr>
-          <w:instrText xml:space="preserve"> PAGEREF _Toc242198110 \h </w:instrText>
+          <w:instrText xml:space="preserve"> PAGEREF _Toc242400718 \h </w:instrText>
         </w:r>
         <w:r>
           <w:rPr>
@@ -6520,7 +6520,7 @@
             <w:noProof/>
             <w:webHidden/>
           </w:rPr>
-          <w:t>64</w:t>
+          <w:t>65</w:t>
         </w:r>
         <w:r>
           <w:rPr>
@@ -6739,7 +6739,7 @@
         </w:rPr>
         <w:fldChar w:fldCharType="separate"/>
       </w:r>
-      <w:hyperlink w:anchor="_Toc242198111" w:history="1">
+      <w:hyperlink w:anchor="_Toc242400719" w:history="1">
         <w:r>
           <w:rPr>
             <w:rStyle w:val="Hipervnculo"/>
@@ -6767,7 +6767,7 @@
             <w:noProof/>
             <w:webHidden/>
           </w:rPr>
-          <w:instrText xml:space="preserve"> PAGEREF _Toc242198111 \h </w:instrText>
+          <w:instrText xml:space="preserve"> PAGEREF _Toc242400719 \h </w:instrText>
         </w:r>
         <w:r>
           <w:rPr>
@@ -6815,7 +6815,7 @@
           <w14:ligatures w14:val="standardContextual"/>
         </w:rPr>
       </w:pPr>
-      <w:hyperlink w:anchor="_Toc242198112" w:history="1">
+      <w:hyperlink w:anchor="_Toc242400720" w:history="1">
         <w:r>
           <w:rPr>
             <w:rStyle w:val="Hipervnculo"/>
@@ -6843,7 +6843,7 @@
             <w:noProof/>
             <w:webHidden/>
           </w:rPr>
-          <w:instrText xml:space="preserve"> PAGEREF _Toc242198112 \h </w:instrText>
+          <w:instrText xml:space="preserve"> PAGEREF _Toc242400720 \h </w:instrText>
         </w:r>
         <w:r>
           <w:rPr>
@@ -6891,7 +6891,7 @@
           <w14:ligatures w14:val="standardContextual"/>
         </w:rPr>
       </w:pPr>
-      <w:hyperlink w:anchor="_Toc242198113" w:history="1">
+      <w:hyperlink w:anchor="_Toc242400721" w:history="1">
         <w:r>
           <w:rPr>
             <w:rStyle w:val="Hipervnculo"/>
@@ -6927,7 +6927,7 @@
             <w:noProof/>
             <w:webHidden/>
           </w:rPr>
-          <w:instrText xml:space="preserve"> PAGEREF _Toc242198113 \h </w:instrText>
+          <w:instrText xml:space="preserve"> PAGEREF _Toc242400721 \h </w:instrText>
         </w:r>
         <w:r>
           <w:rPr>
@@ -6975,7 +6975,7 @@
           <w14:ligatures w14:val="standardContextual"/>
         </w:rPr>
       </w:pPr>
-      <w:hyperlink w:anchor="_Toc242198114" w:history="1">
+      <w:hyperlink w:anchor="_Toc242400722" w:history="1">
         <w:r>
           <w:rPr>
             <w:rStyle w:val="Hipervnculo"/>
@@ -7011,7 +7011,7 @@
             <w:noProof/>
             <w:webHidden/>
           </w:rPr>
-          <w:instrText xml:space="preserve"> PAGEREF _Toc242198114 \h </w:instrText>
+          <w:instrText xml:space="preserve"> PAGEREF _Toc242400722 \h </w:instrText>
         </w:r>
         <w:r>
           <w:rPr>
@@ -7059,7 +7059,7 @@
           <w14:ligatures w14:val="standardContextual"/>
         </w:rPr>
       </w:pPr>
-      <w:hyperlink w:anchor="_Toc242198115" w:history="1">
+      <w:hyperlink w:anchor="_Toc242400723" w:history="1">
         <w:r>
           <w:rPr>
             <w:rStyle w:val="Hipervnculo"/>
@@ -7087,7 +7087,7 @@
             <w:noProof/>
             <w:webHidden/>
           </w:rPr>
-          <w:instrText xml:space="preserve"> PAGEREF _Toc242198115 \h </w:instrText>
+          <w:instrText xml:space="preserve"> PAGEREF _Toc242400723 \h </w:instrText>
         </w:r>
         <w:r>
           <w:rPr>
@@ -7135,7 +7135,7 @@
           <w14:ligatures w14:val="standardContextual"/>
         </w:rPr>
       </w:pPr>
-      <w:hyperlink w:anchor="_Toc242198116" w:history="1">
+      <w:hyperlink w:anchor="_Toc242400724" w:history="1">
         <w:r>
           <w:rPr>
             <w:rStyle w:val="Hipervnculo"/>
@@ -7163,7 +7163,7 @@
             <w:noProof/>
             <w:webHidden/>
           </w:rPr>
-          <w:instrText xml:space="preserve"> PAGEREF _Toc242198116 \h </w:instrText>
+          <w:instrText xml:space="preserve"> PAGEREF _Toc242400724 \h </w:instrText>
         </w:r>
         <w:r>
           <w:rPr>
@@ -7211,7 +7211,7 @@
           <w14:ligatures w14:val="standardContextual"/>
         </w:rPr>
       </w:pPr>
-      <w:hyperlink w:anchor="_Toc242198117" w:history="1">
+      <w:hyperlink w:anchor="_Toc242400725" w:history="1">
         <w:r>
           <w:rPr>
             <w:rStyle w:val="Hipervnculo"/>
@@ -7239,83 +7239,7 @@
             <w:noProof/>
             <w:webHidden/>
           </w:rPr>
-          <w:instrText xml:space="preserve"> PAGEREF _Toc242198117 \h </w:instrText>
-        </w:r>
-        <w:r>
-          <w:rPr>
-            <w:noProof/>
-            <w:webHidden/>
-          </w:rPr>
-        </w:r>
-        <w:r>
-          <w:rPr>
-            <w:noProof/>
-            <w:webHidden/>
-          </w:rPr>
-          <w:fldChar w:fldCharType="separate"/>
-        </w:r>
-        <w:r>
-          <w:rPr>
-            <w:noProof/>
-            <w:webHidden/>
-          </w:rPr>
-          <w:t>61</w:t>
-        </w:r>
-        <w:r>
-          <w:rPr>
-            <w:noProof/>
-            <w:webHidden/>
-          </w:rPr>
-          <w:fldChar w:fldCharType="end"/>
-        </w:r>
-      </w:hyperlink>
-    </w:p>
-    <w:p>
-      <w:pPr>
-        <w:pStyle w:val="Tabladeilustraciones"/>
-        <w:tabs>
-          <w:tab w:val="right" w:leader="dot" w:pos="9964"/>
-        </w:tabs>
-        <w:rPr>
-          <w:rFonts w:eastAsiaTheme="minorEastAsia" w:cstheme="minorBidi"/>
-          <w:smallCaps w:val="0"/>
-          <w:noProof/>
-          <w:color w:val="auto"/>
-          <w:kern w:val="2"/>
-          <w:sz w:val="24"/>
-          <w:szCs w:val="24"/>
-          <w14:ligatures w14:val="standardContextual"/>
-        </w:rPr>
-      </w:pPr>
-      <w:hyperlink w:anchor="_Toc242198118" w:history="1">
-        <w:r>
-          <w:rPr>
-            <w:rStyle w:val="Hipervnculo"/>
-            <w:rFonts w:cs="Arial"/>
-            <w:noProof/>
-          </w:rPr>
-          <w:t>Figura 8. Recolección de materiales en el Nivel 3, con la lista de tareas y las flechas en pantalla</w:t>
-        </w:r>
-        <w:r>
-          <w:rPr>
-            <w:noProof/>
-            <w:webHidden/>
-          </w:rPr>
-          <w:tab/>
-        </w:r>
-        <w:r>
-          <w:rPr>
-            <w:noProof/>
-            <w:webHidden/>
-          </w:rPr>
-          <w:fldChar w:fldCharType="begin"/>
-        </w:r>
-        <w:r>
-          <w:rPr>
-            <w:noProof/>
-            <w:webHidden/>
-          </w:rPr>
-          <w:instrText xml:space="preserve"> PAGEREF _Toc242198118 \h </w:instrText>
+          <w:instrText xml:space="preserve"> PAGEREF _Toc242400725 \h </w:instrText>
         </w:r>
         <w:r>
           <w:rPr>
@@ -7348,6 +7272,82 @@
     </w:p>
     <w:p>
       <w:pPr>
+        <w:pStyle w:val="Tabladeilustraciones"/>
+        <w:tabs>
+          <w:tab w:val="right" w:leader="dot" w:pos="9964"/>
+        </w:tabs>
+        <w:rPr>
+          <w:rFonts w:eastAsiaTheme="minorEastAsia" w:cstheme="minorBidi"/>
+          <w:smallCaps w:val="0"/>
+          <w:noProof/>
+          <w:color w:val="auto"/>
+          <w:kern w:val="2"/>
+          <w:sz w:val="24"/>
+          <w:szCs w:val="24"/>
+          <w14:ligatures w14:val="standardContextual"/>
+        </w:rPr>
+      </w:pPr>
+      <w:hyperlink w:anchor="_Toc242400726" w:history="1">
+        <w:r>
+          <w:rPr>
+            <w:rStyle w:val="Hipervnculo"/>
+            <w:rFonts w:cs="Arial"/>
+            <w:noProof/>
+          </w:rPr>
+          <w:t>Figura 8. Recolección de materiales en el Nivel 3, con la lista de tareas y las flechas en pantalla</w:t>
+        </w:r>
+        <w:r>
+          <w:rPr>
+            <w:noProof/>
+            <w:webHidden/>
+          </w:rPr>
+          <w:tab/>
+        </w:r>
+        <w:r>
+          <w:rPr>
+            <w:noProof/>
+            <w:webHidden/>
+          </w:rPr>
+          <w:fldChar w:fldCharType="begin"/>
+        </w:r>
+        <w:r>
+          <w:rPr>
+            <w:noProof/>
+            <w:webHidden/>
+          </w:rPr>
+          <w:instrText xml:space="preserve"> PAGEREF _Toc242400726 \h </w:instrText>
+        </w:r>
+        <w:r>
+          <w:rPr>
+            <w:noProof/>
+            <w:webHidden/>
+          </w:rPr>
+        </w:r>
+        <w:r>
+          <w:rPr>
+            <w:noProof/>
+            <w:webHidden/>
+          </w:rPr>
+          <w:fldChar w:fldCharType="separate"/>
+        </w:r>
+        <w:r>
+          <w:rPr>
+            <w:noProof/>
+            <w:webHidden/>
+          </w:rPr>
+          <w:t>62</w:t>
+        </w:r>
+        <w:r>
+          <w:rPr>
+            <w:noProof/>
+            <w:webHidden/>
+          </w:rPr>
+          <w:fldChar w:fldCharType="end"/>
+        </w:r>
+      </w:hyperlink>
+    </w:p>
+    <w:p>
+      <w:pPr>
         <w:tabs>
           <w:tab w:val="right" w:pos="9352"/>
         </w:tabs>
@@ -8504,7 +8504,7 @@
       </w:pPr>
       <w:bookmarkStart w:id="3" w:name="_Toc475112151"/>
       <w:bookmarkStart w:id="4" w:name="_Toc475115507"/>
-      <w:bookmarkStart w:id="5" w:name="_Toc242198036"/>
+      <w:bookmarkStart w:id="5" w:name="_Toc242400644"/>
       <w:r>
         <w:rPr>
           <w:rFonts w:cs="Arial"/>
@@ -8656,7 +8656,7 @@
           <w:caps w:val="0"/>
         </w:rPr>
       </w:pPr>
-      <w:bookmarkStart w:id="6" w:name="_Toc242198037"/>
+      <w:bookmarkStart w:id="6" w:name="_Toc242400645"/>
       <w:r>
         <w:rPr>
           <w:rFonts w:cs="Arial"/>
@@ -8705,7 +8705,7 @@
       </w:pPr>
       <w:bookmarkStart w:id="7" w:name="_Toc475112154"/>
       <w:bookmarkStart w:id="8" w:name="_Toc475115510"/>
-      <w:bookmarkStart w:id="9" w:name="_Toc242198038"/>
+      <w:bookmarkStart w:id="9" w:name="_Toc242400646"/>
       <w:r>
         <w:t>1.1 Planteamiento del problema</w:t>
       </w:r>
@@ -8762,7 +8762,7 @@
           <w:iCs w:val="0"/>
         </w:rPr>
       </w:pPr>
-      <w:bookmarkStart w:id="10" w:name="_Toc242198111"/>
+      <w:bookmarkStart w:id="10" w:name="_Toc242400719"/>
       <w:r>
         <w:rPr>
           <w:rFonts w:cs="Arial"/>
@@ -8983,7 +8983,7 @@
           <w:iCs w:val="0"/>
         </w:rPr>
       </w:pPr>
-      <w:bookmarkStart w:id="11" w:name="_Toc242198112"/>
+      <w:bookmarkStart w:id="11" w:name="_Toc242400720"/>
       <w:r>
         <w:rPr>
           <w:rFonts w:cs="Arial"/>
@@ -9131,7 +9131,7 @@
           <w:rFonts w:eastAsia="Arial" w:cs="Arial"/>
         </w:rPr>
       </w:pPr>
-      <w:bookmarkStart w:id="12" w:name="_Toc242198113"/>
+      <w:bookmarkStart w:id="12" w:name="_Toc242400721"/>
       <w:r>
         <w:rPr>
           <w:rFonts w:cs="Arial"/>
@@ -9382,7 +9382,7 @@
       </w:pPr>
       <w:bookmarkStart w:id="13" w:name="_Toc475112156"/>
       <w:bookmarkStart w:id="14" w:name="_Toc475115512"/>
-      <w:bookmarkStart w:id="15" w:name="_Toc242198039"/>
+      <w:bookmarkStart w:id="15" w:name="_Toc242400647"/>
       <w:r>
         <w:t>1.2 Pregunta de investigación</w:t>
       </w:r>
@@ -9433,7 +9433,7 @@
       <w:pPr>
         <w:pStyle w:val="Ttulo2"/>
       </w:pPr>
-      <w:bookmarkStart w:id="16" w:name="_Toc242198040"/>
+      <w:bookmarkStart w:id="16" w:name="_Toc242400648"/>
       <w:r>
         <w:t>1.3 Justificación</w:t>
       </w:r>
@@ -9562,7 +9562,7 @@
           <w:iCs w:val="0"/>
         </w:rPr>
       </w:pPr>
-      <w:bookmarkStart w:id="17" w:name="_Toc242198114"/>
+      <w:bookmarkStart w:id="17" w:name="_Toc242400722"/>
       <w:r>
         <w:rPr>
           <w:rFonts w:cs="Arial"/>
@@ -9737,7 +9737,7 @@
       </w:pPr>
       <w:bookmarkStart w:id="18" w:name="_Toc475112155"/>
       <w:bookmarkStart w:id="19" w:name="_Toc475115511"/>
-      <w:bookmarkStart w:id="20" w:name="_Toc242198041"/>
+      <w:bookmarkStart w:id="20" w:name="_Toc242400649"/>
       <w:r>
         <w:t>1.4 Antecedentes del</w:t>
       </w:r>
@@ -9891,7 +9891,7 @@
           <w:caps w:val="0"/>
         </w:rPr>
       </w:pPr>
-      <w:bookmarkStart w:id="21" w:name="_Toc242198042"/>
+      <w:bookmarkStart w:id="21" w:name="_Toc242400650"/>
       <w:r>
         <w:rPr>
           <w:rFonts w:cs="Arial"/>
@@ -9932,7 +9932,7 @@
       </w:pPr>
       <w:bookmarkStart w:id="22" w:name="_Toc475112161"/>
       <w:bookmarkStart w:id="23" w:name="_Toc475115517"/>
-      <w:bookmarkStart w:id="24" w:name="_Toc242198043"/>
+      <w:bookmarkStart w:id="24" w:name="_Toc242400651"/>
       <w:r>
         <w:t>2.1 Objetivo general</w:t>
       </w:r>
@@ -9991,7 +9991,7 @@
         <w:pStyle w:val="Ttulo2"/>
         <w:ind w:left="567" w:hanging="576"/>
       </w:pPr>
-      <w:bookmarkStart w:id="27" w:name="_Toc242198044"/>
+      <w:bookmarkStart w:id="27" w:name="_Toc242400652"/>
       <w:r>
         <w:t>2.2 Objetivos específicos</w:t>
       </w:r>
@@ -10117,7 +10117,7 @@
       </w:pPr>
       <w:bookmarkStart w:id="28" w:name="_Toc475112165"/>
       <w:bookmarkStart w:id="29" w:name="_Toc475115521"/>
-      <w:bookmarkStart w:id="30" w:name="_Toc242198045"/>
+      <w:bookmarkStart w:id="30" w:name="_Toc242400653"/>
       <w:r>
         <w:rPr>
           <w:rFonts w:cs="Arial"/>
@@ -10146,7 +10146,7 @@
       </w:pPr>
       <w:bookmarkStart w:id="31" w:name="_Toc475112166"/>
       <w:bookmarkStart w:id="32" w:name="_Toc475115522"/>
-      <w:bookmarkStart w:id="33" w:name="_Toc242198046"/>
+      <w:bookmarkStart w:id="33" w:name="_Toc242400654"/>
       <w:r>
         <w:t>3.1 Marco conceptual</w:t>
       </w:r>
@@ -10168,7 +10168,7 @@
           <w:rFonts w:cs="Arial"/>
         </w:rPr>
       </w:pPr>
-      <w:bookmarkStart w:id="34" w:name="_Toc242198047"/>
+      <w:bookmarkStart w:id="34" w:name="_Toc242400655"/>
       <w:r>
         <w:t>3.1.1 El pensamiento computacional (PC):</w:t>
       </w:r>
@@ -10461,7 +10461,7 @@
           <w:bCs/>
         </w:rPr>
       </w:pPr>
-      <w:bookmarkStart w:id="35" w:name="_Toc242198048"/>
+      <w:bookmarkStart w:id="35" w:name="_Toc242400656"/>
       <w:r>
         <w:t>3.1.2. Pruebas Bebras:</w:t>
       </w:r>
@@ -10497,7 +10497,7 @@
           <w:rFonts w:cs="Arial"/>
         </w:rPr>
       </w:pPr>
-      <w:bookmarkStart w:id="36" w:name="_Toc242198049"/>
+      <w:bookmarkStart w:id="36" w:name="_Toc242400657"/>
       <w:r>
         <w:t>3.1.3. teoría del flujo</w:t>
       </w:r>
@@ -10519,7 +10519,7 @@
           <w:iCs w:val="0"/>
         </w:rPr>
       </w:pPr>
-      <w:bookmarkStart w:id="37" w:name="_Toc242198115"/>
+      <w:bookmarkStart w:id="37" w:name="_Toc242400723"/>
       <w:r>
         <w:rPr>
           <w:rFonts w:cs="Arial"/>
@@ -10665,7 +10665,7 @@
       <w:pPr>
         <w:pStyle w:val="Ttulo3"/>
       </w:pPr>
-      <w:bookmarkStart w:id="38" w:name="_Toc242198050"/>
+      <w:bookmarkStart w:id="38" w:name="_Toc242400658"/>
       <w:r>
         <w:t>3.1.4. Teoría de la Autodeterminación</w:t>
       </w:r>
@@ -11165,7 +11165,7 @@
           <w:rFonts w:eastAsia="Arial" w:cs="Arial"/>
         </w:rPr>
       </w:pPr>
-      <w:bookmarkStart w:id="39" w:name="_Toc242198051"/>
+      <w:bookmarkStart w:id="39" w:name="_Toc242400659"/>
       <w:r>
         <w:t>3.1.6 GOLDEN PATH</w:t>
       </w:r>
@@ -11206,7 +11206,7 @@
           <w:rFonts w:eastAsia="Arial" w:cs="Arial"/>
         </w:rPr>
       </w:pPr>
-      <w:bookmarkStart w:id="40" w:name="_Toc242198052"/>
+      <w:bookmarkStart w:id="40" w:name="_Toc242400660"/>
       <w:r>
         <w:t>3.1.7 Gamificación</w:t>
       </w:r>
@@ -11264,7 +11264,7 @@
       </w:pPr>
       <w:bookmarkStart w:id="41" w:name="_Toc475112167"/>
       <w:bookmarkStart w:id="42" w:name="_Toc475115523"/>
-      <w:bookmarkStart w:id="43" w:name="_Toc242198053"/>
+      <w:bookmarkStart w:id="43" w:name="_Toc242400661"/>
       <w:r>
         <w:t>3.2 Marco teórico</w:t>
       </w:r>
@@ -11286,7 +11286,7 @@
           <w:rFonts w:cs="Arial"/>
         </w:rPr>
       </w:pPr>
-      <w:bookmarkStart w:id="44" w:name="_Toc242198054"/>
+      <w:bookmarkStart w:id="44" w:name="_Toc242400662"/>
       <w:r>
         <w:t>3.2.1 Aprendizaje basado en juegos (ABJ)</w:t>
       </w:r>
@@ -11504,7 +11504,7 @@
           <w:caps w:val="0"/>
         </w:rPr>
       </w:pPr>
-      <w:bookmarkStart w:id="45" w:name="_Toc242198055"/>
+      <w:bookmarkStart w:id="45" w:name="_Toc242400663"/>
       <w:r>
         <w:t xml:space="preserve">3.2.2. </w:t>
       </w:r>
@@ -11549,7 +11549,7 @@
           <w:caps w:val="0"/>
         </w:rPr>
       </w:pPr>
-      <w:bookmarkStart w:id="46" w:name="_Toc242198056"/>
+      <w:bookmarkStart w:id="46" w:name="_Toc242400664"/>
       <w:r>
         <w:t xml:space="preserve">3.2.3 </w:t>
       </w:r>
@@ -11912,7 +11912,7 @@
       <w:pPr>
         <w:pStyle w:val="Ttulo3"/>
       </w:pPr>
-      <w:bookmarkStart w:id="47" w:name="_Toc242198057"/>
+      <w:bookmarkStart w:id="47" w:name="_Toc242400665"/>
       <w:r>
         <w:t>3.2.</w:t>
       </w:r>
@@ -12052,7 +12052,7 @@
           <w:bCs/>
         </w:rPr>
       </w:pPr>
-      <w:bookmarkStart w:id="48" w:name="_Toc242198058"/>
+      <w:bookmarkStart w:id="48" w:name="_Toc242400666"/>
       <w:r>
         <w:t>3.2.</w:t>
       </w:r>
@@ -12177,7 +12177,7 @@
           <w:rFonts w:cs="Arial"/>
         </w:rPr>
       </w:pPr>
-      <w:bookmarkStart w:id="49" w:name="_Toc242198059"/>
+      <w:bookmarkStart w:id="49" w:name="_Toc242400667"/>
       <w:r>
         <w:t>3.2.</w:t>
       </w:r>
@@ -12296,7 +12296,7 @@
           <w:rFonts w:cs="Arial"/>
         </w:rPr>
       </w:pPr>
-      <w:bookmarkStart w:id="50" w:name="_Toc242198060"/>
+      <w:bookmarkStart w:id="50" w:name="_Toc242400668"/>
       <w:r>
         <w:t>3.2.</w:t>
       </w:r>
@@ -12362,7 +12362,7 @@
       </w:pPr>
       <w:bookmarkStart w:id="51" w:name="_Toc475112168"/>
       <w:bookmarkStart w:id="52" w:name="_Toc475115524"/>
-      <w:bookmarkStart w:id="53" w:name="_Toc242198061"/>
+      <w:bookmarkStart w:id="53" w:name="_Toc242400669"/>
       <w:r>
         <w:t>3.3 Marco jurídico</w:t>
       </w:r>
@@ -12393,7 +12393,7 @@
           <w:rFonts w:cs="Arial"/>
         </w:rPr>
       </w:pPr>
-      <w:bookmarkStart w:id="54" w:name="_Toc242198062"/>
+      <w:bookmarkStart w:id="54" w:name="_Toc242400670"/>
       <w:r>
         <w:t>3.3.1. Tratamiento de datos personales y régimen de habeas data</w:t>
       </w:r>
@@ -12758,7 +12758,7 @@
       <w:pPr>
         <w:pStyle w:val="Ttulo3"/>
       </w:pPr>
-      <w:bookmarkStart w:id="55" w:name="_Toc242198063"/>
+      <w:bookmarkStart w:id="55" w:name="_Toc242400671"/>
       <w:r>
         <w:t>3.3.2. Derechos de autor sobre los personajes utilizados</w:t>
       </w:r>
@@ -13009,7 +13009,7 @@
       </w:pPr>
       <w:bookmarkStart w:id="56" w:name="_Toc475112170"/>
       <w:bookmarkStart w:id="57" w:name="_Toc475115526"/>
-      <w:bookmarkStart w:id="58" w:name="_Toc242198064"/>
+      <w:bookmarkStart w:id="58" w:name="_Toc242400672"/>
       <w:r>
         <w:rPr>
           <w:color w:val="auto"/>
@@ -13095,7 +13095,7 @@
           <w:caps w:val="0"/>
         </w:rPr>
       </w:pPr>
-      <w:bookmarkStart w:id="61" w:name="_Toc242198065"/>
+      <w:bookmarkStart w:id="61" w:name="_Toc242400673"/>
       <w:r>
         <w:rPr>
           <w:rFonts w:cs="Arial"/>
@@ -13498,7 +13498,7 @@
       </w:pPr>
       <w:bookmarkStart w:id="62" w:name="_Toc475112172"/>
       <w:bookmarkStart w:id="63" w:name="_Toc475115528"/>
-      <w:bookmarkStart w:id="64" w:name="_Toc242198066"/>
+      <w:bookmarkStart w:id="64" w:name="_Toc242400674"/>
       <w:r>
         <w:rPr>
           <w:rFonts w:cs="Arial"/>
@@ -13650,7 +13650,7 @@
         <w:pStyle w:val="Ttulo2"/>
         <w:ind w:left="567" w:hanging="576"/>
       </w:pPr>
-      <w:bookmarkStart w:id="65" w:name="_Toc242198067"/>
+      <w:bookmarkStart w:id="65" w:name="_Toc242400675"/>
       <w:r>
         <w:lastRenderedPageBreak/>
         <w:t>5.1 Fases del trabajo de grado</w:t>
@@ -13694,7 +13694,7 @@
         <w:pStyle w:val="Ttulo3"/>
         <w:spacing w:before="240"/>
       </w:pPr>
-      <w:bookmarkStart w:id="66" w:name="_Toc242198068"/>
+      <w:bookmarkStart w:id="66" w:name="_Toc242400676"/>
       <w:r>
         <w:t>5.1.1 Apertura del trabajo con Árcade y Kanban</w:t>
       </w:r>
@@ -13741,7 +13741,7 @@
         <w:pStyle w:val="Ttulo3"/>
         <w:spacing w:before="240"/>
       </w:pPr>
-      <w:bookmarkStart w:id="67" w:name="_Toc242198069"/>
+      <w:bookmarkStart w:id="67" w:name="_Toc242400677"/>
       <w:r>
         <w:t>5.1.2 Diseño del guion</w:t>
       </w:r>
@@ -13788,7 +13788,7 @@
         <w:pStyle w:val="Ttulo3"/>
         <w:spacing w:before="240"/>
       </w:pPr>
-      <w:bookmarkStart w:id="68" w:name="_Toc242198070"/>
+      <w:bookmarkStart w:id="68" w:name="_Toc242400678"/>
       <w:r>
         <w:t>5.1.3 Especificación de requerimientos (objetivo 1)</w:t>
       </w:r>
@@ -13851,7 +13851,7 @@
         <w:pStyle w:val="Ttulo3"/>
         <w:spacing w:before="240"/>
       </w:pPr>
-      <w:bookmarkStart w:id="69" w:name="_Toc242198071"/>
+      <w:bookmarkStart w:id="69" w:name="_Toc242400679"/>
       <w:r>
         <w:t>5.1.4 Diseño del videojuego (objetivo 2)</w:t>
       </w:r>
@@ -13890,7 +13890,13 @@
         <w:spacing w:before="240" w:after="240"/>
       </w:pPr>
       <w:r>
-        <w:t>El acta D01 (02/09/2026) lleva el rótulo «Diseño» (momento 4, identificación y elaboración de assets). Vinculó a una colaboradora, estudiante de animación y diseño, y le entregó la dirección de arte. Quedó asentado que su participación es de diseño y asesoría gráfica y que las decisiones pedagógicas y de mecánica permanecen en los autores, y se fijó una sesión de revisión de assets cada miércoles a la 1:00 p. m. hasta el 30/09/2026. Su encabezado asigna ya la sesión al objetivo 3, de modo que es una de las actas que muestran el solape entre objetivos.</w:t>
+        <w:t xml:space="preserve">El acta D01 (02/09/2026) lleva el rótulo «Diseño» (momento 4, identificación y elaboración de assets). Vinculó a </w:t>
+      </w:r>
+      <w:r>
+        <w:t>Sofía Valentina Giraldo Segovia, estudiante de animación y diseño, contratada para el diseño y la asesoría de los sprites, y le entregó la dirección de arte. Quedó asentado que su participación es de diseño y asesoría gráfica y que la autoría del trabajo y las decisiones pedagógicas y de mecánica permanecen en los autores, y se fijó una sesión de revisión de assets cada miércoles a la 1:00 p. m. hasta el 30/09/2026. Su encabezado asigna ya la sesión al objetivo 3, de modo que es una de las actas que muestran el solape entre objetivos. El apartado 8.1.1 cuenta cómo se produjo cada sprite</w:t>
+      </w:r>
+      <w:r>
+        <w:t>.</w:t>
       </w:r>
     </w:p>
     <w:p>
@@ -13920,7 +13926,7 @@
         <w:pStyle w:val="Ttulo3"/>
         <w:spacing w:before="240"/>
       </w:pPr>
-      <w:bookmarkStart w:id="70" w:name="_Toc242198072"/>
+      <w:bookmarkStart w:id="70" w:name="_Toc242400680"/>
       <w:r>
         <w:t>5.1.5 Ciclo Diseño ↔ Desarrollo ↔ Pruebas (objetivo 3)</w:t>
       </w:r>
@@ -13939,7 +13945,11 @@
         <w:spacing w:before="240" w:after="240"/>
       </w:pPr>
       <w:r>
-        <w:t>La D02 retomó la planeación en cuatro incrementos de la O05, la contrastó con los 47 RF y revisó la fase de cimientos del primer slice, ya ejecutada a partir de la tarjeta O03-3 del 30/08/2026: 23 pruebas de lógica y 3 de integración superadas, con el tiempo de carga declarado como no verificado porque la ejecución por lotes no sirve para medirlo. Resolvió dos puntos que ningún documento fijaba. Reconfirmar una fase no sobrescribe el registro anterior, porque acumular inflaría los pasos utilizados, y se rechaza el nombre de perfil que no sirva como nombre de archivo, porque un nombre con separadores de ruta escribiría fuera de la carpeta portable. De las cuatro tareas de la fase siguiente (T05 a T08) se comprometieron solo las dos primeras, que se sostienen mutuamente y obligan a conectar por primera vez la persistencia con el disco.</w:t>
+        <w:t xml:space="preserve">La D02 retomó la planeación en cuatro incrementos de la O05, la contrastó con los 47 RF y revisó la fase de cimientos del primer slice, ya ejecutada a partir de la tarjeta O03-3 del 30/08/2026: 23 pruebas de lógica y 3 de integración superadas, con el tiempo de carga declarado como no verificado porque la ejecución por lotes no sirve para medirlo. Resolvió dos puntos que ningún documento fijaba. Reconfirmar una fase no sobrescribe el registro anterior, porque acumular inflaría los pasos utilizados, y se rechaza el nombre de perfil que no sirva como nombre de archivo, porque un nombre con separadores de ruta escribiría fuera de la carpeta portable. De las cuatro tareas de la fase siguiente (T05 a T08) se comprometieron solo las dos primeras, que se sostienen mutuamente y obligan a conectar por primera vez la </w:t>
+      </w:r>
+      <w:r>
+        <w:lastRenderedPageBreak/>
+        <w:t>persistencia con el disco.</w:t>
       </w:r>
     </w:p>
     <w:p>
@@ -13947,8 +13957,54 @@
         <w:spacing w:before="240" w:after="240"/>
       </w:pPr>
       <w:r>
+        <w:t>La D03 (06/09/2026) ejecutó esas dos tareas y conectó el corredor de pruebas al editor abierto, con lo que quedó habilitado escribir la prueba antes que el código; la O03, la O04, la O05 y la D02 habían dejado esa instalación como pendiente. Resolvió por precedencia del contrato del proyecto que la selección de perfil fuera un panel y no una escena, fijó con carácter provisional el título «Algoritm» y adoptó o descartó tres bocetos de entornos (la vista cenital del nivel 1 no se adoptó y se reservó para la fase 3 del nivel 2). Registró tres defectos hallados al ejecutar, entre ellos una prueba del tiempo de carga que podía pasar sin medir nada. Cerró con 34 de 34 pruebas de lógica y 16 de 16 de integración, y declaró que el punto de control de la fase no se cerraba porque faltaban el menú de niveles, los créditos y comprobaciones manuales.</w:t>
+      </w:r>
+    </w:p>
+    <w:p>
+      <w:pPr>
+        <w:spacing w:before="240" w:after="240"/>
+      </w:pPr>
+      <w:r>
+        <w:t>La D04 (09/09/2026), sesión de los miércoles con la colaboradora, tomó decisiones de arte con una medida real: el ejecutable portable armado el 08/09 pesaba 137 MB frente al máximo de 500 MB, de modo que los entornos se entregarían a 2048 × 1152 sin apretar la calidad. Resolvió la progresión de luz del nivel 1 con una máscara de opacidad variable sobre una sola pieza y no con cuatro entornos, para no multiplicar por cuatro el peso. Registró también que el ejecutable dejaba un archivo de registro y archivos de telemetría fuera de su carpeta de datos, defecto que exigía dos decisiones. La respuesta llegó el 29/09/2026 (decisión D3, acta D10): la analítica quedó apagada sin retirar ningún paquete.</w:t>
+      </w:r>
+    </w:p>
+    <w:p>
+      <w:pPr>
+        <w:spacing w:before="240" w:after="240"/>
+      </w:pPr>
+      <w:r>
+        <w:t>La D05 (13/09/2026) revisó la puesta en escena de los niveles 1 y 2 y halló dos escenas del guion que existían como contenido y que nada reproducía, y objetos que el texto nombra y quedaban bajo el cuadro de diálogo. Cuando objeto y encuadre no concordaban, se movió el objeto y no la cámara, porque los encuadres son el diseño registrado; se dejó una comprobación automática y se generaron hojas gráficas de verificación. La misma acta repartió el trabajo y arrastró la tarjeta D0</w:t>
+      </w:r>
+      <w:r>
+        <w:t>5-1</w:t>
+      </w:r>
+      <w:r>
+        <w:t>, que abre el slice 2 «en paralelo de la finalización del primer Slice». La regla de orden estricto que habían fijado la O05 y la D02 dejó así de regir, como describe el apartado 8.1.1.</w:t>
+      </w:r>
+    </w:p>
+    <w:p>
+      <w:pPr>
+        <w:spacing w:before="240" w:after="240"/>
+      </w:pPr>
+      <w:r>
+        <w:t>Los entornos finalizados llegaron en la D06 (15/09/2026), que definió los props sobre los marcadores provisionales, ya medidos en sus encuadres. Entre los dos autores se aprobaron dos cambios: el nivel 1 pasó a dos fases (reunir las piezas y encender con dos deslizantes, hallazgo 47 del registro de inconsistencias) y el empuje del bosque del nivel 2 salió a la escena narrativa (hallazgo 50). Declaró el resultado de la suite tal cual: 221 de 221 pruebas de edición y 144 de 153 de juego, con seis omitidas porque el modo por lotes no puede capturarlas y tres fallos de disposición que ese modo provoca por su resolución reducida y que ya existían antes del cambio. Con ese resultado se acordó fusionar la rama del slice 2, que la D07 da por fusionada.</w:t>
+      </w:r>
+    </w:p>
+    <w:p>
+      <w:pPr>
+        <w:spacing w:before="240" w:after="240"/>
+      </w:pPr>
+      <w:r>
+        <w:t>El ensamblaje de la balsa del nivel 3 se definió en la D07 (19/09/2026). Se juega sobre el río y no en una ventana superpuesta, porque el estudiante debe ver de dónde salió cada material, y se arma en tres partes que se bloquean entre sí. Entre los materiales hay un tronco más largo que, usado en la base, hunde la balsa y vuelve la prueba una ocasión de depurar. Colocar una pieza no valida nada; valida el botón. La escena del primer fallo aparece solo la primera vez. La D07 cambió también el encargo de arte: componer la balsa en el motor con ocho piezas en lugar de pedir treinta y cuatro láminas de estado. Fijó que ningún efecto de sonido pueda sonar a derrota, error o castigo, regla que el capítulo 6 cita.</w:t>
+      </w:r>
+    </w:p>
+    <w:p>
+      <w:pPr>
+        <w:spacing w:before="240" w:after="240"/>
+      </w:pPr>
+      <w:r>
         <w:lastRenderedPageBreak/>
-        <w:t>La D03 (06/09/2026) ejecutó esas dos tareas y conectó el corredor de pruebas al editor abierto, con lo que quedó habilitado escribir la prueba antes que el código; la O03, la O04, la O05 y la D02 habían dejado esa instalación como pendiente. Resolvió por precedencia del contrato del proyecto que la selección de perfil fuera un panel y no una escena, fijó con carácter provisional el título «Algoritm» y adoptó o descartó tres bocetos de entornos (la vista cenital del nivel 1 no se adoptó y se reservó para la fase 3 del nivel 2). Registró tres defectos hallados al ejecutar, entre ellos una prueba del tiempo de carga que podía pasar sin medir nada. Cerró con 34 de 34 pruebas de lógica y 16 de 16 de integración, y declaró que el punto de control de la fase no se cerraba porque faltaban el menú de niveles, los créditos y comprobaciones manuales.</w:t>
+        <w:t>La D08 (23/09/2026) se adelantó a la sesión prevista del 27/09 porque el slice 3 cerró el 21/09, seis días antes del plazo de su tarjeta D07-1, y el carril de arte y sonido quedó integrado a la rama principal el mismo 23/09. Aprobó que el nivel 2 transcurra del amanecer a la noche con luz aplicada sobre la ilustración y no con un dibujo por hora, de modo que el encargo de arte no crece, y que la pantalla funda a negro, a cuatro décimas de segundo por mitad, entre narrativa y juego. Abrió el slice 4 con un módulo de informe que depende solo del núcleo. Repartió lo que quedaba: un autor lleva el slice 4 y el otro los sprites y sonidos. La D09 (24/09/2026) presentó a la colaboradora el juego con corte al último commit, con el slice 4 cerrado y fusionado (RF-01 a RF-47 implementados, 321 de 321 pruebas de edición según su documento de resultados) y los personajes animados en las 18 secuencias narrativas y las cinco escenas jugables, y acordó que los troncos del nivel 2 rodaran en el motor y no como secuencia de cuadros.</w:t>
       </w:r>
     </w:p>
     <w:p>
@@ -13956,7 +14012,7 @@
         <w:spacing w:before="240" w:after="240"/>
       </w:pPr>
       <w:r>
-        <w:t>La D04 (09/09/2026), sesión de los miércoles con la colaboradora, tomó decisiones de arte con una medida real: el ejecutable portable armado el 08/09 pesaba 137 MB frente al máximo de 500 MB, de modo que los entornos se entregarían a 2048 × 1152 sin apretar la calidad. Resolvió la progresión de luz del nivel 1 con una máscara de opacidad variable sobre una sola pieza y no con cuatro entornos, para no multiplicar por cuatro el peso. Registró también que el ejecutable dejaba un archivo de registro y archivos de telemetría fuera de su carpeta de datos, defecto que exigía dos decisiones. La respuesta llegó el 29/09/2026 (decisión D3, acta D10): la analítica quedó apagada sin retirar ningún paquete.</w:t>
+        <w:t>La D10 (30/09/2026) cerró los tableros del ciclo. Ratificó el cierre general de inconsistencias del 29/09, hecho con una sola regla: ante un conflicto gana el juego y se corrige el documento, lo que solo pide el documento se implementa y lo que solo tiene el juego se escribe en el documento. Revisó una por una las 119 casillas sin cerrar de los tableros de los cuatro slices (103 sin marcar y 16 parciales), y registró con las tarjetas D10-1 a D10-4 las correcciones de los tres niveles y la verificación del arte, y con la D10-5 y la D10-6 la medición de cargas y el arnés de la evaluación.</w:t>
       </w:r>
     </w:p>
     <w:p>
@@ -13964,13 +14020,7 @@
         <w:spacing w:before="240" w:after="240"/>
       </w:pPr>
       <w:r>
-        <w:t>La D05 (13/09/2026) revisó la puesta en escena de los niveles 1 y 2 y halló dos escenas del guion que existían como contenido y que nada reproducía, y objetos que el texto nombra y quedaban bajo el cuadro de diálogo. Cuando objeto y encuadre no concordaban, se movió el objeto y no la cámara, porque los encuadres son el diseño registrado; se dejó una comprobación automática y se generaron hojas gráficas de verificación. La misma acta repartió el trabajo y arrastró la tarjeta D0</w:t>
-      </w:r>
-      <w:r>
-        <w:t>5-1</w:t>
-      </w:r>
-      <w:r>
-        <w:t>, que abre el slice 2 «en paralelo de la finalización del primer Slice». La regla de orden estricto que habían fijado la O05 y la D02 dejó así de regir, como describe el apartado 8.1.1.</w:t>
+        <w:t>El Kanban operó aquí en dos niveles. El primero es el tablero de las actas. El segundo, que la D02 dejó fijado, es el tablero de tareas de cada slice, con casillas verificables y puntos de control, junto a un plan con el alcance y el grafo de dependencias; la D10 los cerró todos salvo ocho casillas. Las tablas de movimientos aparecen en las actas hasta la D04 (09/09/2026); desde la D05 las actas listan los compromisos y los cierres se dicen en el texto (D06-3 en la D07, D07-1 en la D08, D08-1 en la D09, D09-1 en la D10). El tablero hizo visible lo que se atascaba: la D01-3 (habilitar la carpeta de assets) figura «en proceso» en las actas D02, D03 y D04, y la D06-1 (seguimiento de los props, a cargo de la colaboradora) aparece sin cerrar de la D06 a la D09. Las tarjetas D06-2, D07-2 y D08-2 se arrastran a la D10 con la nota «Continúa». La D10 dice también que no revisó las D06-1, D07-3, D09-2, D09-3 y D09-4, porque dependen de personas que no asistieron.</w:t>
       </w:r>
     </w:p>
     <w:p>
@@ -13978,7 +14028,7 @@
         <w:spacing w:before="240" w:after="240"/>
       </w:pPr>
       <w:r>
-        <w:t>Los entornos finalizados llegaron en la D06 (15/09/2026), que definió los props sobre los marcadores provisionales, ya medidos en sus encuadres. Entre los dos autores se aprobaron dos cambios: el nivel 1 pasó a dos fases (reunir las piezas y encender con dos deslizantes, hallazgo 47 del registro de inconsistencias) y el empuje del bosque del nivel 2 salió a la escena narrativa (hallazgo 50). Declaró el resultado de la suite tal cual: 221 de 221 pruebas de edición y 144 de 153 de juego, con seis omitidas porque el modo por lotes no puede capturarlas y tres fallos de disposición que ese modo provoca por su resolución reducida y que ya existían antes del cambio. Con ese resultado se acordó fusionar la rama del slice 2, que la D07 da por fusionada.</w:t>
+        <w:t>Ninguna de estas actas fija un límite numérico de trabajo en curso; lo más cercano es la decisión de la D02 de comprometer dos de las cuatro tareas de la fase de navegación.</w:t>
       </w:r>
     </w:p>
     <w:p>
@@ -13986,51 +14036,10 @@
         <w:spacing w:before="240" w:after="240"/>
       </w:pPr>
       <w:r>
-        <w:t>El ensamblaje de la balsa del nivel 3 se definió en la D07 (19/09/2026). Se juega sobre el río y no en una ventana superpuesta, porque el estudiante debe ver de dónde salió cada material, y se arma en tres partes que se bloquean entre sí. Entre los materiales hay un tronco más largo que, usado en la base, hunde la balsa y vuelve la prueba una ocasión de depurar. Colocar una pieza no valida nada; valida el botón. La escena del primer fallo aparece solo la primera vez. La D07 cambió también el encargo de arte: componer la balsa en el motor con ocho piezas en lugar de pedir treinta y cuatro láminas de estado. Fijó que ningún efecto de sonido pueda sonar a derrota, error o castigo, regla que el capítulo 6 cita.</w:t>
-      </w:r>
-    </w:p>
-    <w:p>
-      <w:pPr>
-        <w:spacing w:before="240" w:after="240"/>
-      </w:pPr>
-      <w:r>
-        <w:t xml:space="preserve">La D08 (23/09/2026) se adelantó a la sesión prevista del 27/09 porque el slice 3 cerró el 21/09, seis días antes del plazo de su tarjeta D07-1, y el carril de arte y sonido quedó integrado a la </w:t>
-      </w:r>
-      <w:r>
-        <w:lastRenderedPageBreak/>
-        <w:t>rama principal el mismo 23/09. Aprobó que el nivel 2 transcurra del amanecer a la noche con luz aplicada sobre la ilustración y no con un dibujo por hora, de modo que el encargo de arte no crece, y que la pantalla funda a negro, a cuatro décimas de segundo por mitad, entre narrativa y juego. Abrió el slice 4 con un módulo de informe que depende solo del núcleo. Repartió lo que quedaba: un autor lleva el slice 4 y el otro los sprites y sonidos. La D09 (24/09/2026) presentó a la colaboradora el juego con corte al último commit, con el slice 4 cerrado y fusionado (RF-01 a RF-47 implementados, 321 de 321 pruebas de edición según su documento de resultados) y los personajes animados en las 18 secuencias narrativas y las cinco escenas jugables, y acordó que los troncos del nivel 2 rodaran en el motor y no como secuencia de cuadros.</w:t>
-      </w:r>
-    </w:p>
-    <w:p>
-      <w:pPr>
-        <w:spacing w:before="240" w:after="240"/>
-      </w:pPr>
-      <w:r>
-        <w:t>La D10 (30/09/2026) cerró los tableros del ciclo. Ratificó el cierre general de inconsistencias del 29/09, hecho con una sola regla: ante un conflicto gana el juego y se corrige el documento, lo que solo pide el documento se implementa y lo que solo tiene el juego se escribe en el documento. Revisó una por una las 119 casillas sin cerrar de los tableros de los cuatro slices (103 sin marcar y 16 parciales), y registró con las tarjetas D10-1 a D10-4 las correcciones de los tres niveles y la verificación del arte, y con la D10-5 y la D10-6 la medición de cargas y el arnés de la evaluación.</w:t>
-      </w:r>
-    </w:p>
-    <w:p>
-      <w:pPr>
-        <w:spacing w:before="240" w:after="240"/>
-      </w:pPr>
-      <w:r>
-        <w:t>El Kanban operó aquí en dos niveles. El primero es el tablero de las actas. El segundo, que la D02 dejó fijado, es el tablero de tareas de cada slice, con casillas verificables y puntos de control, junto a un plan con el alcance y el grafo de dependencias; la D10 los cerró todos salvo ocho casillas. Las tablas de movimientos aparecen en las actas hasta la D04 (09/09/2026); desde la D05 las actas listan los compromisos y los cierres se dicen en el texto (D06-3 en la D07, D07-1 en la D08, D08-1 en la D09, D09-1 en la D10). El tablero hizo visible lo que se atascaba: la D01-3 (habilitar la carpeta de assets) figura «en proceso» en las actas D02, D03 y D04, y la D06-1 (seguimiento de los props, a cargo de la colaboradora) aparece sin cerrar de la D06 a la D09. Las tarjetas D06-2, D07-2 y D08-2 se arrastran a la D10 con la nota «Continúa». La D10 dice también que no revisó las D06-1, D07-3, D09-2, D09-3 y D09-4, porque dependen de personas que no asistieron.</w:t>
-      </w:r>
-    </w:p>
-    <w:p>
-      <w:pPr>
-        <w:spacing w:before="240" w:after="240"/>
-      </w:pPr>
-      <w:r>
-        <w:t>Ninguna de estas actas fija un límite numérico de trabajo en curso; lo más cercano es la decisión de la D02 de comprometer dos de las cuatro tareas de la fase de navegación.</w:t>
-      </w:r>
-    </w:p>
-    <w:p>
-      <w:pPr>
-        <w:spacing w:before="240" w:after="240"/>
-      </w:pPr>
-      <w:r>
         <w:t>La iteración que el marco teórico atribuye al ciclo se ve en lo que cada acta devolvió al diseño. La D03 corrigió pruebas que podían pasar sin verificar nada, la D04 sustituyó cuatro entornos por una máscara al medir el paquete, la D05 movió objetos de lugar, la D06 rehízo la mecánica del nivel 1 y la adenda del 01/10/2026 a la D10 registra que los cuadros del fuego pasaron a importarse a 1024 px porque el primer ejecutable de doce escenas pesó 866,7 MB frente al tope de 500 MB de RNF-06.</w:t>
+      </w:r>
+      <w:r>
+        <w:t xml:space="preserve"> La ronda de ajustes del 8 de octubre volvió sobre pantallas ya terminadas, como la portada del menú, el laberinto y el cuadro de diálogo, y se cuenta en el apartado 8.1.3.</w:t>
       </w:r>
     </w:p>
     <w:p>
@@ -14038,7 +14047,7 @@
         <w:pStyle w:val="Ttulo3"/>
         <w:spacing w:before="240"/>
       </w:pPr>
-      <w:bookmarkStart w:id="71" w:name="_Toc242198073"/>
+      <w:bookmarkStart w:id="71" w:name="_Toc242400681"/>
       <w:r>
         <w:t>5.1.6 Evaluación del prototipo (objetivo 4)</w:t>
       </w:r>
@@ -14049,7 +14058,11 @@
         <w:spacing w:before="240" w:after="240"/>
       </w:pPr>
       <w:r>
-        <w:t>El objetivo 4 no tiene serie de actas propia. Lo que el archivo de actas registra de esta fase está en la D10 y en su adenda del 01/10/2026, que la tratan como parte del ciclo y no como una fase aparte, y en los documentos de resultados del objetivo que la adenda cita.</w:t>
+        <w:t xml:space="preserve">El objetivo 4 no tiene serie de actas propia. Lo que el archivo de actas registra de esta fase está en la D10 y en su adenda del 01/10/2026, que la tratan como parte del ciclo y no como </w:t>
+      </w:r>
+      <w:r>
+        <w:lastRenderedPageBreak/>
+        <w:t>una fase aparte, y en los documentos de resultados del objetivo que la adenda cita.</w:t>
       </w:r>
     </w:p>
     <w:p>
@@ -14057,11 +14070,7 @@
         <w:spacing w:before="240" w:after="240"/>
       </w:pPr>
       <w:r>
-        <w:t xml:space="preserve">La D10 recoge que el 29/09/2026 entró el plan de pruebas, con unos 120 casos y seis puntos de control, y fija cómo se ejecuta: sobre el ejecutable compilado y con un arnés que lo maneja </w:t>
-      </w:r>
-      <w:r>
-        <w:lastRenderedPageBreak/>
-        <w:t>como caja negra, e incluye dos recorridos completos de la ruta principal, cierres forzados en seis momentos, borrado de un perfil, comprobación de residuos fuera de la carpeta de datos, ejecución desde una ruta con espacios, tres mediciones de la carga de cada escena y la prueba de exclusión de RNF-16. La D10 preveía un segundo candidato si la primera pasada hallaba un defecto bloqueante o mayor, y la adenda registra que esa pasada, sobre el candidato rc1, halló defectos que se corrigieron antes de la entrega: entre ellos, las conexiones de red de los servicios de Unity, que ahora se apagan al compilar. El primer ejecutable de doce escenas pesaba 866,7 MB y quedó en 479,0 MB. El segundo candidato, rc2, se reverificó con un tercer recorrido completo, y quedaron 103 casos con veredicto: 89 con P, 13 con P parcial, ninguno con F y uno con NE. Otros 24 casos siguen sin ejecutar, entre ellos todos los de verificación manual.</w:t>
+        <w:t>La D10 recoge que el 29/09/2026 entró el plan de pruebas, con unos 120 casos y seis puntos de control, y fija cómo se ejecuta: sobre el ejecutable compilado y con un arnés que lo maneja como caja negra, e incluye dos recorridos completos de la ruta principal, cierres forzados en seis momentos, borrado de un perfil, comprobación de residuos fuera de la carpeta de datos, ejecución desde una ruta con espacios, tres mediciones de la carga de cada escena y la prueba de exclusión de RNF-16. La D10 preveía un segundo candidato si la primera pasada hallaba un defecto bloqueante o mayor, y la adenda registra que esa pasada, sobre el candidato rc1, halló defectos que se corrigieron antes de la entrega: entre ellos, las conexiones de red de los servicios de Unity, que ahora se apagan al compilar. El primer ejecutable de doce escenas pesaba 866,7 MB y quedó en 479,0 MB. El segundo candidato, rc2, se reverificó con un tercer recorrido completo, y quedaron 103 casos con veredicto: 89 con P, 13 con P parcial, ninguno con F y uno con NE. Otros 24 casos siguen sin ejecutar, entre ellos todos los de verificación manual.</w:t>
       </w:r>
     </w:p>
     <w:p>
@@ -14087,7 +14096,7 @@
       </w:pPr>
       <w:bookmarkStart w:id="72" w:name="_Toc475112174"/>
       <w:bookmarkStart w:id="73" w:name="_Toc475115530"/>
-      <w:bookmarkStart w:id="74" w:name="_Toc242198074"/>
+      <w:bookmarkStart w:id="74" w:name="_Toc242400682"/>
       <w:r>
         <w:t>5.</w:t>
       </w:r>
@@ -14276,7 +14285,14 @@
         <w:rPr>
           <w:rFonts w:eastAsia="Arial" w:cs="Arial"/>
         </w:rPr>
-        <w:t xml:space="preserve"> (Anthropic) servirá como asistente de programación con inteligencia artificial para escribir código y documentación, bajo la revisión de los autores, que responden por lo que entra al proyecto.</w:t>
+        <w:t xml:space="preserve"> (Anthropic) servirá como asistente de programación con inteligencia artificial para escribir código y documentación, bajo la revisión de los autores, que </w:t>
+      </w:r>
+      <w:r>
+        <w:rPr>
+          <w:rFonts w:eastAsia="Arial" w:cs="Arial"/>
+        </w:rPr>
+        <w:lastRenderedPageBreak/>
+        <w:t>responden por lo que entra al proyecto.</w:t>
       </w:r>
     </w:p>
     <w:p>
@@ -14304,11 +14320,7 @@
         <w:t>, con la autorización escrita de sus autores (3.3.2)</w:t>
       </w:r>
       <w:r>
-        <w:t xml:space="preserve">, asegurando </w:t>
-      </w:r>
-      <w:r>
-        <w:lastRenderedPageBreak/>
-        <w:t>coherencia entre la propuesta narrativa y los elementos gráficos del proyecto.</w:t>
+        <w:t>, asegurando coherencia entre la propuesta narrativa y los elementos gráficos del proyecto.</w:t>
       </w:r>
     </w:p>
     <w:p>
@@ -14328,26 +14340,16 @@
           <w:b/>
           <w:bCs/>
         </w:rPr>
-        <w:t xml:space="preserve">Adobe </w:t>
-      </w:r>
-      <w:bookmarkStart w:id="75" w:name="_Int_veL2b2Fl"/>
-      <w:r>
-        <w:rPr>
-          <w:b/>
+        <w:t>CLIP Studio</w:t>
+      </w:r>
+      <w:r>
+        <w:rPr>
           <w:bCs/>
         </w:rPr>
-        <w:t>Illustrator</w:t>
-      </w:r>
-      <w:bookmarkEnd w:id="75"/>
-      <w:r>
-        <w:rPr>
-          <w:b/>
-          <w:bCs/>
-        </w:rPr>
-        <w:t xml:space="preserve"> y Adobe Photoshop</w:t>
-      </w:r>
-      <w:r>
-        <w:t xml:space="preserve"> serán utilizados para el diseño y la creación de los recursos gráficos del videojuego, incluyendo personajes, fondos e interfaces visuales, garantizando una identidad visual coherente y alineada con los objetivos educativos del proyecto.</w:t>
+        <w:t xml:space="preserve"> se empleará para ilustrar los sprites del videojuego, incluyendo personajes, fondos e interfaces visuales, con los cinco pasos que describe el apartado 8.1.1 y una identidad visual coherente con la dirección de arte</w:t>
+      </w:r>
+      <w:r>
+        <w:t>.</w:t>
       </w:r>
     </w:p>
     <w:p>
@@ -14362,8 +14364,8 @@
         <w:pStyle w:val="Ttulo2"/>
         <w:ind w:left="567" w:hanging="576"/>
       </w:pPr>
-      <w:bookmarkStart w:id="76" w:name="_Toc475115531"/>
-      <w:bookmarkStart w:id="77" w:name="_Toc242198075"/>
+      <w:bookmarkStart w:id="75" w:name="_Toc475115531"/>
+      <w:bookmarkStart w:id="76" w:name="_Toc242400683"/>
       <w:r>
         <w:t>5.</w:t>
       </w:r>
@@ -14373,8 +14375,8 @@
       <w:r>
         <w:t xml:space="preserve"> Población y muestra</w:t>
       </w:r>
+      <w:bookmarkEnd w:id="75"/>
       <w:bookmarkEnd w:id="76"/>
-      <w:bookmarkEnd w:id="77"/>
     </w:p>
     <w:p>
       <w:pPr>
@@ -14464,7 +14466,7 @@
           <w:b/>
         </w:rPr>
       </w:pPr>
-      <w:bookmarkStart w:id="78" w:name="_Toc242198076"/>
+      <w:bookmarkStart w:id="77" w:name="_Toc242400684"/>
       <w:r>
         <w:rPr>
           <w:rFonts w:cs="Arial"/>
@@ -14473,7 +14475,7 @@
         <w:lastRenderedPageBreak/>
         <w:t>6. LINEAMIENTOS Y REQUERIMIENTOS DEL VIDEOJUEGO</w:t>
       </w:r>
-      <w:bookmarkEnd w:id="78"/>
+      <w:bookmarkEnd w:id="77"/>
     </w:p>
     <w:p>
       <w:pPr>
@@ -14499,14 +14501,14 @@
           <w:color w:val="auto"/>
         </w:rPr>
       </w:pPr>
-      <w:bookmarkStart w:id="79" w:name="_Toc242198077"/>
+      <w:bookmarkStart w:id="78" w:name="_Toc242400685"/>
       <w:r>
         <w:rPr>
           <w:color w:val="auto"/>
         </w:rPr>
         <w:t>6.1 Desarrollo</w:t>
       </w:r>
-      <w:bookmarkEnd w:id="79"/>
+      <w:bookmarkEnd w:id="78"/>
     </w:p>
     <w:p>
       <w:pPr>
@@ -14516,14 +14518,14 @@
           <w:rFonts w:cs="Arial"/>
         </w:rPr>
       </w:pPr>
-      <w:bookmarkStart w:id="80" w:name="_Toc242198078"/>
+      <w:bookmarkStart w:id="79" w:name="_Toc242400686"/>
       <w:r>
         <w:rPr>
           <w:rFonts w:cs="Arial"/>
         </w:rPr>
         <w:t>6.1.1 De la revisión teórica a los lineamientos</w:t>
       </w:r>
-      <w:bookmarkEnd w:id="80"/>
+      <w:bookmarkEnd w:id="79"/>
     </w:p>
     <w:p>
       <w:pPr>
@@ -14568,7 +14570,7 @@
           <w:color w:val="auto"/>
         </w:rPr>
       </w:pPr>
-      <w:bookmarkStart w:id="81" w:name="_Toc242198100"/>
+      <w:bookmarkStart w:id="80" w:name="_Toc242400708"/>
       <w:r>
         <w:rPr>
           <w:rFonts w:cs="Arial"/>
@@ -14627,7 +14629,7 @@
         </w:rPr>
         <w:t>Lineamientos conceptuales del videojuego</w:t>
       </w:r>
-      <w:bookmarkEnd w:id="81"/>
+      <w:bookmarkEnd w:id="80"/>
     </w:p>
     <w:tbl>
       <w:tblPr>
@@ -14916,14 +14918,14 @@
           <w:rFonts w:cs="Arial"/>
         </w:rPr>
       </w:pPr>
-      <w:bookmarkStart w:id="82" w:name="_Toc242198079"/>
+      <w:bookmarkStart w:id="81" w:name="_Toc242400687"/>
       <w:r>
         <w:rPr>
           <w:rFonts w:cs="Arial"/>
         </w:rPr>
         <w:t>6.1.2 Especificación de requerimientos</w:t>
       </w:r>
-      <w:bookmarkEnd w:id="82"/>
+      <w:bookmarkEnd w:id="81"/>
     </w:p>
     <w:p>
       <w:pPr>
@@ -14952,7 +14954,7 @@
           <w:color w:val="auto"/>
         </w:rPr>
       </w:pPr>
-      <w:bookmarkStart w:id="83" w:name="_Toc242198101"/>
+      <w:bookmarkStart w:id="82" w:name="_Toc242400709"/>
       <w:r>
         <w:rPr>
           <w:rFonts w:cs="Arial"/>
@@ -15011,7 +15013,7 @@
         </w:rPr>
         <w:t>Módulos funcionales y requerimientos que agrupan</w:t>
       </w:r>
-      <w:bookmarkEnd w:id="83"/>
+      <w:bookmarkEnd w:id="82"/>
     </w:p>
     <w:tbl>
       <w:tblPr>
@@ -15658,7 +15660,7 @@
           <w:rFonts w:cs="Arial"/>
         </w:rPr>
       </w:pPr>
-      <w:bookmarkStart w:id="84" w:name="_Toc242198080"/>
+      <w:bookmarkStart w:id="83" w:name="_Toc242400688"/>
       <w:r>
         <w:rPr>
           <w:rFonts w:cs="Arial"/>
@@ -15666,7 +15668,7 @@
         <w:lastRenderedPageBreak/>
         <w:t>6.1.3 Un documento que se corrigió con el juego</w:t>
       </w:r>
-      <w:bookmarkEnd w:id="84"/>
+      <w:bookmarkEnd w:id="83"/>
     </w:p>
     <w:p>
       <w:pPr>
@@ -15734,14 +15736,14 @@
           <w:color w:val="auto"/>
         </w:rPr>
       </w:pPr>
-      <w:bookmarkStart w:id="85" w:name="_Toc242198081"/>
+      <w:bookmarkStart w:id="84" w:name="_Toc242400689"/>
       <w:r>
         <w:rPr>
           <w:color w:val="auto"/>
         </w:rPr>
         <w:t>6.2 Resultados</w:t>
       </w:r>
-      <w:bookmarkEnd w:id="85"/>
+      <w:bookmarkEnd w:id="84"/>
     </w:p>
     <w:p>
       <w:pPr>
@@ -15770,7 +15772,7 @@
           <w:color w:val="auto"/>
         </w:rPr>
       </w:pPr>
-      <w:bookmarkStart w:id="86" w:name="_Toc242198102"/>
+      <w:bookmarkStart w:id="85" w:name="_Toc242400710"/>
       <w:r>
         <w:rPr>
           <w:rFonts w:cs="Arial"/>
@@ -15829,7 +15831,7 @@
         </w:rPr>
         <w:t>Facetas del pensamiento computacional, nivel donde se ejercitan y requerimientos que las implementan</w:t>
       </w:r>
-      <w:bookmarkEnd w:id="86"/>
+      <w:bookmarkEnd w:id="85"/>
     </w:p>
     <w:tbl>
       <w:tblPr>
@@ -16554,7 +16556,7 @@
           <w:color w:val="auto"/>
         </w:rPr>
       </w:pPr>
-      <w:bookmarkStart w:id="87" w:name="_Toc242198103"/>
+      <w:bookmarkStart w:id="86" w:name="_Toc242400711"/>
       <w:r>
         <w:rPr>
           <w:rFonts w:cs="Arial"/>
@@ -16613,7 +16615,7 @@
         </w:rPr>
         <w:t>Metas del primer objetivo y resultado obtenido</w:t>
       </w:r>
-      <w:bookmarkEnd w:id="87"/>
+      <w:bookmarkEnd w:id="86"/>
     </w:p>
     <w:tbl>
       <w:tblPr>
@@ -16904,14 +16906,14 @@
           <w:color w:val="auto"/>
         </w:rPr>
       </w:pPr>
-      <w:bookmarkStart w:id="88" w:name="_Toc242198082"/>
+      <w:bookmarkStart w:id="87" w:name="_Toc242400690"/>
       <w:r>
         <w:rPr>
           <w:color w:val="auto"/>
         </w:rPr>
         <w:t>6.3 Conclusiones del objetivo</w:t>
       </w:r>
-      <w:bookmarkEnd w:id="88"/>
+      <w:bookmarkEnd w:id="87"/>
     </w:p>
     <w:p>
       <w:pPr>
@@ -17003,7 +17005,7 @@
           <w:b/>
         </w:rPr>
       </w:pPr>
-      <w:bookmarkStart w:id="89" w:name="_Toc242198083"/>
+      <w:bookmarkStart w:id="88" w:name="_Toc242400691"/>
       <w:r>
         <w:rPr>
           <w:rFonts w:cs="Arial"/>
@@ -17012,7 +17014,7 @@
         <w:lastRenderedPageBreak/>
         <w:t>7. DISEÑO PEDAGÓGICO Y NARRATIVO DEL VIDEOJUEGO</w:t>
       </w:r>
-      <w:bookmarkEnd w:id="89"/>
+      <w:bookmarkEnd w:id="88"/>
     </w:p>
     <w:p>
       <w:pPr>
@@ -17038,14 +17040,14 @@
           <w:color w:val="auto"/>
         </w:rPr>
       </w:pPr>
-      <w:bookmarkStart w:id="90" w:name="_Toc242198084"/>
+      <w:bookmarkStart w:id="89" w:name="_Toc242400692"/>
       <w:r>
         <w:rPr>
           <w:color w:val="auto"/>
         </w:rPr>
         <w:t>7.1 Desarrollo</w:t>
       </w:r>
-      <w:bookmarkEnd w:id="90"/>
+      <w:bookmarkEnd w:id="89"/>
     </w:p>
     <w:p>
       <w:pPr>
@@ -17055,14 +17057,14 @@
           <w:rFonts w:cs="Arial"/>
         </w:rPr>
       </w:pPr>
-      <w:bookmarkStart w:id="91" w:name="_Toc242198085"/>
+      <w:bookmarkStart w:id="90" w:name="_Toc242400693"/>
       <w:r>
         <w:rPr>
           <w:rFonts w:cs="Arial"/>
         </w:rPr>
         <w:t>7.1.1 Premisa y hilo narrativo</w:t>
       </w:r>
-      <w:bookmarkEnd w:id="91"/>
+      <w:bookmarkEnd w:id="90"/>
     </w:p>
     <w:p>
       <w:pPr>
@@ -17152,14 +17154,14 @@
           <w:rFonts w:cs="Arial"/>
         </w:rPr>
       </w:pPr>
-      <w:bookmarkStart w:id="92" w:name="_Toc242198086"/>
+      <w:bookmarkStart w:id="91" w:name="_Toc242400694"/>
       <w:r>
         <w:rPr>
           <w:rFonts w:cs="Arial"/>
         </w:rPr>
         <w:t>7.1.2 Niveles, facetas y retos</w:t>
       </w:r>
-      <w:bookmarkEnd w:id="92"/>
+      <w:bookmarkEnd w:id="91"/>
     </w:p>
     <w:p>
       <w:pPr>
@@ -17188,7 +17190,7 @@
           <w:color w:val="auto"/>
         </w:rPr>
       </w:pPr>
-      <w:bookmarkStart w:id="93" w:name="_Toc242198104"/>
+      <w:bookmarkStart w:id="92" w:name="_Toc242400712"/>
       <w:r>
         <w:rPr>
           <w:rFonts w:cs="Arial"/>
@@ -17248,7 +17250,7 @@
         </w:rPr>
         <w:t>Estructura pedagógica de los tres niveles</w:t>
       </w:r>
-      <w:bookmarkEnd w:id="93"/>
+      <w:bookmarkEnd w:id="92"/>
     </w:p>
     <w:tbl>
       <w:tblPr>
@@ -17854,14 +17856,14 @@
           <w:rFonts w:cs="Arial"/>
         </w:rPr>
       </w:pPr>
-      <w:bookmarkStart w:id="94" w:name="_Toc242198087"/>
+      <w:bookmarkStart w:id="93" w:name="_Toc242400695"/>
       <w:r>
         <w:rPr>
           <w:rFonts w:cs="Arial"/>
         </w:rPr>
         <w:t>7.1.3 Andamiaje y retroalimentación</w:t>
       </w:r>
-      <w:bookmarkEnd w:id="94"/>
+      <w:bookmarkEnd w:id="93"/>
     </w:p>
     <w:p>
       <w:pPr>
@@ -17927,14 +17929,14 @@
           <w:rFonts w:cs="Arial"/>
         </w:rPr>
       </w:pPr>
-      <w:bookmarkStart w:id="95" w:name="_Toc242198088"/>
+      <w:bookmarkStart w:id="94" w:name="_Toc242400696"/>
       <w:r>
         <w:rPr>
           <w:rFonts w:cs="Arial"/>
         </w:rPr>
         <w:t>7.1.4 Casos de uso, historias de usuario y arquitectura</w:t>
       </w:r>
-      <w:bookmarkEnd w:id="95"/>
+      <w:bookmarkEnd w:id="94"/>
     </w:p>
     <w:p>
       <w:pPr>
@@ -17976,14 +17978,14 @@
           <w:color w:val="auto"/>
         </w:rPr>
       </w:pPr>
-      <w:bookmarkStart w:id="96" w:name="_Toc242198089"/>
+      <w:bookmarkStart w:id="95" w:name="_Toc242400697"/>
       <w:r>
         <w:rPr>
           <w:color w:val="auto"/>
         </w:rPr>
         <w:t>7.2 Resultados</w:t>
       </w:r>
-      <w:bookmarkEnd w:id="96"/>
+      <w:bookmarkEnd w:id="95"/>
     </w:p>
     <w:p>
       <w:pPr>
@@ -18028,7 +18030,7 @@
           <w:color w:val="auto"/>
         </w:rPr>
       </w:pPr>
-      <w:bookmarkStart w:id="97" w:name="_Toc242198105"/>
+      <w:bookmarkStart w:id="96" w:name="_Toc242400713"/>
       <w:r>
         <w:rPr>
           <w:rFonts w:cs="Arial"/>
@@ -18087,7 +18089,7 @@
         </w:rPr>
         <w:t>Comparación de la dificultad entre niveles</w:t>
       </w:r>
-      <w:bookmarkEnd w:id="97"/>
+      <w:bookmarkEnd w:id="96"/>
     </w:p>
     <w:tbl>
       <w:tblPr>
@@ -18699,7 +18701,7 @@
           <w:color w:val="auto"/>
         </w:rPr>
       </w:pPr>
-      <w:bookmarkStart w:id="98" w:name="_Toc242198106"/>
+      <w:bookmarkStart w:id="97" w:name="_Toc242400714"/>
       <w:r>
         <w:rPr>
           <w:rFonts w:cs="Arial"/>
@@ -18758,7 +18760,7 @@
         </w:rPr>
         <w:t>Metas del segundo objetivo y resultado obtenido</w:t>
       </w:r>
-      <w:bookmarkEnd w:id="98"/>
+      <w:bookmarkEnd w:id="97"/>
     </w:p>
     <w:tbl>
       <w:tblPr>
@@ -19065,14 +19067,14 @@
           <w:color w:val="auto"/>
         </w:rPr>
       </w:pPr>
-      <w:bookmarkStart w:id="99" w:name="_Toc242198090"/>
+      <w:bookmarkStart w:id="98" w:name="_Toc242400698"/>
       <w:r>
         <w:rPr>
           <w:color w:val="auto"/>
         </w:rPr>
         <w:t>7.3 Conclusiones del objetivo</w:t>
       </w:r>
-      <w:bookmarkEnd w:id="99"/>
+      <w:bookmarkEnd w:id="98"/>
     </w:p>
     <w:p>
       <w:pPr>
@@ -19164,7 +19166,7 @@
           <w:b/>
         </w:rPr>
       </w:pPr>
-      <w:bookmarkStart w:id="100" w:name="_Toc242198091"/>
+      <w:bookmarkStart w:id="99" w:name="_Toc242400699"/>
       <w:r>
         <w:rPr>
           <w:rFonts w:cs="Arial"/>
@@ -19173,7 +19175,7 @@
         <w:lastRenderedPageBreak/>
         <w:t>8. DESARROLLO DEL PROTOTIPO FUNCIONAL</w:t>
       </w:r>
-      <w:bookmarkEnd w:id="100"/>
+      <w:bookmarkEnd w:id="99"/>
     </w:p>
     <w:p>
       <w:pPr>
@@ -19213,14 +19215,14 @@
           <w:color w:val="auto"/>
         </w:rPr>
       </w:pPr>
-      <w:bookmarkStart w:id="101" w:name="_Toc242198092"/>
+      <w:bookmarkStart w:id="100" w:name="_Toc242400700"/>
       <w:r>
         <w:rPr>
           <w:color w:val="auto"/>
         </w:rPr>
         <w:t>8.1 Desarrollo</w:t>
       </w:r>
-      <w:bookmarkEnd w:id="101"/>
+      <w:bookmarkEnd w:id="100"/>
     </w:p>
     <w:p>
       <w:pPr>
@@ -19230,14 +19232,14 @@
           <w:rFonts w:cs="Arial"/>
         </w:rPr>
       </w:pPr>
-      <w:bookmarkStart w:id="102" w:name="_Toc242198093"/>
+      <w:bookmarkStart w:id="101" w:name="_Toc242400701"/>
       <w:r>
         <w:rPr>
           <w:rFonts w:cs="Arial"/>
         </w:rPr>
         <w:t>8.1.1 Organización del trabajo</w:t>
       </w:r>
-      <w:bookmarkEnd w:id="102"/>
+      <w:bookmarkEnd w:id="101"/>
     </w:p>
     <w:p>
       <w:pPr>
@@ -19310,7 +19312,7 @@
           <w:color w:val="auto"/>
         </w:rPr>
       </w:pPr>
-      <w:bookmarkStart w:id="103" w:name="_Toc242198107"/>
+      <w:bookmarkStart w:id="102" w:name="_Toc242400715"/>
       <w:r>
         <w:rPr>
           <w:rFonts w:cs="Arial"/>
@@ -19369,7 +19371,7 @@
         </w:rPr>
         <w:t>Incrementos del desarrollo</w:t>
       </w:r>
-      <w:bookmarkEnd w:id="103"/>
+      <w:bookmarkEnd w:id="102"/>
     </w:p>
     <w:tbl>
       <w:tblPr>
@@ -19961,16 +19963,26 @@
           <w:rFonts w:cs="Arial"/>
           <w:color w:val="auto"/>
         </w:rPr>
-        <w:t>. Los recursos gráficos los produjo una colaboradora externa, estudiante de animación y diseño, y las decisiones pedagógicas y de mecánica quedaron en manos de los autores.</w:t>
+        <w:t>. Los recursos gráficos los produjo una colaboradora externa, estudiante de animación y diseño, y la</w:t>
+      </w:r>
+      <w:r>
+        <w:rPr>
+          <w:rFonts w:cs="Arial"/>
+          <w:color w:val="auto"/>
+        </w:rPr>
+        <w:t xml:space="preserve"> autoría del trabajo, junto con las decisiones pedagógicas y de mecánica, quedó</w:t>
+      </w:r>
+      <w:r>
+        <w:rPr>
+          <w:rFonts w:cs="Arial"/>
+          <w:color w:val="auto"/>
+        </w:rPr>
+        <w:t xml:space="preserve"> en manos de los autores.</w:t>
       </w:r>
     </w:p>
     <w:p>
       <w:pPr>
         <w:spacing w:before="240" w:after="240"/>
-        <w:rPr>
-          <w:rFonts w:cs="Arial"/>
-          <w:color w:val="auto"/>
-        </w:rPr>
       </w:pPr>
       <w:r>
         <w:rPr>
@@ -19978,6 +19990,22 @@
           <w:color w:val="auto"/>
         </w:rPr>
         <w:lastRenderedPageBreak/>
+        <w:t>La colaboradora es Sofía Valentina Giraldo Segovia, vinculada el 2 de septiembre de 2026 (acta D01) para el diseño y la asesoría gráfica de los sprites, que dibujó con CLIP Studio. Cada sprite pasó por cinco pasos. Empezaba con una búsqueda de inspiración en equipo, una lluvia de ideas a partir de la dirección de arte. De ahí salía el boceto, y del boceto la limpieza de la línea, seguida de la aplicación del color y las sombras, que el acta D04 pidió planas y de un solo tono, sin degradado, para no romper el sombreado del resto del juego. El quinto paso era la entrega y las correcciones: en la sesión de los miércoles, que corrió hasta el 30 de septiembre, los autores revisaban cómo se leía la pieza en pantalla y cómo entraba en el motor, en tamaño, capas y nomenclatura, y ningún boceto pasaba a arte final sin resolver las dos cosas. Como las piezas llevan el nombre que fija la dirección de arte, mientras la composición se conserve la versión corregida entra sustituyendo el archivo, sin tocar código ni escenas.</w:t>
+      </w:r>
+    </w:p>
+    <w:p>
+      <w:pPr>
+        <w:spacing w:before="240" w:after="240"/>
+        <w:rPr>
+          <w:rFonts w:cs="Arial"/>
+          <w:color w:val="auto"/>
+        </w:rPr>
+      </w:pPr>
+      <w:r>
+        <w:rPr>
+          <w:rFonts w:cs="Arial"/>
+          <w:color w:val="auto"/>
+        </w:rPr>
         <w:t xml:space="preserve">El contrato de desarrollo exigía escribir la prueba antes que el código: diseñar los casos, escribir la prueba, verla fallar y solo entonces implementar. El nombre de cada prueba incluye el requerimiento que verifica; GameFlow_CP02_NoExisteEstadoDeDerrota, por ejemplo, comprueba que la máquina de estados no tiene estado de derrota. El entorno fue Unity 6000.5.10f1 con la plantilla 2D y el Universal Render Pipeline 17.6.0, con Input System 1.20.0 para la entrada y Unity Test Framework 1.7.0 para las pruebas. El código se versionó en Git y GitHub, con </w:t>
       </w:r>
       <w:r>
@@ -20017,14 +20045,14 @@
           <w:rFonts w:cs="Arial"/>
         </w:rPr>
       </w:pPr>
-      <w:bookmarkStart w:id="104" w:name="_Toc242198094"/>
+      <w:bookmarkStart w:id="103" w:name="_Toc242400702"/>
       <w:r>
         <w:rPr>
           <w:rFonts w:cs="Arial"/>
         </w:rPr>
         <w:t>8.1.2 Arquitectura implementada</w:t>
       </w:r>
-      <w:bookmarkEnd w:id="104"/>
+      <w:bookmarkEnd w:id="103"/>
     </w:p>
     <w:p>
       <w:pPr>
@@ -20106,7 +20134,15 @@
           <w:rFonts w:cs="Arial"/>
           <w:color w:val="auto"/>
         </w:rPr>
-        <w:t xml:space="preserve"> Cada guardado escribe primero un archivo temporal y después lo pone en el lugar del perfil, de modo que un cierre forzado al guardar no deja un perfil truncado. Si un perfil no se puede leer, el juego lo avisa sin cerrarse y permite borrarlo. El panel de perfiles los presenta de tres en tres, con flechas para pasar de página.</w:t>
+        <w:t xml:space="preserve"> Cada guardado escribe primero un archivo temporal y después lo pone en el lugar del perfil, de modo </w:t>
+      </w:r>
+      <w:r>
+        <w:rPr>
+          <w:rFonts w:cs="Arial"/>
+          <w:color w:val="auto"/>
+        </w:rPr>
+        <w:lastRenderedPageBreak/>
+        <w:t>que un cierre forzado al guardar no deja un perfil truncado. Si un perfil no se puede leer, el juego lo avisa sin cerrarse y permite borrarlo. El panel de perfiles los presenta de tres en tres, con flechas para pasar de página.</w:t>
       </w:r>
       <w:r>
         <w:rPr>
@@ -20138,14 +20174,14 @@
           <w:rFonts w:cs="Arial"/>
         </w:rPr>
       </w:pPr>
-      <w:bookmarkStart w:id="105" w:name="_Toc242198095"/>
+      <w:bookmarkStart w:id="104" w:name="_Toc242400703"/>
       <w:r>
         <w:rPr>
           <w:rFonts w:cs="Arial"/>
         </w:rPr>
         <w:t>8.1.3 Los tres niveles implementados</w:t>
       </w:r>
-      <w:bookmarkEnd w:id="105"/>
+      <w:bookmarkEnd w:id="104"/>
     </w:p>
     <w:p>
       <w:pPr>
@@ -20181,15 +20217,7 @@
           <w:rFonts w:cs="Arial"/>
           <w:color w:val="auto"/>
         </w:rPr>
-        <w:t xml:space="preserve">; desde </w:t>
-      </w:r>
-      <w:r>
-        <w:rPr>
-          <w:rFonts w:cs="Arial"/>
-          <w:color w:val="auto"/>
-        </w:rPr>
-        <w:lastRenderedPageBreak/>
-        <w:t>ese momento los mandos se atenúan y dejan de responder, para que un segundo clic no repita el encendido</w:t>
+        <w:t>; desde ese momento los mandos se atenúan y dejan de responder, para que un segundo clic no repita el encendido</w:t>
       </w:r>
       <w:r>
         <w:rPr>
@@ -20210,7 +20238,7 @@
           <w:color w:val="auto"/>
         </w:rPr>
       </w:pPr>
-      <w:bookmarkStart w:id="106" w:name="_Toc242198116"/>
+      <w:bookmarkStart w:id="105" w:name="_Toc242400724"/>
       <w:r>
         <w:rPr>
           <w:rFonts w:cs="Arial"/>
@@ -20269,7 +20297,7 @@
         </w:rPr>
         <w:t>Panel de encendido del Nivel 1</w:t>
       </w:r>
-      <w:bookmarkEnd w:id="106"/>
+      <w:bookmarkEnd w:id="105"/>
     </w:p>
     <w:p>
       <w:pPr>
@@ -20398,12 +20426,13 @@
           <w:color w:val="auto"/>
         </w:rPr>
       </w:pPr>
-      <w:bookmarkStart w:id="107" w:name="_Toc242198117"/>
-      <w:r>
-        <w:rPr>
-          <w:rFonts w:cs="Arial"/>
-          <w:color w:val="auto"/>
-        </w:rPr>
+      <w:bookmarkStart w:id="106" w:name="_Toc242400725"/>
+      <w:r>
+        <w:rPr>
+          <w:rFonts w:cs="Arial"/>
+          <w:color w:val="auto"/>
+        </w:rPr>
+        <w:lastRenderedPageBreak/>
         <w:t xml:space="preserve">Figura </w:t>
       </w:r>
       <w:r>
@@ -20457,7 +20486,7 @@
         </w:rPr>
         <w:t>Laberinto del Nivel 2 con el editor de bloques</w:t>
       </w:r>
-      <w:bookmarkEnd w:id="107"/>
+      <w:bookmarkEnd w:id="106"/>
     </w:p>
     <w:p>
       <w:pPr>
@@ -20469,10 +20498,10 @@
           <w:noProof/>
         </w:rPr>
         <w:drawing>
-          <wp:inline distT="0" distB="0" distL="0" distR="0" wp14:anchorId="5591E45E" wp14:editId="045C5C9D">
-            <wp:extent cx="3810000" cy="2142565"/>
+          <wp:inline distT="0" distB="0" distL="0" distR="0" wp14:anchorId="09F67712" wp14:editId="33866BFE">
+            <wp:extent cx="3810000" cy="2142982"/>
             <wp:effectExtent l="0" t="0" r="0" b="0"/>
-            <wp:docPr id="5" name="Imagen 5"/>
+            <wp:docPr id="1" name="Imagen 1"/>
             <wp:cNvGraphicFramePr>
               <a:graphicFrameLocks xmlns:a="http://schemas.openxmlformats.org/drawingml/2006/main" noChangeAspect="1"/>
             </wp:cNvGraphicFramePr>
@@ -20480,7 +20509,7 @@
               <a:graphicData uri="http://schemas.openxmlformats.org/drawingml/2006/picture">
                 <pic:pic xmlns:pic="http://schemas.openxmlformats.org/drawingml/2006/picture">
                   <pic:nvPicPr>
-                    <pic:cNvPr id="5" name=""/>
+                    <pic:cNvPr id="1" name=""/>
                     <pic:cNvPicPr/>
                   </pic:nvPicPr>
                   <pic:blipFill>
@@ -20498,7 +20527,7 @@
                   <pic:spPr>
                     <a:xfrm>
                       <a:off x="0" y="0"/>
-                      <a:ext cx="3810000" cy="2142565"/>
+                      <a:ext cx="3810000" cy="2142982"/>
                     </a:xfrm>
                     <a:prstGeom prst="rect">
                       <a:avLst/>
@@ -20526,7 +20555,7 @@
           <w:color w:val="auto"/>
           <w:sz w:val="18"/>
         </w:rPr>
-        <w:t xml:space="preserve">Fuente: captura del prototipo, </w:t>
+        <w:t xml:space="preserve">Fuente: captura del </w:t>
       </w:r>
       <w:r>
         <w:rPr>
@@ -20534,7 +20563,7 @@
           <w:color w:val="auto"/>
           <w:sz w:val="18"/>
         </w:rPr>
-        <w:t>01/10/2026 (Anexo E, figura 4.7)</w:t>
+        <w:t>Editor, 08</w:t>
       </w:r>
       <w:r>
         <w:rPr>
@@ -20542,6 +20571,14 @@
           <w:color w:val="auto"/>
           <w:sz w:val="18"/>
         </w:rPr>
+        <w:t>/10/2026 (Anexo E, figura 4.7)</w:t>
+      </w:r>
+      <w:r>
+        <w:rPr>
+          <w:rFonts w:cs="Arial"/>
+          <w:color w:val="auto"/>
+          <w:sz w:val="18"/>
+        </w:rPr>
         <w:t>.</w:t>
       </w:r>
     </w:p>
@@ -20558,7 +20595,6 @@
           <w:rFonts w:cs="Arial"/>
           <w:color w:val="auto"/>
         </w:rPr>
-        <w:lastRenderedPageBreak/>
         <w:t>El Nivel 3 empieza en la orilla del río (Figura 8). Mamá se mueve con cuatro flechas en pantalla que responden al clic sostenido y recoge ocho materiales, que el inventario agrupa en cuatro casillas, mientras una lista de cuatro tareas marca lo que ya se hizo. Después la balsa se arma sobre el agua, en diecisiete espacios repartidos en tres fases que se habilitan en orden: base, amarre, y mástil con vela. Colocar una pieza no la valida, y el veredicto llega al pulsar «Listo» o «Probar balsa». Entre los troncos hay uno más largo, el mástil, puesto a propósito como trampa para la base. Cuando la balsa falla, el juego señala el espacio exacto</w:t>
       </w:r>
       <w:r>
@@ -20587,7 +20623,7 @@
           <w:color w:val="auto"/>
         </w:rPr>
       </w:pPr>
-      <w:bookmarkStart w:id="108" w:name="_Toc242198118"/>
+      <w:bookmarkStart w:id="107" w:name="_Toc242400726"/>
       <w:r>
         <w:rPr>
           <w:rFonts w:cs="Arial"/>
@@ -20646,7 +20682,7 @@
         </w:rPr>
         <w:t>Recolección de materiales en el Nivel 3, con la lista de tareas y las flechas en pantalla</w:t>
       </w:r>
-      <w:bookmarkEnd w:id="108"/>
+      <w:bookmarkEnd w:id="107"/>
     </w:p>
     <w:p>
       <w:pPr>
@@ -20736,20 +20772,66 @@
     </w:p>
     <w:p>
       <w:pPr>
+        <w:spacing w:before="240" w:after="240"/>
+      </w:pPr>
+      <w:r>
+        <w:rPr>
+          <w:rFonts w:cs="Arial"/>
+          <w:color w:val="auto"/>
+        </w:rPr>
+        <w:t xml:space="preserve">Una ronda de ajustes de diseño, decidida por los autores el 8 de octubre, cambió después del corte la presentación de varias pantallas sin tocar las mecánicas. La portada del menú es ahora la mitad izquierda del bosque del Nivel 2 con los cinco personajes en reposo, cada uno en un punto distinto de su ciclo para que no respiren al unísono; el título, blanco de 112 px con contorno de 4 px, quedó encima de una tarjeta que se redujo de 280 a 120 px y conserva solo el lema. En el laberinto, el entorno y la tarjeta comparten un único fondo ámbar (#E8A33D) y </w:t>
+      </w:r>
+      <w:r>
+        <w:rPr>
+          <w:rFonts w:cs="Arial"/>
+          <w:color w:val="auto"/>
+        </w:rPr>
+        <w:lastRenderedPageBreak/>
+        <w:t xml:space="preserve">un marco redondeado de 8 px; la Figura 7 muestra el </w:t>
+      </w:r>
+      <w:r>
+        <w:rPr>
+          <w:rFonts w:cs="Arial"/>
+          <w:color w:val="auto"/>
+        </w:rPr>
+        <w:t>laberinto con ese fondo y esos marcos</w:t>
+      </w:r>
+      <w:r>
+        <w:rPr>
+          <w:rFonts w:cs="Arial"/>
+          <w:color w:val="auto"/>
+        </w:rPr>
+        <w:t>. El texto del cuadro de diálogo pasó de 26 a 30 px y a un tono más oscuro, y el cuadro de 180 a 216 px de alto, todavía dentro del cuarto inferior de la pantalla: la más alta de las 139 líneas mide 131 px en una caja de 137. En el cruce del Nivel 3 la cámara sigue a la balsa, que antes terminaba 204 px fuera del encuadre, y las nueve llamas de las escenas narrativas y la cenital del Nivel 1 tienen un halo naranja tenue que late cada 2 s, sin destellos (RNF-21).</w:t>
+      </w:r>
+    </w:p>
+    <w:p>
+      <w:pPr>
+        <w:spacing w:before="240" w:after="240"/>
+      </w:pPr>
+      <w:r>
+        <w:rPr>
+          <w:rFonts w:cs="Arial"/>
+          <w:color w:val="auto"/>
+        </w:rPr>
+        <w:t>Los personajes también cambiaron. Algoritm se recortó de su arte provisional en nueve piezas por forma (fuego, madera y agua), de modo que mueve brazos y piernas en todas sus escenas, y el arte final las sustituye con los mismos nombres; en los créditos saluda con una acción nueva, Wave, un bucle de 4,8 s con pausa de reposo, y la tarjeta que lo enmarcaba se retiró. En Papá se subió el húmero y se bajaron 37 px los antebrazos para que el hueso no asome por el codo al doblarlo.</w:t>
+      </w:r>
+    </w:p>
+    <w:p>
+      <w:pPr>
         <w:pStyle w:val="Ttulo3"/>
         <w:spacing w:before="240"/>
         <w:rPr>
           <w:rFonts w:cs="Arial"/>
         </w:rPr>
       </w:pPr>
-      <w:bookmarkStart w:id="109" w:name="_Toc242198096"/>
+      <w:bookmarkStart w:id="108" w:name="_Toc242400704"/>
       <w:r>
         <w:rPr>
           <w:rFonts w:cs="Arial"/>
         </w:rPr>
         <w:t>8.1.4 Rendimiento</w:t>
       </w:r>
-      <w:bookmarkEnd w:id="109"/>
+      <w:bookmarkEnd w:id="108"/>
     </w:p>
     <w:p>
       <w:pPr>
@@ -20798,15 +20880,108 @@
           <w:color w:val="auto"/>
         </w:rPr>
       </w:pPr>
-      <w:bookmarkStart w:id="110" w:name="_Toc242198097"/>
-      <w:r>
-        <w:rPr>
+      <w:bookmarkStart w:id="109" w:name="_Toc242400705"/>
+      <w:r>
+        <w:rPr>
+          <w:color w:val="auto"/>
+        </w:rPr>
+        <w:t>8.2 Resultados</w:t>
+      </w:r>
+      <w:bookmarkEnd w:id="109"/>
+    </w:p>
+    <w:p>
+      <w:pPr>
+        <w:spacing w:before="240" w:after="240"/>
+        <w:rPr>
+          <w:rFonts w:cs="Arial"/>
+          <w:color w:val="auto"/>
+        </w:rPr>
+      </w:pPr>
+      <w:r>
+        <w:rPr>
+          <w:rFonts w:cs="Arial"/>
+          <w:color w:val="auto"/>
+        </w:rPr>
+        <w:t>El resultado del objetivo es el prototipo, que se compila como una carpeta ejecutable para Windows</w:t>
+      </w:r>
+      <w:r>
+        <w:rPr>
+          <w:rFonts w:cs="Arial"/>
+          <w:color w:val="auto"/>
+        </w:rPr>
+        <w:t xml:space="preserve">, funciona sin instalación y </w:t>
+      </w:r>
+      <w:r>
+        <w:rPr>
+          <w:rFonts w:cs="Arial"/>
+          <w:color w:val="auto"/>
+        </w:rPr>
+        <w:t>está hecho para no usar</w:t>
+      </w:r>
+      <w:r>
+        <w:rPr>
+          <w:rFonts w:cs="Arial"/>
+          <w:color w:val="auto"/>
+        </w:rPr>
+        <w:t xml:space="preserve"> la red</w:t>
+      </w:r>
+      <w:r>
+        <w:rPr>
+          <w:rFonts w:cs="Arial"/>
+          <w:color w:val="auto"/>
+        </w:rPr>
+        <w:t xml:space="preserve">. Tiene doce escenas, tres niveles, siete fases jugables y dieciocho secuencias narrativas, y los 47 requerimientos funcionales quedaron implementados, incluidos los dos que no eran de prioridad alta. El </w:t>
+      </w:r>
+      <w:r>
+        <w:rPr>
+          <w:rFonts w:cs="Arial"/>
+          <w:color w:val="auto"/>
+        </w:rPr>
+        <w:t xml:space="preserve">ejecutable vigente se compiló el 1 de octubre con las doce escenas y es la segunda versión candidata a entrega: los defectos que mostró la primera, del mismo día, se corrigieron con una prueba nueva cada uno, y sobre la segunda se repitieron los casos afectados y las mediciones. Los servicios en línea de Unity, como la analítica, quedan apagados al compilar, y si el juego resultante nombra sus servidores la compilación se detiene con error. En siete lanzamientos de la versión vigente, con </w:t>
+      </w:r>
+      <w:r>
+        <w:rPr>
+          <w:rFonts w:cs="Arial"/>
+          <w:color w:val="auto"/>
+        </w:rPr>
+        <w:t>una muestra cada dos segundos a partir de los primeros segundos de cada arranque, no se observ</w:t>
+      </w:r>
+      <w:r>
+        <w:rPr>
+          <w:rFonts w:cs="Arial"/>
+          <w:color w:val="auto"/>
+        </w:rPr>
+        <w:t xml:space="preserve">ó ninguna conexión de red (RNF-10); la primera abría tres con servidores de Google Cloud. Fuera de la carpeta Datos solo quedan el Player.log del </w:t>
+      </w:r>
+      <w:r>
+        <w:rPr>
+          <w:rFonts w:cs="Arial"/>
           <w:color w:val="auto"/>
         </w:rPr>
         <w:lastRenderedPageBreak/>
-        <w:t>8.2 Resultados</w:t>
-      </w:r>
-      <w:bookmarkEnd w:id="110"/>
+        <w:t>reproductor y, en el Registro de Windows, las preferencias de pantalla, un contador y unos identificadores de sesión y de instalación que el motor genera aun con los servicios desactivados. Ninguno guarda datos del estudiante, y un perfil borrado no deja su nombre en ning</w:t>
+      </w:r>
+      <w:r>
+        <w:rPr>
+          <w:rFonts w:cs="Arial"/>
+          <w:color w:val="auto"/>
+        </w:rPr>
+        <w:t>uno de los sitios revisados, que fueron la carpeta portable, LocalLow, la carpeta temporal de Windows y el Registro</w:t>
+      </w:r>
+      <w:r>
+        <w:rPr>
+          <w:rFonts w:cs="Arial"/>
+          <w:color w:val="auto"/>
+        </w:rPr>
+        <w:t xml:space="preserve"> (RNF-11)</w:t>
+      </w:r>
+      <w:r>
+        <w:rPr>
+          <w:rFonts w:cs="Arial"/>
+          <w:color w:val="auto"/>
+        </w:rPr>
+        <w:t>.</w:t>
+      </w:r>
     </w:p>
     <w:p>
       <w:pPr>
@@ -20821,70 +20996,14 @@
           <w:rFonts w:cs="Arial"/>
           <w:color w:val="auto"/>
         </w:rPr>
-        <w:t>El resultado del objetivo es el prototipo, que se compila como una carpeta ejecutable para Windows</w:t>
-      </w:r>
-      <w:r>
-        <w:rPr>
-          <w:rFonts w:cs="Arial"/>
-          <w:color w:val="auto"/>
-        </w:rPr>
-        <w:t xml:space="preserve">, funciona sin instalación y </w:t>
-      </w:r>
-      <w:r>
-        <w:rPr>
-          <w:rFonts w:cs="Arial"/>
-          <w:color w:val="auto"/>
-        </w:rPr>
-        <w:t>está hecho para no usar</w:t>
-      </w:r>
-      <w:r>
-        <w:rPr>
-          <w:rFonts w:cs="Arial"/>
-          <w:color w:val="auto"/>
-        </w:rPr>
-        <w:t xml:space="preserve"> la red</w:t>
-      </w:r>
-      <w:r>
-        <w:rPr>
-          <w:rFonts w:cs="Arial"/>
-          <w:color w:val="auto"/>
-        </w:rPr>
-        <w:t xml:space="preserve">. Tiene doce escenas, tres niveles, siete fases jugables y dieciocho secuencias narrativas, y los 47 requerimientos funcionales quedaron implementados, incluidos los dos que no eran de prioridad alta. El </w:t>
-      </w:r>
-      <w:r>
-        <w:rPr>
-          <w:rFonts w:cs="Arial"/>
-          <w:color w:val="auto"/>
-        </w:rPr>
-        <w:t xml:space="preserve">ejecutable vigente se compiló el 1 de octubre con las doce escenas y es la segunda versión candidata a entrega: los defectos que mostró la primera, del mismo día, se corrigieron con una prueba nueva cada uno, y sobre la segunda se repitieron los casos afectados y las mediciones. Los servicios en línea de Unity, como la analítica, quedan apagados al compilar, y si el juego resultante nombra sus servidores la compilación se detiene con error. En siete lanzamientos de la versión vigente, con </w:t>
-      </w:r>
-      <w:r>
-        <w:rPr>
-          <w:rFonts w:cs="Arial"/>
-          <w:color w:val="auto"/>
-        </w:rPr>
-        <w:t>una muestra cada dos segundos a partir de los primeros segundos de cada arranque, no se observ</w:t>
-      </w:r>
-      <w:r>
-        <w:rPr>
-          <w:rFonts w:cs="Arial"/>
-          <w:color w:val="auto"/>
-        </w:rPr>
-        <w:t>ó ninguna conexión de red (RNF-10); la primera abría tres con servidores de Google Cloud. Fuera de la carpeta Datos solo quedan el Player.log del reproductor y, en el Registro de Windows, las preferencias de pantalla, un contador y unos identificadores de sesión y de instalación que el motor genera aun con los servicios desactivados. Ninguno guarda datos del estudiante, y un perfil borrado no deja su nombre en ning</w:t>
-      </w:r>
-      <w:r>
-        <w:rPr>
-          <w:rFonts w:cs="Arial"/>
-          <w:color w:val="auto"/>
-        </w:rPr>
-        <w:t>uno de los sitios revisados, que fueron la carpeta portable, LocalLow, la carpeta temporal de Windows y el Registro</w:t>
-      </w:r>
-      <w:r>
-        <w:rPr>
-          <w:rFonts w:cs="Arial"/>
-          <w:color w:val="auto"/>
-        </w:rPr>
-        <w:t xml:space="preserve"> (RNF-11)</w:t>
+        <w:t>Para este objetivo había dos indicadores (Tabla 9). El primero pedía al menos tres mecánicas principales. El guion especificaba siete y las siete se implementaron: el encendido del fuego, la selección por patrón, el armado de la carretilla, la programación por bloques, la recolección con desplazamiento, el ensamblaje por fases y la prueba y depuración de la balsa. C</w:t>
+      </w:r>
+      <w:r>
+        <w:rPr>
+          <w:rFonts w:cs="Arial"/>
+          <w:color w:val="auto"/>
+        </w:rPr>
+        <w:t>inco de ellas cambiaron durante el desarrollo por decisiones documentadas, como la del Nivel 1 (INC-47) o la prueba anticipada de la balsa (INC-122), y desde las correcciones del 29 de septiembre y del 1 de octubre los documentos radicados describen lo implementado</w:t>
       </w:r>
       <w:r>
         <w:rPr>
@@ -20907,21 +21026,56 @@
           <w:rFonts w:cs="Arial"/>
           <w:color w:val="auto"/>
         </w:rPr>
-        <w:t>Para este objetivo había dos indicadores (Tabla 9). El primero pedía al menos tres mecánicas principales. El guion especificaba siete y las siete se implementaron: el encendido del fuego, la selección por patrón, el armado de la carretilla, la programación por bloques, la recolección con desplazamiento, el ensamblaje por fases y la prueba y depuración de la balsa. C</w:t>
-      </w:r>
-      <w:r>
-        <w:rPr>
-          <w:rFonts w:cs="Arial"/>
-          <w:color w:val="auto"/>
-        </w:rPr>
-        <w:t>inco de ellas cambiaron durante el desarrollo por decisiones documentadas, como la del Nivel 1 (INC-47) o la prueba anticipada de la balsa (INC-122), y desde las correcciones del 29 de septiembre y del 1 de octubre los documentos radicados describen lo implementado</w:t>
-      </w:r>
-      <w:r>
-        <w:rPr>
-          <w:rFonts w:cs="Arial"/>
-          <w:color w:val="auto"/>
-        </w:rPr>
-        <w:t>.</w:t>
+        <w:t xml:space="preserve">El segundo pedía una ruta principal sin bloqueos en los tres niveles. </w:t>
+      </w:r>
+      <w:r>
+        <w:rPr>
+          <w:rFonts w:cs="Arial"/>
+          <w:color w:val="auto"/>
+        </w:rPr>
+        <w:t>Las pruebas automáticas que la recorren en el editor pasaron en la corrida completa del 1 de octu</w:t>
+      </w:r>
+      <w:r>
+        <w:rPr>
+          <w:rFonts w:cs="Arial"/>
+          <w:color w:val="auto"/>
+        </w:rPr>
+        <w:t xml:space="preserve">bre. Los niveles 2 y 3 </w:t>
+      </w:r>
+      <w:r>
+        <w:rPr>
+          <w:rFonts w:cs="Arial"/>
+          <w:color w:val="auto"/>
+        </w:rPr>
+        <w:t>cuentan con dos pruebas cada uno que los juegan de principio a fin a partir de la escena de arranque, y en una de las del Nivel 3</w:t>
+      </w:r>
+      <w:r>
+        <w:rPr>
+          <w:rFonts w:cs="Arial"/>
+          <w:color w:val="auto"/>
+        </w:rPr>
+        <w:t xml:space="preserve"> la balsa se hunde, aparece la escena 3.2 y el estudiante corrige. E</w:t>
+      </w:r>
+      <w:r>
+        <w:rPr>
+          <w:rFonts w:cs="Arial"/>
+          <w:color w:val="auto"/>
+        </w:rPr>
+        <w:t>n el editor, el Nivel 1 se prueba en dos partes, la apertura y el cierre, que por sí solas no suman</w:t>
+      </w:r>
+      <w:r>
+        <w:rPr>
+          <w:rFonts w:cs="Arial"/>
+          <w:color w:val="auto"/>
+        </w:rPr>
+        <w:t xml:space="preserve"> los dos recorridos completos que pide RNF-13. Esas pruebas llaman directamente a los controladores de cada escena en lugar de simular el puntero, </w:t>
+      </w:r>
+      <w:r>
+        <w:rPr>
+          <w:rFonts w:cs="Arial"/>
+          <w:color w:val="auto"/>
+        </w:rPr>
+        <w:t>y por eso el juego se recorrió además sobre el ejecutable.</w:t>
       </w:r>
     </w:p>
     <w:p>
@@ -20937,80 +21091,7 @@
           <w:rFonts w:cs="Arial"/>
           <w:color w:val="auto"/>
         </w:rPr>
-        <w:t xml:space="preserve">El segundo pedía una ruta principal sin bloqueos en los tres niveles. </w:t>
-      </w:r>
-      <w:r>
-        <w:rPr>
-          <w:rFonts w:cs="Arial"/>
-          <w:color w:val="auto"/>
-        </w:rPr>
-        <w:t>Las pruebas automáticas que la recorren en el editor pasaron en la corrida completa del 1 de octu</w:t>
-      </w:r>
-      <w:r>
-        <w:rPr>
-          <w:rFonts w:cs="Arial"/>
-          <w:color w:val="auto"/>
-        </w:rPr>
-        <w:t xml:space="preserve">bre. Los niveles 2 y 3 </w:t>
-      </w:r>
-      <w:r>
-        <w:rPr>
-          <w:rFonts w:cs="Arial"/>
-          <w:color w:val="auto"/>
-        </w:rPr>
-        <w:t>cuentan con dos pruebas cada uno que los juegan de principio a fin a partir de la escena de arranque, y en una de las del Nivel 3</w:t>
-      </w:r>
-      <w:r>
-        <w:rPr>
-          <w:rFonts w:cs="Arial"/>
-          <w:color w:val="auto"/>
-        </w:rPr>
-        <w:t xml:space="preserve"> la balsa se hunde, aparece la escena 3.2 y el estudiante corrige. E</w:t>
-      </w:r>
-      <w:r>
-        <w:rPr>
-          <w:rFonts w:cs="Arial"/>
-          <w:color w:val="auto"/>
-        </w:rPr>
-        <w:t>n el editor, el Nivel 1 se prueba en dos partes, la apertura y el cierre, que por sí solas no suman</w:t>
-      </w:r>
-      <w:r>
-        <w:rPr>
-          <w:rFonts w:cs="Arial"/>
-          <w:color w:val="auto"/>
-        </w:rPr>
-        <w:t xml:space="preserve"> los dos recorridos completos que pide RNF-13. Esas pruebas llaman directamente a los controladores de cada escena en lugar de simular el puntero, </w:t>
-      </w:r>
-      <w:r>
-        <w:rPr>
-          <w:rFonts w:cs="Arial"/>
-          <w:color w:val="auto"/>
-        </w:rPr>
-        <w:t>y por eso el juego se recorrió además sobre el ejecutable.</w:t>
-      </w:r>
-    </w:p>
-    <w:p>
-      <w:pPr>
-        <w:spacing w:before="240" w:after="240"/>
-        <w:rPr>
-          <w:rFonts w:cs="Arial"/>
-          <w:color w:val="auto"/>
-        </w:rPr>
-      </w:pPr>
-      <w:r>
-        <w:rPr>
-          <w:rFonts w:cs="Arial"/>
-          <w:color w:val="auto"/>
-        </w:rPr>
-        <w:t xml:space="preserve">El arnés preparado para el cuarto objetivo juega con los mismos gestos que un estudiante: escribe el nombre de un perfil nuevo, entra a cada nivel desde el menú y resuelve las mecánicas solo con clic y clic sostenido sobre la ventana, sin tocar el código. Recorrió el juego entero tres veces, desde la pantalla de inicio hasta los créditos, en 87 y 33 minutos sobre la primera versión y en 16 sobre la vigente, las dos últimas a pantalla completa. Ningún recorrido se bloqueó, se cerró de forma inesperada ni dejó el juego sin salida. Los dos primeros encontraron dos defectos del laberinto que no impedían terminarlo, un bloque que se quedaba pegado al cursor y otro que se ejecutaba fuera de la vista, y el tercero ya no los vio. Esas duraciones dependen del ritmo del arnés y no miden a un niño; la de un estudiante, que OE1 sitúa entre 20 y 40 minutos, se cronometra en el cuarto objetivo. El cierre forzado (RNF-14) se probó en nueve momentos, dos de ellos justo cuando el juego guardaba, y en todos el perfil </w:t>
-      </w:r>
-      <w:r>
-        <w:rPr>
-          <w:rFonts w:cs="Arial"/>
-          <w:color w:val="auto"/>
-        </w:rPr>
-        <w:lastRenderedPageBreak/>
-        <w:t xml:space="preserve">se abrió sin error y sin truncarse, </w:t>
+        <w:t xml:space="preserve">El arnés preparado para el cuarto objetivo juega con los mismos gestos que un estudiante: escribe el nombre de un perfil nuevo, entra a cada nivel desde el menú y resuelve las mecánicas solo con clic y clic sostenido sobre la ventana, sin tocar el código. Recorrió el juego entero tres veces, desde la pantalla de inicio hasta los créditos, en 87 y 33 minutos sobre la primera versión y en 16 sobre la vigente, las dos últimas a pantalla completa. Ningún recorrido se bloqueó, se cerró de forma inesperada ni dejó el juego sin salida. Los dos primeros encontraron dos defectos del laberinto que no impedían terminarlo, un bloque que se quedaba pegado al cursor y otro que se ejecutaba fuera de la vista, y el tercero ya no los vio. Esas duraciones dependen del ritmo del arnés y no miden a un niño; la de un estudiante, que OE1 sitúa entre 20 y 40 minutos, se cronometra en el cuarto objetivo. El cierre forzado (RNF-14) se probó en nueve momentos, dos de ellos justo cuando el juego guardaba, y en todos el perfil se abrió sin error y sin truncarse, </w:t>
       </w:r>
       <w:r>
         <w:rPr>
@@ -21038,7 +21119,7 @@
           <w:color w:val="auto"/>
         </w:rPr>
       </w:pPr>
-      <w:bookmarkStart w:id="111" w:name="_Toc242198108"/>
+      <w:bookmarkStart w:id="110" w:name="_Toc242400716"/>
       <w:r>
         <w:rPr>
           <w:rFonts w:cs="Arial"/>
@@ -21097,7 +21178,7 @@
         </w:rPr>
         <w:t>Metas del tercer objetivo y resultado obtenido</w:t>
       </w:r>
-      <w:bookmarkEnd w:id="111"/>
+      <w:bookmarkEnd w:id="110"/>
     </w:p>
     <w:tbl>
       <w:tblPr>
@@ -21409,6 +21490,7 @@
           <w:rFonts w:cs="Arial"/>
           <w:color w:val="auto"/>
         </w:rPr>
+        <w:lastRenderedPageBreak/>
         <w:t xml:space="preserve">La corrida completa de la suite se hizo el </w:t>
       </w:r>
       <w:r>
@@ -21438,6 +21520,13 @@
           <w:color w:val="auto"/>
         </w:rPr>
         <w:t>. El caso omitido necesita una carpeta de solo lectura que el equipo donde se corrió no permitió simular.</w:t>
+      </w:r>
+      <w:r>
+        <w:rPr>
+          <w:rFonts w:cs="Arial"/>
+          <w:color w:val="auto"/>
+        </w:rPr>
+        <w:t xml:space="preserve"> Después, el 9 de octubre, con la ronda de ajustes de diseño ya integrada y sin compilar un ejecutable nuevo, otra corrida completa listó 1 128 casos: en EditMode pasaron 706 de 711, con una omisión por entorno y cuatro pruebas en rojo a propósito, y en PlayMode pasaron 416 de 417, con una inconclusiva. Las cinco pruebas restantes son del carril de los personajes de perfil y esperan su arte.</w:t>
       </w:r>
     </w:p>
     <w:p>
@@ -21451,7 +21540,7 @@
           <w:color w:val="auto"/>
         </w:rPr>
       </w:pPr>
-      <w:bookmarkStart w:id="112" w:name="_Toc242198109"/>
+      <w:bookmarkStart w:id="111" w:name="_Toc242400717"/>
       <w:r>
         <w:rPr>
           <w:rFonts w:cs="Arial"/>
@@ -21526,7 +21615,7 @@
         </w:rPr>
         <w:t>bre de 2026</w:t>
       </w:r>
-      <w:bookmarkEnd w:id="112"/>
+      <w:bookmarkEnd w:id="111"/>
     </w:p>
     <w:tbl>
       <w:tblPr>
@@ -22129,21 +22218,21 @@
           <w:rFonts w:cs="Arial"/>
           <w:color w:val="auto"/>
         </w:rPr>
-        <w:t xml:space="preserve">Los 47 requerimientos funcionales tienen al menos una prueba que los nombra, y una prueba de trazabilidad lo verifica en cada corrida. De los </w:t>
-      </w:r>
-      <w:r>
-        <w:rPr>
-          <w:rFonts w:cs="Arial"/>
-          <w:color w:val="auto"/>
-        </w:rPr>
-        <w:t>721 métodos de prueba, 381 citan un requerimiento funcional, y 36</w:t>
-      </w:r>
-      <w:r>
-        <w:rPr>
-          <w:rFonts w:cs="Arial"/>
-          <w:color w:val="auto"/>
-        </w:rPr>
-        <w:t xml:space="preserve"> de los 47 requerimientos se comprueban tanto en su lógica como en la escena real.</w:t>
+        <w:t xml:space="preserve">Los 47 requerimientos funcionales tienen al menos una prueba que los nombra, y una prueba de trazabilidad lo verifica en cada corrida. </w:t>
+      </w:r>
+      <w:r>
+        <w:rPr>
+          <w:rFonts w:cs="Arial"/>
+          <w:color w:val="auto"/>
+        </w:rPr>
+        <w:t>Al 1 de octubre, de los 721 métodos de prueba, 381 citaban un requerimiento funcional, y 36 de los 47 requerimientos se comprobaban tanto en su lógica como en la escena real; el 9 de octubre son 416 de 857 métodos y 37 de los 47</w:t>
+      </w:r>
+      <w:r>
+        <w:rPr>
+          <w:rFonts w:cs="Arial"/>
+          <w:color w:val="auto"/>
+        </w:rPr>
+        <w:t>.</w:t>
       </w:r>
     </w:p>
     <w:p>
@@ -22180,7 +22269,7 @@
           <w:color w:val="auto"/>
         </w:rPr>
       </w:pPr>
-      <w:bookmarkStart w:id="113" w:name="_Toc242198110"/>
+      <w:bookmarkStart w:id="112" w:name="_Toc242400718"/>
       <w:r>
         <w:rPr>
           <w:rFonts w:cs="Arial"/>
@@ -22239,7 +22328,7 @@
         </w:rPr>
         <w:t>Presupuestos de rendimiento y estado de su medición</w:t>
       </w:r>
-      <w:bookmarkEnd w:id="113"/>
+      <w:bookmarkEnd w:id="112"/>
     </w:p>
     <w:tbl>
       <w:tblPr>
@@ -22524,7 +22613,6 @@
                 <w:color w:val="auto"/>
                 <w:sz w:val="20"/>
               </w:rPr>
-              <w:lastRenderedPageBreak/>
               <w:t>RNF-05, memoria</w:t>
             </w:r>
           </w:p>
@@ -22887,7 +22975,15 @@
           <w:rFonts w:cs="Arial"/>
           <w:color w:val="auto"/>
         </w:rPr>
-        <w:t>Los días 29 y 30 de septiembre y 1 de octubre se contrastaron todos los documentos con el juego y se cerraron los hallazgos que seguían abiertos, junto con los que esa revisión y el cierre encontraron, hasta INC-130</w:t>
+        <w:t xml:space="preserve">Los días 29 y 30 de septiembre y 1 de octubre se contrastaron todos los documentos con el juego y se cerraron los hallazgos que seguían abiertos, junto con los que esa revisión y el </w:t>
+      </w:r>
+      <w:r>
+        <w:rPr>
+          <w:rFonts w:cs="Arial"/>
+          <w:color w:val="auto"/>
+        </w:rPr>
+        <w:lastRenderedPageBreak/>
+        <w:t>cierre encontraron, hasta INC-130</w:t>
       </w:r>
       <w:r>
         <w:rPr>
@@ -22919,14 +23015,14 @@
           <w:color w:val="auto"/>
         </w:rPr>
       </w:pPr>
-      <w:bookmarkStart w:id="114" w:name="_Toc242198098"/>
+      <w:bookmarkStart w:id="113" w:name="_Toc242400706"/>
       <w:r>
         <w:rPr>
           <w:color w:val="auto"/>
         </w:rPr>
         <w:t>8.3 Conclusiones del objetivo</w:t>
       </w:r>
-      <w:bookmarkEnd w:id="114"/>
+      <w:bookmarkEnd w:id="113"/>
     </w:p>
     <w:p>
       <w:pPr>
@@ -22964,14 +23060,21 @@
           <w:rFonts w:cs="Arial"/>
           <w:color w:val="auto"/>
         </w:rPr>
-        <w:t>470 casos de EditMode corran en menos de veinte</w:t>
-      </w:r>
-      <w:r>
-        <w:rPr>
-          <w:rFonts w:cs="Arial"/>
-          <w:color w:val="auto"/>
-        </w:rPr>
-        <w:t xml:space="preserve"> segundos.</w:t>
+        <w:t xml:space="preserve">470 casos de EditMode </w:t>
+      </w:r>
+      <w:r>
+        <w:rPr>
+          <w:rFonts w:cs="Arial"/>
+          <w:color w:val="auto"/>
+        </w:rPr>
+        <w:t xml:space="preserve">del corte corrieran en menos de veinte segundos, y los 711 del 9 de octubre, en 16,4 </w:t>
+      </w:r>
+      <w:r>
+        <w:rPr>
+          <w:rFonts w:cs="Arial"/>
+          <w:color w:val="auto"/>
+        </w:rPr>
+        <w:t>s.</w:t>
       </w:r>
     </w:p>
     <w:p>
@@ -23079,8 +23182,8 @@
           <w:caps w:val="0"/>
         </w:rPr>
       </w:pPr>
-      <w:bookmarkStart w:id="115" w:name="_Toc379905744"/>
-      <w:bookmarkStart w:id="116" w:name="_Toc242198099"/>
+      <w:bookmarkStart w:id="114" w:name="_Toc379905744"/>
+      <w:bookmarkStart w:id="115" w:name="_Toc242400707"/>
       <w:r>
         <w:rPr>
           <w:rFonts w:cs="Arial"/>
@@ -23091,8 +23194,8 @@
         <w:lastRenderedPageBreak/>
         <w:t>BIBLIOGRAFÍA</w:t>
       </w:r>
+      <w:bookmarkEnd w:id="114"/>
       <w:bookmarkEnd w:id="115"/>
-      <w:bookmarkEnd w:id="116"/>
     </w:p>
     <w:p>
       <w:pPr>
@@ -25885,9 +25988,6 @@
     <int2:textHash int2:hashCode="vdL7msMIst+jiO" int2:id="BKcE0bcU">
       <int2:state int2:value="Rejected" int2:type="spell"/>
     </int2:textHash>
-    <int2:bookmark int2:bookmarkName="_Int_veL2b2Fl" int2:invalidationBookmarkName="" int2:hashCode="GuSMVS4xICnn3U" int2:id="658BFl7j">
-      <int2:state int2:value="Rejected" int2:type="spell"/>
-    </int2:bookmark>
   </int2:observations>
   <int2:intelligenceSettings/>
   <int2:onDemandWorkflows/>

</xml_diff>

<commit_message>
Guion and thesis aligned with the prototype of 09/10/2026 (INC-134 to INC-136, INC-146, INC-147)
Authorized by Santiago on 09/10/2026. Guion (Solucion_OE2_Diseno_final): 1.1.1 describes Algoritm's final design (a flame, a wooden disc and a drop with checked shorts), the notes of bridges I and II say he changes body in the fade to black, and 1.6 and 1.6.3.2 leave the maze out of the Level 2 light (note of 07/10 on INC-71 and INC-137), with the change-control row of 09/10/2026. Thesis: 5.1.5, 7.1.1, 8.1.3 (new paragraph on the profile view, the two-frame blink and Algoritm's final design with his arms behind the body), 8.1.4 (499,3 MB, then 420,6 MB with INC-146), 8.2 (suite of the Editor round 2) and 8.3. Applied with reemplazar_parrafos.ps1, insertar_parrafos.ps1 and agregar_fila_tabla.ps1; verified with verificar_reemplazos.py.
</commit_message>
<xml_diff>
--- a/docs/Trabajo_de_Grado_Entrega_Plantilla_28jul.docx
+++ b/docs/Trabajo_de_Grado_Entrega_Plantilla_28jul.docx
@@ -1073,7 +1073,7 @@
           <w:r>
             <w:fldChar w:fldCharType="separate"/>
           </w:r>
-          <w:hyperlink w:anchor="_Toc242400644" w:history="1">
+          <w:hyperlink w:anchor="_Toc242442965" w:history="1">
             <w:r>
               <w:rPr>
                 <w:rStyle w:val="Hipervnculo"/>
@@ -1103,7 +1103,7 @@
                 <w:noProof/>
                 <w:webHidden/>
               </w:rPr>
-              <w:instrText xml:space="preserve"> PAGEREF _Toc242400644 \h </w:instrText>
+              <w:instrText xml:space="preserve"> PAGEREF _Toc242442965 \h </w:instrText>
             </w:r>
             <w:r>
               <w:rPr>
@@ -1145,7 +1145,7 @@
               <w14:ligatures w14:val="standardContextual"/>
             </w:rPr>
           </w:pPr>
-          <w:hyperlink w:anchor="_Toc242400645" w:history="1">
+          <w:hyperlink w:anchor="_Toc242442966" w:history="1">
             <w:r>
               <w:rPr>
                 <w:rStyle w:val="Hipervnculo"/>
@@ -1175,7 +1175,7 @@
                 <w:noProof/>
                 <w:webHidden/>
               </w:rPr>
-              <w:instrText xml:space="preserve"> PAGEREF _Toc242400645 \h </w:instrText>
+              <w:instrText xml:space="preserve"> PAGEREF _Toc242442966 \h </w:instrText>
             </w:r>
             <w:r>
               <w:rPr>
@@ -1220,7 +1220,7 @@
               <w14:ligatures w14:val="standardContextual"/>
             </w:rPr>
           </w:pPr>
-          <w:hyperlink w:anchor="_Toc242400646" w:history="1">
+          <w:hyperlink w:anchor="_Toc242442967" w:history="1">
             <w:r>
               <w:rPr>
                 <w:rStyle w:val="Hipervnculo"/>
@@ -1247,7 +1247,7 @@
                 <w:noProof/>
                 <w:webHidden/>
               </w:rPr>
-              <w:instrText xml:space="preserve"> PAGEREF _Toc242400646 \h </w:instrText>
+              <w:instrText xml:space="preserve"> PAGEREF _Toc242442967 \h </w:instrText>
             </w:r>
             <w:r>
               <w:rPr>
@@ -1292,7 +1292,7 @@
               <w14:ligatures w14:val="standardContextual"/>
             </w:rPr>
           </w:pPr>
-          <w:hyperlink w:anchor="_Toc242400647" w:history="1">
+          <w:hyperlink w:anchor="_Toc242442968" w:history="1">
             <w:r>
               <w:rPr>
                 <w:rStyle w:val="Hipervnculo"/>
@@ -1319,7 +1319,7 @@
                 <w:noProof/>
                 <w:webHidden/>
               </w:rPr>
-              <w:instrText xml:space="preserve"> PAGEREF _Toc242400647 \h </w:instrText>
+              <w:instrText xml:space="preserve"> PAGEREF _Toc242442968 \h </w:instrText>
             </w:r>
             <w:r>
               <w:rPr>
@@ -1364,7 +1364,7 @@
               <w14:ligatures w14:val="standardContextual"/>
             </w:rPr>
           </w:pPr>
-          <w:hyperlink w:anchor="_Toc242400648" w:history="1">
+          <w:hyperlink w:anchor="_Toc242442969" w:history="1">
             <w:r>
               <w:rPr>
                 <w:rStyle w:val="Hipervnculo"/>
@@ -1391,7 +1391,7 @@
                 <w:noProof/>
                 <w:webHidden/>
               </w:rPr>
-              <w:instrText xml:space="preserve"> PAGEREF _Toc242400648 \h </w:instrText>
+              <w:instrText xml:space="preserve"> PAGEREF _Toc242442969 \h </w:instrText>
             </w:r>
             <w:r>
               <w:rPr>
@@ -1436,7 +1436,7 @@
               <w14:ligatures w14:val="standardContextual"/>
             </w:rPr>
           </w:pPr>
-          <w:hyperlink w:anchor="_Toc242400649" w:history="1">
+          <w:hyperlink w:anchor="_Toc242442970" w:history="1">
             <w:r>
               <w:rPr>
                 <w:rStyle w:val="Hipervnculo"/>
@@ -1463,7 +1463,7 @@
                 <w:noProof/>
                 <w:webHidden/>
               </w:rPr>
-              <w:instrText xml:space="preserve"> PAGEREF _Toc242400649 \h </w:instrText>
+              <w:instrText xml:space="preserve"> PAGEREF _Toc242442970 \h </w:instrText>
             </w:r>
             <w:r>
               <w:rPr>
@@ -1505,7 +1505,7 @@
               <w14:ligatures w14:val="standardContextual"/>
             </w:rPr>
           </w:pPr>
-          <w:hyperlink w:anchor="_Toc242400650" w:history="1">
+          <w:hyperlink w:anchor="_Toc242442971" w:history="1">
             <w:r>
               <w:rPr>
                 <w:rStyle w:val="Hipervnculo"/>
@@ -1535,7 +1535,7 @@
                 <w:noProof/>
                 <w:webHidden/>
               </w:rPr>
-              <w:instrText xml:space="preserve"> PAGEREF _Toc242400650 \h </w:instrText>
+              <w:instrText xml:space="preserve"> PAGEREF _Toc242442971 \h </w:instrText>
             </w:r>
             <w:r>
               <w:rPr>
@@ -1580,7 +1580,7 @@
               <w14:ligatures w14:val="standardContextual"/>
             </w:rPr>
           </w:pPr>
-          <w:hyperlink w:anchor="_Toc242400651" w:history="1">
+          <w:hyperlink w:anchor="_Toc242442972" w:history="1">
             <w:r>
               <w:rPr>
                 <w:rStyle w:val="Hipervnculo"/>
@@ -1607,7 +1607,7 @@
                 <w:noProof/>
                 <w:webHidden/>
               </w:rPr>
-              <w:instrText xml:space="preserve"> PAGEREF _Toc242400651 \h </w:instrText>
+              <w:instrText xml:space="preserve"> PAGEREF _Toc242442972 \h </w:instrText>
             </w:r>
             <w:r>
               <w:rPr>
@@ -1652,7 +1652,7 @@
               <w14:ligatures w14:val="standardContextual"/>
             </w:rPr>
           </w:pPr>
-          <w:hyperlink w:anchor="_Toc242400652" w:history="1">
+          <w:hyperlink w:anchor="_Toc242442973" w:history="1">
             <w:r>
               <w:rPr>
                 <w:rStyle w:val="Hipervnculo"/>
@@ -1679,7 +1679,7 @@
                 <w:noProof/>
                 <w:webHidden/>
               </w:rPr>
-              <w:instrText xml:space="preserve"> PAGEREF _Toc242400652 \h </w:instrText>
+              <w:instrText xml:space="preserve"> PAGEREF _Toc242442973 \h </w:instrText>
             </w:r>
             <w:r>
               <w:rPr>
@@ -1721,7 +1721,7 @@
               <w14:ligatures w14:val="standardContextual"/>
             </w:rPr>
           </w:pPr>
-          <w:hyperlink w:anchor="_Toc242400653" w:history="1">
+          <w:hyperlink w:anchor="_Toc242442974" w:history="1">
             <w:r>
               <w:rPr>
                 <w:rStyle w:val="Hipervnculo"/>
@@ -1751,7 +1751,7 @@
                 <w:noProof/>
                 <w:webHidden/>
               </w:rPr>
-              <w:instrText xml:space="preserve"> PAGEREF _Toc242400653 \h </w:instrText>
+              <w:instrText xml:space="preserve"> PAGEREF _Toc242442974 \h </w:instrText>
             </w:r>
             <w:r>
               <w:rPr>
@@ -1796,7 +1796,7 @@
               <w14:ligatures w14:val="standardContextual"/>
             </w:rPr>
           </w:pPr>
-          <w:hyperlink w:anchor="_Toc242400654" w:history="1">
+          <w:hyperlink w:anchor="_Toc242442975" w:history="1">
             <w:r>
               <w:rPr>
                 <w:rStyle w:val="Hipervnculo"/>
@@ -1823,7 +1823,7 @@
                 <w:noProof/>
                 <w:webHidden/>
               </w:rPr>
-              <w:instrText xml:space="preserve"> PAGEREF _Toc242400654 \h </w:instrText>
+              <w:instrText xml:space="preserve"> PAGEREF _Toc242442975 \h </w:instrText>
             </w:r>
             <w:r>
               <w:rPr>
@@ -1865,7 +1865,7 @@
               <w14:ligatures w14:val="standardContextual"/>
             </w:rPr>
           </w:pPr>
-          <w:hyperlink w:anchor="_Toc242400655" w:history="1">
+          <w:hyperlink w:anchor="_Toc242442976" w:history="1">
             <w:r>
               <w:rPr>
                 <w:rStyle w:val="Hipervnculo"/>
@@ -1892,7 +1892,7 @@
                 <w:noProof/>
                 <w:webHidden/>
               </w:rPr>
-              <w:instrText xml:space="preserve"> PAGEREF _Toc242400655 \h </w:instrText>
+              <w:instrText xml:space="preserve"> PAGEREF _Toc242442976 \h </w:instrText>
             </w:r>
             <w:r>
               <w:rPr>
@@ -1934,7 +1934,7 @@
               <w14:ligatures w14:val="standardContextual"/>
             </w:rPr>
           </w:pPr>
-          <w:hyperlink w:anchor="_Toc242400656" w:history="1">
+          <w:hyperlink w:anchor="_Toc242442977" w:history="1">
             <w:r>
               <w:rPr>
                 <w:rStyle w:val="Hipervnculo"/>
@@ -1961,7 +1961,7 @@
                 <w:noProof/>
                 <w:webHidden/>
               </w:rPr>
-              <w:instrText xml:space="preserve"> PAGEREF _Toc242400656 \h </w:instrText>
+              <w:instrText xml:space="preserve"> PAGEREF _Toc242442977 \h </w:instrText>
             </w:r>
             <w:r>
               <w:rPr>
@@ -2003,7 +2003,7 @@
               <w14:ligatures w14:val="standardContextual"/>
             </w:rPr>
           </w:pPr>
-          <w:hyperlink w:anchor="_Toc242400657" w:history="1">
+          <w:hyperlink w:anchor="_Toc242442978" w:history="1">
             <w:r>
               <w:rPr>
                 <w:rStyle w:val="Hipervnculo"/>
@@ -2030,7 +2030,7 @@
                 <w:noProof/>
                 <w:webHidden/>
               </w:rPr>
-              <w:instrText xml:space="preserve"> PAGEREF _Toc242400657 \h </w:instrText>
+              <w:instrText xml:space="preserve"> PAGEREF _Toc242442978 \h </w:instrText>
             </w:r>
             <w:r>
               <w:rPr>
@@ -2072,7 +2072,7 @@
               <w14:ligatures w14:val="standardContextual"/>
             </w:rPr>
           </w:pPr>
-          <w:hyperlink w:anchor="_Toc242400658" w:history="1">
+          <w:hyperlink w:anchor="_Toc242442979" w:history="1">
             <w:r>
               <w:rPr>
                 <w:rStyle w:val="Hipervnculo"/>
@@ -2099,7 +2099,7 @@
                 <w:noProof/>
                 <w:webHidden/>
               </w:rPr>
-              <w:instrText xml:space="preserve"> PAGEREF _Toc242400658 \h </w:instrText>
+              <w:instrText xml:space="preserve"> PAGEREF _Toc242442979 \h </w:instrText>
             </w:r>
             <w:r>
               <w:rPr>
@@ -2141,7 +2141,7 @@
               <w14:ligatures w14:val="standardContextual"/>
             </w:rPr>
           </w:pPr>
-          <w:hyperlink w:anchor="_Toc242400659" w:history="1">
+          <w:hyperlink w:anchor="_Toc242442980" w:history="1">
             <w:r>
               <w:rPr>
                 <w:rStyle w:val="Hipervnculo"/>
@@ -2168,7 +2168,7 @@
                 <w:noProof/>
                 <w:webHidden/>
               </w:rPr>
-              <w:instrText xml:space="preserve"> PAGEREF _Toc242400659 \h </w:instrText>
+              <w:instrText xml:space="preserve"> PAGEREF _Toc242442980 \h </w:instrText>
             </w:r>
             <w:r>
               <w:rPr>
@@ -2210,7 +2210,7 @@
               <w14:ligatures w14:val="standardContextual"/>
             </w:rPr>
           </w:pPr>
-          <w:hyperlink w:anchor="_Toc242400660" w:history="1">
+          <w:hyperlink w:anchor="_Toc242442981" w:history="1">
             <w:r>
               <w:rPr>
                 <w:rStyle w:val="Hipervnculo"/>
@@ -2237,7 +2237,7 @@
                 <w:noProof/>
                 <w:webHidden/>
               </w:rPr>
-              <w:instrText xml:space="preserve"> PAGEREF _Toc242400660 \h </w:instrText>
+              <w:instrText xml:space="preserve"> PAGEREF _Toc242442981 \h </w:instrText>
             </w:r>
             <w:r>
               <w:rPr>
@@ -2282,7 +2282,7 @@
               <w14:ligatures w14:val="standardContextual"/>
             </w:rPr>
           </w:pPr>
-          <w:hyperlink w:anchor="_Toc242400661" w:history="1">
+          <w:hyperlink w:anchor="_Toc242442982" w:history="1">
             <w:r>
               <w:rPr>
                 <w:rStyle w:val="Hipervnculo"/>
@@ -2309,7 +2309,7 @@
                 <w:noProof/>
                 <w:webHidden/>
               </w:rPr>
-              <w:instrText xml:space="preserve"> PAGEREF _Toc242400661 \h </w:instrText>
+              <w:instrText xml:space="preserve"> PAGEREF _Toc242442982 \h </w:instrText>
             </w:r>
             <w:r>
               <w:rPr>
@@ -2351,7 +2351,7 @@
               <w14:ligatures w14:val="standardContextual"/>
             </w:rPr>
           </w:pPr>
-          <w:hyperlink w:anchor="_Toc242400662" w:history="1">
+          <w:hyperlink w:anchor="_Toc242442983" w:history="1">
             <w:r>
               <w:rPr>
                 <w:rStyle w:val="Hipervnculo"/>
@@ -2378,7 +2378,7 @@
                 <w:noProof/>
                 <w:webHidden/>
               </w:rPr>
-              <w:instrText xml:space="preserve"> PAGEREF _Toc242400662 \h </w:instrText>
+              <w:instrText xml:space="preserve"> PAGEREF _Toc242442983 \h </w:instrText>
             </w:r>
             <w:r>
               <w:rPr>
@@ -2420,7 +2420,7 @@
               <w14:ligatures w14:val="standardContextual"/>
             </w:rPr>
           </w:pPr>
-          <w:hyperlink w:anchor="_Toc242400663" w:history="1">
+          <w:hyperlink w:anchor="_Toc242442984" w:history="1">
             <w:r>
               <w:rPr>
                 <w:rStyle w:val="Hipervnculo"/>
@@ -2447,7 +2447,7 @@
                 <w:noProof/>
                 <w:webHidden/>
               </w:rPr>
-              <w:instrText xml:space="preserve"> PAGEREF _Toc242400663 \h </w:instrText>
+              <w:instrText xml:space="preserve"> PAGEREF _Toc242442984 \h </w:instrText>
             </w:r>
             <w:r>
               <w:rPr>
@@ -2489,7 +2489,7 @@
               <w14:ligatures w14:val="standardContextual"/>
             </w:rPr>
           </w:pPr>
-          <w:hyperlink w:anchor="_Toc242400664" w:history="1">
+          <w:hyperlink w:anchor="_Toc242442985" w:history="1">
             <w:r>
               <w:rPr>
                 <w:rStyle w:val="Hipervnculo"/>
@@ -2516,7 +2516,7 @@
                 <w:noProof/>
                 <w:webHidden/>
               </w:rPr>
-              <w:instrText xml:space="preserve"> PAGEREF _Toc242400664 \h </w:instrText>
+              <w:instrText xml:space="preserve"> PAGEREF _Toc242442985 \h </w:instrText>
             </w:r>
             <w:r>
               <w:rPr>
@@ -2558,7 +2558,7 @@
               <w14:ligatures w14:val="standardContextual"/>
             </w:rPr>
           </w:pPr>
-          <w:hyperlink w:anchor="_Toc242400665" w:history="1">
+          <w:hyperlink w:anchor="_Toc242442986" w:history="1">
             <w:r>
               <w:rPr>
                 <w:rStyle w:val="Hipervnculo"/>
@@ -2585,7 +2585,7 @@
                 <w:noProof/>
                 <w:webHidden/>
               </w:rPr>
-              <w:instrText xml:space="preserve"> PAGEREF _Toc242400665 \h </w:instrText>
+              <w:instrText xml:space="preserve"> PAGEREF _Toc242442986 \h </w:instrText>
             </w:r>
             <w:r>
               <w:rPr>
@@ -2627,7 +2627,7 @@
               <w14:ligatures w14:val="standardContextual"/>
             </w:rPr>
           </w:pPr>
-          <w:hyperlink w:anchor="_Toc242400666" w:history="1">
+          <w:hyperlink w:anchor="_Toc242442987" w:history="1">
             <w:r>
               <w:rPr>
                 <w:rStyle w:val="Hipervnculo"/>
@@ -2654,7 +2654,7 @@
                 <w:noProof/>
                 <w:webHidden/>
               </w:rPr>
-              <w:instrText xml:space="preserve"> PAGEREF _Toc242400666 \h </w:instrText>
+              <w:instrText xml:space="preserve"> PAGEREF _Toc242442987 \h </w:instrText>
             </w:r>
             <w:r>
               <w:rPr>
@@ -2696,7 +2696,7 @@
               <w14:ligatures w14:val="standardContextual"/>
             </w:rPr>
           </w:pPr>
-          <w:hyperlink w:anchor="_Toc242400667" w:history="1">
+          <w:hyperlink w:anchor="_Toc242442988" w:history="1">
             <w:r>
               <w:rPr>
                 <w:rStyle w:val="Hipervnculo"/>
@@ -2723,7 +2723,7 @@
                 <w:noProof/>
                 <w:webHidden/>
               </w:rPr>
-              <w:instrText xml:space="preserve"> PAGEREF _Toc242400667 \h </w:instrText>
+              <w:instrText xml:space="preserve"> PAGEREF _Toc242442988 \h </w:instrText>
             </w:r>
             <w:r>
               <w:rPr>
@@ -2765,7 +2765,7 @@
               <w14:ligatures w14:val="standardContextual"/>
             </w:rPr>
           </w:pPr>
-          <w:hyperlink w:anchor="_Toc242400668" w:history="1">
+          <w:hyperlink w:anchor="_Toc242442989" w:history="1">
             <w:r>
               <w:rPr>
                 <w:rStyle w:val="Hipervnculo"/>
@@ -2792,7 +2792,7 @@
                 <w:noProof/>
                 <w:webHidden/>
               </w:rPr>
-              <w:instrText xml:space="preserve"> PAGEREF _Toc242400668 \h </w:instrText>
+              <w:instrText xml:space="preserve"> PAGEREF _Toc242442989 \h </w:instrText>
             </w:r>
             <w:r>
               <w:rPr>
@@ -2837,7 +2837,7 @@
               <w14:ligatures w14:val="standardContextual"/>
             </w:rPr>
           </w:pPr>
-          <w:hyperlink w:anchor="_Toc242400669" w:history="1">
+          <w:hyperlink w:anchor="_Toc242442990" w:history="1">
             <w:r>
               <w:rPr>
                 <w:rStyle w:val="Hipervnculo"/>
@@ -2864,7 +2864,7 @@
                 <w:noProof/>
                 <w:webHidden/>
               </w:rPr>
-              <w:instrText xml:space="preserve"> PAGEREF _Toc242400669 \h </w:instrText>
+              <w:instrText xml:space="preserve"> PAGEREF _Toc242442990 \h </w:instrText>
             </w:r>
             <w:r>
               <w:rPr>
@@ -2906,7 +2906,7 @@
               <w14:ligatures w14:val="standardContextual"/>
             </w:rPr>
           </w:pPr>
-          <w:hyperlink w:anchor="_Toc242400670" w:history="1">
+          <w:hyperlink w:anchor="_Toc242442991" w:history="1">
             <w:r>
               <w:rPr>
                 <w:rStyle w:val="Hipervnculo"/>
@@ -2933,7 +2933,7 @@
                 <w:noProof/>
                 <w:webHidden/>
               </w:rPr>
-              <w:instrText xml:space="preserve"> PAGEREF _Toc242400670 \h </w:instrText>
+              <w:instrText xml:space="preserve"> PAGEREF _Toc242442991 \h </w:instrText>
             </w:r>
             <w:r>
               <w:rPr>
@@ -2975,7 +2975,7 @@
               <w14:ligatures w14:val="standardContextual"/>
             </w:rPr>
           </w:pPr>
-          <w:hyperlink w:anchor="_Toc242400671" w:history="1">
+          <w:hyperlink w:anchor="_Toc242442992" w:history="1">
             <w:r>
               <w:rPr>
                 <w:rStyle w:val="Hipervnculo"/>
@@ -3002,7 +3002,7 @@
                 <w:noProof/>
                 <w:webHidden/>
               </w:rPr>
-              <w:instrText xml:space="preserve"> PAGEREF _Toc242400671 \h </w:instrText>
+              <w:instrText xml:space="preserve"> PAGEREF _Toc242442992 \h </w:instrText>
             </w:r>
             <w:r>
               <w:rPr>
@@ -3047,7 +3047,7 @@
               <w14:ligatures w14:val="standardContextual"/>
             </w:rPr>
           </w:pPr>
-          <w:hyperlink w:anchor="_Toc242400672" w:history="1">
+          <w:hyperlink w:anchor="_Toc242442993" w:history="1">
             <w:r>
               <w:rPr>
                 <w:rStyle w:val="Hipervnculo"/>
@@ -3074,7 +3074,7 @@
                 <w:noProof/>
                 <w:webHidden/>
               </w:rPr>
-              <w:instrText xml:space="preserve"> PAGEREF _Toc242400672 \h </w:instrText>
+              <w:instrText xml:space="preserve"> PAGEREF _Toc242442993 \h </w:instrText>
             </w:r>
             <w:r>
               <w:rPr>
@@ -3116,7 +3116,7 @@
               <w14:ligatures w14:val="standardContextual"/>
             </w:rPr>
           </w:pPr>
-          <w:hyperlink w:anchor="_Toc242400673" w:history="1">
+          <w:hyperlink w:anchor="_Toc242442994" w:history="1">
             <w:r>
               <w:rPr>
                 <w:rStyle w:val="Hipervnculo"/>
@@ -3146,7 +3146,7 @@
                 <w:noProof/>
                 <w:webHidden/>
               </w:rPr>
-              <w:instrText xml:space="preserve"> PAGEREF _Toc242400673 \h </w:instrText>
+              <w:instrText xml:space="preserve"> PAGEREF _Toc242442994 \h </w:instrText>
             </w:r>
             <w:r>
               <w:rPr>
@@ -3188,7 +3188,7 @@
               <w14:ligatures w14:val="standardContextual"/>
             </w:rPr>
           </w:pPr>
-          <w:hyperlink w:anchor="_Toc242400674" w:history="1">
+          <w:hyperlink w:anchor="_Toc242442995" w:history="1">
             <w:r>
               <w:rPr>
                 <w:rStyle w:val="Hipervnculo"/>
@@ -3218,7 +3218,7 @@
                 <w:noProof/>
                 <w:webHidden/>
               </w:rPr>
-              <w:instrText xml:space="preserve"> PAGEREF _Toc242400674 \h </w:instrText>
+              <w:instrText xml:space="preserve"> PAGEREF _Toc242442995 \h </w:instrText>
             </w:r>
             <w:r>
               <w:rPr>
@@ -3263,7 +3263,7 @@
               <w14:ligatures w14:val="standardContextual"/>
             </w:rPr>
           </w:pPr>
-          <w:hyperlink w:anchor="_Toc242400675" w:history="1">
+          <w:hyperlink w:anchor="_Toc242442996" w:history="1">
             <w:r>
               <w:rPr>
                 <w:rStyle w:val="Hipervnculo"/>
@@ -3290,7 +3290,7 @@
                 <w:noProof/>
                 <w:webHidden/>
               </w:rPr>
-              <w:instrText xml:space="preserve"> PAGEREF _Toc242400675 \h </w:instrText>
+              <w:instrText xml:space="preserve"> PAGEREF _Toc242442996 \h </w:instrText>
             </w:r>
             <w:r>
               <w:rPr>
@@ -3332,7 +3332,7 @@
               <w14:ligatures w14:val="standardContextual"/>
             </w:rPr>
           </w:pPr>
-          <w:hyperlink w:anchor="_Toc242400676" w:history="1">
+          <w:hyperlink w:anchor="_Toc242442997" w:history="1">
             <w:r>
               <w:rPr>
                 <w:rStyle w:val="Hipervnculo"/>
@@ -3359,7 +3359,7 @@
                 <w:noProof/>
                 <w:webHidden/>
               </w:rPr>
-              <w:instrText xml:space="preserve"> PAGEREF _Toc242400676 \h </w:instrText>
+              <w:instrText xml:space="preserve"> PAGEREF _Toc242442997 \h </w:instrText>
             </w:r>
             <w:r>
               <w:rPr>
@@ -3401,7 +3401,7 @@
               <w14:ligatures w14:val="standardContextual"/>
             </w:rPr>
           </w:pPr>
-          <w:hyperlink w:anchor="_Toc242400677" w:history="1">
+          <w:hyperlink w:anchor="_Toc242442998" w:history="1">
             <w:r>
               <w:rPr>
                 <w:rStyle w:val="Hipervnculo"/>
@@ -3428,7 +3428,7 @@
                 <w:noProof/>
                 <w:webHidden/>
               </w:rPr>
-              <w:instrText xml:space="preserve"> PAGEREF _Toc242400677 \h </w:instrText>
+              <w:instrText xml:space="preserve"> PAGEREF _Toc242442998 \h </w:instrText>
             </w:r>
             <w:r>
               <w:rPr>
@@ -3470,7 +3470,7 @@
               <w14:ligatures w14:val="standardContextual"/>
             </w:rPr>
           </w:pPr>
-          <w:hyperlink w:anchor="_Toc242400678" w:history="1">
+          <w:hyperlink w:anchor="_Toc242442999" w:history="1">
             <w:r>
               <w:rPr>
                 <w:rStyle w:val="Hipervnculo"/>
@@ -3497,7 +3497,7 @@
                 <w:noProof/>
                 <w:webHidden/>
               </w:rPr>
-              <w:instrText xml:space="preserve"> PAGEREF _Toc242400678 \h </w:instrText>
+              <w:instrText xml:space="preserve"> PAGEREF _Toc242442999 \h </w:instrText>
             </w:r>
             <w:r>
               <w:rPr>
@@ -3539,7 +3539,7 @@
               <w14:ligatures w14:val="standardContextual"/>
             </w:rPr>
           </w:pPr>
-          <w:hyperlink w:anchor="_Toc242400679" w:history="1">
+          <w:hyperlink w:anchor="_Toc242443000" w:history="1">
             <w:r>
               <w:rPr>
                 <w:rStyle w:val="Hipervnculo"/>
@@ -3566,7 +3566,7 @@
                 <w:noProof/>
                 <w:webHidden/>
               </w:rPr>
-              <w:instrText xml:space="preserve"> PAGEREF _Toc242400679 \h </w:instrText>
+              <w:instrText xml:space="preserve"> PAGEREF _Toc242443000 \h </w:instrText>
             </w:r>
             <w:r>
               <w:rPr>
@@ -3608,7 +3608,7 @@
               <w14:ligatures w14:val="standardContextual"/>
             </w:rPr>
           </w:pPr>
-          <w:hyperlink w:anchor="_Toc242400680" w:history="1">
+          <w:hyperlink w:anchor="_Toc242443001" w:history="1">
             <w:r>
               <w:rPr>
                 <w:rStyle w:val="Hipervnculo"/>
@@ -3635,7 +3635,7 @@
                 <w:noProof/>
                 <w:webHidden/>
               </w:rPr>
-              <w:instrText xml:space="preserve"> PAGEREF _Toc242400680 \h </w:instrText>
+              <w:instrText xml:space="preserve"> PAGEREF _Toc242443001 \h </w:instrText>
             </w:r>
             <w:r>
               <w:rPr>
@@ -3677,7 +3677,7 @@
               <w14:ligatures w14:val="standardContextual"/>
             </w:rPr>
           </w:pPr>
-          <w:hyperlink w:anchor="_Toc242400681" w:history="1">
+          <w:hyperlink w:anchor="_Toc242443002" w:history="1">
             <w:r>
               <w:rPr>
                 <w:rStyle w:val="Hipervnculo"/>
@@ -3704,7 +3704,7 @@
                 <w:noProof/>
                 <w:webHidden/>
               </w:rPr>
-              <w:instrText xml:space="preserve"> PAGEREF _Toc242400681 \h </w:instrText>
+              <w:instrText xml:space="preserve"> PAGEREF _Toc242443002 \h </w:instrText>
             </w:r>
             <w:r>
               <w:rPr>
@@ -3724,7 +3724,7 @@
                 <w:noProof/>
                 <w:webHidden/>
               </w:rPr>
-              <w:t>48</w:t>
+              <w:t>49</w:t>
             </w:r>
             <w:r>
               <w:rPr>
@@ -3749,7 +3749,7 @@
               <w14:ligatures w14:val="standardContextual"/>
             </w:rPr>
           </w:pPr>
-          <w:hyperlink w:anchor="_Toc242400682" w:history="1">
+          <w:hyperlink w:anchor="_Toc242443003" w:history="1">
             <w:r>
               <w:rPr>
                 <w:rStyle w:val="Hipervnculo"/>
@@ -3776,7 +3776,7 @@
                 <w:noProof/>
                 <w:webHidden/>
               </w:rPr>
-              <w:instrText xml:space="preserve"> PAGEREF _Toc242400682 \h </w:instrText>
+              <w:instrText xml:space="preserve"> PAGEREF _Toc242443003 \h </w:instrText>
             </w:r>
             <w:r>
               <w:rPr>
@@ -3821,7 +3821,7 @@
               <w14:ligatures w14:val="standardContextual"/>
             </w:rPr>
           </w:pPr>
-          <w:hyperlink w:anchor="_Toc242400683" w:history="1">
+          <w:hyperlink w:anchor="_Toc242443004" w:history="1">
             <w:r>
               <w:rPr>
                 <w:rStyle w:val="Hipervnculo"/>
@@ -3848,7 +3848,7 @@
                 <w:noProof/>
                 <w:webHidden/>
               </w:rPr>
-              <w:instrText xml:space="preserve"> PAGEREF _Toc242400683 \h </w:instrText>
+              <w:instrText xml:space="preserve"> PAGEREF _Toc242443004 \h </w:instrText>
             </w:r>
             <w:r>
               <w:rPr>
@@ -3890,7 +3890,7 @@
               <w14:ligatures w14:val="standardContextual"/>
             </w:rPr>
           </w:pPr>
-          <w:hyperlink w:anchor="_Toc242400684" w:history="1">
+          <w:hyperlink w:anchor="_Toc242443005" w:history="1">
             <w:r>
               <w:rPr>
                 <w:rStyle w:val="Hipervnculo"/>
@@ -3919,7 +3919,7 @@
                 <w:noProof/>
                 <w:webHidden/>
               </w:rPr>
-              <w:instrText xml:space="preserve"> PAGEREF _Toc242400684 \h </w:instrText>
+              <w:instrText xml:space="preserve"> PAGEREF _Toc242443005 \h </w:instrText>
             </w:r>
             <w:r>
               <w:rPr>
@@ -3964,7 +3964,7 @@
               <w14:ligatures w14:val="standardContextual"/>
             </w:rPr>
           </w:pPr>
-          <w:hyperlink w:anchor="_Toc242400685" w:history="1">
+          <w:hyperlink w:anchor="_Toc242443006" w:history="1">
             <w:r>
               <w:rPr>
                 <w:rStyle w:val="Hipervnculo"/>
@@ -3991,7 +3991,7 @@
                 <w:noProof/>
                 <w:webHidden/>
               </w:rPr>
-              <w:instrText xml:space="preserve"> PAGEREF _Toc242400685 \h </w:instrText>
+              <w:instrText xml:space="preserve"> PAGEREF _Toc242443006 \h </w:instrText>
             </w:r>
             <w:r>
               <w:rPr>
@@ -4033,7 +4033,7 @@
               <w14:ligatures w14:val="standardContextual"/>
             </w:rPr>
           </w:pPr>
-          <w:hyperlink w:anchor="_Toc242400686" w:history="1">
+          <w:hyperlink w:anchor="_Toc242443007" w:history="1">
             <w:r>
               <w:rPr>
                 <w:rStyle w:val="Hipervnculo"/>
@@ -4061,7 +4061,7 @@
                 <w:noProof/>
                 <w:webHidden/>
               </w:rPr>
-              <w:instrText xml:space="preserve"> PAGEREF _Toc242400686 \h </w:instrText>
+              <w:instrText xml:space="preserve"> PAGEREF _Toc242443007 \h </w:instrText>
             </w:r>
             <w:r>
               <w:rPr>
@@ -4103,7 +4103,7 @@
               <w14:ligatures w14:val="standardContextual"/>
             </w:rPr>
           </w:pPr>
-          <w:hyperlink w:anchor="_Toc242400687" w:history="1">
+          <w:hyperlink w:anchor="_Toc242443008" w:history="1">
             <w:r>
               <w:rPr>
                 <w:rStyle w:val="Hipervnculo"/>
@@ -4131,7 +4131,7 @@
                 <w:noProof/>
                 <w:webHidden/>
               </w:rPr>
-              <w:instrText xml:space="preserve"> PAGEREF _Toc242400687 \h </w:instrText>
+              <w:instrText xml:space="preserve"> PAGEREF _Toc242443008 \h </w:instrText>
             </w:r>
             <w:r>
               <w:rPr>
@@ -4173,7 +4173,7 @@
               <w14:ligatures w14:val="standardContextual"/>
             </w:rPr>
           </w:pPr>
-          <w:hyperlink w:anchor="_Toc242400688" w:history="1">
+          <w:hyperlink w:anchor="_Toc242443009" w:history="1">
             <w:r>
               <w:rPr>
                 <w:rStyle w:val="Hipervnculo"/>
@@ -4201,7 +4201,7 @@
                 <w:noProof/>
                 <w:webHidden/>
               </w:rPr>
-              <w:instrText xml:space="preserve"> PAGEREF _Toc242400688 \h </w:instrText>
+              <w:instrText xml:space="preserve"> PAGEREF _Toc242443009 \h </w:instrText>
             </w:r>
             <w:r>
               <w:rPr>
@@ -4246,7 +4246,7 @@
               <w14:ligatures w14:val="standardContextual"/>
             </w:rPr>
           </w:pPr>
-          <w:hyperlink w:anchor="_Toc242400689" w:history="1">
+          <w:hyperlink w:anchor="_Toc242443010" w:history="1">
             <w:r>
               <w:rPr>
                 <w:rStyle w:val="Hipervnculo"/>
@@ -4273,7 +4273,7 @@
                 <w:noProof/>
                 <w:webHidden/>
               </w:rPr>
-              <w:instrText xml:space="preserve"> PAGEREF _Toc242400689 \h </w:instrText>
+              <w:instrText xml:space="preserve"> PAGEREF _Toc242443010 \h </w:instrText>
             </w:r>
             <w:r>
               <w:rPr>
@@ -4318,7 +4318,7 @@
               <w14:ligatures w14:val="standardContextual"/>
             </w:rPr>
           </w:pPr>
-          <w:hyperlink w:anchor="_Toc242400690" w:history="1">
+          <w:hyperlink w:anchor="_Toc242443011" w:history="1">
             <w:r>
               <w:rPr>
                 <w:rStyle w:val="Hipervnculo"/>
@@ -4345,7 +4345,7 @@
                 <w:noProof/>
                 <w:webHidden/>
               </w:rPr>
-              <w:instrText xml:space="preserve"> PAGEREF _Toc242400690 \h </w:instrText>
+              <w:instrText xml:space="preserve"> PAGEREF _Toc242443011 \h </w:instrText>
             </w:r>
             <w:r>
               <w:rPr>
@@ -4387,7 +4387,7 @@
               <w14:ligatures w14:val="standardContextual"/>
             </w:rPr>
           </w:pPr>
-          <w:hyperlink w:anchor="_Toc242400691" w:history="1">
+          <w:hyperlink w:anchor="_Toc242443012" w:history="1">
             <w:r>
               <w:rPr>
                 <w:rStyle w:val="Hipervnculo"/>
@@ -4416,7 +4416,7 @@
                 <w:noProof/>
                 <w:webHidden/>
               </w:rPr>
-              <w:instrText xml:space="preserve"> PAGEREF _Toc242400691 \h </w:instrText>
+              <w:instrText xml:space="preserve"> PAGEREF _Toc242443012 \h </w:instrText>
             </w:r>
             <w:r>
               <w:rPr>
@@ -4461,7 +4461,7 @@
               <w14:ligatures w14:val="standardContextual"/>
             </w:rPr>
           </w:pPr>
-          <w:hyperlink w:anchor="_Toc242400692" w:history="1">
+          <w:hyperlink w:anchor="_Toc242443013" w:history="1">
             <w:r>
               <w:rPr>
                 <w:rStyle w:val="Hipervnculo"/>
@@ -4488,7 +4488,7 @@
                 <w:noProof/>
                 <w:webHidden/>
               </w:rPr>
-              <w:instrText xml:space="preserve"> PAGEREF _Toc242400692 \h </w:instrText>
+              <w:instrText xml:space="preserve"> PAGEREF _Toc242443013 \h </w:instrText>
             </w:r>
             <w:r>
               <w:rPr>
@@ -4530,7 +4530,7 @@
               <w14:ligatures w14:val="standardContextual"/>
             </w:rPr>
           </w:pPr>
-          <w:hyperlink w:anchor="_Toc242400693" w:history="1">
+          <w:hyperlink w:anchor="_Toc242443014" w:history="1">
             <w:r>
               <w:rPr>
                 <w:rStyle w:val="Hipervnculo"/>
@@ -4558,7 +4558,7 @@
                 <w:noProof/>
                 <w:webHidden/>
               </w:rPr>
-              <w:instrText xml:space="preserve"> PAGEREF _Toc242400693 \h </w:instrText>
+              <w:instrText xml:space="preserve"> PAGEREF _Toc242443014 \h </w:instrText>
             </w:r>
             <w:r>
               <w:rPr>
@@ -4600,7 +4600,7 @@
               <w14:ligatures w14:val="standardContextual"/>
             </w:rPr>
           </w:pPr>
-          <w:hyperlink w:anchor="_Toc242400694" w:history="1">
+          <w:hyperlink w:anchor="_Toc242443015" w:history="1">
             <w:r>
               <w:rPr>
                 <w:rStyle w:val="Hipervnculo"/>
@@ -4628,7 +4628,7 @@
                 <w:noProof/>
                 <w:webHidden/>
               </w:rPr>
-              <w:instrText xml:space="preserve"> PAGEREF _Toc242400694 \h </w:instrText>
+              <w:instrText xml:space="preserve"> PAGEREF _Toc242443015 \h </w:instrText>
             </w:r>
             <w:r>
               <w:rPr>
@@ -4670,7 +4670,7 @@
               <w14:ligatures w14:val="standardContextual"/>
             </w:rPr>
           </w:pPr>
-          <w:hyperlink w:anchor="_Toc242400695" w:history="1">
+          <w:hyperlink w:anchor="_Toc242443016" w:history="1">
             <w:r>
               <w:rPr>
                 <w:rStyle w:val="Hipervnculo"/>
@@ -4698,7 +4698,7 @@
                 <w:noProof/>
                 <w:webHidden/>
               </w:rPr>
-              <w:instrText xml:space="preserve"> PAGEREF _Toc242400695 \h </w:instrText>
+              <w:instrText xml:space="preserve"> PAGEREF _Toc242443016 \h </w:instrText>
             </w:r>
             <w:r>
               <w:rPr>
@@ -4740,7 +4740,7 @@
               <w14:ligatures w14:val="standardContextual"/>
             </w:rPr>
           </w:pPr>
-          <w:hyperlink w:anchor="_Toc242400696" w:history="1">
+          <w:hyperlink w:anchor="_Toc242443017" w:history="1">
             <w:r>
               <w:rPr>
                 <w:rStyle w:val="Hipervnculo"/>
@@ -4768,7 +4768,7 @@
                 <w:noProof/>
                 <w:webHidden/>
               </w:rPr>
-              <w:instrText xml:space="preserve"> PAGEREF _Toc242400696 \h </w:instrText>
+              <w:instrText xml:space="preserve"> PAGEREF _Toc242443017 \h </w:instrText>
             </w:r>
             <w:r>
               <w:rPr>
@@ -4813,7 +4813,7 @@
               <w14:ligatures w14:val="standardContextual"/>
             </w:rPr>
           </w:pPr>
-          <w:hyperlink w:anchor="_Toc242400697" w:history="1">
+          <w:hyperlink w:anchor="_Toc242443018" w:history="1">
             <w:r>
               <w:rPr>
                 <w:rStyle w:val="Hipervnculo"/>
@@ -4840,7 +4840,7 @@
                 <w:noProof/>
                 <w:webHidden/>
               </w:rPr>
-              <w:instrText xml:space="preserve"> PAGEREF _Toc242400697 \h </w:instrText>
+              <w:instrText xml:space="preserve"> PAGEREF _Toc242443018 \h </w:instrText>
             </w:r>
             <w:r>
               <w:rPr>
@@ -4885,7 +4885,7 @@
               <w14:ligatures w14:val="standardContextual"/>
             </w:rPr>
           </w:pPr>
-          <w:hyperlink w:anchor="_Toc242400698" w:history="1">
+          <w:hyperlink w:anchor="_Toc242443019" w:history="1">
             <w:r>
               <w:rPr>
                 <w:rStyle w:val="Hipervnculo"/>
@@ -4912,7 +4912,7 @@
                 <w:noProof/>
                 <w:webHidden/>
               </w:rPr>
-              <w:instrText xml:space="preserve"> PAGEREF _Toc242400698 \h </w:instrText>
+              <w:instrText xml:space="preserve"> PAGEREF _Toc242443019 \h </w:instrText>
             </w:r>
             <w:r>
               <w:rPr>
@@ -4954,7 +4954,7 @@
               <w14:ligatures w14:val="standardContextual"/>
             </w:rPr>
           </w:pPr>
-          <w:hyperlink w:anchor="_Toc242400699" w:history="1">
+          <w:hyperlink w:anchor="_Toc242443020" w:history="1">
             <w:r>
               <w:rPr>
                 <w:rStyle w:val="Hipervnculo"/>
@@ -4983,7 +4983,7 @@
                 <w:noProof/>
                 <w:webHidden/>
               </w:rPr>
-              <w:instrText xml:space="preserve"> PAGEREF _Toc242400699 \h </w:instrText>
+              <w:instrText xml:space="preserve"> PAGEREF _Toc242443020 \h </w:instrText>
             </w:r>
             <w:r>
               <w:rPr>
@@ -5028,7 +5028,7 @@
               <w14:ligatures w14:val="standardContextual"/>
             </w:rPr>
           </w:pPr>
-          <w:hyperlink w:anchor="_Toc242400700" w:history="1">
+          <w:hyperlink w:anchor="_Toc242443021" w:history="1">
             <w:r>
               <w:rPr>
                 <w:rStyle w:val="Hipervnculo"/>
@@ -5055,7 +5055,7 @@
                 <w:noProof/>
                 <w:webHidden/>
               </w:rPr>
-              <w:instrText xml:space="preserve"> PAGEREF _Toc242400700 \h </w:instrText>
+              <w:instrText xml:space="preserve"> PAGEREF _Toc242443021 \h </w:instrText>
             </w:r>
             <w:r>
               <w:rPr>
@@ -5097,7 +5097,7 @@
               <w14:ligatures w14:val="standardContextual"/>
             </w:rPr>
           </w:pPr>
-          <w:hyperlink w:anchor="_Toc242400701" w:history="1">
+          <w:hyperlink w:anchor="_Toc242443022" w:history="1">
             <w:r>
               <w:rPr>
                 <w:rStyle w:val="Hipervnculo"/>
@@ -5125,7 +5125,7 @@
                 <w:noProof/>
                 <w:webHidden/>
               </w:rPr>
-              <w:instrText xml:space="preserve"> PAGEREF _Toc242400701 \h </w:instrText>
+              <w:instrText xml:space="preserve"> PAGEREF _Toc242443022 \h </w:instrText>
             </w:r>
             <w:r>
               <w:rPr>
@@ -5167,7 +5167,7 @@
               <w14:ligatures w14:val="standardContextual"/>
             </w:rPr>
           </w:pPr>
-          <w:hyperlink w:anchor="_Toc242400702" w:history="1">
+          <w:hyperlink w:anchor="_Toc242443023" w:history="1">
             <w:r>
               <w:rPr>
                 <w:rStyle w:val="Hipervnculo"/>
@@ -5195,7 +5195,7 @@
                 <w:noProof/>
                 <w:webHidden/>
               </w:rPr>
-              <w:instrText xml:space="preserve"> PAGEREF _Toc242400702 \h </w:instrText>
+              <w:instrText xml:space="preserve"> PAGEREF _Toc242443023 \h </w:instrText>
             </w:r>
             <w:r>
               <w:rPr>
@@ -5237,7 +5237,7 @@
               <w14:ligatures w14:val="standardContextual"/>
             </w:rPr>
           </w:pPr>
-          <w:hyperlink w:anchor="_Toc242400703" w:history="1">
+          <w:hyperlink w:anchor="_Toc242443024" w:history="1">
             <w:r>
               <w:rPr>
                 <w:rStyle w:val="Hipervnculo"/>
@@ -5265,7 +5265,7 @@
                 <w:noProof/>
                 <w:webHidden/>
               </w:rPr>
-              <w:instrText xml:space="preserve"> PAGEREF _Toc242400703 \h </w:instrText>
+              <w:instrText xml:space="preserve"> PAGEREF _Toc242443024 \h </w:instrText>
             </w:r>
             <w:r>
               <w:rPr>
@@ -5307,7 +5307,7 @@
               <w14:ligatures w14:val="standardContextual"/>
             </w:rPr>
           </w:pPr>
-          <w:hyperlink w:anchor="_Toc242400704" w:history="1">
+          <w:hyperlink w:anchor="_Toc242443025" w:history="1">
             <w:r>
               <w:rPr>
                 <w:rStyle w:val="Hipervnculo"/>
@@ -5335,7 +5335,7 @@
                 <w:noProof/>
                 <w:webHidden/>
               </w:rPr>
-              <w:instrText xml:space="preserve"> PAGEREF _Toc242400704 \h </w:instrText>
+              <w:instrText xml:space="preserve"> PAGEREF _Toc242443025 \h </w:instrText>
             </w:r>
             <w:r>
               <w:rPr>
@@ -5380,7 +5380,7 @@
               <w14:ligatures w14:val="standardContextual"/>
             </w:rPr>
           </w:pPr>
-          <w:hyperlink w:anchor="_Toc242400705" w:history="1">
+          <w:hyperlink w:anchor="_Toc242443026" w:history="1">
             <w:r>
               <w:rPr>
                 <w:rStyle w:val="Hipervnculo"/>
@@ -5407,7 +5407,7 @@
                 <w:noProof/>
                 <w:webHidden/>
               </w:rPr>
-              <w:instrText xml:space="preserve"> PAGEREF _Toc242400705 \h </w:instrText>
+              <w:instrText xml:space="preserve"> PAGEREF _Toc242443026 \h </w:instrText>
             </w:r>
             <w:r>
               <w:rPr>
@@ -5427,7 +5427,7 @@
                 <w:noProof/>
                 <w:webHidden/>
               </w:rPr>
-              <w:t>63</w:t>
+              <w:t>64</w:t>
             </w:r>
             <w:r>
               <w:rPr>
@@ -5452,7 +5452,7 @@
               <w14:ligatures w14:val="standardContextual"/>
             </w:rPr>
           </w:pPr>
-          <w:hyperlink w:anchor="_Toc242400706" w:history="1">
+          <w:hyperlink w:anchor="_Toc242443027" w:history="1">
             <w:r>
               <w:rPr>
                 <w:rStyle w:val="Hipervnculo"/>
@@ -5479,7 +5479,7 @@
                 <w:noProof/>
                 <w:webHidden/>
               </w:rPr>
-              <w:instrText xml:space="preserve"> PAGEREF _Toc242400706 \h </w:instrText>
+              <w:instrText xml:space="preserve"> PAGEREF _Toc242443027 \h </w:instrText>
             </w:r>
             <w:r>
               <w:rPr>
@@ -5521,7 +5521,7 @@
               <w14:ligatures w14:val="standardContextual"/>
             </w:rPr>
           </w:pPr>
-          <w:hyperlink w:anchor="_Toc242400707" w:history="1">
+          <w:hyperlink w:anchor="_Toc242443028" w:history="1">
             <w:r>
               <w:rPr>
                 <w:rStyle w:val="Hipervnculo"/>
@@ -5551,7 +5551,7 @@
                 <w:noProof/>
                 <w:webHidden/>
               </w:rPr>
-              <w:instrText xml:space="preserve"> PAGEREF _Toc242400707 \h </w:instrText>
+              <w:instrText xml:space="preserve"> PAGEREF _Toc242443028 \h </w:instrText>
             </w:r>
             <w:r>
               <w:rPr>
@@ -5571,7 +5571,7 @@
                 <w:noProof/>
                 <w:webHidden/>
               </w:rPr>
-              <w:t>67</w:t>
+              <w:t>68</w:t>
             </w:r>
             <w:r>
               <w:rPr>
@@ -5712,7 +5712,7 @@
         </w:rPr>
         <w:fldChar w:fldCharType="separate"/>
       </w:r>
-      <w:hyperlink w:anchor="_Toc242400708" w:history="1">
+      <w:hyperlink w:anchor="_Toc242443029" w:history="1">
         <w:r>
           <w:rPr>
             <w:rStyle w:val="Hipervnculo"/>
@@ -5740,7 +5740,7 @@
             <w:noProof/>
             <w:webHidden/>
           </w:rPr>
-          <w:instrText xml:space="preserve"> PAGEREF _Toc242400708 \h </w:instrText>
+          <w:instrText xml:space="preserve"> PAGEREF _Toc242443029 \h </w:instrText>
         </w:r>
         <w:r>
           <w:rPr>
@@ -5788,7 +5788,7 @@
           <w14:ligatures w14:val="standardContextual"/>
         </w:rPr>
       </w:pPr>
-      <w:hyperlink w:anchor="_Toc242400709" w:history="1">
+      <w:hyperlink w:anchor="_Toc242443030" w:history="1">
         <w:r>
           <w:rPr>
             <w:rStyle w:val="Hipervnculo"/>
@@ -5816,7 +5816,7 @@
             <w:noProof/>
             <w:webHidden/>
           </w:rPr>
-          <w:instrText xml:space="preserve"> PAGEREF _Toc242400709 \h </w:instrText>
+          <w:instrText xml:space="preserve"> PAGEREF _Toc242443030 \h </w:instrText>
         </w:r>
         <w:r>
           <w:rPr>
@@ -5864,7 +5864,7 @@
           <w14:ligatures w14:val="standardContextual"/>
         </w:rPr>
       </w:pPr>
-      <w:hyperlink w:anchor="_Toc242400710" w:history="1">
+      <w:hyperlink w:anchor="_Toc242443031" w:history="1">
         <w:r>
           <w:rPr>
             <w:rStyle w:val="Hipervnculo"/>
@@ -5892,7 +5892,7 @@
             <w:noProof/>
             <w:webHidden/>
           </w:rPr>
-          <w:instrText xml:space="preserve"> PAGEREF _Toc242400710 \h </w:instrText>
+          <w:instrText xml:space="preserve"> PAGEREF _Toc242443031 \h </w:instrText>
         </w:r>
         <w:r>
           <w:rPr>
@@ -5940,7 +5940,7 @@
           <w14:ligatures w14:val="standardContextual"/>
         </w:rPr>
       </w:pPr>
-      <w:hyperlink w:anchor="_Toc242400711" w:history="1">
+      <w:hyperlink w:anchor="_Toc242443032" w:history="1">
         <w:r>
           <w:rPr>
             <w:rStyle w:val="Hipervnculo"/>
@@ -5968,7 +5968,7 @@
             <w:noProof/>
             <w:webHidden/>
           </w:rPr>
-          <w:instrText xml:space="preserve"> PAGEREF _Toc242400711 \h </w:instrText>
+          <w:instrText xml:space="preserve"> PAGEREF _Toc242443032 \h </w:instrText>
         </w:r>
         <w:r>
           <w:rPr>
@@ -6016,7 +6016,7 @@
           <w14:ligatures w14:val="standardContextual"/>
         </w:rPr>
       </w:pPr>
-      <w:hyperlink w:anchor="_Toc242400712" w:history="1">
+      <w:hyperlink w:anchor="_Toc242443033" w:history="1">
         <w:r>
           <w:rPr>
             <w:rStyle w:val="Hipervnculo"/>
@@ -6044,7 +6044,7 @@
             <w:noProof/>
             <w:webHidden/>
           </w:rPr>
-          <w:instrText xml:space="preserve"> PAGEREF _Toc242400712 \h </w:instrText>
+          <w:instrText xml:space="preserve"> PAGEREF _Toc242443033 \h </w:instrText>
         </w:r>
         <w:r>
           <w:rPr>
@@ -6092,7 +6092,7 @@
           <w14:ligatures w14:val="standardContextual"/>
         </w:rPr>
       </w:pPr>
-      <w:hyperlink w:anchor="_Toc242400713" w:history="1">
+      <w:hyperlink w:anchor="_Toc242443034" w:history="1">
         <w:r>
           <w:rPr>
             <w:rStyle w:val="Hipervnculo"/>
@@ -6120,7 +6120,7 @@
             <w:noProof/>
             <w:webHidden/>
           </w:rPr>
-          <w:instrText xml:space="preserve"> PAGEREF _Toc242400713 \h </w:instrText>
+          <w:instrText xml:space="preserve"> PAGEREF _Toc242443034 \h </w:instrText>
         </w:r>
         <w:r>
           <w:rPr>
@@ -6168,7 +6168,7 @@
           <w14:ligatures w14:val="standardContextual"/>
         </w:rPr>
       </w:pPr>
-      <w:hyperlink w:anchor="_Toc242400714" w:history="1">
+      <w:hyperlink w:anchor="_Toc242443035" w:history="1">
         <w:r>
           <w:rPr>
             <w:rStyle w:val="Hipervnculo"/>
@@ -6196,7 +6196,7 @@
             <w:noProof/>
             <w:webHidden/>
           </w:rPr>
-          <w:instrText xml:space="preserve"> PAGEREF _Toc242400714 \h </w:instrText>
+          <w:instrText xml:space="preserve"> PAGEREF _Toc242443035 \h </w:instrText>
         </w:r>
         <w:r>
           <w:rPr>
@@ -6244,7 +6244,7 @@
           <w14:ligatures w14:val="standardContextual"/>
         </w:rPr>
       </w:pPr>
-      <w:hyperlink w:anchor="_Toc242400715" w:history="1">
+      <w:hyperlink w:anchor="_Toc242443036" w:history="1">
         <w:r>
           <w:rPr>
             <w:rStyle w:val="Hipervnculo"/>
@@ -6272,7 +6272,7 @@
             <w:noProof/>
             <w:webHidden/>
           </w:rPr>
-          <w:instrText xml:space="preserve"> PAGEREF _Toc242400715 \h </w:instrText>
+          <w:instrText xml:space="preserve"> PAGEREF _Toc242443036 \h </w:instrText>
         </w:r>
         <w:r>
           <w:rPr>
@@ -6320,7 +6320,7 @@
           <w14:ligatures w14:val="standardContextual"/>
         </w:rPr>
       </w:pPr>
-      <w:hyperlink w:anchor="_Toc242400716" w:history="1">
+      <w:hyperlink w:anchor="_Toc242443037" w:history="1">
         <w:r>
           <w:rPr>
             <w:rStyle w:val="Hipervnculo"/>
@@ -6348,83 +6348,7 @@
             <w:noProof/>
             <w:webHidden/>
           </w:rPr>
-          <w:instrText xml:space="preserve"> PAGEREF _Toc242400716 \h </w:instrText>
-        </w:r>
-        <w:r>
-          <w:rPr>
-            <w:noProof/>
-            <w:webHidden/>
-          </w:rPr>
-        </w:r>
-        <w:r>
-          <w:rPr>
-            <w:noProof/>
-            <w:webHidden/>
-          </w:rPr>
-          <w:fldChar w:fldCharType="separate"/>
-        </w:r>
-        <w:r>
-          <w:rPr>
-            <w:noProof/>
-            <w:webHidden/>
-          </w:rPr>
-          <w:t>64</w:t>
-        </w:r>
-        <w:r>
-          <w:rPr>
-            <w:noProof/>
-            <w:webHidden/>
-          </w:rPr>
-          <w:fldChar w:fldCharType="end"/>
-        </w:r>
-      </w:hyperlink>
-    </w:p>
-    <w:p>
-      <w:pPr>
-        <w:pStyle w:val="Tabladeilustraciones"/>
-        <w:tabs>
-          <w:tab w:val="right" w:leader="dot" w:pos="9964"/>
-        </w:tabs>
-        <w:rPr>
-          <w:rFonts w:eastAsiaTheme="minorEastAsia" w:cstheme="minorBidi"/>
-          <w:smallCaps w:val="0"/>
-          <w:noProof/>
-          <w:color w:val="auto"/>
-          <w:kern w:val="2"/>
-          <w:sz w:val="24"/>
-          <w:szCs w:val="24"/>
-          <w14:ligatures w14:val="standardContextual"/>
-        </w:rPr>
-      </w:pPr>
-      <w:hyperlink w:anchor="_Toc242400717" w:history="1">
-        <w:r>
-          <w:rPr>
-            <w:rStyle w:val="Hipervnculo"/>
-            <w:rFonts w:cs="Arial"/>
-            <w:noProof/>
-          </w:rPr>
-          <w:t>Tabla 10. Resultado de la suite de pruebas del 1 de octubre de 2026</w:t>
-        </w:r>
-        <w:r>
-          <w:rPr>
-            <w:noProof/>
-            <w:webHidden/>
-          </w:rPr>
-          <w:tab/>
-        </w:r>
-        <w:r>
-          <w:rPr>
-            <w:noProof/>
-            <w:webHidden/>
-          </w:rPr>
-          <w:fldChar w:fldCharType="begin"/>
-        </w:r>
-        <w:r>
-          <w:rPr>
-            <w:noProof/>
-            <w:webHidden/>
-          </w:rPr>
-          <w:instrText xml:space="preserve"> PAGEREF _Toc242400717 \h </w:instrText>
+          <w:instrText xml:space="preserve"> PAGEREF _Toc242443037 \h </w:instrText>
         </w:r>
         <w:r>
           <w:rPr>
@@ -6472,14 +6396,14 @@
           <w14:ligatures w14:val="standardContextual"/>
         </w:rPr>
       </w:pPr>
-      <w:hyperlink w:anchor="_Toc242400718" w:history="1">
+      <w:hyperlink w:anchor="_Toc242443038" w:history="1">
         <w:r>
           <w:rPr>
             <w:rStyle w:val="Hipervnculo"/>
             <w:rFonts w:cs="Arial"/>
             <w:noProof/>
           </w:rPr>
-          <w:t>Tabla 11. Presupuestos de rendimiento y estado de su medición</w:t>
+          <w:t>Tabla 10. Resultado de la suite de pruebas del 1 de octubre de 2026</w:t>
         </w:r>
         <w:r>
           <w:rPr>
@@ -6500,7 +6424,7 @@
             <w:noProof/>
             <w:webHidden/>
           </w:rPr>
-          <w:instrText xml:space="preserve"> PAGEREF _Toc242400718 \h </w:instrText>
+          <w:instrText xml:space="preserve"> PAGEREF _Toc242443038 \h </w:instrText>
         </w:r>
         <w:r>
           <w:rPr>
@@ -6533,171 +6457,6 @@
     </w:p>
     <w:p>
       <w:pPr>
-        <w:pStyle w:val="TDC1"/>
-        <w:rPr>
-          <w:rFonts w:eastAsia="Arial" w:cs="Arial"/>
-        </w:rPr>
-      </w:pPr>
-      <w:r>
-        <w:rPr>
-          <w:rStyle w:val="Hipervnculo"/>
-          <w:rFonts w:cs="Arial"/>
-          <w:noProof/>
-        </w:rPr>
-        <w:fldChar w:fldCharType="end"/>
-      </w:r>
-      <w:r>
-        <w:rPr>
-          <w:rFonts w:cs="Arial"/>
-        </w:rPr>
-        <w:t xml:space="preserve"> </w:t>
-      </w:r>
-    </w:p>
-    <w:p>
-      <w:pPr>
-        <w:ind w:firstLine="431"/>
-        <w:jc w:val="right"/>
-        <w:rPr>
-          <w:rFonts w:eastAsia="Arial" w:cs="Arial"/>
-        </w:rPr>
-      </w:pPr>
-    </w:p>
-    <w:p>
-      <w:pPr>
-        <w:ind w:firstLine="431"/>
-        <w:jc w:val="right"/>
-        <w:rPr>
-          <w:rFonts w:eastAsia="Arial" w:cs="Arial"/>
-        </w:rPr>
-      </w:pPr>
-    </w:p>
-    <w:p>
-      <w:pPr>
-        <w:spacing w:after="240"/>
-        <w:jc w:val="center"/>
-        <w:rPr>
-          <w:rFonts w:cs="Arial"/>
-          <w:b/>
-          <w:bCs/>
-        </w:rPr>
-      </w:pPr>
-      <w:r>
-        <w:rPr>
-          <w:rFonts w:cs="Arial"/>
-          <w:b/>
-          <w:bCs/>
-        </w:rPr>
-        <w:t>LISTA DE CUADROS</w:t>
-      </w:r>
-    </w:p>
-    <w:p>
-      <w:pPr>
-        <w:spacing w:after="240"/>
-        <w:jc w:val="right"/>
-        <w:rPr>
-          <w:rFonts w:cs="Arial"/>
-        </w:rPr>
-      </w:pPr>
-      <w:r>
-        <w:rPr>
-          <w:rFonts w:cs="Arial"/>
-        </w:rPr>
-        <w:t>Pág.</w:t>
-      </w:r>
-    </w:p>
-    <w:p>
-      <w:pPr>
-        <w:spacing w:after="240"/>
-        <w:jc w:val="left"/>
-        <w:rPr>
-          <w:rFonts w:cs="Arial"/>
-        </w:rPr>
-      </w:pPr>
-      <w:r>
-        <w:rPr>
-          <w:rFonts w:cs="Arial"/>
-        </w:rPr>
-        <w:t>El presente trabajo de grado no incluye cuadros.</w:t>
-      </w:r>
-    </w:p>
-    <w:p>
-      <w:pPr>
-        <w:spacing w:before="240" w:after="480"/>
-        <w:ind w:firstLine="709"/>
-        <w:rPr>
-          <w:rFonts w:cs="Arial"/>
-        </w:rPr>
-      </w:pPr>
-      <w:r>
-        <w:rPr>
-          <w:rFonts w:cs="Arial"/>
-        </w:rPr>
-        <w:br w:type="page"/>
-      </w:r>
-    </w:p>
-    <w:p>
-      <w:pPr>
-        <w:jc w:val="center"/>
-        <w:rPr>
-          <w:rFonts w:cs="Arial"/>
-          <w:b/>
-          <w:bCs/>
-        </w:rPr>
-      </w:pPr>
-      <w:r>
-        <w:rPr>
-          <w:rFonts w:cs="Arial"/>
-          <w:b/>
-          <w:bCs/>
-        </w:rPr>
-        <w:lastRenderedPageBreak/>
-        <w:t>LISTA DE FIGURAS</w:t>
-      </w:r>
-    </w:p>
-    <w:p>
-      <w:pPr>
-        <w:ind w:firstLine="431"/>
-        <w:jc w:val="right"/>
-        <w:rPr>
-          <w:rFonts w:eastAsia="Arial" w:cs="Arial"/>
-        </w:rPr>
-      </w:pPr>
-    </w:p>
-    <w:p>
-      <w:pPr>
-        <w:ind w:firstLine="431"/>
-        <w:jc w:val="right"/>
-        <w:rPr>
-          <w:rFonts w:eastAsia="Arial" w:cs="Arial"/>
-        </w:rPr>
-      </w:pPr>
-    </w:p>
-    <w:p>
-      <w:pPr>
-        <w:ind w:firstLine="431"/>
-        <w:jc w:val="right"/>
-        <w:rPr>
-          <w:rFonts w:eastAsia="Arial" w:cs="Arial"/>
-        </w:rPr>
-      </w:pPr>
-      <w:r>
-        <w:rPr>
-          <w:rFonts w:eastAsia="Arial" w:cs="Arial"/>
-        </w:rPr>
-        <w:t>Pág.</w:t>
-      </w:r>
-    </w:p>
-    <w:p>
-      <w:pPr>
-        <w:ind w:firstLine="431"/>
-        <w:jc w:val="right"/>
-        <w:rPr>
-          <w:rFonts w:eastAsia="Arial" w:cs="Arial"/>
-        </w:rPr>
-      </w:pPr>
-    </w:p>
-    <w:p>
-      <w:pPr>
         <w:pStyle w:val="Tabladeilustraciones"/>
         <w:tabs>
           <w:tab w:val="right" w:leader="dot" w:pos="9964"/>
@@ -6713,6 +6472,247 @@
           <w14:ligatures w14:val="standardContextual"/>
         </w:rPr>
       </w:pPr>
+      <w:hyperlink w:anchor="_Toc242443039" w:history="1">
+        <w:r>
+          <w:rPr>
+            <w:rStyle w:val="Hipervnculo"/>
+            <w:rFonts w:cs="Arial"/>
+            <w:noProof/>
+          </w:rPr>
+          <w:t>Tabla 11. Presupuestos de rendimiento y estado de su medición</w:t>
+        </w:r>
+        <w:r>
+          <w:rPr>
+            <w:noProof/>
+            <w:webHidden/>
+          </w:rPr>
+          <w:tab/>
+        </w:r>
+        <w:r>
+          <w:rPr>
+            <w:noProof/>
+            <w:webHidden/>
+          </w:rPr>
+          <w:fldChar w:fldCharType="begin"/>
+        </w:r>
+        <w:r>
+          <w:rPr>
+            <w:noProof/>
+            <w:webHidden/>
+          </w:rPr>
+          <w:instrText xml:space="preserve"> PAGEREF _Toc242443039 \h </w:instrText>
+        </w:r>
+        <w:r>
+          <w:rPr>
+            <w:noProof/>
+            <w:webHidden/>
+          </w:rPr>
+        </w:r>
+        <w:r>
+          <w:rPr>
+            <w:noProof/>
+            <w:webHidden/>
+          </w:rPr>
+          <w:fldChar w:fldCharType="separate"/>
+        </w:r>
+        <w:r>
+          <w:rPr>
+            <w:noProof/>
+            <w:webHidden/>
+          </w:rPr>
+          <w:t>66</w:t>
+        </w:r>
+        <w:r>
+          <w:rPr>
+            <w:noProof/>
+            <w:webHidden/>
+          </w:rPr>
+          <w:fldChar w:fldCharType="end"/>
+        </w:r>
+      </w:hyperlink>
+    </w:p>
+    <w:p>
+      <w:pPr>
+        <w:pStyle w:val="TDC1"/>
+        <w:rPr>
+          <w:rFonts w:eastAsia="Arial" w:cs="Arial"/>
+        </w:rPr>
+      </w:pPr>
+      <w:r>
+        <w:rPr>
+          <w:rStyle w:val="Hipervnculo"/>
+          <w:rFonts w:cs="Arial"/>
+          <w:noProof/>
+        </w:rPr>
+        <w:fldChar w:fldCharType="end"/>
+      </w:r>
+      <w:r>
+        <w:rPr>
+          <w:rFonts w:cs="Arial"/>
+        </w:rPr>
+        <w:t xml:space="preserve"> </w:t>
+      </w:r>
+    </w:p>
+    <w:p>
+      <w:pPr>
+        <w:ind w:firstLine="431"/>
+        <w:jc w:val="right"/>
+        <w:rPr>
+          <w:rFonts w:eastAsia="Arial" w:cs="Arial"/>
+        </w:rPr>
+      </w:pPr>
+    </w:p>
+    <w:p>
+      <w:pPr>
+        <w:ind w:firstLine="431"/>
+        <w:jc w:val="right"/>
+        <w:rPr>
+          <w:rFonts w:eastAsia="Arial" w:cs="Arial"/>
+        </w:rPr>
+      </w:pPr>
+    </w:p>
+    <w:p>
+      <w:pPr>
+        <w:spacing w:after="240"/>
+        <w:jc w:val="center"/>
+        <w:rPr>
+          <w:rFonts w:cs="Arial"/>
+          <w:b/>
+          <w:bCs/>
+        </w:rPr>
+      </w:pPr>
+      <w:r>
+        <w:rPr>
+          <w:rFonts w:cs="Arial"/>
+          <w:b/>
+          <w:bCs/>
+        </w:rPr>
+        <w:t>LISTA DE CUADROS</w:t>
+      </w:r>
+    </w:p>
+    <w:p>
+      <w:pPr>
+        <w:spacing w:after="240"/>
+        <w:jc w:val="right"/>
+        <w:rPr>
+          <w:rFonts w:cs="Arial"/>
+        </w:rPr>
+      </w:pPr>
+      <w:r>
+        <w:rPr>
+          <w:rFonts w:cs="Arial"/>
+        </w:rPr>
+        <w:t>Pág.</w:t>
+      </w:r>
+    </w:p>
+    <w:p>
+      <w:pPr>
+        <w:spacing w:after="240"/>
+        <w:jc w:val="left"/>
+        <w:rPr>
+          <w:rFonts w:cs="Arial"/>
+        </w:rPr>
+      </w:pPr>
+      <w:r>
+        <w:rPr>
+          <w:rFonts w:cs="Arial"/>
+        </w:rPr>
+        <w:t>El presente trabajo de grado no incluye cuadros.</w:t>
+      </w:r>
+    </w:p>
+    <w:p>
+      <w:pPr>
+        <w:spacing w:before="240" w:after="480"/>
+        <w:ind w:firstLine="709"/>
+        <w:rPr>
+          <w:rFonts w:cs="Arial"/>
+        </w:rPr>
+      </w:pPr>
+      <w:r>
+        <w:rPr>
+          <w:rFonts w:cs="Arial"/>
+        </w:rPr>
+        <w:br w:type="page"/>
+      </w:r>
+    </w:p>
+    <w:p>
+      <w:pPr>
+        <w:jc w:val="center"/>
+        <w:rPr>
+          <w:rFonts w:cs="Arial"/>
+          <w:b/>
+          <w:bCs/>
+        </w:rPr>
+      </w:pPr>
+      <w:r>
+        <w:rPr>
+          <w:rFonts w:cs="Arial"/>
+          <w:b/>
+          <w:bCs/>
+        </w:rPr>
+        <w:lastRenderedPageBreak/>
+        <w:t>LISTA DE FIGURAS</w:t>
+      </w:r>
+    </w:p>
+    <w:p>
+      <w:pPr>
+        <w:ind w:firstLine="431"/>
+        <w:jc w:val="right"/>
+        <w:rPr>
+          <w:rFonts w:eastAsia="Arial" w:cs="Arial"/>
+        </w:rPr>
+      </w:pPr>
+    </w:p>
+    <w:p>
+      <w:pPr>
+        <w:ind w:firstLine="431"/>
+        <w:jc w:val="right"/>
+        <w:rPr>
+          <w:rFonts w:eastAsia="Arial" w:cs="Arial"/>
+        </w:rPr>
+      </w:pPr>
+    </w:p>
+    <w:p>
+      <w:pPr>
+        <w:ind w:firstLine="431"/>
+        <w:jc w:val="right"/>
+        <w:rPr>
+          <w:rFonts w:eastAsia="Arial" w:cs="Arial"/>
+        </w:rPr>
+      </w:pPr>
+      <w:r>
+        <w:rPr>
+          <w:rFonts w:eastAsia="Arial" w:cs="Arial"/>
+        </w:rPr>
+        <w:t>Pág.</w:t>
+      </w:r>
+    </w:p>
+    <w:p>
+      <w:pPr>
+        <w:ind w:firstLine="431"/>
+        <w:jc w:val="right"/>
+        <w:rPr>
+          <w:rFonts w:eastAsia="Arial" w:cs="Arial"/>
+        </w:rPr>
+      </w:pPr>
+    </w:p>
+    <w:p>
+      <w:pPr>
+        <w:pStyle w:val="Tabladeilustraciones"/>
+        <w:tabs>
+          <w:tab w:val="right" w:leader="dot" w:pos="9964"/>
+        </w:tabs>
+        <w:rPr>
+          <w:rFonts w:eastAsiaTheme="minorEastAsia" w:cstheme="minorBidi"/>
+          <w:smallCaps w:val="0"/>
+          <w:noProof/>
+          <w:color w:val="auto"/>
+          <w:kern w:val="2"/>
+          <w:sz w:val="24"/>
+          <w:szCs w:val="24"/>
+          <w14:ligatures w14:val="standardContextual"/>
+        </w:rPr>
+      </w:pPr>
       <w:r>
         <w:rPr>
           <w:rFonts w:cs="Arial"/>
@@ -6739,7 +6739,7 @@
         </w:rPr>
         <w:fldChar w:fldCharType="separate"/>
       </w:r>
-      <w:hyperlink w:anchor="_Toc242400719" w:history="1">
+      <w:hyperlink w:anchor="_Toc242443040" w:history="1">
         <w:r>
           <w:rPr>
             <w:rStyle w:val="Hipervnculo"/>
@@ -6767,7 +6767,7 @@
             <w:noProof/>
             <w:webHidden/>
           </w:rPr>
-          <w:instrText xml:space="preserve"> PAGEREF _Toc242400719 \h </w:instrText>
+          <w:instrText xml:space="preserve"> PAGEREF _Toc242443040 \h </w:instrText>
         </w:r>
         <w:r>
           <w:rPr>
@@ -6815,7 +6815,7 @@
           <w14:ligatures w14:val="standardContextual"/>
         </w:rPr>
       </w:pPr>
-      <w:hyperlink w:anchor="_Toc242400720" w:history="1">
+      <w:hyperlink w:anchor="_Toc242443041" w:history="1">
         <w:r>
           <w:rPr>
             <w:rStyle w:val="Hipervnculo"/>
@@ -6843,7 +6843,7 @@
             <w:noProof/>
             <w:webHidden/>
           </w:rPr>
-          <w:instrText xml:space="preserve"> PAGEREF _Toc242400720 \h </w:instrText>
+          <w:instrText xml:space="preserve"> PAGEREF _Toc242443041 \h </w:instrText>
         </w:r>
         <w:r>
           <w:rPr>
@@ -6891,7 +6891,7 @@
           <w14:ligatures w14:val="standardContextual"/>
         </w:rPr>
       </w:pPr>
-      <w:hyperlink w:anchor="_Toc242400721" w:history="1">
+      <w:hyperlink w:anchor="_Toc242443042" w:history="1">
         <w:r>
           <w:rPr>
             <w:rStyle w:val="Hipervnculo"/>
@@ -6927,7 +6927,7 @@
             <w:noProof/>
             <w:webHidden/>
           </w:rPr>
-          <w:instrText xml:space="preserve"> PAGEREF _Toc242400721 \h </w:instrText>
+          <w:instrText xml:space="preserve"> PAGEREF _Toc242443042 \h </w:instrText>
         </w:r>
         <w:r>
           <w:rPr>
@@ -6975,7 +6975,7 @@
           <w14:ligatures w14:val="standardContextual"/>
         </w:rPr>
       </w:pPr>
-      <w:hyperlink w:anchor="_Toc242400722" w:history="1">
+      <w:hyperlink w:anchor="_Toc242443043" w:history="1">
         <w:r>
           <w:rPr>
             <w:rStyle w:val="Hipervnculo"/>
@@ -7011,7 +7011,7 @@
             <w:noProof/>
             <w:webHidden/>
           </w:rPr>
-          <w:instrText xml:space="preserve"> PAGEREF _Toc242400722 \h </w:instrText>
+          <w:instrText xml:space="preserve"> PAGEREF _Toc242443043 \h </w:instrText>
         </w:r>
         <w:r>
           <w:rPr>
@@ -7059,7 +7059,7 @@
           <w14:ligatures w14:val="standardContextual"/>
         </w:rPr>
       </w:pPr>
-      <w:hyperlink w:anchor="_Toc242400723" w:history="1">
+      <w:hyperlink w:anchor="_Toc242443044" w:history="1">
         <w:r>
           <w:rPr>
             <w:rStyle w:val="Hipervnculo"/>
@@ -7087,7 +7087,7 @@
             <w:noProof/>
             <w:webHidden/>
           </w:rPr>
-          <w:instrText xml:space="preserve"> PAGEREF _Toc242400723 \h </w:instrText>
+          <w:instrText xml:space="preserve"> PAGEREF _Toc242443044 \h </w:instrText>
         </w:r>
         <w:r>
           <w:rPr>
@@ -7135,7 +7135,7 @@
           <w14:ligatures w14:val="standardContextual"/>
         </w:rPr>
       </w:pPr>
-      <w:hyperlink w:anchor="_Toc242400724" w:history="1">
+      <w:hyperlink w:anchor="_Toc242443045" w:history="1">
         <w:r>
           <w:rPr>
             <w:rStyle w:val="Hipervnculo"/>
@@ -7163,7 +7163,7 @@
             <w:noProof/>
             <w:webHidden/>
           </w:rPr>
-          <w:instrText xml:space="preserve"> PAGEREF _Toc242400724 \h </w:instrText>
+          <w:instrText xml:space="preserve"> PAGEREF _Toc242443045 \h </w:instrText>
         </w:r>
         <w:r>
           <w:rPr>
@@ -7211,7 +7211,7 @@
           <w14:ligatures w14:val="standardContextual"/>
         </w:rPr>
       </w:pPr>
-      <w:hyperlink w:anchor="_Toc242400725" w:history="1">
+      <w:hyperlink w:anchor="_Toc242443046" w:history="1">
         <w:r>
           <w:rPr>
             <w:rStyle w:val="Hipervnculo"/>
@@ -7239,7 +7239,7 @@
             <w:noProof/>
             <w:webHidden/>
           </w:rPr>
-          <w:instrText xml:space="preserve"> PAGEREF _Toc242400725 \h </w:instrText>
+          <w:instrText xml:space="preserve"> PAGEREF _Toc242443046 \h </w:instrText>
         </w:r>
         <w:r>
           <w:rPr>
@@ -7287,7 +7287,7 @@
           <w14:ligatures w14:val="standardContextual"/>
         </w:rPr>
       </w:pPr>
-      <w:hyperlink w:anchor="_Toc242400726" w:history="1">
+      <w:hyperlink w:anchor="_Toc242443047" w:history="1">
         <w:r>
           <w:rPr>
             <w:rStyle w:val="Hipervnculo"/>
@@ -7315,7 +7315,7 @@
             <w:noProof/>
             <w:webHidden/>
           </w:rPr>
-          <w:instrText xml:space="preserve"> PAGEREF _Toc242400726 \h </w:instrText>
+          <w:instrText xml:space="preserve"> PAGEREF _Toc242443047 \h </w:instrText>
         </w:r>
         <w:r>
           <w:rPr>
@@ -8504,7 +8504,7 @@
       </w:pPr>
       <w:bookmarkStart w:id="3" w:name="_Toc475112151"/>
       <w:bookmarkStart w:id="4" w:name="_Toc475115507"/>
-      <w:bookmarkStart w:id="5" w:name="_Toc242400644"/>
+      <w:bookmarkStart w:id="5" w:name="_Toc242442965"/>
       <w:r>
         <w:rPr>
           <w:rFonts w:cs="Arial"/>
@@ -8656,7 +8656,7 @@
           <w:caps w:val="0"/>
         </w:rPr>
       </w:pPr>
-      <w:bookmarkStart w:id="6" w:name="_Toc242400645"/>
+      <w:bookmarkStart w:id="6" w:name="_Toc242442966"/>
       <w:r>
         <w:rPr>
           <w:rFonts w:cs="Arial"/>
@@ -8705,7 +8705,7 @@
       </w:pPr>
       <w:bookmarkStart w:id="7" w:name="_Toc475112154"/>
       <w:bookmarkStart w:id="8" w:name="_Toc475115510"/>
-      <w:bookmarkStart w:id="9" w:name="_Toc242400646"/>
+      <w:bookmarkStart w:id="9" w:name="_Toc242442967"/>
       <w:r>
         <w:t>1.1 Planteamiento del problema</w:t>
       </w:r>
@@ -8762,7 +8762,7 @@
           <w:iCs w:val="0"/>
         </w:rPr>
       </w:pPr>
-      <w:bookmarkStart w:id="10" w:name="_Toc242400719"/>
+      <w:bookmarkStart w:id="10" w:name="_Toc242443040"/>
       <w:r>
         <w:rPr>
           <w:rFonts w:cs="Arial"/>
@@ -8983,7 +8983,7 @@
           <w:iCs w:val="0"/>
         </w:rPr>
       </w:pPr>
-      <w:bookmarkStart w:id="11" w:name="_Toc242400720"/>
+      <w:bookmarkStart w:id="11" w:name="_Toc242443041"/>
       <w:r>
         <w:rPr>
           <w:rFonts w:cs="Arial"/>
@@ -9131,7 +9131,7 @@
           <w:rFonts w:eastAsia="Arial" w:cs="Arial"/>
         </w:rPr>
       </w:pPr>
-      <w:bookmarkStart w:id="12" w:name="_Toc242400721"/>
+      <w:bookmarkStart w:id="12" w:name="_Toc242443042"/>
       <w:r>
         <w:rPr>
           <w:rFonts w:cs="Arial"/>
@@ -9382,7 +9382,7 @@
       </w:pPr>
       <w:bookmarkStart w:id="13" w:name="_Toc475112156"/>
       <w:bookmarkStart w:id="14" w:name="_Toc475115512"/>
-      <w:bookmarkStart w:id="15" w:name="_Toc242400647"/>
+      <w:bookmarkStart w:id="15" w:name="_Toc242442968"/>
       <w:r>
         <w:t>1.2 Pregunta de investigación</w:t>
       </w:r>
@@ -9433,7 +9433,7 @@
       <w:pPr>
         <w:pStyle w:val="Ttulo2"/>
       </w:pPr>
-      <w:bookmarkStart w:id="16" w:name="_Toc242400648"/>
+      <w:bookmarkStart w:id="16" w:name="_Toc242442969"/>
       <w:r>
         <w:t>1.3 Justificación</w:t>
       </w:r>
@@ -9562,7 +9562,7 @@
           <w:iCs w:val="0"/>
         </w:rPr>
       </w:pPr>
-      <w:bookmarkStart w:id="17" w:name="_Toc242400722"/>
+      <w:bookmarkStart w:id="17" w:name="_Toc242443043"/>
       <w:r>
         <w:rPr>
           <w:rFonts w:cs="Arial"/>
@@ -9737,7 +9737,7 @@
       </w:pPr>
       <w:bookmarkStart w:id="18" w:name="_Toc475112155"/>
       <w:bookmarkStart w:id="19" w:name="_Toc475115511"/>
-      <w:bookmarkStart w:id="20" w:name="_Toc242400649"/>
+      <w:bookmarkStart w:id="20" w:name="_Toc242442970"/>
       <w:r>
         <w:t>1.4 Antecedentes del</w:t>
       </w:r>
@@ -9891,7 +9891,7 @@
           <w:caps w:val="0"/>
         </w:rPr>
       </w:pPr>
-      <w:bookmarkStart w:id="21" w:name="_Toc242400650"/>
+      <w:bookmarkStart w:id="21" w:name="_Toc242442971"/>
       <w:r>
         <w:rPr>
           <w:rFonts w:cs="Arial"/>
@@ -9932,7 +9932,7 @@
       </w:pPr>
       <w:bookmarkStart w:id="22" w:name="_Toc475112161"/>
       <w:bookmarkStart w:id="23" w:name="_Toc475115517"/>
-      <w:bookmarkStart w:id="24" w:name="_Toc242400651"/>
+      <w:bookmarkStart w:id="24" w:name="_Toc242442972"/>
       <w:r>
         <w:t>2.1 Objetivo general</w:t>
       </w:r>
@@ -9991,7 +9991,7 @@
         <w:pStyle w:val="Ttulo2"/>
         <w:ind w:left="567" w:hanging="576"/>
       </w:pPr>
-      <w:bookmarkStart w:id="27" w:name="_Toc242400652"/>
+      <w:bookmarkStart w:id="27" w:name="_Toc242442973"/>
       <w:r>
         <w:t>2.2 Objetivos específicos</w:t>
       </w:r>
@@ -10117,7 +10117,7 @@
       </w:pPr>
       <w:bookmarkStart w:id="28" w:name="_Toc475112165"/>
       <w:bookmarkStart w:id="29" w:name="_Toc475115521"/>
-      <w:bookmarkStart w:id="30" w:name="_Toc242400653"/>
+      <w:bookmarkStart w:id="30" w:name="_Toc242442974"/>
       <w:r>
         <w:rPr>
           <w:rFonts w:cs="Arial"/>
@@ -10146,7 +10146,7 @@
       </w:pPr>
       <w:bookmarkStart w:id="31" w:name="_Toc475112166"/>
       <w:bookmarkStart w:id="32" w:name="_Toc475115522"/>
-      <w:bookmarkStart w:id="33" w:name="_Toc242400654"/>
+      <w:bookmarkStart w:id="33" w:name="_Toc242442975"/>
       <w:r>
         <w:t>3.1 Marco conceptual</w:t>
       </w:r>
@@ -10168,7 +10168,7 @@
           <w:rFonts w:cs="Arial"/>
         </w:rPr>
       </w:pPr>
-      <w:bookmarkStart w:id="34" w:name="_Toc242400655"/>
+      <w:bookmarkStart w:id="34" w:name="_Toc242442976"/>
       <w:r>
         <w:t>3.1.1 El pensamiento computacional (PC):</w:t>
       </w:r>
@@ -10461,7 +10461,7 @@
           <w:bCs/>
         </w:rPr>
       </w:pPr>
-      <w:bookmarkStart w:id="35" w:name="_Toc242400656"/>
+      <w:bookmarkStart w:id="35" w:name="_Toc242442977"/>
       <w:r>
         <w:t>3.1.2. Pruebas Bebras:</w:t>
       </w:r>
@@ -10497,7 +10497,7 @@
           <w:rFonts w:cs="Arial"/>
         </w:rPr>
       </w:pPr>
-      <w:bookmarkStart w:id="36" w:name="_Toc242400657"/>
+      <w:bookmarkStart w:id="36" w:name="_Toc242442978"/>
       <w:r>
         <w:t>3.1.3. teoría del flujo</w:t>
       </w:r>
@@ -10519,7 +10519,7 @@
           <w:iCs w:val="0"/>
         </w:rPr>
       </w:pPr>
-      <w:bookmarkStart w:id="37" w:name="_Toc242400723"/>
+      <w:bookmarkStart w:id="37" w:name="_Toc242443044"/>
       <w:r>
         <w:rPr>
           <w:rFonts w:cs="Arial"/>
@@ -10665,7 +10665,7 @@
       <w:pPr>
         <w:pStyle w:val="Ttulo3"/>
       </w:pPr>
-      <w:bookmarkStart w:id="38" w:name="_Toc242400658"/>
+      <w:bookmarkStart w:id="38" w:name="_Toc242442979"/>
       <w:r>
         <w:t>3.1.4. Teoría de la Autodeterminación</w:t>
       </w:r>
@@ -11165,7 +11165,7 @@
           <w:rFonts w:eastAsia="Arial" w:cs="Arial"/>
         </w:rPr>
       </w:pPr>
-      <w:bookmarkStart w:id="39" w:name="_Toc242400659"/>
+      <w:bookmarkStart w:id="39" w:name="_Toc242442980"/>
       <w:r>
         <w:t>3.1.6 GOLDEN PATH</w:t>
       </w:r>
@@ -11206,7 +11206,7 @@
           <w:rFonts w:eastAsia="Arial" w:cs="Arial"/>
         </w:rPr>
       </w:pPr>
-      <w:bookmarkStart w:id="40" w:name="_Toc242400660"/>
+      <w:bookmarkStart w:id="40" w:name="_Toc242442981"/>
       <w:r>
         <w:t>3.1.7 Gamificación</w:t>
       </w:r>
@@ -11264,7 +11264,7 @@
       </w:pPr>
       <w:bookmarkStart w:id="41" w:name="_Toc475112167"/>
       <w:bookmarkStart w:id="42" w:name="_Toc475115523"/>
-      <w:bookmarkStart w:id="43" w:name="_Toc242400661"/>
+      <w:bookmarkStart w:id="43" w:name="_Toc242442982"/>
       <w:r>
         <w:t>3.2 Marco teórico</w:t>
       </w:r>
@@ -11286,7 +11286,7 @@
           <w:rFonts w:cs="Arial"/>
         </w:rPr>
       </w:pPr>
-      <w:bookmarkStart w:id="44" w:name="_Toc242400662"/>
+      <w:bookmarkStart w:id="44" w:name="_Toc242442983"/>
       <w:r>
         <w:t>3.2.1 Aprendizaje basado en juegos (ABJ)</w:t>
       </w:r>
@@ -11504,7 +11504,7 @@
           <w:caps w:val="0"/>
         </w:rPr>
       </w:pPr>
-      <w:bookmarkStart w:id="45" w:name="_Toc242400663"/>
+      <w:bookmarkStart w:id="45" w:name="_Toc242442984"/>
       <w:r>
         <w:t xml:space="preserve">3.2.2. </w:t>
       </w:r>
@@ -11549,7 +11549,7 @@
           <w:caps w:val="0"/>
         </w:rPr>
       </w:pPr>
-      <w:bookmarkStart w:id="46" w:name="_Toc242400664"/>
+      <w:bookmarkStart w:id="46" w:name="_Toc242442985"/>
       <w:r>
         <w:t xml:space="preserve">3.2.3 </w:t>
       </w:r>
@@ -11912,7 +11912,7 @@
       <w:pPr>
         <w:pStyle w:val="Ttulo3"/>
       </w:pPr>
-      <w:bookmarkStart w:id="47" w:name="_Toc242400665"/>
+      <w:bookmarkStart w:id="47" w:name="_Toc242442986"/>
       <w:r>
         <w:t>3.2.</w:t>
       </w:r>
@@ -12052,7 +12052,7 @@
           <w:bCs/>
         </w:rPr>
       </w:pPr>
-      <w:bookmarkStart w:id="48" w:name="_Toc242400666"/>
+      <w:bookmarkStart w:id="48" w:name="_Toc242442987"/>
       <w:r>
         <w:t>3.2.</w:t>
       </w:r>
@@ -12177,7 +12177,7 @@
           <w:rFonts w:cs="Arial"/>
         </w:rPr>
       </w:pPr>
-      <w:bookmarkStart w:id="49" w:name="_Toc242400667"/>
+      <w:bookmarkStart w:id="49" w:name="_Toc242442988"/>
       <w:r>
         <w:t>3.2.</w:t>
       </w:r>
@@ -12296,7 +12296,7 @@
           <w:rFonts w:cs="Arial"/>
         </w:rPr>
       </w:pPr>
-      <w:bookmarkStart w:id="50" w:name="_Toc242400668"/>
+      <w:bookmarkStart w:id="50" w:name="_Toc242442989"/>
       <w:r>
         <w:t>3.2.</w:t>
       </w:r>
@@ -12362,7 +12362,7 @@
       </w:pPr>
       <w:bookmarkStart w:id="51" w:name="_Toc475112168"/>
       <w:bookmarkStart w:id="52" w:name="_Toc475115524"/>
-      <w:bookmarkStart w:id="53" w:name="_Toc242400669"/>
+      <w:bookmarkStart w:id="53" w:name="_Toc242442990"/>
       <w:r>
         <w:t>3.3 Marco jurídico</w:t>
       </w:r>
@@ -12393,7 +12393,7 @@
           <w:rFonts w:cs="Arial"/>
         </w:rPr>
       </w:pPr>
-      <w:bookmarkStart w:id="54" w:name="_Toc242400670"/>
+      <w:bookmarkStart w:id="54" w:name="_Toc242442991"/>
       <w:r>
         <w:t>3.3.1. Tratamiento de datos personales y régimen de habeas data</w:t>
       </w:r>
@@ -12758,7 +12758,7 @@
       <w:pPr>
         <w:pStyle w:val="Ttulo3"/>
       </w:pPr>
-      <w:bookmarkStart w:id="55" w:name="_Toc242400671"/>
+      <w:bookmarkStart w:id="55" w:name="_Toc242442992"/>
       <w:r>
         <w:t>3.3.2. Derechos de autor sobre los personajes utilizados</w:t>
       </w:r>
@@ -13009,7 +13009,7 @@
       </w:pPr>
       <w:bookmarkStart w:id="56" w:name="_Toc475112170"/>
       <w:bookmarkStart w:id="57" w:name="_Toc475115526"/>
-      <w:bookmarkStart w:id="58" w:name="_Toc242400672"/>
+      <w:bookmarkStart w:id="58" w:name="_Toc242442993"/>
       <w:r>
         <w:rPr>
           <w:color w:val="auto"/>
@@ -13095,7 +13095,7 @@
           <w:caps w:val="0"/>
         </w:rPr>
       </w:pPr>
-      <w:bookmarkStart w:id="61" w:name="_Toc242400673"/>
+      <w:bookmarkStart w:id="61" w:name="_Toc242442994"/>
       <w:r>
         <w:rPr>
           <w:rFonts w:cs="Arial"/>
@@ -13498,7 +13498,7 @@
       </w:pPr>
       <w:bookmarkStart w:id="62" w:name="_Toc475112172"/>
       <w:bookmarkStart w:id="63" w:name="_Toc475115528"/>
-      <w:bookmarkStart w:id="64" w:name="_Toc242400674"/>
+      <w:bookmarkStart w:id="64" w:name="_Toc242442995"/>
       <w:r>
         <w:rPr>
           <w:rFonts w:cs="Arial"/>
@@ -13650,7 +13650,7 @@
         <w:pStyle w:val="Ttulo2"/>
         <w:ind w:left="567" w:hanging="576"/>
       </w:pPr>
-      <w:bookmarkStart w:id="65" w:name="_Toc242400675"/>
+      <w:bookmarkStart w:id="65" w:name="_Toc242442996"/>
       <w:r>
         <w:lastRenderedPageBreak/>
         <w:t>5.1 Fases del trabajo de grado</w:t>
@@ -13694,7 +13694,7 @@
         <w:pStyle w:val="Ttulo3"/>
         <w:spacing w:before="240"/>
       </w:pPr>
-      <w:bookmarkStart w:id="66" w:name="_Toc242400676"/>
+      <w:bookmarkStart w:id="66" w:name="_Toc242442997"/>
       <w:r>
         <w:t>5.1.1 Apertura del trabajo con Árcade y Kanban</w:t>
       </w:r>
@@ -13741,7 +13741,7 @@
         <w:pStyle w:val="Ttulo3"/>
         <w:spacing w:before="240"/>
       </w:pPr>
-      <w:bookmarkStart w:id="67" w:name="_Toc242400677"/>
+      <w:bookmarkStart w:id="67" w:name="_Toc242442998"/>
       <w:r>
         <w:t>5.1.2 Diseño del guion</w:t>
       </w:r>
@@ -13788,7 +13788,7 @@
         <w:pStyle w:val="Ttulo3"/>
         <w:spacing w:before="240"/>
       </w:pPr>
-      <w:bookmarkStart w:id="68" w:name="_Toc242400678"/>
+      <w:bookmarkStart w:id="68" w:name="_Toc242442999"/>
       <w:r>
         <w:t>5.1.3 Especificación de requerimientos (objetivo 1)</w:t>
       </w:r>
@@ -13851,7 +13851,7 @@
         <w:pStyle w:val="Ttulo3"/>
         <w:spacing w:before="240"/>
       </w:pPr>
-      <w:bookmarkStart w:id="69" w:name="_Toc242400679"/>
+      <w:bookmarkStart w:id="69" w:name="_Toc242443000"/>
       <w:r>
         <w:t>5.1.4 Diseño del videojuego (objetivo 2)</w:t>
       </w:r>
@@ -13926,7 +13926,7 @@
         <w:pStyle w:val="Ttulo3"/>
         <w:spacing w:before="240"/>
       </w:pPr>
-      <w:bookmarkStart w:id="70" w:name="_Toc242400680"/>
+      <w:bookmarkStart w:id="70" w:name="_Toc242443001"/>
       <w:r>
         <w:t>5.1.5 Ciclo Diseño ↔ Desarrollo ↔ Pruebas (objetivo 3)</w:t>
       </w:r>
@@ -14041,14 +14041,18 @@
       <w:r>
         <w:t xml:space="preserve"> La ronda de ajustes del 8 de octubre volvió sobre pantallas ya terminadas, como la portada del menú, el laberinto y el cuadro de diálogo, y se cuenta en el apartado 8.1.3.</w:t>
       </w:r>
+      <w:r>
+        <w:t xml:space="preserve"> El 9 de octubre se repitió el movimiento con el arte final de los personajes: el peso del paquete, medido en un ejecutable, llevó a importar cinco imágenes del Nivel 1 a 256 px (INC-146), como se cuenta en el apartado 8.1.4.</w:t>
+      </w:r>
     </w:p>
     <w:p>
       <w:pPr>
         <w:pStyle w:val="Ttulo3"/>
         <w:spacing w:before="240"/>
       </w:pPr>
-      <w:bookmarkStart w:id="71" w:name="_Toc242400681"/>
-      <w:r>
+      <w:bookmarkStart w:id="71" w:name="_Toc242443002"/>
+      <w:r>
+        <w:lastRenderedPageBreak/>
         <w:t>5.1.6 Evaluación del prototipo (objetivo 4)</w:t>
       </w:r>
       <w:bookmarkEnd w:id="71"/>
@@ -14058,11 +14062,7 @@
         <w:spacing w:before="240" w:after="240"/>
       </w:pPr>
       <w:r>
-        <w:t xml:space="preserve">El objetivo 4 no tiene serie de actas propia. Lo que el archivo de actas registra de esta fase está en la D10 y en su adenda del 01/10/2026, que la tratan como parte del ciclo y no como </w:t>
-      </w:r>
-      <w:r>
-        <w:lastRenderedPageBreak/>
-        <w:t>una fase aparte, y en los documentos de resultados del objetivo que la adenda cita.</w:t>
+        <w:t>El objetivo 4 no tiene serie de actas propia. Lo que el archivo de actas registra de esta fase está en la D10 y en su adenda del 01/10/2026, que la tratan como parte del ciclo y no como una fase aparte, y en los documentos de resultados del objetivo que la adenda cita.</w:t>
       </w:r>
     </w:p>
     <w:p>
@@ -14096,7 +14096,7 @@
       </w:pPr>
       <w:bookmarkStart w:id="72" w:name="_Toc475112174"/>
       <w:bookmarkStart w:id="73" w:name="_Toc475115530"/>
-      <w:bookmarkStart w:id="74" w:name="_Toc242400682"/>
+      <w:bookmarkStart w:id="74" w:name="_Toc242443003"/>
       <w:r>
         <w:t>5.</w:t>
       </w:r>
@@ -14253,6 +14253,7 @@
           <w:rFonts w:eastAsia="Arial" w:cs="Arial"/>
           <w:b/>
         </w:rPr>
+        <w:lastRenderedPageBreak/>
         <w:t>Git</w:t>
       </w:r>
       <w:r>
@@ -14285,14 +14286,7 @@
         <w:rPr>
           <w:rFonts w:eastAsia="Arial" w:cs="Arial"/>
         </w:rPr>
-        <w:t xml:space="preserve"> (Anthropic) servirá como asistente de programación con inteligencia artificial para escribir código y documentación, bajo la revisión de los autores, que </w:t>
-      </w:r>
-      <w:r>
-        <w:rPr>
-          <w:rFonts w:eastAsia="Arial" w:cs="Arial"/>
-        </w:rPr>
-        <w:lastRenderedPageBreak/>
-        <w:t>responden por lo que entra al proyecto.</w:t>
+        <w:t xml:space="preserve"> (Anthropic) servirá como asistente de programación con inteligencia artificial para escribir código y documentación, bajo la revisión de los autores, que responden por lo que entra al proyecto.</w:t>
       </w:r>
     </w:p>
     <w:p>
@@ -14365,7 +14359,7 @@
         <w:ind w:left="567" w:hanging="576"/>
       </w:pPr>
       <w:bookmarkStart w:id="75" w:name="_Toc475115531"/>
-      <w:bookmarkStart w:id="76" w:name="_Toc242400683"/>
+      <w:bookmarkStart w:id="76" w:name="_Toc242443004"/>
       <w:r>
         <w:t>5.</w:t>
       </w:r>
@@ -14466,7 +14460,7 @@
           <w:b/>
         </w:rPr>
       </w:pPr>
-      <w:bookmarkStart w:id="77" w:name="_Toc242400684"/>
+      <w:bookmarkStart w:id="77" w:name="_Toc242443005"/>
       <w:r>
         <w:rPr>
           <w:rFonts w:cs="Arial"/>
@@ -14501,7 +14495,7 @@
           <w:color w:val="auto"/>
         </w:rPr>
       </w:pPr>
-      <w:bookmarkStart w:id="78" w:name="_Toc242400685"/>
+      <w:bookmarkStart w:id="78" w:name="_Toc242443006"/>
       <w:r>
         <w:rPr>
           <w:color w:val="auto"/>
@@ -14518,7 +14512,7 @@
           <w:rFonts w:cs="Arial"/>
         </w:rPr>
       </w:pPr>
-      <w:bookmarkStart w:id="79" w:name="_Toc242400686"/>
+      <w:bookmarkStart w:id="79" w:name="_Toc242443007"/>
       <w:r>
         <w:rPr>
           <w:rFonts w:cs="Arial"/>
@@ -14570,7 +14564,7 @@
           <w:color w:val="auto"/>
         </w:rPr>
       </w:pPr>
-      <w:bookmarkStart w:id="80" w:name="_Toc242400708"/>
+      <w:bookmarkStart w:id="80" w:name="_Toc242443029"/>
       <w:r>
         <w:rPr>
           <w:rFonts w:cs="Arial"/>
@@ -14918,7 +14912,7 @@
           <w:rFonts w:cs="Arial"/>
         </w:rPr>
       </w:pPr>
-      <w:bookmarkStart w:id="81" w:name="_Toc242400687"/>
+      <w:bookmarkStart w:id="81" w:name="_Toc242443008"/>
       <w:r>
         <w:rPr>
           <w:rFonts w:cs="Arial"/>
@@ -14954,7 +14948,7 @@
           <w:color w:val="auto"/>
         </w:rPr>
       </w:pPr>
-      <w:bookmarkStart w:id="82" w:name="_Toc242400709"/>
+      <w:bookmarkStart w:id="82" w:name="_Toc242443030"/>
       <w:r>
         <w:rPr>
           <w:rFonts w:cs="Arial"/>
@@ -15660,7 +15654,7 @@
           <w:rFonts w:cs="Arial"/>
         </w:rPr>
       </w:pPr>
-      <w:bookmarkStart w:id="83" w:name="_Toc242400688"/>
+      <w:bookmarkStart w:id="83" w:name="_Toc242443009"/>
       <w:r>
         <w:rPr>
           <w:rFonts w:cs="Arial"/>
@@ -15736,7 +15730,7 @@
           <w:color w:val="auto"/>
         </w:rPr>
       </w:pPr>
-      <w:bookmarkStart w:id="84" w:name="_Toc242400689"/>
+      <w:bookmarkStart w:id="84" w:name="_Toc242443010"/>
       <w:r>
         <w:rPr>
           <w:color w:val="auto"/>
@@ -15772,7 +15766,7 @@
           <w:color w:val="auto"/>
         </w:rPr>
       </w:pPr>
-      <w:bookmarkStart w:id="85" w:name="_Toc242400710"/>
+      <w:bookmarkStart w:id="85" w:name="_Toc242443031"/>
       <w:r>
         <w:rPr>
           <w:rFonts w:cs="Arial"/>
@@ -16556,7 +16550,7 @@
           <w:color w:val="auto"/>
         </w:rPr>
       </w:pPr>
-      <w:bookmarkStart w:id="86" w:name="_Toc242400711"/>
+      <w:bookmarkStart w:id="86" w:name="_Toc242443032"/>
       <w:r>
         <w:rPr>
           <w:rFonts w:cs="Arial"/>
@@ -16906,7 +16900,7 @@
           <w:color w:val="auto"/>
         </w:rPr>
       </w:pPr>
-      <w:bookmarkStart w:id="87" w:name="_Toc242400690"/>
+      <w:bookmarkStart w:id="87" w:name="_Toc242443011"/>
       <w:r>
         <w:rPr>
           <w:color w:val="auto"/>
@@ -17005,7 +16999,7 @@
           <w:b/>
         </w:rPr>
       </w:pPr>
-      <w:bookmarkStart w:id="88" w:name="_Toc242400691"/>
+      <w:bookmarkStart w:id="88" w:name="_Toc242443012"/>
       <w:r>
         <w:rPr>
           <w:rFonts w:cs="Arial"/>
@@ -17040,7 +17034,7 @@
           <w:color w:val="auto"/>
         </w:rPr>
       </w:pPr>
-      <w:bookmarkStart w:id="89" w:name="_Toc242400692"/>
+      <w:bookmarkStart w:id="89" w:name="_Toc242443013"/>
       <w:r>
         <w:rPr>
           <w:color w:val="auto"/>
@@ -17057,7 +17051,7 @@
           <w:rFonts w:cs="Arial"/>
         </w:rPr>
       </w:pPr>
-      <w:bookmarkStart w:id="90" w:name="_Toc242400693"/>
+      <w:bookmarkStart w:id="90" w:name="_Toc242443014"/>
       <w:r>
         <w:rPr>
           <w:rFonts w:cs="Arial"/>
@@ -17127,7 +17121,21 @@
           <w:rFonts w:cs="Arial"/>
           <w:color w:val="auto"/>
         </w:rPr>
-        <w:t>Algoritm, el guía, acompaña los tres niveles. Es una llamita con brazos y piernas que conserva el cuerpo y cambia de material según el nivel: fuego en la cueva, madera en el bosque, agua en el río. El guion le asigna una función pedagógica que se repite en los tres niveles. Al abrir plantea el objetivo, durante el juego da la instrucción de cada tarea, formula una pista si el estudiante falla tres veces seguidas y, al cerrar, nombra la habilidad que se acaba de practicar. Nunca da la respuesta.</w:t>
+        <w:t>Algoritm, el guía, acompaña los tres niveles. Es un</w:t>
+      </w:r>
+      <w:r>
+        <w:rPr>
+          <w:rFonts w:cs="Arial"/>
+          <w:color w:val="auto"/>
+        </w:rPr>
+        <w:t xml:space="preserve"> solo personaje con una silueta por nivel: una llama en la cueva, un disco de madera en el bosque y una gota de agua en el río, con brazos y piernas gruesos y una pantaloneta de cuadros que cambia de color con la forma. Así lo dibuja el diseño final del 9 de octubre (INC-136), y así lo describe desde ese día el guion</w:t>
+      </w:r>
+      <w:r>
+        <w:rPr>
+          <w:rFonts w:cs="Arial"/>
+          <w:color w:val="auto"/>
+        </w:rPr>
+        <w:t>. El guion le asigna una función pedagógica que se repite en los tres niveles. Al abrir plantea el objetivo, durante el juego da la instrucción de cada tarea, formula una pista si el estudiante falla tres veces seguidas y, al cerrar, nombra la habilidad que se acaba de practicar. Nunca da la respuesta.</w:t>
       </w:r>
     </w:p>
     <w:p>
@@ -17154,7 +17162,7 @@
           <w:rFonts w:cs="Arial"/>
         </w:rPr>
       </w:pPr>
-      <w:bookmarkStart w:id="91" w:name="_Toc242400694"/>
+      <w:bookmarkStart w:id="91" w:name="_Toc242443015"/>
       <w:r>
         <w:rPr>
           <w:rFonts w:cs="Arial"/>
@@ -17190,7 +17198,7 @@
           <w:color w:val="auto"/>
         </w:rPr>
       </w:pPr>
-      <w:bookmarkStart w:id="92" w:name="_Toc242400712"/>
+      <w:bookmarkStart w:id="92" w:name="_Toc242443033"/>
       <w:r>
         <w:rPr>
           <w:rFonts w:cs="Arial"/>
@@ -17856,7 +17864,7 @@
           <w:rFonts w:cs="Arial"/>
         </w:rPr>
       </w:pPr>
-      <w:bookmarkStart w:id="93" w:name="_Toc242400695"/>
+      <w:bookmarkStart w:id="93" w:name="_Toc242443016"/>
       <w:r>
         <w:rPr>
           <w:rFonts w:cs="Arial"/>
@@ -17929,7 +17937,7 @@
           <w:rFonts w:cs="Arial"/>
         </w:rPr>
       </w:pPr>
-      <w:bookmarkStart w:id="94" w:name="_Toc242400696"/>
+      <w:bookmarkStart w:id="94" w:name="_Toc242443017"/>
       <w:r>
         <w:rPr>
           <w:rFonts w:cs="Arial"/>
@@ -17978,7 +17986,7 @@
           <w:color w:val="auto"/>
         </w:rPr>
       </w:pPr>
-      <w:bookmarkStart w:id="95" w:name="_Toc242400697"/>
+      <w:bookmarkStart w:id="95" w:name="_Toc242443018"/>
       <w:r>
         <w:rPr>
           <w:color w:val="auto"/>
@@ -18030,7 +18038,7 @@
           <w:color w:val="auto"/>
         </w:rPr>
       </w:pPr>
-      <w:bookmarkStart w:id="96" w:name="_Toc242400713"/>
+      <w:bookmarkStart w:id="96" w:name="_Toc242443034"/>
       <w:r>
         <w:rPr>
           <w:rFonts w:cs="Arial"/>
@@ -18701,7 +18709,7 @@
           <w:color w:val="auto"/>
         </w:rPr>
       </w:pPr>
-      <w:bookmarkStart w:id="97" w:name="_Toc242400714"/>
+      <w:bookmarkStart w:id="97" w:name="_Toc242443035"/>
       <w:r>
         <w:rPr>
           <w:rFonts w:cs="Arial"/>
@@ -19067,7 +19075,7 @@
           <w:color w:val="auto"/>
         </w:rPr>
       </w:pPr>
-      <w:bookmarkStart w:id="98" w:name="_Toc242400698"/>
+      <w:bookmarkStart w:id="98" w:name="_Toc242443019"/>
       <w:r>
         <w:rPr>
           <w:color w:val="auto"/>
@@ -19166,7 +19174,7 @@
           <w:b/>
         </w:rPr>
       </w:pPr>
-      <w:bookmarkStart w:id="99" w:name="_Toc242400699"/>
+      <w:bookmarkStart w:id="99" w:name="_Toc242443020"/>
       <w:r>
         <w:rPr>
           <w:rFonts w:cs="Arial"/>
@@ -19215,7 +19223,7 @@
           <w:color w:val="auto"/>
         </w:rPr>
       </w:pPr>
-      <w:bookmarkStart w:id="100" w:name="_Toc242400700"/>
+      <w:bookmarkStart w:id="100" w:name="_Toc242443021"/>
       <w:r>
         <w:rPr>
           <w:color w:val="auto"/>
@@ -19232,7 +19240,7 @@
           <w:rFonts w:cs="Arial"/>
         </w:rPr>
       </w:pPr>
-      <w:bookmarkStart w:id="101" w:name="_Toc242400701"/>
+      <w:bookmarkStart w:id="101" w:name="_Toc242443022"/>
       <w:r>
         <w:rPr>
           <w:rFonts w:cs="Arial"/>
@@ -19312,7 +19320,7 @@
           <w:color w:val="auto"/>
         </w:rPr>
       </w:pPr>
-      <w:bookmarkStart w:id="102" w:name="_Toc242400715"/>
+      <w:bookmarkStart w:id="102" w:name="_Toc242443036"/>
       <w:r>
         <w:rPr>
           <w:rFonts w:cs="Arial"/>
@@ -20045,7 +20053,7 @@
           <w:rFonts w:cs="Arial"/>
         </w:rPr>
       </w:pPr>
-      <w:bookmarkStart w:id="103" w:name="_Toc242400702"/>
+      <w:bookmarkStart w:id="103" w:name="_Toc242443023"/>
       <w:r>
         <w:rPr>
           <w:rFonts w:cs="Arial"/>
@@ -20174,7 +20182,7 @@
           <w:rFonts w:cs="Arial"/>
         </w:rPr>
       </w:pPr>
-      <w:bookmarkStart w:id="104" w:name="_Toc242400703"/>
+      <w:bookmarkStart w:id="104" w:name="_Toc242443024"/>
       <w:r>
         <w:rPr>
           <w:rFonts w:cs="Arial"/>
@@ -20238,7 +20246,7 @@
           <w:color w:val="auto"/>
         </w:rPr>
       </w:pPr>
-      <w:bookmarkStart w:id="105" w:name="_Toc242400724"/>
+      <w:bookmarkStart w:id="105" w:name="_Toc242443045"/>
       <w:r>
         <w:rPr>
           <w:rFonts w:cs="Arial"/>
@@ -20426,7 +20434,7 @@
           <w:color w:val="auto"/>
         </w:rPr>
       </w:pPr>
-      <w:bookmarkStart w:id="106" w:name="_Toc242400725"/>
+      <w:bookmarkStart w:id="106" w:name="_Toc242443046"/>
       <w:r>
         <w:rPr>
           <w:rFonts w:cs="Arial"/>
@@ -20623,7 +20631,7 @@
           <w:color w:val="auto"/>
         </w:rPr>
       </w:pPr>
-      <w:bookmarkStart w:id="107" w:name="_Toc242400726"/>
+      <w:bookmarkStart w:id="107" w:name="_Toc242443047"/>
       <w:r>
         <w:rPr>
           <w:rFonts w:cs="Arial"/>
@@ -20813,7 +20821,33 @@
           <w:rFonts w:cs="Arial"/>
           <w:color w:val="auto"/>
         </w:rPr>
-        <w:t>Los personajes también cambiaron. Algoritm se recortó de su arte provisional en nueve piezas por forma (fuego, madera y agua), de modo que mueve brazos y piernas en todas sus escenas, y el arte final las sustituye con los mismos nombres; en los créditos saluda con una acción nueva, Wave, un bucle de 4,8 s con pausa de reposo, y la tarjeta que lo enmarcaba se retiró. En Papá se subió el húmero y se bajaron 37 px los antebrazos para que el hueso no asome por el codo al doblarlo.</w:t>
+        <w:t>Los personajes también cambiaron. Algoritm se recortó de su arte provisional en nueve piezas por forma (fuego, madera y agua), de modo que mueve brazos y piernas en todas sus escenas, y el arte final las sustituy</w:t>
+      </w:r>
+      <w:r>
+        <w:rPr>
+          <w:rFonts w:cs="Arial"/>
+          <w:color w:val="auto"/>
+        </w:rPr>
+        <w:t>ó el 9 de octubr</w:t>
+      </w:r>
+      <w:r>
+        <w:rPr>
+          <w:rFonts w:cs="Arial"/>
+          <w:color w:val="auto"/>
+        </w:rPr>
+        <w:t>e con los mismos nombres; en los créditos saluda con una acción nueva, Wave, un bucle de 4,8 s con pausa de reposo, y la tarjeta que lo enmarcaba se retiró. En Papá se subió el húmero y se bajaron 37 px los antebrazos para que el hueso no asome por el codo al doblarlo.</w:t>
+      </w:r>
+    </w:p>
+    <w:p>
+      <w:pPr>
+        <w:spacing w:before="240" w:after="240"/>
+      </w:pPr>
+      <w:r>
+        <w:rPr>
+          <w:rFonts w:cs="Arial"/>
+          <w:color w:val="auto"/>
+        </w:rPr>
+        <w:t>El 9 de octubre llegaron de la colaboradora el arte de perfil de Papá, Mamá, la Niña y el Niño y el diseño final de Algoritm, y Santiago Benavides Rey decidió cómo entraban al juego (INC-134 a INC-136 e INC-147). La familia se ve de perfil mientras camina, corre, carga, empuja, recoge, se arrodilla o sopla, y de frente en reposo y en los demás gestos. El lado lo da el rumbo, a la izquierda si va a la izquierda o hacia arriba y a la derecha si va a la derecha o hacia abajo, y las dos piernas se dibujan siempre detrás del torso. El parpadeo es de dos cuadros, ojos abiertos y ojos cerrados. Algoritm es ahora una llama, un disco de madera y una gota con pantaloneta de cuadros, en siete piezas por forma en lugar de nueve, y sus brazos van detrás de todo el cuerpo para que ninguna mano le tape la cara. De la colaboradora faltan la cara de Algoritm, que lleva por ahora los ojos y la boca del dibujo anterior y no parpadea ni mueve la boca, y los ojos cerrados de frente de la familia, que por eso solo parpadea de perfil.</w:t>
       </w:r>
     </w:p>
     <w:p>
@@ -20824,7 +20858,7 @@
           <w:rFonts w:cs="Arial"/>
         </w:rPr>
       </w:pPr>
-      <w:bookmarkStart w:id="108" w:name="_Toc242400704"/>
+      <w:bookmarkStart w:id="108" w:name="_Toc242443025"/>
       <w:r>
         <w:rPr>
           <w:rFonts w:cs="Arial"/>
@@ -20846,7 +20880,21 @@
           <w:rFonts w:cs="Arial"/>
           <w:color w:val="auto"/>
         </w:rPr>
-        <w:t>Varias decisiones buscaron que el juego corriera en los equipos del colegio. Las escenas narrativas se resolvieron con ilustración y diálogo, sin empaquetar video, y todas las escenas cargan de forma asíncrona. La animación del fuego llegó exportada a 30 cuadros por segundo pero dibujada cada seis u ocho cuadros, y muchos archivos repetían el mismo dibujo. Al conservar un solo cuadro por cada dibujo distinto, 249 archivos se redujeron a 34 dibujos y la memoria de texturas bajó de 1469 MB a 235 MB. Los troncos del Nivel 2 ruedan dibujados por el motor a partir de una sola textura. Los personajes se animan moviendo sus partes, y todo su arte ocupa 16,3 MB en memoria. La oscuridad de la cueva es un único material a pantalla completa, y ninguna escena usa luces 2D.</w:t>
+        <w:t>Varias decisiones buscaron que el juego corriera en los equipos del colegio. Las escenas narrativas se resolvieron con ilustración y diálogo, sin empaquetar video, y todas las escenas cargan de forma asíncrona. La animación del fuego llegó exportada a 30 cuadros por segundo pero dibujada cada seis u ocho cuadros, y muchos archivos repetían el mismo dibujo. Al conservar un solo cuadro por cada dibujo distinto, 249 archivos se redujeron a 34 dibujos y la memoria de texturas bajó de 1469 MB a 235 MB. Los troncos del Nivel 2 ruedan dibujados por el motor a partir de una sola textura. Los personajes se animan moviendo sus partes, y todo su arte ocupa</w:t>
+      </w:r>
+      <w:r>
+        <w:rPr>
+          <w:rFonts w:cs="Arial"/>
+          <w:color w:val="auto"/>
+        </w:rPr>
+        <w:t>ba 16,3 MB en memoria en el corte del 1 de octubre, antes del arte de perfil y del diseño final de Algoritm</w:t>
+      </w:r>
+      <w:r>
+        <w:rPr>
+          <w:rFonts w:cs="Arial"/>
+          <w:color w:val="auto"/>
+        </w:rPr>
+        <w:t>. La oscuridad de la cueva es un único material a pantalla completa, y ninguna escena usa luces 2D.</w:t>
       </w:r>
     </w:p>
     <w:p>
@@ -20870,6 +20918,21 @@
           <w:color w:val="auto"/>
         </w:rPr>
         <w:t xml:space="preserve"> El costo llegó también al paquete. Con las 67 imágenes de la animación del fuego y del humo a su resolución original, la primera compilación con las doce escenas llegó a 866,7 MB, y esas imágenes pasaron a importarse a 1024 píxeles como máximo, todavía sin comprimir (INC-130). El fuego se ve en pantalla a unos 650 píxeles como mucho, y comparando capturas ampliadas tomadas antes y después del cambio no se vio diferencia. El paquete bajó a 479,0 MB.</w:t>
+      </w:r>
+      <w:r>
+        <w:rPr>
+          <w:rFonts w:cs="Arial"/>
+          <w:color w:val="auto"/>
+        </w:rPr>
+        <w:t xml:space="preserve"> El 9 de octubre el peso volvió a ser un problema: un ejecutable con el arte de perfil de la familia y el diseño final de Algoritm pesó 499,3 MB, 0,7 MB por debajo del tope. Lo más pesado eran cinco imágenes del Nivel 1 de 2000 por 2000 </w:t>
+      </w:r>
+      <w:r>
+        <w:rPr>
+          <w:rFonts w:cs="Arial"/>
+          <w:color w:val="auto"/>
+        </w:rPr>
+        <w:lastRenderedPageBreak/>
+        <w:t>píxeles (el pedernal, el sílex, la hoja y los dos montones de hojas), de 15,3 MB cada una, que en pantalla miden de 72 a 300 píxeles. Santiago Benavides Rey decidió importarlas a 256 píxeles, todavía sin comprimir (INC-146), y el paquete bajó a 420,6 MB. Los dos ejecutables se compilaron solo para medir el peso y no son candidatos: la carga y la memoria con el arte nuevo no se midieron en ellos.</w:t>
       </w:r>
     </w:p>
     <w:p>
@@ -20880,7 +20943,7 @@
           <w:color w:val="auto"/>
         </w:rPr>
       </w:pPr>
-      <w:bookmarkStart w:id="109" w:name="_Toc242400705"/>
+      <w:bookmarkStart w:id="109" w:name="_Toc242443026"/>
       <w:r>
         <w:rPr>
           <w:color w:val="auto"/>
@@ -20951,7 +21014,139 @@
           <w:rFonts w:cs="Arial"/>
           <w:color w:val="auto"/>
         </w:rPr>
-        <w:t xml:space="preserve">ó ninguna conexión de red (RNF-10); la primera abría tres con servidores de Google Cloud. Fuera de la carpeta Datos solo quedan el Player.log del </w:t>
+        <w:t>ó ninguna conexión de red (RNF-10); la primera abría tres con servidores de Google Cloud. Fuera de la carpeta Datos solo quedan el Player.log del reproductor y, en el Registro de Windows, las preferencias de pantalla, un contador y unos identificadores de sesión y de instalación que el motor genera aun con los servicios desactivados. Ninguno guarda datos del estudiante, y un perfil borrado no deja su nombre en ning</w:t>
+      </w:r>
+      <w:r>
+        <w:rPr>
+          <w:rFonts w:cs="Arial"/>
+          <w:color w:val="auto"/>
+        </w:rPr>
+        <w:t>uno de los sitios revisados, que fueron la carpeta portable, LocalLow, la carpeta temporal de Windows y el Registro</w:t>
+      </w:r>
+      <w:r>
+        <w:rPr>
+          <w:rFonts w:cs="Arial"/>
+          <w:color w:val="auto"/>
+        </w:rPr>
+        <w:t xml:space="preserve"> (RNF-11)</w:t>
+      </w:r>
+      <w:r>
+        <w:rPr>
+          <w:rFonts w:cs="Arial"/>
+          <w:color w:val="auto"/>
+        </w:rPr>
+        <w:t>.</w:t>
+      </w:r>
+    </w:p>
+    <w:p>
+      <w:pPr>
+        <w:spacing w:before="240" w:after="240"/>
+        <w:rPr>
+          <w:rFonts w:cs="Arial"/>
+          <w:color w:val="auto"/>
+        </w:rPr>
+      </w:pPr>
+      <w:r>
+        <w:rPr>
+          <w:rFonts w:cs="Arial"/>
+          <w:color w:val="auto"/>
+        </w:rPr>
+        <w:t>Para este objetivo había dos indicadores (Tabla 9). El primero pedía al menos tres mecánicas principales. El guion especificaba siete y las siete se implementaron: el encendido del fuego, la selección por patrón, el armado de la carretilla, la programación por bloques, la recolección con desplazamiento, el ensamblaje por fases y la prueba y depuración de la balsa. C</w:t>
+      </w:r>
+      <w:r>
+        <w:rPr>
+          <w:rFonts w:cs="Arial"/>
+          <w:color w:val="auto"/>
+        </w:rPr>
+        <w:t>inco de ellas cambiaron durante el desarrollo por decisiones documentadas, como la del Nivel 1 (INC-47) o la prueba anticipada de la balsa (INC-122), y desde las correcciones del 29 de septiembre y del 1 de octubre los documentos radicados describen lo implementado</w:t>
+      </w:r>
+      <w:r>
+        <w:rPr>
+          <w:rFonts w:cs="Arial"/>
+          <w:color w:val="auto"/>
+        </w:rPr>
+        <w:t>.</w:t>
+      </w:r>
+    </w:p>
+    <w:p>
+      <w:pPr>
+        <w:spacing w:before="240" w:after="240"/>
+        <w:rPr>
+          <w:rFonts w:cs="Arial"/>
+          <w:color w:val="auto"/>
+        </w:rPr>
+      </w:pPr>
+      <w:r>
+        <w:rPr>
+          <w:rFonts w:cs="Arial"/>
+          <w:color w:val="auto"/>
+        </w:rPr>
+        <w:t xml:space="preserve">El segundo pedía una ruta principal sin bloqueos en los tres niveles. </w:t>
+      </w:r>
+      <w:r>
+        <w:rPr>
+          <w:rFonts w:cs="Arial"/>
+          <w:color w:val="auto"/>
+        </w:rPr>
+        <w:t>Las pruebas automáticas que la recorren en el editor pasaron en la corrida completa del 1 de octu</w:t>
+      </w:r>
+      <w:r>
+        <w:rPr>
+          <w:rFonts w:cs="Arial"/>
+          <w:color w:val="auto"/>
+        </w:rPr>
+        <w:t xml:space="preserve">bre. Los niveles 2 y 3 </w:t>
+      </w:r>
+      <w:r>
+        <w:rPr>
+          <w:rFonts w:cs="Arial"/>
+          <w:color w:val="auto"/>
+        </w:rPr>
+        <w:t>cuentan con dos pruebas cada uno que los juegan de principio a fin a partir de la escena de arranque, y en una de las del Nivel 3</w:t>
+      </w:r>
+      <w:r>
+        <w:rPr>
+          <w:rFonts w:cs="Arial"/>
+          <w:color w:val="auto"/>
+        </w:rPr>
+        <w:t xml:space="preserve"> la balsa se hunde, aparece la escena 3.2 y el estudiante corrige. E</w:t>
+      </w:r>
+      <w:r>
+        <w:rPr>
+          <w:rFonts w:cs="Arial"/>
+          <w:color w:val="auto"/>
+        </w:rPr>
+        <w:t>n el editor, el Nivel 1 se prueba en dos partes, la apertura y el cierre, que por sí solas no suman</w:t>
+      </w:r>
+      <w:r>
+        <w:rPr>
+          <w:rFonts w:cs="Arial"/>
+          <w:color w:val="auto"/>
+        </w:rPr>
+        <w:t xml:space="preserve"> los dos recorridos completos que pide RNF-13. Esas pruebas llaman directamente a los controladores de cada escena en lugar de simular el puntero, </w:t>
+      </w:r>
+      <w:r>
+        <w:rPr>
+          <w:rFonts w:cs="Arial"/>
+          <w:color w:val="auto"/>
+        </w:rPr>
+        <w:t>y por eso el juego se recorrió además sobre el ejecutable.</w:t>
+      </w:r>
+    </w:p>
+    <w:p>
+      <w:pPr>
+        <w:spacing w:before="240" w:after="240"/>
+        <w:rPr>
+          <w:rFonts w:cs="Arial"/>
+          <w:color w:val="auto"/>
+        </w:rPr>
+      </w:pPr>
+      <w:r>
+        <w:rPr>
+          <w:rFonts w:cs="Arial"/>
+          <w:color w:val="auto"/>
+        </w:rPr>
+        <w:t xml:space="preserve">El arnés preparado para el cuarto objetivo juega con los mismos gestos que un estudiante: escribe el nombre de un perfil nuevo, entra a cada nivel desde el menú y resuelve las mecánicas solo con clic y clic sostenido sobre la ventana, sin tocar el código. Recorrió el juego entero tres veces, desde la pantalla de inicio hasta los créditos, en 87 y 33 minutos sobre la primera versión y en 16 sobre la vigente, las dos últimas a pantalla completa. Ningún recorrido se bloqueó, se cerró de forma inesperada ni dejó el juego sin salida. Los dos primeros </w:t>
       </w:r>
       <w:r>
         <w:rPr>
@@ -20959,139 +21154,7 @@
           <w:color w:val="auto"/>
         </w:rPr>
         <w:lastRenderedPageBreak/>
-        <w:t>reproductor y, en el Registro de Windows, las preferencias de pantalla, un contador y unos identificadores de sesión y de instalación que el motor genera aun con los servicios desactivados. Ninguno guarda datos del estudiante, y un perfil borrado no deja su nombre en ning</w:t>
-      </w:r>
-      <w:r>
-        <w:rPr>
-          <w:rFonts w:cs="Arial"/>
-          <w:color w:val="auto"/>
-        </w:rPr>
-        <w:t>uno de los sitios revisados, que fueron la carpeta portable, LocalLow, la carpeta temporal de Windows y el Registro</w:t>
-      </w:r>
-      <w:r>
-        <w:rPr>
-          <w:rFonts w:cs="Arial"/>
-          <w:color w:val="auto"/>
-        </w:rPr>
-        <w:t xml:space="preserve"> (RNF-11)</w:t>
-      </w:r>
-      <w:r>
-        <w:rPr>
-          <w:rFonts w:cs="Arial"/>
-          <w:color w:val="auto"/>
-        </w:rPr>
-        <w:t>.</w:t>
-      </w:r>
-    </w:p>
-    <w:p>
-      <w:pPr>
-        <w:spacing w:before="240" w:after="240"/>
-        <w:rPr>
-          <w:rFonts w:cs="Arial"/>
-          <w:color w:val="auto"/>
-        </w:rPr>
-      </w:pPr>
-      <w:r>
-        <w:rPr>
-          <w:rFonts w:cs="Arial"/>
-          <w:color w:val="auto"/>
-        </w:rPr>
-        <w:t>Para este objetivo había dos indicadores (Tabla 9). El primero pedía al menos tres mecánicas principales. El guion especificaba siete y las siete se implementaron: el encendido del fuego, la selección por patrón, el armado de la carretilla, la programación por bloques, la recolección con desplazamiento, el ensamblaje por fases y la prueba y depuración de la balsa. C</w:t>
-      </w:r>
-      <w:r>
-        <w:rPr>
-          <w:rFonts w:cs="Arial"/>
-          <w:color w:val="auto"/>
-        </w:rPr>
-        <w:t>inco de ellas cambiaron durante el desarrollo por decisiones documentadas, como la del Nivel 1 (INC-47) o la prueba anticipada de la balsa (INC-122), y desde las correcciones del 29 de septiembre y del 1 de octubre los documentos radicados describen lo implementado</w:t>
-      </w:r>
-      <w:r>
-        <w:rPr>
-          <w:rFonts w:cs="Arial"/>
-          <w:color w:val="auto"/>
-        </w:rPr>
-        <w:t>.</w:t>
-      </w:r>
-    </w:p>
-    <w:p>
-      <w:pPr>
-        <w:spacing w:before="240" w:after="240"/>
-        <w:rPr>
-          <w:rFonts w:cs="Arial"/>
-          <w:color w:val="auto"/>
-        </w:rPr>
-      </w:pPr>
-      <w:r>
-        <w:rPr>
-          <w:rFonts w:cs="Arial"/>
-          <w:color w:val="auto"/>
-        </w:rPr>
-        <w:t xml:space="preserve">El segundo pedía una ruta principal sin bloqueos en los tres niveles. </w:t>
-      </w:r>
-      <w:r>
-        <w:rPr>
-          <w:rFonts w:cs="Arial"/>
-          <w:color w:val="auto"/>
-        </w:rPr>
-        <w:t>Las pruebas automáticas que la recorren en el editor pasaron en la corrida completa del 1 de octu</w:t>
-      </w:r>
-      <w:r>
-        <w:rPr>
-          <w:rFonts w:cs="Arial"/>
-          <w:color w:val="auto"/>
-        </w:rPr>
-        <w:t xml:space="preserve">bre. Los niveles 2 y 3 </w:t>
-      </w:r>
-      <w:r>
-        <w:rPr>
-          <w:rFonts w:cs="Arial"/>
-          <w:color w:val="auto"/>
-        </w:rPr>
-        <w:t>cuentan con dos pruebas cada uno que los juegan de principio a fin a partir de la escena de arranque, y en una de las del Nivel 3</w:t>
-      </w:r>
-      <w:r>
-        <w:rPr>
-          <w:rFonts w:cs="Arial"/>
-          <w:color w:val="auto"/>
-        </w:rPr>
-        <w:t xml:space="preserve"> la balsa se hunde, aparece la escena 3.2 y el estudiante corrige. E</w:t>
-      </w:r>
-      <w:r>
-        <w:rPr>
-          <w:rFonts w:cs="Arial"/>
-          <w:color w:val="auto"/>
-        </w:rPr>
-        <w:t>n el editor, el Nivel 1 se prueba en dos partes, la apertura y el cierre, que por sí solas no suman</w:t>
-      </w:r>
-      <w:r>
-        <w:rPr>
-          <w:rFonts w:cs="Arial"/>
-          <w:color w:val="auto"/>
-        </w:rPr>
-        <w:t xml:space="preserve"> los dos recorridos completos que pide RNF-13. Esas pruebas llaman directamente a los controladores de cada escena en lugar de simular el puntero, </w:t>
-      </w:r>
-      <w:r>
-        <w:rPr>
-          <w:rFonts w:cs="Arial"/>
-          <w:color w:val="auto"/>
-        </w:rPr>
-        <w:t>y por eso el juego se recorrió además sobre el ejecutable.</w:t>
-      </w:r>
-    </w:p>
-    <w:p>
-      <w:pPr>
-        <w:spacing w:before="240" w:after="240"/>
-        <w:rPr>
-          <w:rFonts w:cs="Arial"/>
-          <w:color w:val="auto"/>
-        </w:rPr>
-      </w:pPr>
-      <w:r>
-        <w:rPr>
-          <w:rFonts w:cs="Arial"/>
-          <w:color w:val="auto"/>
-        </w:rPr>
-        <w:t xml:space="preserve">El arnés preparado para el cuarto objetivo juega con los mismos gestos que un estudiante: escribe el nombre de un perfil nuevo, entra a cada nivel desde el menú y resuelve las mecánicas solo con clic y clic sostenido sobre la ventana, sin tocar el código. Recorrió el juego entero tres veces, desde la pantalla de inicio hasta los créditos, en 87 y 33 minutos sobre la primera versión y en 16 sobre la vigente, las dos últimas a pantalla completa. Ningún recorrido se bloqueó, se cerró de forma inesperada ni dejó el juego sin salida. Los dos primeros encontraron dos defectos del laberinto que no impedían terminarlo, un bloque que se quedaba pegado al cursor y otro que se ejecutaba fuera de la vista, y el tercero ya no los vio. Esas duraciones dependen del ritmo del arnés y no miden a un niño; la de un estudiante, que OE1 sitúa entre 20 y 40 minutos, se cronometra en el cuarto objetivo. El cierre forzado (RNF-14) se probó en nueve momentos, dos de ellos justo cuando el juego guardaba, y en todos el perfil se abrió sin error y sin truncarse, </w:t>
+        <w:t xml:space="preserve">encontraron dos defectos del laberinto que no impedían terminarlo, un bloque que se quedaba pegado al cursor y otro que se ejecutaba fuera de la vista, y el tercero ya no los vio. Esas duraciones dependen del ritmo del arnés y no miden a un niño; la de un estudiante, que OE1 sitúa entre 20 y 40 minutos, se cronometra en el cuarto objetivo. El cierre forzado (RNF-14) se probó en nueve momentos, dos de ellos justo cuando el juego guardaba, y en todos el perfil se abrió sin error y sin truncarse, </w:t>
       </w:r>
       <w:r>
         <w:rPr>
@@ -21119,7 +21182,7 @@
           <w:color w:val="auto"/>
         </w:rPr>
       </w:pPr>
-      <w:bookmarkStart w:id="110" w:name="_Toc242400716"/>
+      <w:bookmarkStart w:id="110" w:name="_Toc242443037"/>
       <w:r>
         <w:rPr>
           <w:rFonts w:cs="Arial"/>
@@ -21490,7 +21553,6 @@
           <w:rFonts w:cs="Arial"/>
           <w:color w:val="auto"/>
         </w:rPr>
-        <w:lastRenderedPageBreak/>
         <w:t xml:space="preserve">La corrida completa de la suite se hizo el </w:t>
       </w:r>
       <w:r>
@@ -21526,7 +21588,21 @@
           <w:rFonts w:cs="Arial"/>
           <w:color w:val="auto"/>
         </w:rPr>
-        <w:t xml:space="preserve"> Después, el 9 de octubre, con la ronda de ajustes de diseño ya integrada y sin compilar un ejecutable nuevo, otra corrida completa listó 1 128 casos: en EditMode pasaron 706 de 711, con una omisión por entorno y cuatro pruebas en rojo a propósito, y en PlayMode pasaron 416 de 417, con una inconclusiva. Las cinco pruebas restantes son del carril de los personajes de perfil y esperan su arte.</w:t>
+        <w:t xml:space="preserve"> Después, el 9 de octubre, con la ronda de ajustes de diseño ya integrada y sin compilar un ejecutable nuevo, otra corrida completa listó 1 128 casos: en EditMode pasaron 706 de 711, con una omisión por entorno y cuatro pruebas en rojo a propósito, y en PlayMode pasaron 416 de 417, con una inconclusiva. Las cinco pruebas restantes </w:t>
+      </w:r>
+      <w:r>
+        <w:rPr>
+          <w:rFonts w:cs="Arial"/>
+          <w:color w:val="auto"/>
+        </w:rPr>
+        <w:t>eran del carril de los personajes de perfil y esperaban su arte. Cuando ese arte entró, el mismo día, la suite completa se corrió otra vez con los mismos 1 128 casos: en EditMode pasaron 710 de 711, con la misma omisión por entorno, y en PlayMode pasaron 417 de 417, sin pruebas en rojo ni inconclusas. El cambio posterior de INC-147, que solo reordena los hijos de tres prefabs, se comprobó con los grupos de pruebas afectados y no con la suite completa</w:t>
+      </w:r>
+      <w:r>
+        <w:rPr>
+          <w:rFonts w:cs="Arial"/>
+          <w:color w:val="auto"/>
+        </w:rPr>
+        <w:t>.</w:t>
       </w:r>
     </w:p>
     <w:p>
@@ -21540,7 +21616,7 @@
           <w:color w:val="auto"/>
         </w:rPr>
       </w:pPr>
-      <w:bookmarkStart w:id="111" w:name="_Toc242400717"/>
+      <w:bookmarkStart w:id="111" w:name="_Toc242443038"/>
       <w:r>
         <w:rPr>
           <w:rFonts w:cs="Arial"/>
@@ -22248,7 +22324,15 @@
           <w:rFonts w:cs="Arial"/>
           <w:color w:val="auto"/>
         </w:rPr>
-        <w:t>Los tres presupuestos se midieron sobre el ejecutable, en el equipo de desarrollo (Tabla 11). El cargador de escenas escribe en el Player.log cuánto tardó cada carga, y la más lenta, la de la primera narrativa al crear un perfil nuevo, duró 0,78 s; ninguna otra escena pasó de 0,16 s. La memoria la muestreó el arnés cada dos segundos durante las sesiones de juego, y el paquete quedó 21 MB por debajo del límite. Repetir esas medidas en otro equipo, y en uno que no tenga tarjeta gráfica dedicada, queda para el cuarto objetivo</w:t>
+        <w:t xml:space="preserve">Los tres presupuestos se midieron sobre el ejecutable, en el equipo de desarrollo (Tabla 11). </w:t>
+      </w:r>
+      <w:r>
+        <w:rPr>
+          <w:rFonts w:cs="Arial"/>
+          <w:color w:val="auto"/>
+        </w:rPr>
+        <w:lastRenderedPageBreak/>
+        <w:t>El cargador de escenas escribe en el Player.log cuánto tardó cada carga, y la más lenta, la de la primera narrativa al crear un perfil nuevo, duró 0,78 s; ninguna otra escena pasó de 0,16 s. La memoria la muestreó el arnés cada dos segundos durante las sesiones de juego, y el paquete quedó 21 MB por debajo del límite. Repetir esas medidas en otro equipo, y en uno que no tenga tarjeta gráfica dedicada, queda para el cuarto objetivo</w:t>
       </w:r>
       <w:r>
         <w:rPr>
@@ -22256,6 +22340,13 @@
           <w:color w:val="auto"/>
         </w:rPr>
         <w:t>.</w:t>
+      </w:r>
+      <w:r>
+        <w:rPr>
+          <w:rFonts w:cs="Arial"/>
+          <w:color w:val="auto"/>
+        </w:rPr>
+        <w:t xml:space="preserve"> Esas cifras son las del ejecutable del 1 de octubre; los dos ejecutables del 9 de octubre solo se pesaron.</w:t>
       </w:r>
     </w:p>
     <w:p>
@@ -22269,7 +22360,7 @@
           <w:color w:val="auto"/>
         </w:rPr>
       </w:pPr>
-      <w:bookmarkStart w:id="112" w:name="_Toc242400718"/>
+      <w:bookmarkStart w:id="112" w:name="_Toc242443039"/>
       <w:r>
         <w:rPr>
           <w:rFonts w:cs="Arial"/>
@@ -22975,15 +23066,7 @@
           <w:rFonts w:cs="Arial"/>
           <w:color w:val="auto"/>
         </w:rPr>
-        <w:t xml:space="preserve">Los días 29 y 30 de septiembre y 1 de octubre se contrastaron todos los documentos con el juego y se cerraron los hallazgos que seguían abiertos, junto con los que esa revisión y el </w:t>
-      </w:r>
-      <w:r>
-        <w:rPr>
-          <w:rFonts w:cs="Arial"/>
-          <w:color w:val="auto"/>
-        </w:rPr>
-        <w:lastRenderedPageBreak/>
-        <w:t>cierre encontraron, hasta INC-130</w:t>
+        <w:t>Los días 29 y 30 de septiembre y 1 de octubre se contrastaron todos los documentos con el juego y se cerraron los hallazgos que seguían abiertos, junto con los que esa revisión y el cierre encontraron, hasta INC-130</w:t>
       </w:r>
       <w:r>
         <w:rPr>
@@ -23005,6 +23088,13 @@
           <w:color w:val="auto"/>
         </w:rPr>
         <w:t>.</w:t>
+      </w:r>
+      <w:r>
+        <w:rPr>
+          <w:rFonts w:cs="Arial"/>
+          <w:color w:val="auto"/>
+        </w:rPr>
+        <w:t xml:space="preserve"> Después se registraron y cerraron otros diecisiete, INC-131 a INC-147, sobre los personajes, la interfaz, la cámara del cruce y el peso del paquete; el último es del 9 de octubre.</w:t>
       </w:r>
     </w:p>
     <w:p>
@@ -23015,7 +23105,7 @@
           <w:color w:val="auto"/>
         </w:rPr>
       </w:pPr>
-      <w:bookmarkStart w:id="113" w:name="_Toc242400706"/>
+      <w:bookmarkStart w:id="113" w:name="_Toc242443027"/>
       <w:r>
         <w:rPr>
           <w:color w:val="auto"/>
@@ -23106,6 +23196,7 @@
           <w:rFonts w:cs="Arial"/>
           <w:color w:val="auto"/>
         </w:rPr>
+        <w:lastRenderedPageBreak/>
         <w:t xml:space="preserve">Medir sobre el juego compilado cambió dos resultados. La primera compilación de doce escenas superaba el límite de tamaño de RNF-06, y la primera versión candidata abría conexiones de red que las pruebas no detectaban, porque leían la configuración guardada en el repositorio y no la que quedaba dentro del ejecutable. Ambas se corrigieron antes de la entrega, y desde entonces una prueba vigila la importación de </w:t>
       </w:r>
       <w:r>
@@ -23121,6 +23212,13 @@
           <w:color w:val="auto"/>
         </w:rPr>
         <w:t xml:space="preserve"> y la compilación se detiene si el juego vuelve a nombrar los servidores de Unity.</w:t>
+      </w:r>
+      <w:r>
+        <w:rPr>
+          <w:rFonts w:cs="Arial"/>
+          <w:color w:val="auto"/>
+        </w:rPr>
+        <w:t xml:space="preserve"> Volvió a ocurrir el 9 de octubre: con el arte final de los personajes el ejecutable llegó a 499,3 MB, y bajarlo a 420,6 MB exigió importar cinco imágenes del Nivel 1 a 256 píxeles, que ahora vigila la prueba ArtImport_RNF06_LosCincoPropsDelN1SeImportanA256SinComprimir.</w:t>
       </w:r>
     </w:p>
     <w:p>
@@ -23183,7 +23281,7 @@
         </w:rPr>
       </w:pPr>
       <w:bookmarkStart w:id="114" w:name="_Toc379905744"/>
-      <w:bookmarkStart w:id="115" w:name="_Toc242400707"/>
+      <w:bookmarkStart w:id="115" w:name="_Toc242443028"/>
       <w:r>
         <w:rPr>
           <w:rFonts w:cs="Arial"/>

</xml_diff>

<commit_message>
Thesis aligned with the prototype of 10/10/2026: expressions per the guion, animated dialogue card, faces at 256 px and the 426.6 MB build (INC-148 to INC-150)
</commit_message>
<xml_diff>
--- a/docs/Trabajo_de_Grado_Entrega_Plantilla_28jul.docx
+++ b/docs/Trabajo_de_Grado_Entrega_Plantilla_28jul.docx
@@ -1073,7 +1073,7 @@
           <w:r>
             <w:fldChar w:fldCharType="separate"/>
           </w:r>
-          <w:hyperlink w:anchor="_Toc242442965" w:history="1">
+          <w:hyperlink w:anchor="_Toc242545626" w:history="1">
             <w:r>
               <w:rPr>
                 <w:rStyle w:val="Hipervnculo"/>
@@ -1103,7 +1103,7 @@
                 <w:noProof/>
                 <w:webHidden/>
               </w:rPr>
-              <w:instrText xml:space="preserve"> PAGEREF _Toc242442965 \h </w:instrText>
+              <w:instrText xml:space="preserve"> PAGEREF _Toc242545626 \h </w:instrText>
             </w:r>
             <w:r>
               <w:rPr>
@@ -1145,7 +1145,7 @@
               <w14:ligatures w14:val="standardContextual"/>
             </w:rPr>
           </w:pPr>
-          <w:hyperlink w:anchor="_Toc242442966" w:history="1">
+          <w:hyperlink w:anchor="_Toc242545627" w:history="1">
             <w:r>
               <w:rPr>
                 <w:rStyle w:val="Hipervnculo"/>
@@ -1175,7 +1175,7 @@
                 <w:noProof/>
                 <w:webHidden/>
               </w:rPr>
-              <w:instrText xml:space="preserve"> PAGEREF _Toc242442966 \h </w:instrText>
+              <w:instrText xml:space="preserve"> PAGEREF _Toc242545627 \h </w:instrText>
             </w:r>
             <w:r>
               <w:rPr>
@@ -1220,7 +1220,7 @@
               <w14:ligatures w14:val="standardContextual"/>
             </w:rPr>
           </w:pPr>
-          <w:hyperlink w:anchor="_Toc242442967" w:history="1">
+          <w:hyperlink w:anchor="_Toc242545628" w:history="1">
             <w:r>
               <w:rPr>
                 <w:rStyle w:val="Hipervnculo"/>
@@ -1247,7 +1247,7 @@
                 <w:noProof/>
                 <w:webHidden/>
               </w:rPr>
-              <w:instrText xml:space="preserve"> PAGEREF _Toc242442967 \h </w:instrText>
+              <w:instrText xml:space="preserve"> PAGEREF _Toc242545628 \h </w:instrText>
             </w:r>
             <w:r>
               <w:rPr>
@@ -1292,7 +1292,7 @@
               <w14:ligatures w14:val="standardContextual"/>
             </w:rPr>
           </w:pPr>
-          <w:hyperlink w:anchor="_Toc242442968" w:history="1">
+          <w:hyperlink w:anchor="_Toc242545629" w:history="1">
             <w:r>
               <w:rPr>
                 <w:rStyle w:val="Hipervnculo"/>
@@ -1319,7 +1319,7 @@
                 <w:noProof/>
                 <w:webHidden/>
               </w:rPr>
-              <w:instrText xml:space="preserve"> PAGEREF _Toc242442968 \h </w:instrText>
+              <w:instrText xml:space="preserve"> PAGEREF _Toc242545629 \h </w:instrText>
             </w:r>
             <w:r>
               <w:rPr>
@@ -1364,7 +1364,7 @@
               <w14:ligatures w14:val="standardContextual"/>
             </w:rPr>
           </w:pPr>
-          <w:hyperlink w:anchor="_Toc242442969" w:history="1">
+          <w:hyperlink w:anchor="_Toc242545630" w:history="1">
             <w:r>
               <w:rPr>
                 <w:rStyle w:val="Hipervnculo"/>
@@ -1391,7 +1391,7 @@
                 <w:noProof/>
                 <w:webHidden/>
               </w:rPr>
-              <w:instrText xml:space="preserve"> PAGEREF _Toc242442969 \h </w:instrText>
+              <w:instrText xml:space="preserve"> PAGEREF _Toc242545630 \h </w:instrText>
             </w:r>
             <w:r>
               <w:rPr>
@@ -1436,7 +1436,7 @@
               <w14:ligatures w14:val="standardContextual"/>
             </w:rPr>
           </w:pPr>
-          <w:hyperlink w:anchor="_Toc242442970" w:history="1">
+          <w:hyperlink w:anchor="_Toc242545631" w:history="1">
             <w:r>
               <w:rPr>
                 <w:rStyle w:val="Hipervnculo"/>
@@ -1463,7 +1463,7 @@
                 <w:noProof/>
                 <w:webHidden/>
               </w:rPr>
-              <w:instrText xml:space="preserve"> PAGEREF _Toc242442970 \h </w:instrText>
+              <w:instrText xml:space="preserve"> PAGEREF _Toc242545631 \h </w:instrText>
             </w:r>
             <w:r>
               <w:rPr>
@@ -1505,7 +1505,7 @@
               <w14:ligatures w14:val="standardContextual"/>
             </w:rPr>
           </w:pPr>
-          <w:hyperlink w:anchor="_Toc242442971" w:history="1">
+          <w:hyperlink w:anchor="_Toc242545632" w:history="1">
             <w:r>
               <w:rPr>
                 <w:rStyle w:val="Hipervnculo"/>
@@ -1535,7 +1535,7 @@
                 <w:noProof/>
                 <w:webHidden/>
               </w:rPr>
-              <w:instrText xml:space="preserve"> PAGEREF _Toc242442971 \h </w:instrText>
+              <w:instrText xml:space="preserve"> PAGEREF _Toc242545632 \h </w:instrText>
             </w:r>
             <w:r>
               <w:rPr>
@@ -1580,7 +1580,7 @@
               <w14:ligatures w14:val="standardContextual"/>
             </w:rPr>
           </w:pPr>
-          <w:hyperlink w:anchor="_Toc242442972" w:history="1">
+          <w:hyperlink w:anchor="_Toc242545633" w:history="1">
             <w:r>
               <w:rPr>
                 <w:rStyle w:val="Hipervnculo"/>
@@ -1607,7 +1607,7 @@
                 <w:noProof/>
                 <w:webHidden/>
               </w:rPr>
-              <w:instrText xml:space="preserve"> PAGEREF _Toc242442972 \h </w:instrText>
+              <w:instrText xml:space="preserve"> PAGEREF _Toc242545633 \h </w:instrText>
             </w:r>
             <w:r>
               <w:rPr>
@@ -1652,7 +1652,7 @@
               <w14:ligatures w14:val="standardContextual"/>
             </w:rPr>
           </w:pPr>
-          <w:hyperlink w:anchor="_Toc242442973" w:history="1">
+          <w:hyperlink w:anchor="_Toc242545634" w:history="1">
             <w:r>
               <w:rPr>
                 <w:rStyle w:val="Hipervnculo"/>
@@ -1679,7 +1679,7 @@
                 <w:noProof/>
                 <w:webHidden/>
               </w:rPr>
-              <w:instrText xml:space="preserve"> PAGEREF _Toc242442973 \h </w:instrText>
+              <w:instrText xml:space="preserve"> PAGEREF _Toc242545634 \h </w:instrText>
             </w:r>
             <w:r>
               <w:rPr>
@@ -1721,7 +1721,7 @@
               <w14:ligatures w14:val="standardContextual"/>
             </w:rPr>
           </w:pPr>
-          <w:hyperlink w:anchor="_Toc242442974" w:history="1">
+          <w:hyperlink w:anchor="_Toc242545635" w:history="1">
             <w:r>
               <w:rPr>
                 <w:rStyle w:val="Hipervnculo"/>
@@ -1751,7 +1751,7 @@
                 <w:noProof/>
                 <w:webHidden/>
               </w:rPr>
-              <w:instrText xml:space="preserve"> PAGEREF _Toc242442974 \h </w:instrText>
+              <w:instrText xml:space="preserve"> PAGEREF _Toc242545635 \h </w:instrText>
             </w:r>
             <w:r>
               <w:rPr>
@@ -1796,7 +1796,7 @@
               <w14:ligatures w14:val="standardContextual"/>
             </w:rPr>
           </w:pPr>
-          <w:hyperlink w:anchor="_Toc242442975" w:history="1">
+          <w:hyperlink w:anchor="_Toc242545636" w:history="1">
             <w:r>
               <w:rPr>
                 <w:rStyle w:val="Hipervnculo"/>
@@ -1823,7 +1823,7 @@
                 <w:noProof/>
                 <w:webHidden/>
               </w:rPr>
-              <w:instrText xml:space="preserve"> PAGEREF _Toc242442975 \h </w:instrText>
+              <w:instrText xml:space="preserve"> PAGEREF _Toc242545636 \h </w:instrText>
             </w:r>
             <w:r>
               <w:rPr>
@@ -1865,7 +1865,7 @@
               <w14:ligatures w14:val="standardContextual"/>
             </w:rPr>
           </w:pPr>
-          <w:hyperlink w:anchor="_Toc242442976" w:history="1">
+          <w:hyperlink w:anchor="_Toc242545637" w:history="1">
             <w:r>
               <w:rPr>
                 <w:rStyle w:val="Hipervnculo"/>
@@ -1892,7 +1892,7 @@
                 <w:noProof/>
                 <w:webHidden/>
               </w:rPr>
-              <w:instrText xml:space="preserve"> PAGEREF _Toc242442976 \h </w:instrText>
+              <w:instrText xml:space="preserve"> PAGEREF _Toc242545637 \h </w:instrText>
             </w:r>
             <w:r>
               <w:rPr>
@@ -1934,7 +1934,7 @@
               <w14:ligatures w14:val="standardContextual"/>
             </w:rPr>
           </w:pPr>
-          <w:hyperlink w:anchor="_Toc242442977" w:history="1">
+          <w:hyperlink w:anchor="_Toc242545638" w:history="1">
             <w:r>
               <w:rPr>
                 <w:rStyle w:val="Hipervnculo"/>
@@ -1961,7 +1961,7 @@
                 <w:noProof/>
                 <w:webHidden/>
               </w:rPr>
-              <w:instrText xml:space="preserve"> PAGEREF _Toc242442977 \h </w:instrText>
+              <w:instrText xml:space="preserve"> PAGEREF _Toc242545638 \h </w:instrText>
             </w:r>
             <w:r>
               <w:rPr>
@@ -2003,7 +2003,7 @@
               <w14:ligatures w14:val="standardContextual"/>
             </w:rPr>
           </w:pPr>
-          <w:hyperlink w:anchor="_Toc242442978" w:history="1">
+          <w:hyperlink w:anchor="_Toc242545639" w:history="1">
             <w:r>
               <w:rPr>
                 <w:rStyle w:val="Hipervnculo"/>
@@ -2030,7 +2030,7 @@
                 <w:noProof/>
                 <w:webHidden/>
               </w:rPr>
-              <w:instrText xml:space="preserve"> PAGEREF _Toc242442978 \h </w:instrText>
+              <w:instrText xml:space="preserve"> PAGEREF _Toc242545639 \h </w:instrText>
             </w:r>
             <w:r>
               <w:rPr>
@@ -2072,7 +2072,7 @@
               <w14:ligatures w14:val="standardContextual"/>
             </w:rPr>
           </w:pPr>
-          <w:hyperlink w:anchor="_Toc242442979" w:history="1">
+          <w:hyperlink w:anchor="_Toc242545640" w:history="1">
             <w:r>
               <w:rPr>
                 <w:rStyle w:val="Hipervnculo"/>
@@ -2099,7 +2099,7 @@
                 <w:noProof/>
                 <w:webHidden/>
               </w:rPr>
-              <w:instrText xml:space="preserve"> PAGEREF _Toc242442979 \h </w:instrText>
+              <w:instrText xml:space="preserve"> PAGEREF _Toc242545640 \h </w:instrText>
             </w:r>
             <w:r>
               <w:rPr>
@@ -2141,7 +2141,7 @@
               <w14:ligatures w14:val="standardContextual"/>
             </w:rPr>
           </w:pPr>
-          <w:hyperlink w:anchor="_Toc242442980" w:history="1">
+          <w:hyperlink w:anchor="_Toc242545641" w:history="1">
             <w:r>
               <w:rPr>
                 <w:rStyle w:val="Hipervnculo"/>
@@ -2168,7 +2168,7 @@
                 <w:noProof/>
                 <w:webHidden/>
               </w:rPr>
-              <w:instrText xml:space="preserve"> PAGEREF _Toc242442980 \h </w:instrText>
+              <w:instrText xml:space="preserve"> PAGEREF _Toc242545641 \h </w:instrText>
             </w:r>
             <w:r>
               <w:rPr>
@@ -2210,7 +2210,7 @@
               <w14:ligatures w14:val="standardContextual"/>
             </w:rPr>
           </w:pPr>
-          <w:hyperlink w:anchor="_Toc242442981" w:history="1">
+          <w:hyperlink w:anchor="_Toc242545642" w:history="1">
             <w:r>
               <w:rPr>
                 <w:rStyle w:val="Hipervnculo"/>
@@ -2237,7 +2237,7 @@
                 <w:noProof/>
                 <w:webHidden/>
               </w:rPr>
-              <w:instrText xml:space="preserve"> PAGEREF _Toc242442981 \h </w:instrText>
+              <w:instrText xml:space="preserve"> PAGEREF _Toc242545642 \h </w:instrText>
             </w:r>
             <w:r>
               <w:rPr>
@@ -2282,7 +2282,7 @@
               <w14:ligatures w14:val="standardContextual"/>
             </w:rPr>
           </w:pPr>
-          <w:hyperlink w:anchor="_Toc242442982" w:history="1">
+          <w:hyperlink w:anchor="_Toc242545643" w:history="1">
             <w:r>
               <w:rPr>
                 <w:rStyle w:val="Hipervnculo"/>
@@ -2309,7 +2309,7 @@
                 <w:noProof/>
                 <w:webHidden/>
               </w:rPr>
-              <w:instrText xml:space="preserve"> PAGEREF _Toc242442982 \h </w:instrText>
+              <w:instrText xml:space="preserve"> PAGEREF _Toc242545643 \h </w:instrText>
             </w:r>
             <w:r>
               <w:rPr>
@@ -2351,7 +2351,7 @@
               <w14:ligatures w14:val="standardContextual"/>
             </w:rPr>
           </w:pPr>
-          <w:hyperlink w:anchor="_Toc242442983" w:history="1">
+          <w:hyperlink w:anchor="_Toc242545644" w:history="1">
             <w:r>
               <w:rPr>
                 <w:rStyle w:val="Hipervnculo"/>
@@ -2378,7 +2378,7 @@
                 <w:noProof/>
                 <w:webHidden/>
               </w:rPr>
-              <w:instrText xml:space="preserve"> PAGEREF _Toc242442983 \h </w:instrText>
+              <w:instrText xml:space="preserve"> PAGEREF _Toc242545644 \h </w:instrText>
             </w:r>
             <w:r>
               <w:rPr>
@@ -2420,7 +2420,7 @@
               <w14:ligatures w14:val="standardContextual"/>
             </w:rPr>
           </w:pPr>
-          <w:hyperlink w:anchor="_Toc242442984" w:history="1">
+          <w:hyperlink w:anchor="_Toc242545645" w:history="1">
             <w:r>
               <w:rPr>
                 <w:rStyle w:val="Hipervnculo"/>
@@ -2447,7 +2447,7 @@
                 <w:noProof/>
                 <w:webHidden/>
               </w:rPr>
-              <w:instrText xml:space="preserve"> PAGEREF _Toc242442984 \h </w:instrText>
+              <w:instrText xml:space="preserve"> PAGEREF _Toc242545645 \h </w:instrText>
             </w:r>
             <w:r>
               <w:rPr>
@@ -2489,7 +2489,7 @@
               <w14:ligatures w14:val="standardContextual"/>
             </w:rPr>
           </w:pPr>
-          <w:hyperlink w:anchor="_Toc242442985" w:history="1">
+          <w:hyperlink w:anchor="_Toc242545646" w:history="1">
             <w:r>
               <w:rPr>
                 <w:rStyle w:val="Hipervnculo"/>
@@ -2516,7 +2516,7 @@
                 <w:noProof/>
                 <w:webHidden/>
               </w:rPr>
-              <w:instrText xml:space="preserve"> PAGEREF _Toc242442985 \h </w:instrText>
+              <w:instrText xml:space="preserve"> PAGEREF _Toc242545646 \h </w:instrText>
             </w:r>
             <w:r>
               <w:rPr>
@@ -2558,7 +2558,7 @@
               <w14:ligatures w14:val="standardContextual"/>
             </w:rPr>
           </w:pPr>
-          <w:hyperlink w:anchor="_Toc242442986" w:history="1">
+          <w:hyperlink w:anchor="_Toc242545647" w:history="1">
             <w:r>
               <w:rPr>
                 <w:rStyle w:val="Hipervnculo"/>
@@ -2585,7 +2585,7 @@
                 <w:noProof/>
                 <w:webHidden/>
               </w:rPr>
-              <w:instrText xml:space="preserve"> PAGEREF _Toc242442986 \h </w:instrText>
+              <w:instrText xml:space="preserve"> PAGEREF _Toc242545647 \h </w:instrText>
             </w:r>
             <w:r>
               <w:rPr>
@@ -2627,7 +2627,7 @@
               <w14:ligatures w14:val="standardContextual"/>
             </w:rPr>
           </w:pPr>
-          <w:hyperlink w:anchor="_Toc242442987" w:history="1">
+          <w:hyperlink w:anchor="_Toc242545648" w:history="1">
             <w:r>
               <w:rPr>
                 <w:rStyle w:val="Hipervnculo"/>
@@ -2654,7 +2654,7 @@
                 <w:noProof/>
                 <w:webHidden/>
               </w:rPr>
-              <w:instrText xml:space="preserve"> PAGEREF _Toc242442987 \h </w:instrText>
+              <w:instrText xml:space="preserve"> PAGEREF _Toc242545648 \h </w:instrText>
             </w:r>
             <w:r>
               <w:rPr>
@@ -2696,7 +2696,7 @@
               <w14:ligatures w14:val="standardContextual"/>
             </w:rPr>
           </w:pPr>
-          <w:hyperlink w:anchor="_Toc242442988" w:history="1">
+          <w:hyperlink w:anchor="_Toc242545649" w:history="1">
             <w:r>
               <w:rPr>
                 <w:rStyle w:val="Hipervnculo"/>
@@ -2723,7 +2723,7 @@
                 <w:noProof/>
                 <w:webHidden/>
               </w:rPr>
-              <w:instrText xml:space="preserve"> PAGEREF _Toc242442988 \h </w:instrText>
+              <w:instrText xml:space="preserve"> PAGEREF _Toc242545649 \h </w:instrText>
             </w:r>
             <w:r>
               <w:rPr>
@@ -2765,7 +2765,7 @@
               <w14:ligatures w14:val="standardContextual"/>
             </w:rPr>
           </w:pPr>
-          <w:hyperlink w:anchor="_Toc242442989" w:history="1">
+          <w:hyperlink w:anchor="_Toc242545650" w:history="1">
             <w:r>
               <w:rPr>
                 <w:rStyle w:val="Hipervnculo"/>
@@ -2792,7 +2792,7 @@
                 <w:noProof/>
                 <w:webHidden/>
               </w:rPr>
-              <w:instrText xml:space="preserve"> PAGEREF _Toc242442989 \h </w:instrText>
+              <w:instrText xml:space="preserve"> PAGEREF _Toc242545650 \h </w:instrText>
             </w:r>
             <w:r>
               <w:rPr>
@@ -2837,7 +2837,7 @@
               <w14:ligatures w14:val="standardContextual"/>
             </w:rPr>
           </w:pPr>
-          <w:hyperlink w:anchor="_Toc242442990" w:history="1">
+          <w:hyperlink w:anchor="_Toc242545651" w:history="1">
             <w:r>
               <w:rPr>
                 <w:rStyle w:val="Hipervnculo"/>
@@ -2864,7 +2864,7 @@
                 <w:noProof/>
                 <w:webHidden/>
               </w:rPr>
-              <w:instrText xml:space="preserve"> PAGEREF _Toc242442990 \h </w:instrText>
+              <w:instrText xml:space="preserve"> PAGEREF _Toc242545651 \h </w:instrText>
             </w:r>
             <w:r>
               <w:rPr>
@@ -2906,7 +2906,7 @@
               <w14:ligatures w14:val="standardContextual"/>
             </w:rPr>
           </w:pPr>
-          <w:hyperlink w:anchor="_Toc242442991" w:history="1">
+          <w:hyperlink w:anchor="_Toc242545652" w:history="1">
             <w:r>
               <w:rPr>
                 <w:rStyle w:val="Hipervnculo"/>
@@ -2933,7 +2933,7 @@
                 <w:noProof/>
                 <w:webHidden/>
               </w:rPr>
-              <w:instrText xml:space="preserve"> PAGEREF _Toc242442991 \h </w:instrText>
+              <w:instrText xml:space="preserve"> PAGEREF _Toc242545652 \h </w:instrText>
             </w:r>
             <w:r>
               <w:rPr>
@@ -2975,7 +2975,7 @@
               <w14:ligatures w14:val="standardContextual"/>
             </w:rPr>
           </w:pPr>
-          <w:hyperlink w:anchor="_Toc242442992" w:history="1">
+          <w:hyperlink w:anchor="_Toc242545653" w:history="1">
             <w:r>
               <w:rPr>
                 <w:rStyle w:val="Hipervnculo"/>
@@ -3002,7 +3002,7 @@
                 <w:noProof/>
                 <w:webHidden/>
               </w:rPr>
-              <w:instrText xml:space="preserve"> PAGEREF _Toc242442992 \h </w:instrText>
+              <w:instrText xml:space="preserve"> PAGEREF _Toc242545653 \h </w:instrText>
             </w:r>
             <w:r>
               <w:rPr>
@@ -3047,7 +3047,7 @@
               <w14:ligatures w14:val="standardContextual"/>
             </w:rPr>
           </w:pPr>
-          <w:hyperlink w:anchor="_Toc242442993" w:history="1">
+          <w:hyperlink w:anchor="_Toc242545654" w:history="1">
             <w:r>
               <w:rPr>
                 <w:rStyle w:val="Hipervnculo"/>
@@ -3074,7 +3074,7 @@
                 <w:noProof/>
                 <w:webHidden/>
               </w:rPr>
-              <w:instrText xml:space="preserve"> PAGEREF _Toc242442993 \h </w:instrText>
+              <w:instrText xml:space="preserve"> PAGEREF _Toc242545654 \h </w:instrText>
             </w:r>
             <w:r>
               <w:rPr>
@@ -3116,7 +3116,7 @@
               <w14:ligatures w14:val="standardContextual"/>
             </w:rPr>
           </w:pPr>
-          <w:hyperlink w:anchor="_Toc242442994" w:history="1">
+          <w:hyperlink w:anchor="_Toc242545655" w:history="1">
             <w:r>
               <w:rPr>
                 <w:rStyle w:val="Hipervnculo"/>
@@ -3146,7 +3146,7 @@
                 <w:noProof/>
                 <w:webHidden/>
               </w:rPr>
-              <w:instrText xml:space="preserve"> PAGEREF _Toc242442994 \h </w:instrText>
+              <w:instrText xml:space="preserve"> PAGEREF _Toc242545655 \h </w:instrText>
             </w:r>
             <w:r>
               <w:rPr>
@@ -3188,7 +3188,7 @@
               <w14:ligatures w14:val="standardContextual"/>
             </w:rPr>
           </w:pPr>
-          <w:hyperlink w:anchor="_Toc242442995" w:history="1">
+          <w:hyperlink w:anchor="_Toc242545656" w:history="1">
             <w:r>
               <w:rPr>
                 <w:rStyle w:val="Hipervnculo"/>
@@ -3218,7 +3218,7 @@
                 <w:noProof/>
                 <w:webHidden/>
               </w:rPr>
-              <w:instrText xml:space="preserve"> PAGEREF _Toc242442995 \h </w:instrText>
+              <w:instrText xml:space="preserve"> PAGEREF _Toc242545656 \h </w:instrText>
             </w:r>
             <w:r>
               <w:rPr>
@@ -3263,7 +3263,7 @@
               <w14:ligatures w14:val="standardContextual"/>
             </w:rPr>
           </w:pPr>
-          <w:hyperlink w:anchor="_Toc242442996" w:history="1">
+          <w:hyperlink w:anchor="_Toc242545657" w:history="1">
             <w:r>
               <w:rPr>
                 <w:rStyle w:val="Hipervnculo"/>
@@ -3290,7 +3290,7 @@
                 <w:noProof/>
                 <w:webHidden/>
               </w:rPr>
-              <w:instrText xml:space="preserve"> PAGEREF _Toc242442996 \h </w:instrText>
+              <w:instrText xml:space="preserve"> PAGEREF _Toc242545657 \h </w:instrText>
             </w:r>
             <w:r>
               <w:rPr>
@@ -3332,7 +3332,7 @@
               <w14:ligatures w14:val="standardContextual"/>
             </w:rPr>
           </w:pPr>
-          <w:hyperlink w:anchor="_Toc242442997" w:history="1">
+          <w:hyperlink w:anchor="_Toc242545658" w:history="1">
             <w:r>
               <w:rPr>
                 <w:rStyle w:val="Hipervnculo"/>
@@ -3359,7 +3359,7 @@
                 <w:noProof/>
                 <w:webHidden/>
               </w:rPr>
-              <w:instrText xml:space="preserve"> PAGEREF _Toc242442997 \h </w:instrText>
+              <w:instrText xml:space="preserve"> PAGEREF _Toc242545658 \h </w:instrText>
             </w:r>
             <w:r>
               <w:rPr>
@@ -3401,7 +3401,7 @@
               <w14:ligatures w14:val="standardContextual"/>
             </w:rPr>
           </w:pPr>
-          <w:hyperlink w:anchor="_Toc242442998" w:history="1">
+          <w:hyperlink w:anchor="_Toc242545659" w:history="1">
             <w:r>
               <w:rPr>
                 <w:rStyle w:val="Hipervnculo"/>
@@ -3428,7 +3428,7 @@
                 <w:noProof/>
                 <w:webHidden/>
               </w:rPr>
-              <w:instrText xml:space="preserve"> PAGEREF _Toc242442998 \h </w:instrText>
+              <w:instrText xml:space="preserve"> PAGEREF _Toc242545659 \h </w:instrText>
             </w:r>
             <w:r>
               <w:rPr>
@@ -3470,7 +3470,7 @@
               <w14:ligatures w14:val="standardContextual"/>
             </w:rPr>
           </w:pPr>
-          <w:hyperlink w:anchor="_Toc242442999" w:history="1">
+          <w:hyperlink w:anchor="_Toc242545660" w:history="1">
             <w:r>
               <w:rPr>
                 <w:rStyle w:val="Hipervnculo"/>
@@ -3497,7 +3497,7 @@
                 <w:noProof/>
                 <w:webHidden/>
               </w:rPr>
-              <w:instrText xml:space="preserve"> PAGEREF _Toc242442999 \h </w:instrText>
+              <w:instrText xml:space="preserve"> PAGEREF _Toc242545660 \h </w:instrText>
             </w:r>
             <w:r>
               <w:rPr>
@@ -3539,7 +3539,7 @@
               <w14:ligatures w14:val="standardContextual"/>
             </w:rPr>
           </w:pPr>
-          <w:hyperlink w:anchor="_Toc242443000" w:history="1">
+          <w:hyperlink w:anchor="_Toc242545661" w:history="1">
             <w:r>
               <w:rPr>
                 <w:rStyle w:val="Hipervnculo"/>
@@ -3566,7 +3566,7 @@
                 <w:noProof/>
                 <w:webHidden/>
               </w:rPr>
-              <w:instrText xml:space="preserve"> PAGEREF _Toc242443000 \h </w:instrText>
+              <w:instrText xml:space="preserve"> PAGEREF _Toc242545661 \h </w:instrText>
             </w:r>
             <w:r>
               <w:rPr>
@@ -3608,7 +3608,7 @@
               <w14:ligatures w14:val="standardContextual"/>
             </w:rPr>
           </w:pPr>
-          <w:hyperlink w:anchor="_Toc242443001" w:history="1">
+          <w:hyperlink w:anchor="_Toc242545662" w:history="1">
             <w:r>
               <w:rPr>
                 <w:rStyle w:val="Hipervnculo"/>
@@ -3635,7 +3635,7 @@
                 <w:noProof/>
                 <w:webHidden/>
               </w:rPr>
-              <w:instrText xml:space="preserve"> PAGEREF _Toc242443001 \h </w:instrText>
+              <w:instrText xml:space="preserve"> PAGEREF _Toc242545662 \h </w:instrText>
             </w:r>
             <w:r>
               <w:rPr>
@@ -3677,7 +3677,7 @@
               <w14:ligatures w14:val="standardContextual"/>
             </w:rPr>
           </w:pPr>
-          <w:hyperlink w:anchor="_Toc242443002" w:history="1">
+          <w:hyperlink w:anchor="_Toc242545663" w:history="1">
             <w:r>
               <w:rPr>
                 <w:rStyle w:val="Hipervnculo"/>
@@ -3704,7 +3704,7 @@
                 <w:noProof/>
                 <w:webHidden/>
               </w:rPr>
-              <w:instrText xml:space="preserve"> PAGEREF _Toc242443002 \h </w:instrText>
+              <w:instrText xml:space="preserve"> PAGEREF _Toc242545663 \h </w:instrText>
             </w:r>
             <w:r>
               <w:rPr>
@@ -3749,7 +3749,7 @@
               <w14:ligatures w14:val="standardContextual"/>
             </w:rPr>
           </w:pPr>
-          <w:hyperlink w:anchor="_Toc242443003" w:history="1">
+          <w:hyperlink w:anchor="_Toc242545664" w:history="1">
             <w:r>
               <w:rPr>
                 <w:rStyle w:val="Hipervnculo"/>
@@ -3776,7 +3776,7 @@
                 <w:noProof/>
                 <w:webHidden/>
               </w:rPr>
-              <w:instrText xml:space="preserve"> PAGEREF _Toc242443003 \h </w:instrText>
+              <w:instrText xml:space="preserve"> PAGEREF _Toc242545664 \h </w:instrText>
             </w:r>
             <w:r>
               <w:rPr>
@@ -3821,7 +3821,7 @@
               <w14:ligatures w14:val="standardContextual"/>
             </w:rPr>
           </w:pPr>
-          <w:hyperlink w:anchor="_Toc242443004" w:history="1">
+          <w:hyperlink w:anchor="_Toc242545665" w:history="1">
             <w:r>
               <w:rPr>
                 <w:rStyle w:val="Hipervnculo"/>
@@ -3848,7 +3848,7 @@
                 <w:noProof/>
                 <w:webHidden/>
               </w:rPr>
-              <w:instrText xml:space="preserve"> PAGEREF _Toc242443004 \h </w:instrText>
+              <w:instrText xml:space="preserve"> PAGEREF _Toc242545665 \h </w:instrText>
             </w:r>
             <w:r>
               <w:rPr>
@@ -3890,7 +3890,7 @@
               <w14:ligatures w14:val="standardContextual"/>
             </w:rPr>
           </w:pPr>
-          <w:hyperlink w:anchor="_Toc242443005" w:history="1">
+          <w:hyperlink w:anchor="_Toc242545666" w:history="1">
             <w:r>
               <w:rPr>
                 <w:rStyle w:val="Hipervnculo"/>
@@ -3919,7 +3919,7 @@
                 <w:noProof/>
                 <w:webHidden/>
               </w:rPr>
-              <w:instrText xml:space="preserve"> PAGEREF _Toc242443005 \h </w:instrText>
+              <w:instrText xml:space="preserve"> PAGEREF _Toc242545666 \h </w:instrText>
             </w:r>
             <w:r>
               <w:rPr>
@@ -3964,7 +3964,7 @@
               <w14:ligatures w14:val="standardContextual"/>
             </w:rPr>
           </w:pPr>
-          <w:hyperlink w:anchor="_Toc242443006" w:history="1">
+          <w:hyperlink w:anchor="_Toc242545667" w:history="1">
             <w:r>
               <w:rPr>
                 <w:rStyle w:val="Hipervnculo"/>
@@ -3991,7 +3991,7 @@
                 <w:noProof/>
                 <w:webHidden/>
               </w:rPr>
-              <w:instrText xml:space="preserve"> PAGEREF _Toc242443006 \h </w:instrText>
+              <w:instrText xml:space="preserve"> PAGEREF _Toc242545667 \h </w:instrText>
             </w:r>
             <w:r>
               <w:rPr>
@@ -4033,7 +4033,7 @@
               <w14:ligatures w14:val="standardContextual"/>
             </w:rPr>
           </w:pPr>
-          <w:hyperlink w:anchor="_Toc242443007" w:history="1">
+          <w:hyperlink w:anchor="_Toc242545668" w:history="1">
             <w:r>
               <w:rPr>
                 <w:rStyle w:val="Hipervnculo"/>
@@ -4061,7 +4061,7 @@
                 <w:noProof/>
                 <w:webHidden/>
               </w:rPr>
-              <w:instrText xml:space="preserve"> PAGEREF _Toc242443007 \h </w:instrText>
+              <w:instrText xml:space="preserve"> PAGEREF _Toc242545668 \h </w:instrText>
             </w:r>
             <w:r>
               <w:rPr>
@@ -4103,7 +4103,7 @@
               <w14:ligatures w14:val="standardContextual"/>
             </w:rPr>
           </w:pPr>
-          <w:hyperlink w:anchor="_Toc242443008" w:history="1">
+          <w:hyperlink w:anchor="_Toc242545669" w:history="1">
             <w:r>
               <w:rPr>
                 <w:rStyle w:val="Hipervnculo"/>
@@ -4131,7 +4131,7 @@
                 <w:noProof/>
                 <w:webHidden/>
               </w:rPr>
-              <w:instrText xml:space="preserve"> PAGEREF _Toc242443008 \h </w:instrText>
+              <w:instrText xml:space="preserve"> PAGEREF _Toc242545669 \h </w:instrText>
             </w:r>
             <w:r>
               <w:rPr>
@@ -4173,7 +4173,7 @@
               <w14:ligatures w14:val="standardContextual"/>
             </w:rPr>
           </w:pPr>
-          <w:hyperlink w:anchor="_Toc242443009" w:history="1">
+          <w:hyperlink w:anchor="_Toc242545670" w:history="1">
             <w:r>
               <w:rPr>
                 <w:rStyle w:val="Hipervnculo"/>
@@ -4201,7 +4201,7 @@
                 <w:noProof/>
                 <w:webHidden/>
               </w:rPr>
-              <w:instrText xml:space="preserve"> PAGEREF _Toc242443009 \h </w:instrText>
+              <w:instrText xml:space="preserve"> PAGEREF _Toc242545670 \h </w:instrText>
             </w:r>
             <w:r>
               <w:rPr>
@@ -4246,7 +4246,7 @@
               <w14:ligatures w14:val="standardContextual"/>
             </w:rPr>
           </w:pPr>
-          <w:hyperlink w:anchor="_Toc242443010" w:history="1">
+          <w:hyperlink w:anchor="_Toc242545671" w:history="1">
             <w:r>
               <w:rPr>
                 <w:rStyle w:val="Hipervnculo"/>
@@ -4273,7 +4273,7 @@
                 <w:noProof/>
                 <w:webHidden/>
               </w:rPr>
-              <w:instrText xml:space="preserve"> PAGEREF _Toc242443010 \h </w:instrText>
+              <w:instrText xml:space="preserve"> PAGEREF _Toc242545671 \h </w:instrText>
             </w:r>
             <w:r>
               <w:rPr>
@@ -4318,7 +4318,7 @@
               <w14:ligatures w14:val="standardContextual"/>
             </w:rPr>
           </w:pPr>
-          <w:hyperlink w:anchor="_Toc242443011" w:history="1">
+          <w:hyperlink w:anchor="_Toc242545672" w:history="1">
             <w:r>
               <w:rPr>
                 <w:rStyle w:val="Hipervnculo"/>
@@ -4345,7 +4345,7 @@
                 <w:noProof/>
                 <w:webHidden/>
               </w:rPr>
-              <w:instrText xml:space="preserve"> PAGEREF _Toc242443011 \h </w:instrText>
+              <w:instrText xml:space="preserve"> PAGEREF _Toc242545672 \h </w:instrText>
             </w:r>
             <w:r>
               <w:rPr>
@@ -4387,7 +4387,7 @@
               <w14:ligatures w14:val="standardContextual"/>
             </w:rPr>
           </w:pPr>
-          <w:hyperlink w:anchor="_Toc242443012" w:history="1">
+          <w:hyperlink w:anchor="_Toc242545673" w:history="1">
             <w:r>
               <w:rPr>
                 <w:rStyle w:val="Hipervnculo"/>
@@ -4416,7 +4416,7 @@
                 <w:noProof/>
                 <w:webHidden/>
               </w:rPr>
-              <w:instrText xml:space="preserve"> PAGEREF _Toc242443012 \h </w:instrText>
+              <w:instrText xml:space="preserve"> PAGEREF _Toc242545673 \h </w:instrText>
             </w:r>
             <w:r>
               <w:rPr>
@@ -4461,7 +4461,7 @@
               <w14:ligatures w14:val="standardContextual"/>
             </w:rPr>
           </w:pPr>
-          <w:hyperlink w:anchor="_Toc242443013" w:history="1">
+          <w:hyperlink w:anchor="_Toc242545674" w:history="1">
             <w:r>
               <w:rPr>
                 <w:rStyle w:val="Hipervnculo"/>
@@ -4488,7 +4488,7 @@
                 <w:noProof/>
                 <w:webHidden/>
               </w:rPr>
-              <w:instrText xml:space="preserve"> PAGEREF _Toc242443013 \h </w:instrText>
+              <w:instrText xml:space="preserve"> PAGEREF _Toc242545674 \h </w:instrText>
             </w:r>
             <w:r>
               <w:rPr>
@@ -4530,7 +4530,7 @@
               <w14:ligatures w14:val="standardContextual"/>
             </w:rPr>
           </w:pPr>
-          <w:hyperlink w:anchor="_Toc242443014" w:history="1">
+          <w:hyperlink w:anchor="_Toc242545675" w:history="1">
             <w:r>
               <w:rPr>
                 <w:rStyle w:val="Hipervnculo"/>
@@ -4558,7 +4558,7 @@
                 <w:noProof/>
                 <w:webHidden/>
               </w:rPr>
-              <w:instrText xml:space="preserve"> PAGEREF _Toc242443014 \h </w:instrText>
+              <w:instrText xml:space="preserve"> PAGEREF _Toc242545675 \h </w:instrText>
             </w:r>
             <w:r>
               <w:rPr>
@@ -4600,7 +4600,7 @@
               <w14:ligatures w14:val="standardContextual"/>
             </w:rPr>
           </w:pPr>
-          <w:hyperlink w:anchor="_Toc242443015" w:history="1">
+          <w:hyperlink w:anchor="_Toc242545676" w:history="1">
             <w:r>
               <w:rPr>
                 <w:rStyle w:val="Hipervnculo"/>
@@ -4628,7 +4628,7 @@
                 <w:noProof/>
                 <w:webHidden/>
               </w:rPr>
-              <w:instrText xml:space="preserve"> PAGEREF _Toc242443015 \h </w:instrText>
+              <w:instrText xml:space="preserve"> PAGEREF _Toc242545676 \h </w:instrText>
             </w:r>
             <w:r>
               <w:rPr>
@@ -4670,7 +4670,7 @@
               <w14:ligatures w14:val="standardContextual"/>
             </w:rPr>
           </w:pPr>
-          <w:hyperlink w:anchor="_Toc242443016" w:history="1">
+          <w:hyperlink w:anchor="_Toc242545677" w:history="1">
             <w:r>
               <w:rPr>
                 <w:rStyle w:val="Hipervnculo"/>
@@ -4698,7 +4698,7 @@
                 <w:noProof/>
                 <w:webHidden/>
               </w:rPr>
-              <w:instrText xml:space="preserve"> PAGEREF _Toc242443016 \h </w:instrText>
+              <w:instrText xml:space="preserve"> PAGEREF _Toc242545677 \h </w:instrText>
             </w:r>
             <w:r>
               <w:rPr>
@@ -4740,7 +4740,7 @@
               <w14:ligatures w14:val="standardContextual"/>
             </w:rPr>
           </w:pPr>
-          <w:hyperlink w:anchor="_Toc242443017" w:history="1">
+          <w:hyperlink w:anchor="_Toc242545678" w:history="1">
             <w:r>
               <w:rPr>
                 <w:rStyle w:val="Hipervnculo"/>
@@ -4768,7 +4768,7 @@
                 <w:noProof/>
                 <w:webHidden/>
               </w:rPr>
-              <w:instrText xml:space="preserve"> PAGEREF _Toc242443017 \h </w:instrText>
+              <w:instrText xml:space="preserve"> PAGEREF _Toc242545678 \h </w:instrText>
             </w:r>
             <w:r>
               <w:rPr>
@@ -4813,7 +4813,7 @@
               <w14:ligatures w14:val="standardContextual"/>
             </w:rPr>
           </w:pPr>
-          <w:hyperlink w:anchor="_Toc242443018" w:history="1">
+          <w:hyperlink w:anchor="_Toc242545679" w:history="1">
             <w:r>
               <w:rPr>
                 <w:rStyle w:val="Hipervnculo"/>
@@ -4840,7 +4840,7 @@
                 <w:noProof/>
                 <w:webHidden/>
               </w:rPr>
-              <w:instrText xml:space="preserve"> PAGEREF _Toc242443018 \h </w:instrText>
+              <w:instrText xml:space="preserve"> PAGEREF _Toc242545679 \h </w:instrText>
             </w:r>
             <w:r>
               <w:rPr>
@@ -4885,7 +4885,7 @@
               <w14:ligatures w14:val="standardContextual"/>
             </w:rPr>
           </w:pPr>
-          <w:hyperlink w:anchor="_Toc242443019" w:history="1">
+          <w:hyperlink w:anchor="_Toc242545680" w:history="1">
             <w:r>
               <w:rPr>
                 <w:rStyle w:val="Hipervnculo"/>
@@ -4912,7 +4912,7 @@
                 <w:noProof/>
                 <w:webHidden/>
               </w:rPr>
-              <w:instrText xml:space="preserve"> PAGEREF _Toc242443019 \h </w:instrText>
+              <w:instrText xml:space="preserve"> PAGEREF _Toc242545680 \h </w:instrText>
             </w:r>
             <w:r>
               <w:rPr>
@@ -4954,7 +4954,7 @@
               <w14:ligatures w14:val="standardContextual"/>
             </w:rPr>
           </w:pPr>
-          <w:hyperlink w:anchor="_Toc242443020" w:history="1">
+          <w:hyperlink w:anchor="_Toc242545681" w:history="1">
             <w:r>
               <w:rPr>
                 <w:rStyle w:val="Hipervnculo"/>
@@ -4983,7 +4983,7 @@
                 <w:noProof/>
                 <w:webHidden/>
               </w:rPr>
-              <w:instrText xml:space="preserve"> PAGEREF _Toc242443020 \h </w:instrText>
+              <w:instrText xml:space="preserve"> PAGEREF _Toc242545681 \h </w:instrText>
             </w:r>
             <w:r>
               <w:rPr>
@@ -5028,7 +5028,7 @@
               <w14:ligatures w14:val="standardContextual"/>
             </w:rPr>
           </w:pPr>
-          <w:hyperlink w:anchor="_Toc242443021" w:history="1">
+          <w:hyperlink w:anchor="_Toc242545682" w:history="1">
             <w:r>
               <w:rPr>
                 <w:rStyle w:val="Hipervnculo"/>
@@ -5055,7 +5055,7 @@
                 <w:noProof/>
                 <w:webHidden/>
               </w:rPr>
-              <w:instrText xml:space="preserve"> PAGEREF _Toc242443021 \h </w:instrText>
+              <w:instrText xml:space="preserve"> PAGEREF _Toc242545682 \h </w:instrText>
             </w:r>
             <w:r>
               <w:rPr>
@@ -5097,7 +5097,7 @@
               <w14:ligatures w14:val="standardContextual"/>
             </w:rPr>
           </w:pPr>
-          <w:hyperlink w:anchor="_Toc242443022" w:history="1">
+          <w:hyperlink w:anchor="_Toc242545683" w:history="1">
             <w:r>
               <w:rPr>
                 <w:rStyle w:val="Hipervnculo"/>
@@ -5125,7 +5125,7 @@
                 <w:noProof/>
                 <w:webHidden/>
               </w:rPr>
-              <w:instrText xml:space="preserve"> PAGEREF _Toc242443022 \h </w:instrText>
+              <w:instrText xml:space="preserve"> PAGEREF _Toc242545683 \h </w:instrText>
             </w:r>
             <w:r>
               <w:rPr>
@@ -5167,7 +5167,7 @@
               <w14:ligatures w14:val="standardContextual"/>
             </w:rPr>
           </w:pPr>
-          <w:hyperlink w:anchor="_Toc242443023" w:history="1">
+          <w:hyperlink w:anchor="_Toc242545684" w:history="1">
             <w:r>
               <w:rPr>
                 <w:rStyle w:val="Hipervnculo"/>
@@ -5195,7 +5195,7 @@
                 <w:noProof/>
                 <w:webHidden/>
               </w:rPr>
-              <w:instrText xml:space="preserve"> PAGEREF _Toc242443023 \h </w:instrText>
+              <w:instrText xml:space="preserve"> PAGEREF _Toc242545684 \h </w:instrText>
             </w:r>
             <w:r>
               <w:rPr>
@@ -5237,7 +5237,7 @@
               <w14:ligatures w14:val="standardContextual"/>
             </w:rPr>
           </w:pPr>
-          <w:hyperlink w:anchor="_Toc242443024" w:history="1">
+          <w:hyperlink w:anchor="_Toc242545685" w:history="1">
             <w:r>
               <w:rPr>
                 <w:rStyle w:val="Hipervnculo"/>
@@ -5265,7 +5265,7 @@
                 <w:noProof/>
                 <w:webHidden/>
               </w:rPr>
-              <w:instrText xml:space="preserve"> PAGEREF _Toc242443024 \h </w:instrText>
+              <w:instrText xml:space="preserve"> PAGEREF _Toc242545685 \h </w:instrText>
             </w:r>
             <w:r>
               <w:rPr>
@@ -5307,7 +5307,7 @@
               <w14:ligatures w14:val="standardContextual"/>
             </w:rPr>
           </w:pPr>
-          <w:hyperlink w:anchor="_Toc242443025" w:history="1">
+          <w:hyperlink w:anchor="_Toc242545686" w:history="1">
             <w:r>
               <w:rPr>
                 <w:rStyle w:val="Hipervnculo"/>
@@ -5335,7 +5335,7 @@
                 <w:noProof/>
                 <w:webHidden/>
               </w:rPr>
-              <w:instrText xml:space="preserve"> PAGEREF _Toc242443025 \h </w:instrText>
+              <w:instrText xml:space="preserve"> PAGEREF _Toc242545686 \h </w:instrText>
             </w:r>
             <w:r>
               <w:rPr>
@@ -5380,7 +5380,7 @@
               <w14:ligatures w14:val="standardContextual"/>
             </w:rPr>
           </w:pPr>
-          <w:hyperlink w:anchor="_Toc242443026" w:history="1">
+          <w:hyperlink w:anchor="_Toc242545687" w:history="1">
             <w:r>
               <w:rPr>
                 <w:rStyle w:val="Hipervnculo"/>
@@ -5407,7 +5407,7 @@
                 <w:noProof/>
                 <w:webHidden/>
               </w:rPr>
-              <w:instrText xml:space="preserve"> PAGEREF _Toc242443026 \h </w:instrText>
+              <w:instrText xml:space="preserve"> PAGEREF _Toc242545687 \h </w:instrText>
             </w:r>
             <w:r>
               <w:rPr>
@@ -5452,7 +5452,7 @@
               <w14:ligatures w14:val="standardContextual"/>
             </w:rPr>
           </w:pPr>
-          <w:hyperlink w:anchor="_Toc242443027" w:history="1">
+          <w:hyperlink w:anchor="_Toc242545688" w:history="1">
             <w:r>
               <w:rPr>
                 <w:rStyle w:val="Hipervnculo"/>
@@ -5479,7 +5479,7 @@
                 <w:noProof/>
                 <w:webHidden/>
               </w:rPr>
-              <w:instrText xml:space="preserve"> PAGEREF _Toc242443027 \h </w:instrText>
+              <w:instrText xml:space="preserve"> PAGEREF _Toc242545688 \h </w:instrText>
             </w:r>
             <w:r>
               <w:rPr>
@@ -5521,7 +5521,7 @@
               <w14:ligatures w14:val="standardContextual"/>
             </w:rPr>
           </w:pPr>
-          <w:hyperlink w:anchor="_Toc242443028" w:history="1">
+          <w:hyperlink w:anchor="_Toc242545689" w:history="1">
             <w:r>
               <w:rPr>
                 <w:rStyle w:val="Hipervnculo"/>
@@ -5551,7 +5551,7 @@
                 <w:noProof/>
                 <w:webHidden/>
               </w:rPr>
-              <w:instrText xml:space="preserve"> PAGEREF _Toc242443028 \h </w:instrText>
+              <w:instrText xml:space="preserve"> PAGEREF _Toc242545689 \h </w:instrText>
             </w:r>
             <w:r>
               <w:rPr>
@@ -5712,7 +5712,7 @@
         </w:rPr>
         <w:fldChar w:fldCharType="separate"/>
       </w:r>
-      <w:hyperlink w:anchor="_Toc242443029" w:history="1">
+      <w:hyperlink w:anchor="_Toc242545690" w:history="1">
         <w:r>
           <w:rPr>
             <w:rStyle w:val="Hipervnculo"/>
@@ -5740,7 +5740,7 @@
             <w:noProof/>
             <w:webHidden/>
           </w:rPr>
-          <w:instrText xml:space="preserve"> PAGEREF _Toc242443029 \h </w:instrText>
+          <w:instrText xml:space="preserve"> PAGEREF _Toc242545690 \h </w:instrText>
         </w:r>
         <w:r>
           <w:rPr>
@@ -5788,7 +5788,7 @@
           <w14:ligatures w14:val="standardContextual"/>
         </w:rPr>
       </w:pPr>
-      <w:hyperlink w:anchor="_Toc242443030" w:history="1">
+      <w:hyperlink w:anchor="_Toc242545691" w:history="1">
         <w:r>
           <w:rPr>
             <w:rStyle w:val="Hipervnculo"/>
@@ -5816,7 +5816,7 @@
             <w:noProof/>
             <w:webHidden/>
           </w:rPr>
-          <w:instrText xml:space="preserve"> PAGEREF _Toc242443030 \h </w:instrText>
+          <w:instrText xml:space="preserve"> PAGEREF _Toc242545691 \h </w:instrText>
         </w:r>
         <w:r>
           <w:rPr>
@@ -5864,7 +5864,7 @@
           <w14:ligatures w14:val="standardContextual"/>
         </w:rPr>
       </w:pPr>
-      <w:hyperlink w:anchor="_Toc242443031" w:history="1">
+      <w:hyperlink w:anchor="_Toc242545692" w:history="1">
         <w:r>
           <w:rPr>
             <w:rStyle w:val="Hipervnculo"/>
@@ -5892,7 +5892,7 @@
             <w:noProof/>
             <w:webHidden/>
           </w:rPr>
-          <w:instrText xml:space="preserve"> PAGEREF _Toc242443031 \h </w:instrText>
+          <w:instrText xml:space="preserve"> PAGEREF _Toc242545692 \h </w:instrText>
         </w:r>
         <w:r>
           <w:rPr>
@@ -5940,7 +5940,7 @@
           <w14:ligatures w14:val="standardContextual"/>
         </w:rPr>
       </w:pPr>
-      <w:hyperlink w:anchor="_Toc242443032" w:history="1">
+      <w:hyperlink w:anchor="_Toc242545693" w:history="1">
         <w:r>
           <w:rPr>
             <w:rStyle w:val="Hipervnculo"/>
@@ -5968,7 +5968,7 @@
             <w:noProof/>
             <w:webHidden/>
           </w:rPr>
-          <w:instrText xml:space="preserve"> PAGEREF _Toc242443032 \h </w:instrText>
+          <w:instrText xml:space="preserve"> PAGEREF _Toc242545693 \h </w:instrText>
         </w:r>
         <w:r>
           <w:rPr>
@@ -6016,7 +6016,7 @@
           <w14:ligatures w14:val="standardContextual"/>
         </w:rPr>
       </w:pPr>
-      <w:hyperlink w:anchor="_Toc242443033" w:history="1">
+      <w:hyperlink w:anchor="_Toc242545694" w:history="1">
         <w:r>
           <w:rPr>
             <w:rStyle w:val="Hipervnculo"/>
@@ -6044,7 +6044,7 @@
             <w:noProof/>
             <w:webHidden/>
           </w:rPr>
-          <w:instrText xml:space="preserve"> PAGEREF _Toc242443033 \h </w:instrText>
+          <w:instrText xml:space="preserve"> PAGEREF _Toc242545694 \h </w:instrText>
         </w:r>
         <w:r>
           <w:rPr>
@@ -6092,7 +6092,7 @@
           <w14:ligatures w14:val="standardContextual"/>
         </w:rPr>
       </w:pPr>
-      <w:hyperlink w:anchor="_Toc242443034" w:history="1">
+      <w:hyperlink w:anchor="_Toc242545695" w:history="1">
         <w:r>
           <w:rPr>
             <w:rStyle w:val="Hipervnculo"/>
@@ -6120,7 +6120,7 @@
             <w:noProof/>
             <w:webHidden/>
           </w:rPr>
-          <w:instrText xml:space="preserve"> PAGEREF _Toc242443034 \h </w:instrText>
+          <w:instrText xml:space="preserve"> PAGEREF _Toc242545695 \h </w:instrText>
         </w:r>
         <w:r>
           <w:rPr>
@@ -6168,7 +6168,7 @@
           <w14:ligatures w14:val="standardContextual"/>
         </w:rPr>
       </w:pPr>
-      <w:hyperlink w:anchor="_Toc242443035" w:history="1">
+      <w:hyperlink w:anchor="_Toc242545696" w:history="1">
         <w:r>
           <w:rPr>
             <w:rStyle w:val="Hipervnculo"/>
@@ -6196,7 +6196,7 @@
             <w:noProof/>
             <w:webHidden/>
           </w:rPr>
-          <w:instrText xml:space="preserve"> PAGEREF _Toc242443035 \h </w:instrText>
+          <w:instrText xml:space="preserve"> PAGEREF _Toc242545696 \h </w:instrText>
         </w:r>
         <w:r>
           <w:rPr>
@@ -6244,7 +6244,7 @@
           <w14:ligatures w14:val="standardContextual"/>
         </w:rPr>
       </w:pPr>
-      <w:hyperlink w:anchor="_Toc242443036" w:history="1">
+      <w:hyperlink w:anchor="_Toc242545697" w:history="1">
         <w:r>
           <w:rPr>
             <w:rStyle w:val="Hipervnculo"/>
@@ -6272,7 +6272,7 @@
             <w:noProof/>
             <w:webHidden/>
           </w:rPr>
-          <w:instrText xml:space="preserve"> PAGEREF _Toc242443036 \h </w:instrText>
+          <w:instrText xml:space="preserve"> PAGEREF _Toc242545697 \h </w:instrText>
         </w:r>
         <w:r>
           <w:rPr>
@@ -6320,7 +6320,7 @@
           <w14:ligatures w14:val="standardContextual"/>
         </w:rPr>
       </w:pPr>
-      <w:hyperlink w:anchor="_Toc242443037" w:history="1">
+      <w:hyperlink w:anchor="_Toc242545698" w:history="1">
         <w:r>
           <w:rPr>
             <w:rStyle w:val="Hipervnculo"/>
@@ -6348,7 +6348,7 @@
             <w:noProof/>
             <w:webHidden/>
           </w:rPr>
-          <w:instrText xml:space="preserve"> PAGEREF _Toc242443037 \h </w:instrText>
+          <w:instrText xml:space="preserve"> PAGEREF _Toc242545698 \h </w:instrText>
         </w:r>
         <w:r>
           <w:rPr>
@@ -6396,7 +6396,7 @@
           <w14:ligatures w14:val="standardContextual"/>
         </w:rPr>
       </w:pPr>
-      <w:hyperlink w:anchor="_Toc242443038" w:history="1">
+      <w:hyperlink w:anchor="_Toc242545699" w:history="1">
         <w:r>
           <w:rPr>
             <w:rStyle w:val="Hipervnculo"/>
@@ -6424,83 +6424,7 @@
             <w:noProof/>
             <w:webHidden/>
           </w:rPr>
-          <w:instrText xml:space="preserve"> PAGEREF _Toc242443038 \h </w:instrText>
-        </w:r>
-        <w:r>
-          <w:rPr>
-            <w:noProof/>
-            <w:webHidden/>
-          </w:rPr>
-        </w:r>
-        <w:r>
-          <w:rPr>
-            <w:noProof/>
-            <w:webHidden/>
-          </w:rPr>
-          <w:fldChar w:fldCharType="separate"/>
-        </w:r>
-        <w:r>
-          <w:rPr>
-            <w:noProof/>
-            <w:webHidden/>
-          </w:rPr>
-          <w:t>65</w:t>
-        </w:r>
-        <w:r>
-          <w:rPr>
-            <w:noProof/>
-            <w:webHidden/>
-          </w:rPr>
-          <w:fldChar w:fldCharType="end"/>
-        </w:r>
-      </w:hyperlink>
-    </w:p>
-    <w:p>
-      <w:pPr>
-        <w:pStyle w:val="Tabladeilustraciones"/>
-        <w:tabs>
-          <w:tab w:val="right" w:leader="dot" w:pos="9964"/>
-        </w:tabs>
-        <w:rPr>
-          <w:rFonts w:eastAsiaTheme="minorEastAsia" w:cstheme="minorBidi"/>
-          <w:smallCaps w:val="0"/>
-          <w:noProof/>
-          <w:color w:val="auto"/>
-          <w:kern w:val="2"/>
-          <w:sz w:val="24"/>
-          <w:szCs w:val="24"/>
-          <w14:ligatures w14:val="standardContextual"/>
-        </w:rPr>
-      </w:pPr>
-      <w:hyperlink w:anchor="_Toc242443039" w:history="1">
-        <w:r>
-          <w:rPr>
-            <w:rStyle w:val="Hipervnculo"/>
-            <w:rFonts w:cs="Arial"/>
-            <w:noProof/>
-          </w:rPr>
-          <w:t>Tabla 11. Presupuestos de rendimiento y estado de su medición</w:t>
-        </w:r>
-        <w:r>
-          <w:rPr>
-            <w:noProof/>
-            <w:webHidden/>
-          </w:rPr>
-          <w:tab/>
-        </w:r>
-        <w:r>
-          <w:rPr>
-            <w:noProof/>
-            <w:webHidden/>
-          </w:rPr>
-          <w:fldChar w:fldCharType="begin"/>
-        </w:r>
-        <w:r>
-          <w:rPr>
-            <w:noProof/>
-            <w:webHidden/>
-          </w:rPr>
-          <w:instrText xml:space="preserve"> PAGEREF _Toc242443039 \h </w:instrText>
+          <w:instrText xml:space="preserve"> PAGEREF _Toc242545699 \h </w:instrText>
         </w:r>
         <w:r>
           <w:rPr>
@@ -6533,171 +6457,6 @@
     </w:p>
     <w:p>
       <w:pPr>
-        <w:pStyle w:val="TDC1"/>
-        <w:rPr>
-          <w:rFonts w:eastAsia="Arial" w:cs="Arial"/>
-        </w:rPr>
-      </w:pPr>
-      <w:r>
-        <w:rPr>
-          <w:rStyle w:val="Hipervnculo"/>
-          <w:rFonts w:cs="Arial"/>
-          <w:noProof/>
-        </w:rPr>
-        <w:fldChar w:fldCharType="end"/>
-      </w:r>
-      <w:r>
-        <w:rPr>
-          <w:rFonts w:cs="Arial"/>
-        </w:rPr>
-        <w:t xml:space="preserve"> </w:t>
-      </w:r>
-    </w:p>
-    <w:p>
-      <w:pPr>
-        <w:ind w:firstLine="431"/>
-        <w:jc w:val="right"/>
-        <w:rPr>
-          <w:rFonts w:eastAsia="Arial" w:cs="Arial"/>
-        </w:rPr>
-      </w:pPr>
-    </w:p>
-    <w:p>
-      <w:pPr>
-        <w:ind w:firstLine="431"/>
-        <w:jc w:val="right"/>
-        <w:rPr>
-          <w:rFonts w:eastAsia="Arial" w:cs="Arial"/>
-        </w:rPr>
-      </w:pPr>
-    </w:p>
-    <w:p>
-      <w:pPr>
-        <w:spacing w:after="240"/>
-        <w:jc w:val="center"/>
-        <w:rPr>
-          <w:rFonts w:cs="Arial"/>
-          <w:b/>
-          <w:bCs/>
-        </w:rPr>
-      </w:pPr>
-      <w:r>
-        <w:rPr>
-          <w:rFonts w:cs="Arial"/>
-          <w:b/>
-          <w:bCs/>
-        </w:rPr>
-        <w:t>LISTA DE CUADROS</w:t>
-      </w:r>
-    </w:p>
-    <w:p>
-      <w:pPr>
-        <w:spacing w:after="240"/>
-        <w:jc w:val="right"/>
-        <w:rPr>
-          <w:rFonts w:cs="Arial"/>
-        </w:rPr>
-      </w:pPr>
-      <w:r>
-        <w:rPr>
-          <w:rFonts w:cs="Arial"/>
-        </w:rPr>
-        <w:t>Pág.</w:t>
-      </w:r>
-    </w:p>
-    <w:p>
-      <w:pPr>
-        <w:spacing w:after="240"/>
-        <w:jc w:val="left"/>
-        <w:rPr>
-          <w:rFonts w:cs="Arial"/>
-        </w:rPr>
-      </w:pPr>
-      <w:r>
-        <w:rPr>
-          <w:rFonts w:cs="Arial"/>
-        </w:rPr>
-        <w:t>El presente trabajo de grado no incluye cuadros.</w:t>
-      </w:r>
-    </w:p>
-    <w:p>
-      <w:pPr>
-        <w:spacing w:before="240" w:after="480"/>
-        <w:ind w:firstLine="709"/>
-        <w:rPr>
-          <w:rFonts w:cs="Arial"/>
-        </w:rPr>
-      </w:pPr>
-      <w:r>
-        <w:rPr>
-          <w:rFonts w:cs="Arial"/>
-        </w:rPr>
-        <w:br w:type="page"/>
-      </w:r>
-    </w:p>
-    <w:p>
-      <w:pPr>
-        <w:jc w:val="center"/>
-        <w:rPr>
-          <w:rFonts w:cs="Arial"/>
-          <w:b/>
-          <w:bCs/>
-        </w:rPr>
-      </w:pPr>
-      <w:r>
-        <w:rPr>
-          <w:rFonts w:cs="Arial"/>
-          <w:b/>
-          <w:bCs/>
-        </w:rPr>
-        <w:lastRenderedPageBreak/>
-        <w:t>LISTA DE FIGURAS</w:t>
-      </w:r>
-    </w:p>
-    <w:p>
-      <w:pPr>
-        <w:ind w:firstLine="431"/>
-        <w:jc w:val="right"/>
-        <w:rPr>
-          <w:rFonts w:eastAsia="Arial" w:cs="Arial"/>
-        </w:rPr>
-      </w:pPr>
-    </w:p>
-    <w:p>
-      <w:pPr>
-        <w:ind w:firstLine="431"/>
-        <w:jc w:val="right"/>
-        <w:rPr>
-          <w:rFonts w:eastAsia="Arial" w:cs="Arial"/>
-        </w:rPr>
-      </w:pPr>
-    </w:p>
-    <w:p>
-      <w:pPr>
-        <w:ind w:firstLine="431"/>
-        <w:jc w:val="right"/>
-        <w:rPr>
-          <w:rFonts w:eastAsia="Arial" w:cs="Arial"/>
-        </w:rPr>
-      </w:pPr>
-      <w:r>
-        <w:rPr>
-          <w:rFonts w:eastAsia="Arial" w:cs="Arial"/>
-        </w:rPr>
-        <w:t>Pág.</w:t>
-      </w:r>
-    </w:p>
-    <w:p>
-      <w:pPr>
-        <w:ind w:firstLine="431"/>
-        <w:jc w:val="right"/>
-        <w:rPr>
-          <w:rFonts w:eastAsia="Arial" w:cs="Arial"/>
-        </w:rPr>
-      </w:pPr>
-    </w:p>
-    <w:p>
-      <w:pPr>
         <w:pStyle w:val="Tabladeilustraciones"/>
         <w:tabs>
           <w:tab w:val="right" w:leader="dot" w:pos="9964"/>
@@ -6713,6 +6472,247 @@
           <w14:ligatures w14:val="standardContextual"/>
         </w:rPr>
       </w:pPr>
+      <w:hyperlink w:anchor="_Toc242545700" w:history="1">
+        <w:r>
+          <w:rPr>
+            <w:rStyle w:val="Hipervnculo"/>
+            <w:rFonts w:cs="Arial"/>
+            <w:noProof/>
+          </w:rPr>
+          <w:t>Tabla 11. Presupuestos de rendimiento y estado de su medición</w:t>
+        </w:r>
+        <w:r>
+          <w:rPr>
+            <w:noProof/>
+            <w:webHidden/>
+          </w:rPr>
+          <w:tab/>
+        </w:r>
+        <w:r>
+          <w:rPr>
+            <w:noProof/>
+            <w:webHidden/>
+          </w:rPr>
+          <w:fldChar w:fldCharType="begin"/>
+        </w:r>
+        <w:r>
+          <w:rPr>
+            <w:noProof/>
+            <w:webHidden/>
+          </w:rPr>
+          <w:instrText xml:space="preserve"> PAGEREF _Toc242545700 \h </w:instrText>
+        </w:r>
+        <w:r>
+          <w:rPr>
+            <w:noProof/>
+            <w:webHidden/>
+          </w:rPr>
+        </w:r>
+        <w:r>
+          <w:rPr>
+            <w:noProof/>
+            <w:webHidden/>
+          </w:rPr>
+          <w:fldChar w:fldCharType="separate"/>
+        </w:r>
+        <w:r>
+          <w:rPr>
+            <w:noProof/>
+            <w:webHidden/>
+          </w:rPr>
+          <w:t>66</w:t>
+        </w:r>
+        <w:r>
+          <w:rPr>
+            <w:noProof/>
+            <w:webHidden/>
+          </w:rPr>
+          <w:fldChar w:fldCharType="end"/>
+        </w:r>
+      </w:hyperlink>
+    </w:p>
+    <w:p>
+      <w:pPr>
+        <w:pStyle w:val="TDC1"/>
+        <w:rPr>
+          <w:rFonts w:eastAsia="Arial" w:cs="Arial"/>
+        </w:rPr>
+      </w:pPr>
+      <w:r>
+        <w:rPr>
+          <w:rStyle w:val="Hipervnculo"/>
+          <w:rFonts w:cs="Arial"/>
+          <w:noProof/>
+        </w:rPr>
+        <w:fldChar w:fldCharType="end"/>
+      </w:r>
+      <w:r>
+        <w:rPr>
+          <w:rFonts w:cs="Arial"/>
+        </w:rPr>
+        <w:t xml:space="preserve"> </w:t>
+      </w:r>
+    </w:p>
+    <w:p>
+      <w:pPr>
+        <w:ind w:firstLine="431"/>
+        <w:jc w:val="right"/>
+        <w:rPr>
+          <w:rFonts w:eastAsia="Arial" w:cs="Arial"/>
+        </w:rPr>
+      </w:pPr>
+    </w:p>
+    <w:p>
+      <w:pPr>
+        <w:ind w:firstLine="431"/>
+        <w:jc w:val="right"/>
+        <w:rPr>
+          <w:rFonts w:eastAsia="Arial" w:cs="Arial"/>
+        </w:rPr>
+      </w:pPr>
+    </w:p>
+    <w:p>
+      <w:pPr>
+        <w:spacing w:after="240"/>
+        <w:jc w:val="center"/>
+        <w:rPr>
+          <w:rFonts w:cs="Arial"/>
+          <w:b/>
+          <w:bCs/>
+        </w:rPr>
+      </w:pPr>
+      <w:r>
+        <w:rPr>
+          <w:rFonts w:cs="Arial"/>
+          <w:b/>
+          <w:bCs/>
+        </w:rPr>
+        <w:t>LISTA DE CUADROS</w:t>
+      </w:r>
+    </w:p>
+    <w:p>
+      <w:pPr>
+        <w:spacing w:after="240"/>
+        <w:jc w:val="right"/>
+        <w:rPr>
+          <w:rFonts w:cs="Arial"/>
+        </w:rPr>
+      </w:pPr>
+      <w:r>
+        <w:rPr>
+          <w:rFonts w:cs="Arial"/>
+        </w:rPr>
+        <w:t>Pág.</w:t>
+      </w:r>
+    </w:p>
+    <w:p>
+      <w:pPr>
+        <w:spacing w:after="240"/>
+        <w:jc w:val="left"/>
+        <w:rPr>
+          <w:rFonts w:cs="Arial"/>
+        </w:rPr>
+      </w:pPr>
+      <w:r>
+        <w:rPr>
+          <w:rFonts w:cs="Arial"/>
+        </w:rPr>
+        <w:t>El presente trabajo de grado no incluye cuadros.</w:t>
+      </w:r>
+    </w:p>
+    <w:p>
+      <w:pPr>
+        <w:spacing w:before="240" w:after="480"/>
+        <w:ind w:firstLine="709"/>
+        <w:rPr>
+          <w:rFonts w:cs="Arial"/>
+        </w:rPr>
+      </w:pPr>
+      <w:r>
+        <w:rPr>
+          <w:rFonts w:cs="Arial"/>
+        </w:rPr>
+        <w:br w:type="page"/>
+      </w:r>
+    </w:p>
+    <w:p>
+      <w:pPr>
+        <w:jc w:val="center"/>
+        <w:rPr>
+          <w:rFonts w:cs="Arial"/>
+          <w:b/>
+          <w:bCs/>
+        </w:rPr>
+      </w:pPr>
+      <w:r>
+        <w:rPr>
+          <w:rFonts w:cs="Arial"/>
+          <w:b/>
+          <w:bCs/>
+        </w:rPr>
+        <w:lastRenderedPageBreak/>
+        <w:t>LISTA DE FIGURAS</w:t>
+      </w:r>
+    </w:p>
+    <w:p>
+      <w:pPr>
+        <w:ind w:firstLine="431"/>
+        <w:jc w:val="right"/>
+        <w:rPr>
+          <w:rFonts w:eastAsia="Arial" w:cs="Arial"/>
+        </w:rPr>
+      </w:pPr>
+    </w:p>
+    <w:p>
+      <w:pPr>
+        <w:ind w:firstLine="431"/>
+        <w:jc w:val="right"/>
+        <w:rPr>
+          <w:rFonts w:eastAsia="Arial" w:cs="Arial"/>
+        </w:rPr>
+      </w:pPr>
+    </w:p>
+    <w:p>
+      <w:pPr>
+        <w:ind w:firstLine="431"/>
+        <w:jc w:val="right"/>
+        <w:rPr>
+          <w:rFonts w:eastAsia="Arial" w:cs="Arial"/>
+        </w:rPr>
+      </w:pPr>
+      <w:r>
+        <w:rPr>
+          <w:rFonts w:eastAsia="Arial" w:cs="Arial"/>
+        </w:rPr>
+        <w:t>Pág.</w:t>
+      </w:r>
+    </w:p>
+    <w:p>
+      <w:pPr>
+        <w:ind w:firstLine="431"/>
+        <w:jc w:val="right"/>
+        <w:rPr>
+          <w:rFonts w:eastAsia="Arial" w:cs="Arial"/>
+        </w:rPr>
+      </w:pPr>
+    </w:p>
+    <w:p>
+      <w:pPr>
+        <w:pStyle w:val="Tabladeilustraciones"/>
+        <w:tabs>
+          <w:tab w:val="right" w:leader="dot" w:pos="9964"/>
+        </w:tabs>
+        <w:rPr>
+          <w:rFonts w:eastAsiaTheme="minorEastAsia" w:cstheme="minorBidi"/>
+          <w:smallCaps w:val="0"/>
+          <w:noProof/>
+          <w:color w:val="auto"/>
+          <w:kern w:val="2"/>
+          <w:sz w:val="24"/>
+          <w:szCs w:val="24"/>
+          <w14:ligatures w14:val="standardContextual"/>
+        </w:rPr>
+      </w:pPr>
       <w:r>
         <w:rPr>
           <w:rFonts w:cs="Arial"/>
@@ -6739,7 +6739,7 @@
         </w:rPr>
         <w:fldChar w:fldCharType="separate"/>
       </w:r>
-      <w:hyperlink w:anchor="_Toc242443040" w:history="1">
+      <w:hyperlink w:anchor="_Toc242545701" w:history="1">
         <w:r>
           <w:rPr>
             <w:rStyle w:val="Hipervnculo"/>
@@ -6767,7 +6767,7 @@
             <w:noProof/>
             <w:webHidden/>
           </w:rPr>
-          <w:instrText xml:space="preserve"> PAGEREF _Toc242443040 \h </w:instrText>
+          <w:instrText xml:space="preserve"> PAGEREF _Toc242545701 \h </w:instrText>
         </w:r>
         <w:r>
           <w:rPr>
@@ -6815,7 +6815,7 @@
           <w14:ligatures w14:val="standardContextual"/>
         </w:rPr>
       </w:pPr>
-      <w:hyperlink w:anchor="_Toc242443041" w:history="1">
+      <w:hyperlink w:anchor="_Toc242545702" w:history="1">
         <w:r>
           <w:rPr>
             <w:rStyle w:val="Hipervnculo"/>
@@ -6843,7 +6843,7 @@
             <w:noProof/>
             <w:webHidden/>
           </w:rPr>
-          <w:instrText xml:space="preserve"> PAGEREF _Toc242443041 \h </w:instrText>
+          <w:instrText xml:space="preserve"> PAGEREF _Toc242545702 \h </w:instrText>
         </w:r>
         <w:r>
           <w:rPr>
@@ -6891,7 +6891,7 @@
           <w14:ligatures w14:val="standardContextual"/>
         </w:rPr>
       </w:pPr>
-      <w:hyperlink w:anchor="_Toc242443042" w:history="1">
+      <w:hyperlink w:anchor="_Toc242545703" w:history="1">
         <w:r>
           <w:rPr>
             <w:rStyle w:val="Hipervnculo"/>
@@ -6927,7 +6927,7 @@
             <w:noProof/>
             <w:webHidden/>
           </w:rPr>
-          <w:instrText xml:space="preserve"> PAGEREF _Toc242443042 \h </w:instrText>
+          <w:instrText xml:space="preserve"> PAGEREF _Toc242545703 \h </w:instrText>
         </w:r>
         <w:r>
           <w:rPr>
@@ -6975,7 +6975,7 @@
           <w14:ligatures w14:val="standardContextual"/>
         </w:rPr>
       </w:pPr>
-      <w:hyperlink w:anchor="_Toc242443043" w:history="1">
+      <w:hyperlink w:anchor="_Toc242545704" w:history="1">
         <w:r>
           <w:rPr>
             <w:rStyle w:val="Hipervnculo"/>
@@ -7011,7 +7011,7 @@
             <w:noProof/>
             <w:webHidden/>
           </w:rPr>
-          <w:instrText xml:space="preserve"> PAGEREF _Toc242443043 \h </w:instrText>
+          <w:instrText xml:space="preserve"> PAGEREF _Toc242545704 \h </w:instrText>
         </w:r>
         <w:r>
           <w:rPr>
@@ -7059,7 +7059,7 @@
           <w14:ligatures w14:val="standardContextual"/>
         </w:rPr>
       </w:pPr>
-      <w:hyperlink w:anchor="_Toc242443044" w:history="1">
+      <w:hyperlink w:anchor="_Toc242545705" w:history="1">
         <w:r>
           <w:rPr>
             <w:rStyle w:val="Hipervnculo"/>
@@ -7087,7 +7087,7 @@
             <w:noProof/>
             <w:webHidden/>
           </w:rPr>
-          <w:instrText xml:space="preserve"> PAGEREF _Toc242443044 \h </w:instrText>
+          <w:instrText xml:space="preserve"> PAGEREF _Toc242545705 \h </w:instrText>
         </w:r>
         <w:r>
           <w:rPr>
@@ -7135,7 +7135,7 @@
           <w14:ligatures w14:val="standardContextual"/>
         </w:rPr>
       </w:pPr>
-      <w:hyperlink w:anchor="_Toc242443045" w:history="1">
+      <w:hyperlink w:anchor="_Toc242545706" w:history="1">
         <w:r>
           <w:rPr>
             <w:rStyle w:val="Hipervnculo"/>
@@ -7163,7 +7163,7 @@
             <w:noProof/>
             <w:webHidden/>
           </w:rPr>
-          <w:instrText xml:space="preserve"> PAGEREF _Toc242443045 \h </w:instrText>
+          <w:instrText xml:space="preserve"> PAGEREF _Toc242545706 \h </w:instrText>
         </w:r>
         <w:r>
           <w:rPr>
@@ -7211,7 +7211,7 @@
           <w14:ligatures w14:val="standardContextual"/>
         </w:rPr>
       </w:pPr>
-      <w:hyperlink w:anchor="_Toc242443046" w:history="1">
+      <w:hyperlink w:anchor="_Toc242545707" w:history="1">
         <w:r>
           <w:rPr>
             <w:rStyle w:val="Hipervnculo"/>
@@ -7239,7 +7239,7 @@
             <w:noProof/>
             <w:webHidden/>
           </w:rPr>
-          <w:instrText xml:space="preserve"> PAGEREF _Toc242443046 \h </w:instrText>
+          <w:instrText xml:space="preserve"> PAGEREF _Toc242545707 \h </w:instrText>
         </w:r>
         <w:r>
           <w:rPr>
@@ -7287,7 +7287,7 @@
           <w14:ligatures w14:val="standardContextual"/>
         </w:rPr>
       </w:pPr>
-      <w:hyperlink w:anchor="_Toc242443047" w:history="1">
+      <w:hyperlink w:anchor="_Toc242545708" w:history="1">
         <w:r>
           <w:rPr>
             <w:rStyle w:val="Hipervnculo"/>
@@ -7315,7 +7315,7 @@
             <w:noProof/>
             <w:webHidden/>
           </w:rPr>
-          <w:instrText xml:space="preserve"> PAGEREF _Toc242443047 \h </w:instrText>
+          <w:instrText xml:space="preserve"> PAGEREF _Toc242545708 \h </w:instrText>
         </w:r>
         <w:r>
           <w:rPr>
@@ -8504,7 +8504,7 @@
       </w:pPr>
       <w:bookmarkStart w:id="3" w:name="_Toc475112151"/>
       <w:bookmarkStart w:id="4" w:name="_Toc475115507"/>
-      <w:bookmarkStart w:id="5" w:name="_Toc242442965"/>
+      <w:bookmarkStart w:id="5" w:name="_Toc242545626"/>
       <w:r>
         <w:rPr>
           <w:rFonts w:cs="Arial"/>
@@ -8656,7 +8656,7 @@
           <w:caps w:val="0"/>
         </w:rPr>
       </w:pPr>
-      <w:bookmarkStart w:id="6" w:name="_Toc242442966"/>
+      <w:bookmarkStart w:id="6" w:name="_Toc242545627"/>
       <w:r>
         <w:rPr>
           <w:rFonts w:cs="Arial"/>
@@ -8705,7 +8705,7 @@
       </w:pPr>
       <w:bookmarkStart w:id="7" w:name="_Toc475112154"/>
       <w:bookmarkStart w:id="8" w:name="_Toc475115510"/>
-      <w:bookmarkStart w:id="9" w:name="_Toc242442967"/>
+      <w:bookmarkStart w:id="9" w:name="_Toc242545628"/>
       <w:r>
         <w:t>1.1 Planteamiento del problema</w:t>
       </w:r>
@@ -8762,7 +8762,7 @@
           <w:iCs w:val="0"/>
         </w:rPr>
       </w:pPr>
-      <w:bookmarkStart w:id="10" w:name="_Toc242443040"/>
+      <w:bookmarkStart w:id="10" w:name="_Toc242545701"/>
       <w:r>
         <w:rPr>
           <w:rFonts w:cs="Arial"/>
@@ -8983,7 +8983,7 @@
           <w:iCs w:val="0"/>
         </w:rPr>
       </w:pPr>
-      <w:bookmarkStart w:id="11" w:name="_Toc242443041"/>
+      <w:bookmarkStart w:id="11" w:name="_Toc242545702"/>
       <w:r>
         <w:rPr>
           <w:rFonts w:cs="Arial"/>
@@ -9131,7 +9131,7 @@
           <w:rFonts w:eastAsia="Arial" w:cs="Arial"/>
         </w:rPr>
       </w:pPr>
-      <w:bookmarkStart w:id="12" w:name="_Toc242443042"/>
+      <w:bookmarkStart w:id="12" w:name="_Toc242545703"/>
       <w:r>
         <w:rPr>
           <w:rFonts w:cs="Arial"/>
@@ -9382,7 +9382,7 @@
       </w:pPr>
       <w:bookmarkStart w:id="13" w:name="_Toc475112156"/>
       <w:bookmarkStart w:id="14" w:name="_Toc475115512"/>
-      <w:bookmarkStart w:id="15" w:name="_Toc242442968"/>
+      <w:bookmarkStart w:id="15" w:name="_Toc242545629"/>
       <w:r>
         <w:t>1.2 Pregunta de investigación</w:t>
       </w:r>
@@ -9433,7 +9433,7 @@
       <w:pPr>
         <w:pStyle w:val="Ttulo2"/>
       </w:pPr>
-      <w:bookmarkStart w:id="16" w:name="_Toc242442969"/>
+      <w:bookmarkStart w:id="16" w:name="_Toc242545630"/>
       <w:r>
         <w:t>1.3 Justificación</w:t>
       </w:r>
@@ -9562,7 +9562,7 @@
           <w:iCs w:val="0"/>
         </w:rPr>
       </w:pPr>
-      <w:bookmarkStart w:id="17" w:name="_Toc242443043"/>
+      <w:bookmarkStart w:id="17" w:name="_Toc242545704"/>
       <w:r>
         <w:rPr>
           <w:rFonts w:cs="Arial"/>
@@ -9737,7 +9737,7 @@
       </w:pPr>
       <w:bookmarkStart w:id="18" w:name="_Toc475112155"/>
       <w:bookmarkStart w:id="19" w:name="_Toc475115511"/>
-      <w:bookmarkStart w:id="20" w:name="_Toc242442970"/>
+      <w:bookmarkStart w:id="20" w:name="_Toc242545631"/>
       <w:r>
         <w:t>1.4 Antecedentes del</w:t>
       </w:r>
@@ -9891,7 +9891,7 @@
           <w:caps w:val="0"/>
         </w:rPr>
       </w:pPr>
-      <w:bookmarkStart w:id="21" w:name="_Toc242442971"/>
+      <w:bookmarkStart w:id="21" w:name="_Toc242545632"/>
       <w:r>
         <w:rPr>
           <w:rFonts w:cs="Arial"/>
@@ -9932,7 +9932,7 @@
       </w:pPr>
       <w:bookmarkStart w:id="22" w:name="_Toc475112161"/>
       <w:bookmarkStart w:id="23" w:name="_Toc475115517"/>
-      <w:bookmarkStart w:id="24" w:name="_Toc242442972"/>
+      <w:bookmarkStart w:id="24" w:name="_Toc242545633"/>
       <w:r>
         <w:t>2.1 Objetivo general</w:t>
       </w:r>
@@ -9991,7 +9991,7 @@
         <w:pStyle w:val="Ttulo2"/>
         <w:ind w:left="567" w:hanging="576"/>
       </w:pPr>
-      <w:bookmarkStart w:id="27" w:name="_Toc242442973"/>
+      <w:bookmarkStart w:id="27" w:name="_Toc242545634"/>
       <w:r>
         <w:t>2.2 Objetivos específicos</w:t>
       </w:r>
@@ -10117,7 +10117,7 @@
       </w:pPr>
       <w:bookmarkStart w:id="28" w:name="_Toc475112165"/>
       <w:bookmarkStart w:id="29" w:name="_Toc475115521"/>
-      <w:bookmarkStart w:id="30" w:name="_Toc242442974"/>
+      <w:bookmarkStart w:id="30" w:name="_Toc242545635"/>
       <w:r>
         <w:rPr>
           <w:rFonts w:cs="Arial"/>
@@ -10146,7 +10146,7 @@
       </w:pPr>
       <w:bookmarkStart w:id="31" w:name="_Toc475112166"/>
       <w:bookmarkStart w:id="32" w:name="_Toc475115522"/>
-      <w:bookmarkStart w:id="33" w:name="_Toc242442975"/>
+      <w:bookmarkStart w:id="33" w:name="_Toc242545636"/>
       <w:r>
         <w:t>3.1 Marco conceptual</w:t>
       </w:r>
@@ -10168,7 +10168,7 @@
           <w:rFonts w:cs="Arial"/>
         </w:rPr>
       </w:pPr>
-      <w:bookmarkStart w:id="34" w:name="_Toc242442976"/>
+      <w:bookmarkStart w:id="34" w:name="_Toc242545637"/>
       <w:r>
         <w:t>3.1.1 El pensamiento computacional (PC):</w:t>
       </w:r>
@@ -10461,7 +10461,7 @@
           <w:bCs/>
         </w:rPr>
       </w:pPr>
-      <w:bookmarkStart w:id="35" w:name="_Toc242442977"/>
+      <w:bookmarkStart w:id="35" w:name="_Toc242545638"/>
       <w:r>
         <w:t>3.1.2. Pruebas Bebras:</w:t>
       </w:r>
@@ -10497,7 +10497,7 @@
           <w:rFonts w:cs="Arial"/>
         </w:rPr>
       </w:pPr>
-      <w:bookmarkStart w:id="36" w:name="_Toc242442978"/>
+      <w:bookmarkStart w:id="36" w:name="_Toc242545639"/>
       <w:r>
         <w:t>3.1.3. teoría del flujo</w:t>
       </w:r>
@@ -10519,7 +10519,7 @@
           <w:iCs w:val="0"/>
         </w:rPr>
       </w:pPr>
-      <w:bookmarkStart w:id="37" w:name="_Toc242443044"/>
+      <w:bookmarkStart w:id="37" w:name="_Toc242545705"/>
       <w:r>
         <w:rPr>
           <w:rFonts w:cs="Arial"/>
@@ -10665,7 +10665,7 @@
       <w:pPr>
         <w:pStyle w:val="Ttulo3"/>
       </w:pPr>
-      <w:bookmarkStart w:id="38" w:name="_Toc242442979"/>
+      <w:bookmarkStart w:id="38" w:name="_Toc242545640"/>
       <w:r>
         <w:t>3.1.4. Teoría de la Autodeterminación</w:t>
       </w:r>
@@ -11165,7 +11165,7 @@
           <w:rFonts w:eastAsia="Arial" w:cs="Arial"/>
         </w:rPr>
       </w:pPr>
-      <w:bookmarkStart w:id="39" w:name="_Toc242442980"/>
+      <w:bookmarkStart w:id="39" w:name="_Toc242545641"/>
       <w:r>
         <w:t>3.1.6 GOLDEN PATH</w:t>
       </w:r>
@@ -11206,7 +11206,7 @@
           <w:rFonts w:eastAsia="Arial" w:cs="Arial"/>
         </w:rPr>
       </w:pPr>
-      <w:bookmarkStart w:id="40" w:name="_Toc242442981"/>
+      <w:bookmarkStart w:id="40" w:name="_Toc242545642"/>
       <w:r>
         <w:t>3.1.7 Gamificación</w:t>
       </w:r>
@@ -11264,7 +11264,7 @@
       </w:pPr>
       <w:bookmarkStart w:id="41" w:name="_Toc475112167"/>
       <w:bookmarkStart w:id="42" w:name="_Toc475115523"/>
-      <w:bookmarkStart w:id="43" w:name="_Toc242442982"/>
+      <w:bookmarkStart w:id="43" w:name="_Toc242545643"/>
       <w:r>
         <w:t>3.2 Marco teórico</w:t>
       </w:r>
@@ -11286,7 +11286,7 @@
           <w:rFonts w:cs="Arial"/>
         </w:rPr>
       </w:pPr>
-      <w:bookmarkStart w:id="44" w:name="_Toc242442983"/>
+      <w:bookmarkStart w:id="44" w:name="_Toc242545644"/>
       <w:r>
         <w:t>3.2.1 Aprendizaje basado en juegos (ABJ)</w:t>
       </w:r>
@@ -11504,7 +11504,7 @@
           <w:caps w:val="0"/>
         </w:rPr>
       </w:pPr>
-      <w:bookmarkStart w:id="45" w:name="_Toc242442984"/>
+      <w:bookmarkStart w:id="45" w:name="_Toc242545645"/>
       <w:r>
         <w:t xml:space="preserve">3.2.2. </w:t>
       </w:r>
@@ -11549,7 +11549,7 @@
           <w:caps w:val="0"/>
         </w:rPr>
       </w:pPr>
-      <w:bookmarkStart w:id="46" w:name="_Toc242442985"/>
+      <w:bookmarkStart w:id="46" w:name="_Toc242545646"/>
       <w:r>
         <w:t xml:space="preserve">3.2.3 </w:t>
       </w:r>
@@ -11912,7 +11912,7 @@
       <w:pPr>
         <w:pStyle w:val="Ttulo3"/>
       </w:pPr>
-      <w:bookmarkStart w:id="47" w:name="_Toc242442986"/>
+      <w:bookmarkStart w:id="47" w:name="_Toc242545647"/>
       <w:r>
         <w:t>3.2.</w:t>
       </w:r>
@@ -12052,7 +12052,7 @@
           <w:bCs/>
         </w:rPr>
       </w:pPr>
-      <w:bookmarkStart w:id="48" w:name="_Toc242442987"/>
+      <w:bookmarkStart w:id="48" w:name="_Toc242545648"/>
       <w:r>
         <w:t>3.2.</w:t>
       </w:r>
@@ -12177,7 +12177,7 @@
           <w:rFonts w:cs="Arial"/>
         </w:rPr>
       </w:pPr>
-      <w:bookmarkStart w:id="49" w:name="_Toc242442988"/>
+      <w:bookmarkStart w:id="49" w:name="_Toc242545649"/>
       <w:r>
         <w:t>3.2.</w:t>
       </w:r>
@@ -12296,7 +12296,7 @@
           <w:rFonts w:cs="Arial"/>
         </w:rPr>
       </w:pPr>
-      <w:bookmarkStart w:id="50" w:name="_Toc242442989"/>
+      <w:bookmarkStart w:id="50" w:name="_Toc242545650"/>
       <w:r>
         <w:t>3.2.</w:t>
       </w:r>
@@ -12362,7 +12362,7 @@
       </w:pPr>
       <w:bookmarkStart w:id="51" w:name="_Toc475112168"/>
       <w:bookmarkStart w:id="52" w:name="_Toc475115524"/>
-      <w:bookmarkStart w:id="53" w:name="_Toc242442990"/>
+      <w:bookmarkStart w:id="53" w:name="_Toc242545651"/>
       <w:r>
         <w:t>3.3 Marco jurídico</w:t>
       </w:r>
@@ -12393,7 +12393,7 @@
           <w:rFonts w:cs="Arial"/>
         </w:rPr>
       </w:pPr>
-      <w:bookmarkStart w:id="54" w:name="_Toc242442991"/>
+      <w:bookmarkStart w:id="54" w:name="_Toc242545652"/>
       <w:r>
         <w:t>3.3.1. Tratamiento de datos personales y régimen de habeas data</w:t>
       </w:r>
@@ -12758,7 +12758,7 @@
       <w:pPr>
         <w:pStyle w:val="Ttulo3"/>
       </w:pPr>
-      <w:bookmarkStart w:id="55" w:name="_Toc242442992"/>
+      <w:bookmarkStart w:id="55" w:name="_Toc242545653"/>
       <w:r>
         <w:t>3.3.2. Derechos de autor sobre los personajes utilizados</w:t>
       </w:r>
@@ -13009,7 +13009,7 @@
       </w:pPr>
       <w:bookmarkStart w:id="56" w:name="_Toc475112170"/>
       <w:bookmarkStart w:id="57" w:name="_Toc475115526"/>
-      <w:bookmarkStart w:id="58" w:name="_Toc242442993"/>
+      <w:bookmarkStart w:id="58" w:name="_Toc242545654"/>
       <w:r>
         <w:rPr>
           <w:color w:val="auto"/>
@@ -13095,7 +13095,7 @@
           <w:caps w:val="0"/>
         </w:rPr>
       </w:pPr>
-      <w:bookmarkStart w:id="61" w:name="_Toc242442994"/>
+      <w:bookmarkStart w:id="61" w:name="_Toc242545655"/>
       <w:r>
         <w:rPr>
           <w:rFonts w:cs="Arial"/>
@@ -13498,7 +13498,7 @@
       </w:pPr>
       <w:bookmarkStart w:id="62" w:name="_Toc475112172"/>
       <w:bookmarkStart w:id="63" w:name="_Toc475115528"/>
-      <w:bookmarkStart w:id="64" w:name="_Toc242442995"/>
+      <w:bookmarkStart w:id="64" w:name="_Toc242545656"/>
       <w:r>
         <w:rPr>
           <w:rFonts w:cs="Arial"/>
@@ -13650,7 +13650,7 @@
         <w:pStyle w:val="Ttulo2"/>
         <w:ind w:left="567" w:hanging="576"/>
       </w:pPr>
-      <w:bookmarkStart w:id="65" w:name="_Toc242442996"/>
+      <w:bookmarkStart w:id="65" w:name="_Toc242545657"/>
       <w:r>
         <w:lastRenderedPageBreak/>
         <w:t>5.1 Fases del trabajo de grado</w:t>
@@ -13694,7 +13694,7 @@
         <w:pStyle w:val="Ttulo3"/>
         <w:spacing w:before="240"/>
       </w:pPr>
-      <w:bookmarkStart w:id="66" w:name="_Toc242442997"/>
+      <w:bookmarkStart w:id="66" w:name="_Toc242545658"/>
       <w:r>
         <w:t>5.1.1 Apertura del trabajo con Árcade y Kanban</w:t>
       </w:r>
@@ -13741,7 +13741,7 @@
         <w:pStyle w:val="Ttulo3"/>
         <w:spacing w:before="240"/>
       </w:pPr>
-      <w:bookmarkStart w:id="67" w:name="_Toc242442998"/>
+      <w:bookmarkStart w:id="67" w:name="_Toc242545659"/>
       <w:r>
         <w:t>5.1.2 Diseño del guion</w:t>
       </w:r>
@@ -13788,7 +13788,7 @@
         <w:pStyle w:val="Ttulo3"/>
         <w:spacing w:before="240"/>
       </w:pPr>
-      <w:bookmarkStart w:id="68" w:name="_Toc242442999"/>
+      <w:bookmarkStart w:id="68" w:name="_Toc242545660"/>
       <w:r>
         <w:t>5.1.3 Especificación de requerimientos (objetivo 1)</w:t>
       </w:r>
@@ -13851,7 +13851,7 @@
         <w:pStyle w:val="Ttulo3"/>
         <w:spacing w:before="240"/>
       </w:pPr>
-      <w:bookmarkStart w:id="69" w:name="_Toc242443000"/>
+      <w:bookmarkStart w:id="69" w:name="_Toc242545661"/>
       <w:r>
         <w:t>5.1.4 Diseño del videojuego (objetivo 2)</w:t>
       </w:r>
@@ -13926,7 +13926,7 @@
         <w:pStyle w:val="Ttulo3"/>
         <w:spacing w:before="240"/>
       </w:pPr>
-      <w:bookmarkStart w:id="70" w:name="_Toc242443001"/>
+      <w:bookmarkStart w:id="70" w:name="_Toc242545662"/>
       <w:r>
         <w:t>5.1.5 Ciclo Diseño ↔ Desarrollo ↔ Pruebas (objetivo 3)</w:t>
       </w:r>
@@ -14050,7 +14050,7 @@
         <w:pStyle w:val="Ttulo3"/>
         <w:spacing w:before="240"/>
       </w:pPr>
-      <w:bookmarkStart w:id="71" w:name="_Toc242443002"/>
+      <w:bookmarkStart w:id="71" w:name="_Toc242545663"/>
       <w:r>
         <w:lastRenderedPageBreak/>
         <w:t>5.1.6 Evaluación del prototipo (objetivo 4)</w:t>
@@ -14096,7 +14096,7 @@
       </w:pPr>
       <w:bookmarkStart w:id="72" w:name="_Toc475112174"/>
       <w:bookmarkStart w:id="73" w:name="_Toc475115530"/>
-      <w:bookmarkStart w:id="74" w:name="_Toc242443003"/>
+      <w:bookmarkStart w:id="74" w:name="_Toc242545664"/>
       <w:r>
         <w:t>5.</w:t>
       </w:r>
@@ -14359,7 +14359,7 @@
         <w:ind w:left="567" w:hanging="576"/>
       </w:pPr>
       <w:bookmarkStart w:id="75" w:name="_Toc475115531"/>
-      <w:bookmarkStart w:id="76" w:name="_Toc242443004"/>
+      <w:bookmarkStart w:id="76" w:name="_Toc242545665"/>
       <w:r>
         <w:t>5.</w:t>
       </w:r>
@@ -14460,7 +14460,7 @@
           <w:b/>
         </w:rPr>
       </w:pPr>
-      <w:bookmarkStart w:id="77" w:name="_Toc242443005"/>
+      <w:bookmarkStart w:id="77" w:name="_Toc242545666"/>
       <w:r>
         <w:rPr>
           <w:rFonts w:cs="Arial"/>
@@ -14495,7 +14495,7 @@
           <w:color w:val="auto"/>
         </w:rPr>
       </w:pPr>
-      <w:bookmarkStart w:id="78" w:name="_Toc242443006"/>
+      <w:bookmarkStart w:id="78" w:name="_Toc242545667"/>
       <w:r>
         <w:rPr>
           <w:color w:val="auto"/>
@@ -14512,7 +14512,7 @@
           <w:rFonts w:cs="Arial"/>
         </w:rPr>
       </w:pPr>
-      <w:bookmarkStart w:id="79" w:name="_Toc242443007"/>
+      <w:bookmarkStart w:id="79" w:name="_Toc242545668"/>
       <w:r>
         <w:rPr>
           <w:rFonts w:cs="Arial"/>
@@ -14564,7 +14564,7 @@
           <w:color w:val="auto"/>
         </w:rPr>
       </w:pPr>
-      <w:bookmarkStart w:id="80" w:name="_Toc242443029"/>
+      <w:bookmarkStart w:id="80" w:name="_Toc242545690"/>
       <w:r>
         <w:rPr>
           <w:rFonts w:cs="Arial"/>
@@ -14912,7 +14912,7 @@
           <w:rFonts w:cs="Arial"/>
         </w:rPr>
       </w:pPr>
-      <w:bookmarkStart w:id="81" w:name="_Toc242443008"/>
+      <w:bookmarkStart w:id="81" w:name="_Toc242545669"/>
       <w:r>
         <w:rPr>
           <w:rFonts w:cs="Arial"/>
@@ -14948,7 +14948,7 @@
           <w:color w:val="auto"/>
         </w:rPr>
       </w:pPr>
-      <w:bookmarkStart w:id="82" w:name="_Toc242443030"/>
+      <w:bookmarkStart w:id="82" w:name="_Toc242545691"/>
       <w:r>
         <w:rPr>
           <w:rFonts w:cs="Arial"/>
@@ -15654,7 +15654,7 @@
           <w:rFonts w:cs="Arial"/>
         </w:rPr>
       </w:pPr>
-      <w:bookmarkStart w:id="83" w:name="_Toc242443009"/>
+      <w:bookmarkStart w:id="83" w:name="_Toc242545670"/>
       <w:r>
         <w:rPr>
           <w:rFonts w:cs="Arial"/>
@@ -15730,7 +15730,7 @@
           <w:color w:val="auto"/>
         </w:rPr>
       </w:pPr>
-      <w:bookmarkStart w:id="84" w:name="_Toc242443010"/>
+      <w:bookmarkStart w:id="84" w:name="_Toc242545671"/>
       <w:r>
         <w:rPr>
           <w:color w:val="auto"/>
@@ -15766,7 +15766,7 @@
           <w:color w:val="auto"/>
         </w:rPr>
       </w:pPr>
-      <w:bookmarkStart w:id="85" w:name="_Toc242443031"/>
+      <w:bookmarkStart w:id="85" w:name="_Toc242545692"/>
       <w:r>
         <w:rPr>
           <w:rFonts w:cs="Arial"/>
@@ -16550,7 +16550,7 @@
           <w:color w:val="auto"/>
         </w:rPr>
       </w:pPr>
-      <w:bookmarkStart w:id="86" w:name="_Toc242443032"/>
+      <w:bookmarkStart w:id="86" w:name="_Toc242545693"/>
       <w:r>
         <w:rPr>
           <w:rFonts w:cs="Arial"/>
@@ -16900,7 +16900,7 @@
           <w:color w:val="auto"/>
         </w:rPr>
       </w:pPr>
-      <w:bookmarkStart w:id="87" w:name="_Toc242443011"/>
+      <w:bookmarkStart w:id="87" w:name="_Toc242545672"/>
       <w:r>
         <w:rPr>
           <w:color w:val="auto"/>
@@ -16999,7 +16999,7 @@
           <w:b/>
         </w:rPr>
       </w:pPr>
-      <w:bookmarkStart w:id="88" w:name="_Toc242443012"/>
+      <w:bookmarkStart w:id="88" w:name="_Toc242545673"/>
       <w:r>
         <w:rPr>
           <w:rFonts w:cs="Arial"/>
@@ -17034,7 +17034,7 @@
           <w:color w:val="auto"/>
         </w:rPr>
       </w:pPr>
-      <w:bookmarkStart w:id="89" w:name="_Toc242443013"/>
+      <w:bookmarkStart w:id="89" w:name="_Toc242545674"/>
       <w:r>
         <w:rPr>
           <w:color w:val="auto"/>
@@ -17051,7 +17051,7 @@
           <w:rFonts w:cs="Arial"/>
         </w:rPr>
       </w:pPr>
-      <w:bookmarkStart w:id="90" w:name="_Toc242443014"/>
+      <w:bookmarkStart w:id="90" w:name="_Toc242545675"/>
       <w:r>
         <w:rPr>
           <w:rFonts w:cs="Arial"/>
@@ -17162,7 +17162,7 @@
           <w:rFonts w:cs="Arial"/>
         </w:rPr>
       </w:pPr>
-      <w:bookmarkStart w:id="91" w:name="_Toc242443015"/>
+      <w:bookmarkStart w:id="91" w:name="_Toc242545676"/>
       <w:r>
         <w:rPr>
           <w:rFonts w:cs="Arial"/>
@@ -17198,7 +17198,7 @@
           <w:color w:val="auto"/>
         </w:rPr>
       </w:pPr>
-      <w:bookmarkStart w:id="92" w:name="_Toc242443033"/>
+      <w:bookmarkStart w:id="92" w:name="_Toc242545694"/>
       <w:r>
         <w:rPr>
           <w:rFonts w:cs="Arial"/>
@@ -17864,7 +17864,7 @@
           <w:rFonts w:cs="Arial"/>
         </w:rPr>
       </w:pPr>
-      <w:bookmarkStart w:id="93" w:name="_Toc242443016"/>
+      <w:bookmarkStart w:id="93" w:name="_Toc242545677"/>
       <w:r>
         <w:rPr>
           <w:rFonts w:cs="Arial"/>
@@ -17937,7 +17937,7 @@
           <w:rFonts w:cs="Arial"/>
         </w:rPr>
       </w:pPr>
-      <w:bookmarkStart w:id="94" w:name="_Toc242443017"/>
+      <w:bookmarkStart w:id="94" w:name="_Toc242545678"/>
       <w:r>
         <w:rPr>
           <w:rFonts w:cs="Arial"/>
@@ -17986,7 +17986,7 @@
           <w:color w:val="auto"/>
         </w:rPr>
       </w:pPr>
-      <w:bookmarkStart w:id="95" w:name="_Toc242443018"/>
+      <w:bookmarkStart w:id="95" w:name="_Toc242545679"/>
       <w:r>
         <w:rPr>
           <w:color w:val="auto"/>
@@ -18038,7 +18038,7 @@
           <w:color w:val="auto"/>
         </w:rPr>
       </w:pPr>
-      <w:bookmarkStart w:id="96" w:name="_Toc242443034"/>
+      <w:bookmarkStart w:id="96" w:name="_Toc242545695"/>
       <w:r>
         <w:rPr>
           <w:rFonts w:cs="Arial"/>
@@ -18709,7 +18709,7 @@
           <w:color w:val="auto"/>
         </w:rPr>
       </w:pPr>
-      <w:bookmarkStart w:id="97" w:name="_Toc242443035"/>
+      <w:bookmarkStart w:id="97" w:name="_Toc242545696"/>
       <w:r>
         <w:rPr>
           <w:rFonts w:cs="Arial"/>
@@ -19075,7 +19075,7 @@
           <w:color w:val="auto"/>
         </w:rPr>
       </w:pPr>
-      <w:bookmarkStart w:id="98" w:name="_Toc242443019"/>
+      <w:bookmarkStart w:id="98" w:name="_Toc242545680"/>
       <w:r>
         <w:rPr>
           <w:color w:val="auto"/>
@@ -19174,7 +19174,7 @@
           <w:b/>
         </w:rPr>
       </w:pPr>
-      <w:bookmarkStart w:id="99" w:name="_Toc242443020"/>
+      <w:bookmarkStart w:id="99" w:name="_Toc242545681"/>
       <w:r>
         <w:rPr>
           <w:rFonts w:cs="Arial"/>
@@ -19223,7 +19223,7 @@
           <w:color w:val="auto"/>
         </w:rPr>
       </w:pPr>
-      <w:bookmarkStart w:id="100" w:name="_Toc242443021"/>
+      <w:bookmarkStart w:id="100" w:name="_Toc242545682"/>
       <w:r>
         <w:rPr>
           <w:color w:val="auto"/>
@@ -19240,7 +19240,7 @@
           <w:rFonts w:cs="Arial"/>
         </w:rPr>
       </w:pPr>
-      <w:bookmarkStart w:id="101" w:name="_Toc242443022"/>
+      <w:bookmarkStart w:id="101" w:name="_Toc242545683"/>
       <w:r>
         <w:rPr>
           <w:rFonts w:cs="Arial"/>
@@ -19320,7 +19320,7 @@
           <w:color w:val="auto"/>
         </w:rPr>
       </w:pPr>
-      <w:bookmarkStart w:id="102" w:name="_Toc242443036"/>
+      <w:bookmarkStart w:id="102" w:name="_Toc242545697"/>
       <w:r>
         <w:rPr>
           <w:rFonts w:cs="Arial"/>
@@ -20053,7 +20053,7 @@
           <w:rFonts w:cs="Arial"/>
         </w:rPr>
       </w:pPr>
-      <w:bookmarkStart w:id="103" w:name="_Toc242443023"/>
+      <w:bookmarkStart w:id="103" w:name="_Toc242545684"/>
       <w:r>
         <w:rPr>
           <w:rFonts w:cs="Arial"/>
@@ -20182,7 +20182,7 @@
           <w:rFonts w:cs="Arial"/>
         </w:rPr>
       </w:pPr>
-      <w:bookmarkStart w:id="104" w:name="_Toc242443024"/>
+      <w:bookmarkStart w:id="104" w:name="_Toc242545685"/>
       <w:r>
         <w:rPr>
           <w:rFonts w:cs="Arial"/>
@@ -20246,7 +20246,7 @@
           <w:color w:val="auto"/>
         </w:rPr>
       </w:pPr>
-      <w:bookmarkStart w:id="105" w:name="_Toc242443045"/>
+      <w:bookmarkStart w:id="105" w:name="_Toc242545706"/>
       <w:r>
         <w:rPr>
           <w:rFonts w:cs="Arial"/>
@@ -20434,7 +20434,7 @@
           <w:color w:val="auto"/>
         </w:rPr>
       </w:pPr>
-      <w:bookmarkStart w:id="106" w:name="_Toc242443046"/>
+      <w:bookmarkStart w:id="106" w:name="_Toc242545707"/>
       <w:r>
         <w:rPr>
           <w:rFonts w:cs="Arial"/>
@@ -20631,7 +20631,7 @@
           <w:color w:val="auto"/>
         </w:rPr>
       </w:pPr>
-      <w:bookmarkStart w:id="107" w:name="_Toc242443047"/>
+      <w:bookmarkStart w:id="107" w:name="_Toc242545708"/>
       <w:r>
         <w:rPr>
           <w:rFonts w:cs="Arial"/>
@@ -20847,7 +20847,21 @@
           <w:rFonts w:cs="Arial"/>
           <w:color w:val="auto"/>
         </w:rPr>
-        <w:t>El 9 de octubre llegaron de la colaboradora el arte de perfil de Papá, Mamá, la Niña y el Niño y el diseño final de Algoritm, y Santiago Benavides Rey decidió cómo entraban al juego (INC-134 a INC-136 e INC-147). La familia se ve de perfil mientras camina, corre, carga, empuja, recoge, se arrodilla o sopla, y de frente en reposo y en los demás gestos. El lado lo da el rumbo, a la izquierda si va a la izquierda o hacia arriba y a la derecha si va a la derecha o hacia abajo, y las dos piernas se dibujan siempre detrás del torso. El parpadeo es de dos cuadros, ojos abiertos y ojos cerrados. Algoritm es ahora una llama, un disco de madera y una gota con pantaloneta de cuadros, en siete piezas por forma en lugar de nueve, y sus brazos van detrás de todo el cuerpo para que ninguna mano le tape la cara. De la colaboradora faltan la cara de Algoritm, que lleva por ahora los ojos y la boca del dibujo anterior y no parpadea ni mueve la boca, y los ojos cerrados de frente de la familia, que por eso solo parpadea de perfil.</w:t>
+        <w:t xml:space="preserve">El 9 de octubre llegaron de la colaboradora el arte de perfil de Papá, Mamá, la Niña y el Niño y el diseño final de Algoritm, y Santiago Benavides Rey decidió cómo entraban al juego (INC-134 a INC-136 e INC-147). La familia se ve de perfil mientras camina, corre, carga, empuja, recoge, se arrodilla o sopla, y de frente en reposo y en los demás gestos. El lado lo da el rumbo, a la izquierda si va a la izquierda o hacia arriba y a la derecha si va a la derecha o hacia abajo, y las dos piernas se dibujan siempre detrás del torso. El parpadeo es de dos cuadros, ojos abiertos y ojos cerrados. Algoritm es ahora una llama, un disco de madera y una gota con pantaloneta de cuadros, en siete piezas por forma en lugar de nueve, y sus brazos van detrás de todo el cuerpo para que ninguna mano le tape la cara. </w:t>
+      </w:r>
+      <w:r>
+        <w:rPr>
+          <w:rFonts w:cs="Arial"/>
+          <w:color w:val="auto"/>
+        </w:rPr>
+        <w:t>El 10 de octubre llegaron de la colaboradora las expresiones de frente de los cinco personajes (neutra, concentración, preocupación y sorpresa, una boca de hablar y los ojos cerrados) y la cara final de Algoritm, y Santiago Benavides Rey tomó tres decisiones (INC-148 a INC-150). Cada línea de las dieciocho secuencias narrativas se dice con la expresión que pide el guion, y el retrato del cuadro de diálogo pasó de una imagen fija a una cara que cambia de expresión según la línea, parpadea y mueve la boca mientras la línea está en pantalla. Con los ojos cerrados de frente la familia parpadea también de frente, y Algoritm parpadea y habla como ella. Las caras y los retratos se importan recortados y a 256 píxeles como máximo. Además, Papá, Mamá y la Niña dejaron de dar la espalda a la fogata en dos secuencias, porque el rumbo de esos pasos se fijó en los datos. De la colaboradora faltan la alegría y el sueño de los cinco personajes: por ahora los momentos alegres se ven con la cara neutra y el sueño, con los ojos cerrados. La carga y la memoria con el arte nuevo no se han medido sobre un ejecutable</w:t>
+      </w:r>
+      <w:r>
+        <w:rPr>
+          <w:rFonts w:cs="Arial"/>
+          <w:color w:val="auto"/>
+        </w:rPr>
+        <w:t>.</w:t>
       </w:r>
     </w:p>
     <w:p>
@@ -20858,7 +20872,7 @@
           <w:rFonts w:cs="Arial"/>
         </w:rPr>
       </w:pPr>
-      <w:bookmarkStart w:id="108" w:name="_Toc242443025"/>
+      <w:bookmarkStart w:id="108" w:name="_Toc242545686"/>
       <w:r>
         <w:rPr>
           <w:rFonts w:cs="Arial"/>
@@ -20910,6 +20924,7 @@
           <w:rFonts w:cs="Arial"/>
           <w:color w:val="auto"/>
         </w:rPr>
+        <w:lastRenderedPageBreak/>
         <w:t>Importar el arte sin comprimir tiene un costo en memoria. Se aceptó porque, comprimidas, las ilustraciones planas mostraban una rejilla de bloques que la capa de oscuridad del Nivel 1 hacía todavía más visible.</w:t>
       </w:r>
       <w:r>
@@ -20924,15 +20939,14 @@
           <w:rFonts w:cs="Arial"/>
           <w:color w:val="auto"/>
         </w:rPr>
-        <w:t xml:space="preserve"> El 9 de octubre el peso volvió a ser un problema: un ejecutable con el arte de perfil de la familia y el diseño final de Algoritm pesó 499,3 MB, 0,7 MB por debajo del tope. Lo más pesado eran cinco imágenes del Nivel 1 de 2000 por 2000 </w:t>
-      </w:r>
-      <w:r>
-        <w:rPr>
-          <w:rFonts w:cs="Arial"/>
-          <w:color w:val="auto"/>
-        </w:rPr>
-        <w:lastRenderedPageBreak/>
-        <w:t>píxeles (el pedernal, el sílex, la hoja y los dos montones de hojas), de 15,3 MB cada una, que en pantalla miden de 72 a 300 píxeles. Santiago Benavides Rey decidió importarlas a 256 píxeles, todavía sin comprimir (INC-146), y el paquete bajó a 420,6 MB. Los dos ejecutables se compilaron solo para medir el peso y no son candidatos: la carga y la memoria con el arte nuevo no se midieron en ellos.</w:t>
+        <w:t xml:space="preserve"> El 9 de octubre el peso volvió a ser un problema: un ejecutable con el arte de perfil de la familia y el diseño final de Algoritm pesó 499,3 MB, 0,7 MB por debajo del tope. Lo más pesado eran cinco imágenes del Nivel 1 de 2000 por 2000 píxeles (el pedernal, el sílex, la hoja y los dos montones de hojas), de 15,3 MB cada una, que en pantalla miden de 72 a 300 píxeles. Santiago Benavides Rey decidió importarlas a 256 píxeles, todavía sin comprimir (INC-146), y el paquete bajó a 420,6 MB. Los dos ejecutables se compilaron solo para medir el peso y no son candidatos: la carga y la memoria con el arte nuevo no se midieron en ellos.</w:t>
+      </w:r>
+      <w:r>
+        <w:rPr>
+          <w:rFonts w:cs="Arial"/>
+          <w:color w:val="auto"/>
+        </w:rPr>
+        <w:t xml:space="preserve"> El 10 de octubre las caras y los retratos de los personajes, recortados a la unión de las cajas de sus expresiones, entraron también a 256 píxeles como máximo, sin comprimir (INC-149); un tercer ejecutable, compilado el 10 de octubre solo para medir el peso, pesó 426,6 MB, 6,0 MB más que el anterior y 73,4 MB por debajo del tope. Tampoco es un candidato: la carga y la memoria siguen sin medirse en un ejecutable.</w:t>
       </w:r>
     </w:p>
     <w:p>
@@ -20943,7 +20957,7 @@
           <w:color w:val="auto"/>
         </w:rPr>
       </w:pPr>
-      <w:bookmarkStart w:id="109" w:name="_Toc242443026"/>
+      <w:bookmarkStart w:id="109" w:name="_Toc242545687"/>
       <w:r>
         <w:rPr>
           <w:color w:val="auto"/>
@@ -21081,6 +21095,7 @@
           <w:rFonts w:cs="Arial"/>
           <w:color w:val="auto"/>
         </w:rPr>
+        <w:lastRenderedPageBreak/>
         <w:t xml:space="preserve">El segundo pedía una ruta principal sin bloqueos en los tres niveles. </w:t>
       </w:r>
       <w:r>
@@ -21146,15 +21161,7 @@
           <w:rFonts w:cs="Arial"/>
           <w:color w:val="auto"/>
         </w:rPr>
-        <w:t xml:space="preserve">El arnés preparado para el cuarto objetivo juega con los mismos gestos que un estudiante: escribe el nombre de un perfil nuevo, entra a cada nivel desde el menú y resuelve las mecánicas solo con clic y clic sostenido sobre la ventana, sin tocar el código. Recorrió el juego entero tres veces, desde la pantalla de inicio hasta los créditos, en 87 y 33 minutos sobre la primera versión y en 16 sobre la vigente, las dos últimas a pantalla completa. Ningún recorrido se bloqueó, se cerró de forma inesperada ni dejó el juego sin salida. Los dos primeros </w:t>
-      </w:r>
-      <w:r>
-        <w:rPr>
-          <w:rFonts w:cs="Arial"/>
-          <w:color w:val="auto"/>
-        </w:rPr>
-        <w:lastRenderedPageBreak/>
-        <w:t xml:space="preserve">encontraron dos defectos del laberinto que no impedían terminarlo, un bloque que se quedaba pegado al cursor y otro que se ejecutaba fuera de la vista, y el tercero ya no los vio. Esas duraciones dependen del ritmo del arnés y no miden a un niño; la de un estudiante, que OE1 sitúa entre 20 y 40 minutos, se cronometra en el cuarto objetivo. El cierre forzado (RNF-14) se probó en nueve momentos, dos de ellos justo cuando el juego guardaba, y en todos el perfil se abrió sin error y sin truncarse, </w:t>
+        <w:t xml:space="preserve">El arnés preparado para el cuarto objetivo juega con los mismos gestos que un estudiante: escribe el nombre de un perfil nuevo, entra a cada nivel desde el menú y resuelve las mecánicas solo con clic y clic sostenido sobre la ventana, sin tocar el código. Recorrió el juego entero tres veces, desde la pantalla de inicio hasta los créditos, en 87 y 33 minutos sobre la primera versión y en 16 sobre la vigente, las dos últimas a pantalla completa. Ningún recorrido se bloqueó, se cerró de forma inesperada ni dejó el juego sin salida. Los dos primeros encontraron dos defectos del laberinto que no impedían terminarlo, un bloque que se quedaba pegado al cursor y otro que se ejecutaba fuera de la vista, y el tercero ya no los vio. Esas duraciones dependen del ritmo del arnés y no miden a un niño; la de un estudiante, que OE1 sitúa entre 20 y 40 minutos, se cronometra en el cuarto objetivo. El cierre forzado (RNF-14) se probó en nueve momentos, dos de ellos justo cuando el juego guardaba, y en todos el perfil se abrió sin error y sin truncarse, </w:t>
       </w:r>
       <w:r>
         <w:rPr>
@@ -21182,7 +21189,7 @@
           <w:color w:val="auto"/>
         </w:rPr>
       </w:pPr>
-      <w:bookmarkStart w:id="110" w:name="_Toc242443037"/>
+      <w:bookmarkStart w:id="110" w:name="_Toc242545698"/>
       <w:r>
         <w:rPr>
           <w:rFonts w:cs="Arial"/>
@@ -21616,12 +21623,13 @@
           <w:color w:val="auto"/>
         </w:rPr>
       </w:pPr>
-      <w:bookmarkStart w:id="111" w:name="_Toc242443038"/>
-      <w:r>
-        <w:rPr>
-          <w:rFonts w:cs="Arial"/>
-          <w:color w:val="auto"/>
-        </w:rPr>
+      <w:bookmarkStart w:id="111" w:name="_Toc242545699"/>
+      <w:r>
+        <w:rPr>
+          <w:rFonts w:cs="Arial"/>
+          <w:color w:val="auto"/>
+        </w:rPr>
+        <w:lastRenderedPageBreak/>
         <w:t xml:space="preserve">Tabla </w:t>
       </w:r>
       <w:r>
@@ -22324,15 +22332,7 @@
           <w:rFonts w:cs="Arial"/>
           <w:color w:val="auto"/>
         </w:rPr>
-        <w:t xml:space="preserve">Los tres presupuestos se midieron sobre el ejecutable, en el equipo de desarrollo (Tabla 11). </w:t>
-      </w:r>
-      <w:r>
-        <w:rPr>
-          <w:rFonts w:cs="Arial"/>
-          <w:color w:val="auto"/>
-        </w:rPr>
-        <w:lastRenderedPageBreak/>
-        <w:t>El cargador de escenas escribe en el Player.log cuánto tardó cada carga, y la más lenta, la de la primera narrativa al crear un perfil nuevo, duró 0,78 s; ninguna otra escena pasó de 0,16 s. La memoria la muestreó el arnés cada dos segundos durante las sesiones de juego, y el paquete quedó 21 MB por debajo del límite. Repetir esas medidas en otro equipo, y en uno que no tenga tarjeta gráfica dedicada, queda para el cuarto objetivo</w:t>
+        <w:t>Los tres presupuestos se midieron sobre el ejecutable, en el equipo de desarrollo (Tabla 11). El cargador de escenas escribe en el Player.log cuánto tardó cada carga, y la más lenta, la de la primera narrativa al crear un perfil nuevo, duró 0,78 s; ninguna otra escena pasó de 0,16 s. La memoria la muestreó el arnés cada dos segundos durante las sesiones de juego, y el paquete quedó 21 MB por debajo del límite. Repetir esas medidas en otro equipo, y en uno que no tenga tarjeta gráfica dedicada, queda para el cuarto objetivo</w:t>
       </w:r>
       <w:r>
         <w:rPr>
@@ -22360,7 +22360,7 @@
           <w:color w:val="auto"/>
         </w:rPr>
       </w:pPr>
-      <w:bookmarkStart w:id="112" w:name="_Toc242443039"/>
+      <w:bookmarkStart w:id="112" w:name="_Toc242545700"/>
       <w:r>
         <w:rPr>
           <w:rFonts w:cs="Arial"/>
@@ -23094,7 +23094,21 @@
           <w:rFonts w:cs="Arial"/>
           <w:color w:val="auto"/>
         </w:rPr>
-        <w:t xml:space="preserve"> Después se registraron y cerraron otros diecisiete, INC-131 a INC-147, sobre los personajes, la interfaz, la cámara del cruce y el peso del paquete; el último es del 9 de octubre.</w:t>
+        <w:t xml:space="preserve"> Después se registraron y cerraron otros </w:t>
+      </w:r>
+      <w:r>
+        <w:rPr>
+          <w:rFonts w:cs="Arial"/>
+          <w:color w:val="auto"/>
+        </w:rPr>
+        <w:t>veinte, INC-131 a INC-150, sobre los personajes, la interfaz, la cámara del cruce, el peso del paquete y las expresiones de los personajes; el último es del 10</w:t>
+      </w:r>
+      <w:r>
+        <w:rPr>
+          <w:rFonts w:cs="Arial"/>
+          <w:color w:val="auto"/>
+        </w:rPr>
+        <w:t xml:space="preserve"> de octubre.</w:t>
       </w:r>
     </w:p>
     <w:p>
@@ -23105,7 +23119,7 @@
           <w:color w:val="auto"/>
         </w:rPr>
       </w:pPr>
-      <w:bookmarkStart w:id="113" w:name="_Toc242443027"/>
+      <w:bookmarkStart w:id="113" w:name="_Toc242545688"/>
       <w:r>
         <w:rPr>
           <w:color w:val="auto"/>
@@ -23127,7 +23141,15 @@
           <w:rFonts w:cs="Arial"/>
           <w:color w:val="auto"/>
         </w:rPr>
-        <w:t>El prototipo llevó a un programa el diseño de los dos primeros objetivos, con tres niveles cuyos retos lógicos cambian de naturaleza de uno a otro. Los criterios pedagógicos quedaron fijados en pruebas automáticas: ninguna derrota, ninguna cifra ante el estudiante y pistas que no dan la respuesta.</w:t>
+        <w:t xml:space="preserve">El prototipo llevó a un programa el diseño de los dos primeros objetivos, con tres niveles cuyos </w:t>
+      </w:r>
+      <w:r>
+        <w:rPr>
+          <w:rFonts w:cs="Arial"/>
+          <w:color w:val="auto"/>
+        </w:rPr>
+        <w:lastRenderedPageBreak/>
+        <w:t>retos lógicos cambian de naturaleza de uno a otro. Los criterios pedagógicos quedaron fijados en pruebas automáticas: ninguna derrota, ninguna cifra ante el estudiante y pistas que no dan la respuesta.</w:t>
       </w:r>
     </w:p>
     <w:p>
@@ -23196,7 +23218,6 @@
           <w:rFonts w:cs="Arial"/>
           <w:color w:val="auto"/>
         </w:rPr>
-        <w:lastRenderedPageBreak/>
         <w:t xml:space="preserve">Medir sobre el juego compilado cambió dos resultados. La primera compilación de doce escenas superaba el límite de tamaño de RNF-06, y la primera versión candidata abría conexiones de red que las pruebas no detectaban, porque leían la configuración guardada en el repositorio y no la que quedaba dentro del ejecutable. Ambas se corrigieron antes de la entrega, y desde entonces una prueba vigila la importación de </w:t>
       </w:r>
       <w:r>
@@ -23281,7 +23302,7 @@
         </w:rPr>
       </w:pPr>
       <w:bookmarkStart w:id="114" w:name="_Toc379905744"/>
-      <w:bookmarkStart w:id="115" w:name="_Toc242443028"/>
+      <w:bookmarkStart w:id="115" w:name="_Toc242545689"/>
       <w:r>
         <w:rPr>
           <w:rFonts w:cs="Arial"/>
@@ -33568,6 +33589,10 @@
 </file>
 
 <file path=customXml/item1.xml><?xml version="1.0" encoding="utf-8"?>
+<b:Sources xmlns:b="http://schemas.openxmlformats.org/officeDocument/2006/bibliography" xmlns="http://schemas.openxmlformats.org/officeDocument/2006/bibliography" SelectedStyle="\IEEE2006OfficeOnline.xsl" StyleName="IEEE" Version="2006"/>
+</file>
+
+<file path=customXml/item2.xml><?xml version="1.0" encoding="utf-8"?>
 <PERRLA xmlns="PERRLAReferences" id="1" gen="1772897757446_fz0nj9rbg">
   <References>
     <Reference>
@@ -35960,22 +35985,18 @@
 </PERRLA>
 </file>
 
-<file path=customXml/item2.xml><?xml version="1.0" encoding="utf-8"?>
-<b:Sources xmlns:b="http://schemas.openxmlformats.org/officeDocument/2006/bibliography" xmlns="http://schemas.openxmlformats.org/officeDocument/2006/bibliography" SelectedStyle="\IEEE2006OfficeOnline.xsl" StyleName="IEEE" Version="2006"/>
+<file path=customXml/itemProps1.xml><?xml version="1.0" encoding="utf-8"?>
+<ds:datastoreItem xmlns:ds="http://schemas.openxmlformats.org/officeDocument/2006/customXml" ds:itemID="{5C672598-A095-4690-A035-71B3EC7C3A93}">
+  <ds:schemaRefs>
+    <ds:schemaRef ds:uri="http://schemas.openxmlformats.org/officeDocument/2006/bibliography"/>
+  </ds:schemaRefs>
+</ds:datastoreItem>
 </file>
 
-<file path=customXml/itemProps1.xml><?xml version="1.0" encoding="utf-8"?>
+<file path=customXml/itemProps2.xml><?xml version="1.0" encoding="utf-8"?>
 <ds:datastoreItem xmlns:ds="http://schemas.openxmlformats.org/officeDocument/2006/customXml" ds:itemID="{75E55BB1-1658-473A-8BA5-374477F37E7C}">
   <ds:schemaRefs>
     <ds:schemaRef ds:uri="PERRLAReferences"/>
   </ds:schemaRefs>
 </ds:datastoreItem>
-</file>
-
-<file path=customXml/itemProps2.xml><?xml version="1.0" encoding="utf-8"?>
-<ds:datastoreItem xmlns:ds="http://schemas.openxmlformats.org/officeDocument/2006/customXml" ds:itemID="{5C672598-A095-4690-A035-71B3EC7C3A93}">
-  <ds:schemaRefs>
-    <ds:schemaRef ds:uri="http://schemas.openxmlformats.org/officeDocument/2006/bibliography"/>
-  </ds:schemaRefs>
-</ds:datastoreItem>
 </file>
</xml_diff>